<commit_message>
Mod: correzioni errori ortografici SDD
</commit_message>
<xml_diff>
--- a/Workspace/SDD/SDD_EWMS.docx
+++ b/Workspace/SDD/SDD_EWMS.docx
@@ -5187,10 +5187,7 @@
       </w:r>
       <w:proofErr w:type="spellEnd"/>
       <w:r>
-        <w:t xml:space="preserve"> sono </w:t>
-      </w:r>
-      <w:r>
-        <w:t>persistenti</w:t>
+        <w:t xml:space="preserve"> sono persistenti</w:t>
       </w:r>
       <w:r>
         <w:t>; quindi,</w:t>
@@ -5504,14 +5501,7 @@
           <w:b/>
           <w:bCs/>
         </w:rPr>
-        <w:t>Obiettivo:</w:t>
-      </w:r>
-      <w:r>
-        <w:rPr>
-          <w:b/>
-          <w:bCs/>
-        </w:rPr>
-        <w:t xml:space="preserve"> </w:t>
+        <w:t xml:space="preserve">Obiettivo: </w:t>
       </w:r>
       <w:r>
         <w:t xml:space="preserve">Garantire che l’applicazione sia facilmente distribuibile come pacchetto </w:t>
@@ -5633,14 +5623,7 @@
           <w:b/>
           <w:bCs/>
         </w:rPr>
-        <w:t>Obiettivo:</w:t>
-      </w:r>
-      <w:r>
-        <w:rPr>
-          <w:b/>
-          <w:bCs/>
-        </w:rPr>
-        <w:t xml:space="preserve"> </w:t>
+        <w:t xml:space="preserve">Obiettivo: </w:t>
       </w:r>
       <w:r>
         <w:t>Consentire la configurazione del database tramite il contesto del server o file di configurazione interni al pacchetto, rendendo l’applicazione flessibile per diversi ambienti.</w:t>
@@ -5793,14 +5776,7 @@
           <w:b/>
           <w:bCs/>
         </w:rPr>
-        <w:t>Obiettivo:</w:t>
-      </w:r>
-      <w:r>
-        <w:rPr>
-          <w:b/>
-          <w:bCs/>
-        </w:rPr>
-        <w:t xml:space="preserve"> </w:t>
+        <w:t xml:space="preserve">Obiettivo: </w:t>
       </w:r>
       <w:r>
         <w:t xml:space="preserve">Proteggere le informazioni personali dei dipendenti tramite cifratura sicura delle password (AES, </w:t>
@@ -6049,14 +6025,7 @@
           <w:b/>
           <w:bCs/>
         </w:rPr>
-        <w:t>Obiettivo:</w:t>
-      </w:r>
-      <w:r>
-        <w:rPr>
-          <w:b/>
-          <w:bCs/>
-        </w:rPr>
-        <w:t xml:space="preserve"> </w:t>
+        <w:t xml:space="preserve">Obiettivo: </w:t>
       </w:r>
       <w:r>
         <w:t xml:space="preserve">Prevenire SQL injection utilizzando </w:t>
@@ -6991,11 +6960,9 @@
             <w:r>
               <w:t xml:space="preserve">Standard che estende il formato delle </w:t>
             </w:r>
-            <w:proofErr w:type="gramStart"/>
-            <w:r>
-              <w:t>email</w:t>
-            </w:r>
-            <w:proofErr w:type="gramEnd"/>
+            <w:r>
+              <w:t>e-mail</w:t>
+            </w:r>
             <w:r>
               <w:t xml:space="preserve"> e viene usato nel web per indicare il tipo di contenuto di un file (es. </w:t>
             </w:r>
@@ -7176,6 +7143,109 @@
             <w:proofErr w:type="spellEnd"/>
             <w:r>
               <w:t>, classi Java e risorse web.</w:t>
+            </w:r>
+          </w:p>
+        </w:tc>
+      </w:tr>
+      <w:tr>
+        <w:tc>
+          <w:tcPr>
+            <w:tcW w:w="0" w:type="auto"/>
+          </w:tcPr>
+          <w:p>
+            <w:pPr>
+              <w:rPr>
+                <w:b/>
+                <w:bCs/>
+              </w:rPr>
+            </w:pPr>
+            <w:r>
+              <w:rPr>
+                <w:b/>
+                <w:bCs/>
+              </w:rPr>
+              <w:t>UI</w:t>
+            </w:r>
+            <w:r>
+              <w:rPr>
+                <w:b/>
+                <w:bCs/>
+              </w:rPr>
+              <w:t xml:space="preserve"> </w:t>
+            </w:r>
+          </w:p>
+          <w:p>
+            <w:pPr>
+              <w:rPr>
+                <w:b/>
+                <w:bCs/>
+              </w:rPr>
+            </w:pPr>
+          </w:p>
+        </w:tc>
+        <w:tc>
+          <w:tcPr>
+            <w:tcW w:w="0" w:type="auto"/>
+          </w:tcPr>
+          <w:p>
+            <w:r>
+              <w:t>User Interface</w:t>
+            </w:r>
+          </w:p>
+        </w:tc>
+        <w:tc>
+          <w:tcPr>
+            <w:tcW w:w="0" w:type="auto"/>
+          </w:tcPr>
+          <w:p>
+            <w:r>
+              <w:t>Interfaccia Utente, il mezzo attraverso cui l'utente interagisce con il sistema.</w:t>
+            </w:r>
+          </w:p>
+          <w:p/>
+        </w:tc>
+      </w:tr>
+      <w:tr>
+        <w:tc>
+          <w:tcPr>
+            <w:tcW w:w="0" w:type="auto"/>
+          </w:tcPr>
+          <w:p>
+            <w:pPr>
+              <w:rPr>
+                <w:b/>
+                <w:bCs/>
+              </w:rPr>
+            </w:pPr>
+            <w:r>
+              <w:rPr>
+                <w:b/>
+                <w:bCs/>
+              </w:rPr>
+              <w:t>UX</w:t>
+            </w:r>
+          </w:p>
+        </w:tc>
+        <w:tc>
+          <w:tcPr>
+            <w:tcW w:w="0" w:type="auto"/>
+          </w:tcPr>
+          <w:p>
+            <w:r>
+              <w:t>User Experience</w:t>
+            </w:r>
+          </w:p>
+        </w:tc>
+        <w:tc>
+          <w:tcPr>
+            <w:tcW w:w="0" w:type="auto"/>
+          </w:tcPr>
+          <w:p>
+            <w:r>
+              <w:t>R</w:t>
+            </w:r>
+            <w:r>
+              <w:t>iguarda le percezioni e le risposte di una persona risultanti dall'uso del sistema.</w:t>
             </w:r>
           </w:p>
         </w:tc>
@@ -7464,6 +7534,7 @@
         </w:numPr>
       </w:pPr>
       <w:r>
+        <w:lastRenderedPageBreak/>
         <w:t>Viene presentata la scomposizione logica in sottosistemi.</w:t>
       </w:r>
     </w:p>
@@ -7497,7 +7568,6 @@
         </w:numPr>
       </w:pPr>
       <w:r>
-        <w:lastRenderedPageBreak/>
         <w:t>Vengono descritte le condizioni di confine.</w:t>
       </w:r>
     </w:p>
@@ -7735,7 +7805,11 @@
         <w:t xml:space="preserve"> </w:t>
       </w:r>
       <w:r>
-        <w:t>I problemi più comuni riscontrati includono: frammentazione delle informazioni, mancanza di un controllo centralizzato dei task, impossibilità di monitorare efficacemente l’avanzamento, carico comunicativo elevato su canali non strutturati, scarsa scalabilità,  bassa integrazione con i flussi operativi reali, ridondanza delle informazioni e perdita di dati.</w:t>
+        <w:t xml:space="preserve">I problemi più comuni riscontrati includono: frammentazione delle informazioni, mancanza di un controllo centralizzato dei task, impossibilità di monitorare efficacemente l’avanzamento, carico comunicativo elevato su canali non strutturati, </w:t>
+      </w:r>
+      <w:r>
+        <w:lastRenderedPageBreak/>
+        <w:t>scarsa scalabilità,  bassa integrazione con i flussi operativi reali, ridondanza delle informazioni e perdita di dati.</w:t>
       </w:r>
       <w:r>
         <w:t xml:space="preserve"> </w:t>
@@ -7938,10 +8012,6 @@
         <w:t>.</w:t>
       </w:r>
     </w:p>
-    <w:p/>
-    <w:p/>
-    <w:p/>
-    <w:p/>
     <w:p/>
     <w:p/>
     <w:p/>
@@ -10044,6 +10114,9 @@
       <w:r>
         <w:t xml:space="preserve"> specificata</w:t>
       </w:r>
+      <w:r>
+        <w:t>;</w:t>
+      </w:r>
     </w:p>
     <w:p>
       <w:pPr>
@@ -10064,6 +10137,9 @@
       <w:r>
         <w:t xml:space="preserve"> esegue la logica di business</w:t>
       </w:r>
+      <w:r>
+        <w:t>;</w:t>
+      </w:r>
     </w:p>
     <w:p>
       <w:pPr>
@@ -10074,7 +10150,13 @@
         </w:numPr>
       </w:pPr>
       <w:r>
-        <w:t>Al termine il controllo passa a una pagina JSP che genere l’HTML di risposta inviato al client.</w:t>
+        <w:t>Al termine il controllo passa a una pagina JSP che gener</w:t>
+      </w:r>
+      <w:r>
+        <w:t>a</w:t>
+      </w:r>
+      <w:r>
+        <w:t xml:space="preserve"> l’HTML di risposta inviato al client.</w:t>
       </w:r>
       <w:r>
         <w:br/>
@@ -10253,7 +10335,10 @@
       </w:r>
       <w:proofErr w:type="gramStart"/>
       <w:r>
-        <w:t>sono gestiti</w:t>
+        <w:t>è gestit</w:t>
+      </w:r>
+      <w:r>
+        <w:t>o</w:t>
       </w:r>
       <w:proofErr w:type="gramEnd"/>
       <w:r>
@@ -12566,6 +12651,8 @@
         <w:t>di connessioni sempre aperte e pronte all'uso, prestandole ai vari processi quando ne hanno bisogno.</w:t>
       </w:r>
     </w:p>
+    <w:p/>
+    <w:p/>
     <w:sectPr>
       <w:footnotePr>
         <w:pos w:val="beneathText"/>

</xml_diff>

<commit_message>
Add: aggiunta cartella ODD e punti singoli e documento subsystem interface access
</commit_message>
<xml_diff>
--- a/Workspace/SDD/SDD_EWMS.docx
+++ b/Workspace/SDD/SDD_EWMS.docx
@@ -7164,14 +7164,7 @@
                 <w:b/>
                 <w:bCs/>
               </w:rPr>
-              <w:t>UI</w:t>
-            </w:r>
-            <w:r>
-              <w:rPr>
-                <w:b/>
-                <w:bCs/>
-              </w:rPr>
-              <w:t xml:space="preserve"> </w:t>
+              <w:t xml:space="preserve">UI </w:t>
             </w:r>
           </w:p>
           <w:p>
@@ -8053,7 +8046,6 @@
         <w:t>” e le relative dipendenze.</w:t>
       </w:r>
     </w:p>
-    <w:p/>
     <w:p>
       <w:pPr>
         <w:rPr>
@@ -8066,10 +8058,10 @@
           <w:noProof/>
         </w:rPr>
         <w:drawing>
-          <wp:inline distT="0" distB="0" distL="0" distR="0" wp14:anchorId="1D7C963F" wp14:editId="5F5FBB0A">
-            <wp:extent cx="6120130" cy="3644265"/>
-            <wp:effectExtent l="0" t="0" r="3810" b="0"/>
-            <wp:docPr id="1919883923" name="Elemento grafico 1"/>
+          <wp:inline distT="0" distB="0" distL="0" distR="0" wp14:anchorId="7088576A" wp14:editId="522B26A0">
+            <wp:extent cx="6119495" cy="3643630"/>
+            <wp:effectExtent l="0" t="0" r="0" b="0"/>
+            <wp:docPr id="1759503667" name="Elemento grafico 3"/>
             <wp:cNvGraphicFramePr>
               <a:graphicFrameLocks xmlns:a="http://schemas.openxmlformats.org/drawingml/2006/main" noChangeAspect="1"/>
             </wp:cNvGraphicFramePr>
@@ -8077,7 +8069,7 @@
               <a:graphicData uri="http://schemas.openxmlformats.org/drawingml/2006/picture">
                 <pic:pic xmlns:pic="http://schemas.openxmlformats.org/drawingml/2006/picture">
                   <pic:nvPicPr>
-                    <pic:cNvPr id="1919883923" name="Elemento grafico 1919883923"/>
+                    <pic:cNvPr id="1759503667" name="Elemento grafico 1759503667"/>
                     <pic:cNvPicPr/>
                   </pic:nvPicPr>
                   <pic:blipFill>
@@ -8095,7 +8087,7 @@
                   <pic:spPr>
                     <a:xfrm>
                       <a:off x="0" y="0"/>
-                      <a:ext cx="6120130" cy="3644265"/>
+                      <a:ext cx="6119495" cy="3643630"/>
                     </a:xfrm>
                     <a:prstGeom prst="rect">
                       <a:avLst/>
@@ -8106,9 +8098,6 @@
             </a:graphic>
           </wp:inline>
         </w:drawing>
-      </w:r>
-      <w:r>
-        <w:br/>
       </w:r>
       <w:r>
         <w:br/>
@@ -8206,12 +8195,9 @@
           <w:p>
             <w:proofErr w:type="spellStart"/>
             <w:r>
-              <w:t>EWMSServer</w:t>
+              <w:t>AccountControl</w:t>
             </w:r>
             <w:proofErr w:type="spellEnd"/>
-            <w:r>
-              <w:t xml:space="preserve"> </w:t>
-            </w:r>
           </w:p>
         </w:tc>
         <w:tc>
@@ -8220,7 +8206,31 @@
           </w:tcPr>
           <w:p>
             <w:r>
-              <w:t>Sottosistema che rappresenta il server intercetta le richieste da parte dei client e utilizza i sottosistemi sottostanti per applicare la logica di business</w:t>
+              <w:t>Sottosistema che si occupa delle operazioni di controllo di tutto quello che riguarda gli account.</w:t>
+            </w:r>
+          </w:p>
+        </w:tc>
+      </w:tr>
+      <w:tr>
+        <w:tc>
+          <w:tcPr>
+            <w:tcW w:w="2694" w:type="dxa"/>
+          </w:tcPr>
+          <w:p>
+            <w:proofErr w:type="spellStart"/>
+            <w:r>
+              <w:t>TaskControl</w:t>
+            </w:r>
+            <w:proofErr w:type="spellEnd"/>
+          </w:p>
+        </w:tc>
+        <w:tc>
+          <w:tcPr>
+            <w:tcW w:w="6938" w:type="dxa"/>
+          </w:tcPr>
+          <w:p>
+            <w:r>
+              <w:t>Sottosistema che si occupa delle operazioni di controllo di tutto quello che riguarda i task</w:t>
             </w:r>
           </w:p>
         </w:tc>
@@ -8519,15 +8529,18 @@
       </w:r>
     </w:p>
     <w:p>
+      <w:pPr>
+        <w:jc w:val="center"/>
+      </w:pPr>
       <w:r>
         <w:rPr>
           <w:noProof/>
         </w:rPr>
         <w:drawing>
-          <wp:inline distT="0" distB="0" distL="0" distR="0" wp14:anchorId="485DEC53" wp14:editId="28ED524A">
-            <wp:extent cx="6463991" cy="2781300"/>
-            <wp:effectExtent l="0" t="0" r="0" b="0"/>
-            <wp:docPr id="335504766" name="Elemento grafico 3"/>
+          <wp:inline distT="0" distB="0" distL="0" distR="0" wp14:anchorId="65E47189" wp14:editId="77ADF16D">
+            <wp:extent cx="4177556" cy="3079750"/>
+            <wp:effectExtent l="0" t="0" r="0" b="6350"/>
+            <wp:docPr id="1954747525" name="Elemento grafico 2"/>
             <wp:cNvGraphicFramePr>
               <a:graphicFrameLocks xmlns:a="http://schemas.openxmlformats.org/drawingml/2006/main" noChangeAspect="1"/>
             </wp:cNvGraphicFramePr>
@@ -8535,7 +8548,7 @@
               <a:graphicData uri="http://schemas.openxmlformats.org/drawingml/2006/picture">
                 <pic:pic xmlns:pic="http://schemas.openxmlformats.org/drawingml/2006/picture">
                   <pic:nvPicPr>
-                    <pic:cNvPr id="335504766" name="Elemento grafico 335504766"/>
+                    <pic:cNvPr id="1954747525" name="Elemento grafico 1954747525"/>
                     <pic:cNvPicPr/>
                   </pic:nvPicPr>
                   <pic:blipFill>
@@ -8553,7 +8566,7 @@
                   <pic:spPr>
                     <a:xfrm>
                       <a:off x="0" y="0"/>
-                      <a:ext cx="6467641" cy="2782871"/>
+                      <a:ext cx="4185393" cy="3085528"/>
                     </a:xfrm>
                     <a:prstGeom prst="rect">
                       <a:avLst/>
@@ -8564,9 +8577,6 @@
             </a:graphic>
           </wp:inline>
         </w:drawing>
-      </w:r>
-      <w:r>
-        <w:br/>
       </w:r>
     </w:p>
     <w:p>
@@ -16970,6 +16980,7 @@
   <w:style w:type="character" w:default="1" w:styleId="Carpredefinitoparagrafo">
     <w:name w:val="Default Paragraph Font"/>
     <w:uiPriority w:val="1"/>
+    <w:semiHidden/>
     <w:unhideWhenUsed/>
   </w:style>
   <w:style w:type="table" w:default="1" w:styleId="Tabellanormale">

</xml_diff>

<commit_message>
Mod: modificato SDD, le modifiche sono specificate nel documento
</commit_message>
<xml_diff>
--- a/Workspace/SDD/SDD_EWMS.docx
+++ b/Workspace/SDD/SDD_EWMS.docx
@@ -200,7 +200,7 @@
           <w:sz w:val="36"/>
           <w:lang w:val="en-GB"/>
         </w:rPr>
-        <w:t>0</w:t>
+        <w:t>1</w:t>
       </w:r>
       <w:r>
         <w:rPr>
@@ -333,7 +333,37 @@
         <w:rPr>
           <w:sz w:val="32"/>
         </w:rPr>
-        <w:t xml:space="preserve"> 25/11/2025</w:t>
+        <w:t xml:space="preserve"> </w:t>
+      </w:r>
+      <w:r>
+        <w:rPr>
+          <w:sz w:val="32"/>
+        </w:rPr>
+        <w:t>0</w:t>
+      </w:r>
+      <w:r>
+        <w:rPr>
+          <w:sz w:val="32"/>
+        </w:rPr>
+        <w:t>5/</w:t>
+      </w:r>
+      <w:r>
+        <w:rPr>
+          <w:sz w:val="32"/>
+        </w:rPr>
+        <w:t>0</w:t>
+      </w:r>
+      <w:r>
+        <w:rPr>
+          <w:sz w:val="32"/>
+        </w:rPr>
+        <w:t>1/202</w:t>
+      </w:r>
+      <w:r>
+        <w:rPr>
+          <w:sz w:val="32"/>
+        </w:rPr>
+        <w:t>6</w:t>
       </w:r>
     </w:p>
     <w:p/>
@@ -1335,6 +1365,12 @@
                 <w:sz w:val="20"/>
               </w:rPr>
             </w:pPr>
+            <w:r>
+              <w:rPr>
+                <w:sz w:val="20"/>
+              </w:rPr>
+              <w:t>05/01/2026</w:t>
+            </w:r>
           </w:p>
         </w:tc>
         <w:tc>
@@ -1354,6 +1390,12 @@
                 <w:sz w:val="20"/>
               </w:rPr>
             </w:pPr>
+            <w:r>
+              <w:rPr>
+                <w:sz w:val="20"/>
+              </w:rPr>
+              <w:t>1.1</w:t>
+            </w:r>
           </w:p>
         </w:tc>
         <w:tc>
@@ -1368,11 +1410,38 @@
           <w:p>
             <w:pPr>
               <w:pStyle w:val="Contenutotabella"/>
-              <w:jc w:val="center"/>
               <w:rPr>
                 <w:sz w:val="20"/>
               </w:rPr>
             </w:pPr>
+            <w:r>
+              <w:rPr>
+                <w:sz w:val="20"/>
+              </w:rPr>
+              <w:t xml:space="preserve">Modificati il component e deployment </w:t>
+            </w:r>
+            <w:proofErr w:type="spellStart"/>
+            <w:r>
+              <w:rPr>
+                <w:sz w:val="20"/>
+              </w:rPr>
+              <w:t>diagram</w:t>
+            </w:r>
+            <w:proofErr w:type="spellEnd"/>
+            <w:r>
+              <w:rPr>
+                <w:sz w:val="20"/>
+              </w:rPr>
+              <w:t xml:space="preserve">, modificato i servizi offerti dal </w:t>
+            </w:r>
+            <w:proofErr w:type="spellStart"/>
+            <w:r>
+              <w:rPr>
+                <w:sz w:val="20"/>
+              </w:rPr>
+              <w:t>PersistanceManagement</w:t>
+            </w:r>
+            <w:proofErr w:type="spellEnd"/>
           </w:p>
         </w:tc>
         <w:tc>
@@ -1393,6 +1462,12 @@
                 <w:sz w:val="20"/>
               </w:rPr>
             </w:pPr>
+            <w:r>
+              <w:rPr>
+                <w:sz w:val="20"/>
+              </w:rPr>
+              <w:t>Giovanni Robustelli</w:t>
+            </w:r>
           </w:p>
         </w:tc>
       </w:tr>
@@ -1870,7 +1945,7 @@
       <w:r>
         <w:fldChar w:fldCharType="separate"/>
       </w:r>
-      <w:hyperlink w:anchor="_Toc214993109" w:history="1">
+      <w:hyperlink w:anchor="_Toc218505595" w:history="1">
         <w:r>
           <w:rPr>
             <w:rStyle w:val="Collegamentoipertestuale"/>
@@ -1914,7 +1989,7 @@
             <w:noProof/>
             <w:webHidden/>
           </w:rPr>
-          <w:instrText xml:space="preserve"> PAGEREF _Toc214993109 \h </w:instrText>
+          <w:instrText xml:space="preserve"> PAGEREF _Toc218505595 \h </w:instrText>
         </w:r>
         <w:r>
           <w:rPr>
@@ -1934,7 +2009,7 @@
             <w:noProof/>
             <w:webHidden/>
           </w:rPr>
-          <w:t>5</w:t>
+          <w:t>4</w:t>
         </w:r>
         <w:r>
           <w:rPr>
@@ -1959,7 +2034,7 @@
           <w14:ligatures w14:val="standardContextual"/>
         </w:rPr>
       </w:pPr>
-      <w:hyperlink w:anchor="_Toc214993110" w:history="1">
+      <w:hyperlink w:anchor="_Toc218505596" w:history="1">
         <w:r>
           <w:rPr>
             <w:rStyle w:val="Collegamentoipertestuale"/>
@@ -2003,7 +2078,7 @@
             <w:noProof/>
             <w:webHidden/>
           </w:rPr>
-          <w:instrText xml:space="preserve"> PAGEREF _Toc214993110 \h </w:instrText>
+          <w:instrText xml:space="preserve"> PAGEREF _Toc218505596 \h </w:instrText>
         </w:r>
         <w:r>
           <w:rPr>
@@ -2023,7 +2098,7 @@
             <w:noProof/>
             <w:webHidden/>
           </w:rPr>
-          <w:t>5</w:t>
+          <w:t>4</w:t>
         </w:r>
         <w:r>
           <w:rPr>
@@ -2048,7 +2123,7 @@
           <w14:ligatures w14:val="standardContextual"/>
         </w:rPr>
       </w:pPr>
-      <w:hyperlink w:anchor="_Toc214993111" w:history="1">
+      <w:hyperlink w:anchor="_Toc218505597" w:history="1">
         <w:r>
           <w:rPr>
             <w:rStyle w:val="Collegamentoipertestuale"/>
@@ -2092,7 +2167,7 @@
             <w:noProof/>
             <w:webHidden/>
           </w:rPr>
-          <w:instrText xml:space="preserve"> PAGEREF _Toc214993111 \h </w:instrText>
+          <w:instrText xml:space="preserve"> PAGEREF _Toc218505597 \h </w:instrText>
         </w:r>
         <w:r>
           <w:rPr>
@@ -2112,646 +2187,7 @@
             <w:noProof/>
             <w:webHidden/>
           </w:rPr>
-          <w:t>5</w:t>
-        </w:r>
-        <w:r>
-          <w:rPr>
-            <w:noProof/>
-            <w:webHidden/>
-          </w:rPr>
-          <w:fldChar w:fldCharType="end"/>
-        </w:r>
-      </w:hyperlink>
-    </w:p>
-    <w:p>
-      <w:pPr>
-        <w:pStyle w:val="Sommario3"/>
-        <w:tabs>
-          <w:tab w:val="right" w:leader="dot" w:pos="9627"/>
-        </w:tabs>
-        <w:rPr>
-          <w:rFonts w:asciiTheme="minorHAnsi" w:eastAsiaTheme="minorEastAsia" w:hAnsiTheme="minorHAnsi"/>
-          <w:noProof/>
-          <w:szCs w:val="24"/>
-          <w:lang w:eastAsia="it-IT"/>
-        </w:rPr>
-      </w:pPr>
-      <w:hyperlink w:anchor="_Toc214993112" w:history="1">
-        <w:r>
-          <w:rPr>
-            <w:rStyle w:val="Collegamentoipertestuale"/>
-            <w:noProof/>
-          </w:rPr>
-          <w:t>DG_1 – UI Web basata su browser moderni</w:t>
-        </w:r>
-        <w:r>
-          <w:rPr>
-            <w:noProof/>
-            <w:webHidden/>
-          </w:rPr>
-          <w:tab/>
-        </w:r>
-        <w:r>
-          <w:rPr>
-            <w:noProof/>
-            <w:webHidden/>
-          </w:rPr>
-          <w:fldChar w:fldCharType="begin"/>
-        </w:r>
-        <w:r>
-          <w:rPr>
-            <w:noProof/>
-            <w:webHidden/>
-          </w:rPr>
-          <w:instrText xml:space="preserve"> PAGEREF _Toc214993112 \h </w:instrText>
-        </w:r>
-        <w:r>
-          <w:rPr>
-            <w:noProof/>
-            <w:webHidden/>
-          </w:rPr>
-        </w:r>
-        <w:r>
-          <w:rPr>
-            <w:noProof/>
-            <w:webHidden/>
-          </w:rPr>
-          <w:fldChar w:fldCharType="separate"/>
-        </w:r>
-        <w:r>
-          <w:rPr>
-            <w:noProof/>
-            <w:webHidden/>
-          </w:rPr>
-          <w:t>5</w:t>
-        </w:r>
-        <w:r>
-          <w:rPr>
-            <w:noProof/>
-            <w:webHidden/>
-          </w:rPr>
-          <w:fldChar w:fldCharType="end"/>
-        </w:r>
-      </w:hyperlink>
-    </w:p>
-    <w:p>
-      <w:pPr>
-        <w:pStyle w:val="Sommario3"/>
-        <w:tabs>
-          <w:tab w:val="right" w:leader="dot" w:pos="9627"/>
-        </w:tabs>
-        <w:rPr>
-          <w:rFonts w:asciiTheme="minorHAnsi" w:eastAsiaTheme="minorEastAsia" w:hAnsiTheme="minorHAnsi"/>
-          <w:noProof/>
-          <w:szCs w:val="24"/>
-          <w:lang w:eastAsia="it-IT"/>
-        </w:rPr>
-      </w:pPr>
-      <w:hyperlink w:anchor="_Toc214993113" w:history="1">
-        <w:r>
-          <w:rPr>
-            <w:rStyle w:val="Collegamentoipertestuale"/>
-            <w:noProof/>
-          </w:rPr>
-          <w:t>DG_2 – Interfaccia Software Database via JDBC</w:t>
-        </w:r>
-        <w:r>
-          <w:rPr>
-            <w:noProof/>
-            <w:webHidden/>
-          </w:rPr>
-          <w:tab/>
-        </w:r>
-        <w:r>
-          <w:rPr>
-            <w:noProof/>
-            <w:webHidden/>
-          </w:rPr>
-          <w:fldChar w:fldCharType="begin"/>
-        </w:r>
-        <w:r>
-          <w:rPr>
-            <w:noProof/>
-            <w:webHidden/>
-          </w:rPr>
-          <w:instrText xml:space="preserve"> PAGEREF _Toc214993113 \h </w:instrText>
-        </w:r>
-        <w:r>
-          <w:rPr>
-            <w:noProof/>
-            <w:webHidden/>
-          </w:rPr>
-        </w:r>
-        <w:r>
-          <w:rPr>
-            <w:noProof/>
-            <w:webHidden/>
-          </w:rPr>
-          <w:fldChar w:fldCharType="separate"/>
-        </w:r>
-        <w:r>
-          <w:rPr>
-            <w:noProof/>
-            <w:webHidden/>
-          </w:rPr>
-          <w:t>6</w:t>
-        </w:r>
-        <w:r>
-          <w:rPr>
-            <w:noProof/>
-            <w:webHidden/>
-          </w:rPr>
-          <w:fldChar w:fldCharType="end"/>
-        </w:r>
-      </w:hyperlink>
-    </w:p>
-    <w:p>
-      <w:pPr>
-        <w:pStyle w:val="Sommario3"/>
-        <w:tabs>
-          <w:tab w:val="right" w:leader="dot" w:pos="9627"/>
-        </w:tabs>
-        <w:rPr>
-          <w:rFonts w:asciiTheme="minorHAnsi" w:eastAsiaTheme="minorEastAsia" w:hAnsiTheme="minorHAnsi"/>
-          <w:noProof/>
-          <w:szCs w:val="24"/>
-          <w:lang w:eastAsia="it-IT"/>
-        </w:rPr>
-      </w:pPr>
-      <w:hyperlink w:anchor="_Toc214993114" w:history="1">
-        <w:r>
-          <w:rPr>
-            <w:rStyle w:val="Collegamentoipertestuale"/>
-            <w:noProof/>
-          </w:rPr>
-          <w:t>DG_3 – Interfaccia WebSocket per notifiche in tempo reale</w:t>
-        </w:r>
-        <w:r>
-          <w:rPr>
-            <w:noProof/>
-            <w:webHidden/>
-          </w:rPr>
-          <w:tab/>
-        </w:r>
-        <w:r>
-          <w:rPr>
-            <w:noProof/>
-            <w:webHidden/>
-          </w:rPr>
-          <w:fldChar w:fldCharType="begin"/>
-        </w:r>
-        <w:r>
-          <w:rPr>
-            <w:noProof/>
-            <w:webHidden/>
-          </w:rPr>
-          <w:instrText xml:space="preserve"> PAGEREF _Toc214993114 \h </w:instrText>
-        </w:r>
-        <w:r>
-          <w:rPr>
-            <w:noProof/>
-            <w:webHidden/>
-          </w:rPr>
-        </w:r>
-        <w:r>
-          <w:rPr>
-            <w:noProof/>
-            <w:webHidden/>
-          </w:rPr>
-          <w:fldChar w:fldCharType="separate"/>
-        </w:r>
-        <w:r>
-          <w:rPr>
-            <w:noProof/>
-            <w:webHidden/>
-          </w:rPr>
-          <w:t>6</w:t>
-        </w:r>
-        <w:r>
-          <w:rPr>
-            <w:noProof/>
-            <w:webHidden/>
-          </w:rPr>
-          <w:fldChar w:fldCharType="end"/>
-        </w:r>
-      </w:hyperlink>
-    </w:p>
-    <w:p>
-      <w:pPr>
-        <w:pStyle w:val="Sommario3"/>
-        <w:tabs>
-          <w:tab w:val="right" w:leader="dot" w:pos="9627"/>
-        </w:tabs>
-        <w:rPr>
-          <w:rFonts w:asciiTheme="minorHAnsi" w:eastAsiaTheme="minorEastAsia" w:hAnsiTheme="minorHAnsi"/>
-          <w:noProof/>
-          <w:szCs w:val="24"/>
-          <w:lang w:eastAsia="it-IT"/>
-        </w:rPr>
-      </w:pPr>
-      <w:hyperlink w:anchor="_Toc214993115" w:history="1">
-        <w:r>
-          <w:rPr>
-            <w:rStyle w:val="Collegamentoipertestuale"/>
-            <w:noProof/>
-          </w:rPr>
-          <w:t>DG_4 – Accesso limitato alla rete intranet</w:t>
-        </w:r>
-        <w:r>
-          <w:rPr>
-            <w:noProof/>
-            <w:webHidden/>
-          </w:rPr>
-          <w:tab/>
-        </w:r>
-        <w:r>
-          <w:rPr>
-            <w:noProof/>
-            <w:webHidden/>
-          </w:rPr>
-          <w:fldChar w:fldCharType="begin"/>
-        </w:r>
-        <w:r>
-          <w:rPr>
-            <w:noProof/>
-            <w:webHidden/>
-          </w:rPr>
-          <w:instrText xml:space="preserve"> PAGEREF _Toc214993115 \h </w:instrText>
-        </w:r>
-        <w:r>
-          <w:rPr>
-            <w:noProof/>
-            <w:webHidden/>
-          </w:rPr>
-        </w:r>
-        <w:r>
-          <w:rPr>
-            <w:noProof/>
-            <w:webHidden/>
-          </w:rPr>
-          <w:fldChar w:fldCharType="separate"/>
-        </w:r>
-        <w:r>
-          <w:rPr>
-            <w:noProof/>
-            <w:webHidden/>
-          </w:rPr>
-          <w:t>6</w:t>
-        </w:r>
-        <w:r>
-          <w:rPr>
-            <w:noProof/>
-            <w:webHidden/>
-          </w:rPr>
-          <w:fldChar w:fldCharType="end"/>
-        </w:r>
-      </w:hyperlink>
-    </w:p>
-    <w:p>
-      <w:pPr>
-        <w:pStyle w:val="Sommario3"/>
-        <w:tabs>
-          <w:tab w:val="right" w:leader="dot" w:pos="9627"/>
-        </w:tabs>
-        <w:rPr>
-          <w:rFonts w:asciiTheme="minorHAnsi" w:eastAsiaTheme="minorEastAsia" w:hAnsiTheme="minorHAnsi"/>
-          <w:noProof/>
-          <w:szCs w:val="24"/>
-          <w:lang w:eastAsia="it-IT"/>
-        </w:rPr>
-      </w:pPr>
-      <w:hyperlink w:anchor="_Toc214993116" w:history="1">
-        <w:r>
-          <w:rPr>
-            <w:rStyle w:val="Collegamentoipertestuale"/>
-            <w:noProof/>
-          </w:rPr>
-          <w:t>DG_5 –  Distribuzione e portabilità del pacchetto</w:t>
-        </w:r>
-        <w:r>
-          <w:rPr>
-            <w:noProof/>
-            <w:webHidden/>
-          </w:rPr>
-          <w:tab/>
-        </w:r>
-        <w:r>
-          <w:rPr>
-            <w:noProof/>
-            <w:webHidden/>
-          </w:rPr>
-          <w:fldChar w:fldCharType="begin"/>
-        </w:r>
-        <w:r>
-          <w:rPr>
-            <w:noProof/>
-            <w:webHidden/>
-          </w:rPr>
-          <w:instrText xml:space="preserve"> PAGEREF _Toc214993116 \h </w:instrText>
-        </w:r>
-        <w:r>
-          <w:rPr>
-            <w:noProof/>
-            <w:webHidden/>
-          </w:rPr>
-        </w:r>
-        <w:r>
-          <w:rPr>
-            <w:noProof/>
-            <w:webHidden/>
-          </w:rPr>
-          <w:fldChar w:fldCharType="separate"/>
-        </w:r>
-        <w:r>
-          <w:rPr>
-            <w:noProof/>
-            <w:webHidden/>
-          </w:rPr>
-          <w:t>7</w:t>
-        </w:r>
-        <w:r>
-          <w:rPr>
-            <w:noProof/>
-            <w:webHidden/>
-          </w:rPr>
-          <w:fldChar w:fldCharType="end"/>
-        </w:r>
-      </w:hyperlink>
-    </w:p>
-    <w:p>
-      <w:pPr>
-        <w:pStyle w:val="Sommario3"/>
-        <w:tabs>
-          <w:tab w:val="right" w:leader="dot" w:pos="9627"/>
-        </w:tabs>
-        <w:rPr>
-          <w:rFonts w:asciiTheme="minorHAnsi" w:eastAsiaTheme="minorEastAsia" w:hAnsiTheme="minorHAnsi"/>
-          <w:noProof/>
-          <w:szCs w:val="24"/>
-          <w:lang w:eastAsia="it-IT"/>
-        </w:rPr>
-      </w:pPr>
-      <w:hyperlink w:anchor="_Toc214993117" w:history="1">
-        <w:r>
-          <w:rPr>
-            <w:rStyle w:val="Collegamentoipertestuale"/>
-            <w:noProof/>
-          </w:rPr>
-          <w:t>DG_6 –  Configurabilità del database</w:t>
-        </w:r>
-        <w:r>
-          <w:rPr>
-            <w:noProof/>
-            <w:webHidden/>
-          </w:rPr>
-          <w:tab/>
-        </w:r>
-        <w:r>
-          <w:rPr>
-            <w:noProof/>
-            <w:webHidden/>
-          </w:rPr>
-          <w:fldChar w:fldCharType="begin"/>
-        </w:r>
-        <w:r>
-          <w:rPr>
-            <w:noProof/>
-            <w:webHidden/>
-          </w:rPr>
-          <w:instrText xml:space="preserve"> PAGEREF _Toc214993117 \h </w:instrText>
-        </w:r>
-        <w:r>
-          <w:rPr>
-            <w:noProof/>
-            <w:webHidden/>
-          </w:rPr>
-        </w:r>
-        <w:r>
-          <w:rPr>
-            <w:noProof/>
-            <w:webHidden/>
-          </w:rPr>
-          <w:fldChar w:fldCharType="separate"/>
-        </w:r>
-        <w:r>
-          <w:rPr>
-            <w:noProof/>
-            <w:webHidden/>
-          </w:rPr>
-          <w:t>7</w:t>
-        </w:r>
-        <w:r>
-          <w:rPr>
-            <w:noProof/>
-            <w:webHidden/>
-          </w:rPr>
-          <w:fldChar w:fldCharType="end"/>
-        </w:r>
-      </w:hyperlink>
-    </w:p>
-    <w:p>
-      <w:pPr>
-        <w:pStyle w:val="Sommario3"/>
-        <w:tabs>
-          <w:tab w:val="right" w:leader="dot" w:pos="9627"/>
-        </w:tabs>
-        <w:rPr>
-          <w:rFonts w:asciiTheme="minorHAnsi" w:eastAsiaTheme="minorEastAsia" w:hAnsiTheme="minorHAnsi"/>
-          <w:noProof/>
-          <w:szCs w:val="24"/>
-          <w:lang w:eastAsia="it-IT"/>
-        </w:rPr>
-      </w:pPr>
-      <w:hyperlink w:anchor="_Toc214993118" w:history="1">
-        <w:r>
-          <w:rPr>
-            <w:rStyle w:val="Collegamentoipertestuale"/>
-            <w:noProof/>
-          </w:rPr>
-          <w:t>DG_7 –  Sicurezza dei dati sensibili</w:t>
-        </w:r>
-        <w:r>
-          <w:rPr>
-            <w:noProof/>
-            <w:webHidden/>
-          </w:rPr>
-          <w:tab/>
-        </w:r>
-        <w:r>
-          <w:rPr>
-            <w:noProof/>
-            <w:webHidden/>
-          </w:rPr>
-          <w:fldChar w:fldCharType="begin"/>
-        </w:r>
-        <w:r>
-          <w:rPr>
-            <w:noProof/>
-            <w:webHidden/>
-          </w:rPr>
-          <w:instrText xml:space="preserve"> PAGEREF _Toc214993118 \h </w:instrText>
-        </w:r>
-        <w:r>
-          <w:rPr>
-            <w:noProof/>
-            <w:webHidden/>
-          </w:rPr>
-        </w:r>
-        <w:r>
-          <w:rPr>
-            <w:noProof/>
-            <w:webHidden/>
-          </w:rPr>
-          <w:fldChar w:fldCharType="separate"/>
-        </w:r>
-        <w:r>
-          <w:rPr>
-            <w:noProof/>
-            <w:webHidden/>
-          </w:rPr>
-          <w:t>8</w:t>
-        </w:r>
-        <w:r>
-          <w:rPr>
-            <w:noProof/>
-            <w:webHidden/>
-          </w:rPr>
-          <w:fldChar w:fldCharType="end"/>
-        </w:r>
-      </w:hyperlink>
-    </w:p>
-    <w:p>
-      <w:pPr>
-        <w:pStyle w:val="Sommario3"/>
-        <w:tabs>
-          <w:tab w:val="right" w:leader="dot" w:pos="9627"/>
-        </w:tabs>
-        <w:rPr>
-          <w:rFonts w:asciiTheme="minorHAnsi" w:eastAsiaTheme="minorEastAsia" w:hAnsiTheme="minorHAnsi"/>
-          <w:noProof/>
-          <w:szCs w:val="24"/>
-          <w:lang w:eastAsia="it-IT"/>
-        </w:rPr>
-      </w:pPr>
-      <w:hyperlink w:anchor="_Toc214993119" w:history="1">
-        <w:r>
-          <w:rPr>
-            <w:rStyle w:val="Collegamentoipertestuale"/>
-            <w:noProof/>
-          </w:rPr>
-          <w:t>DG-8 –  Gestione sicura delle sessioni</w:t>
-        </w:r>
-        <w:r>
-          <w:rPr>
-            <w:noProof/>
-            <w:webHidden/>
-          </w:rPr>
-          <w:tab/>
-        </w:r>
-        <w:r>
-          <w:rPr>
-            <w:noProof/>
-            <w:webHidden/>
-          </w:rPr>
-          <w:fldChar w:fldCharType="begin"/>
-        </w:r>
-        <w:r>
-          <w:rPr>
-            <w:noProof/>
-            <w:webHidden/>
-          </w:rPr>
-          <w:instrText xml:space="preserve"> PAGEREF _Toc214993119 \h </w:instrText>
-        </w:r>
-        <w:r>
-          <w:rPr>
-            <w:noProof/>
-            <w:webHidden/>
-          </w:rPr>
-        </w:r>
-        <w:r>
-          <w:rPr>
-            <w:noProof/>
-            <w:webHidden/>
-          </w:rPr>
-          <w:fldChar w:fldCharType="separate"/>
-        </w:r>
-        <w:r>
-          <w:rPr>
-            <w:noProof/>
-            <w:webHidden/>
-          </w:rPr>
-          <w:t>8</w:t>
-        </w:r>
-        <w:r>
-          <w:rPr>
-            <w:noProof/>
-            <w:webHidden/>
-          </w:rPr>
-          <w:fldChar w:fldCharType="end"/>
-        </w:r>
-      </w:hyperlink>
-    </w:p>
-    <w:p>
-      <w:pPr>
-        <w:pStyle w:val="Sommario3"/>
-        <w:tabs>
-          <w:tab w:val="right" w:leader="dot" w:pos="9627"/>
-        </w:tabs>
-        <w:rPr>
-          <w:rFonts w:asciiTheme="minorHAnsi" w:eastAsiaTheme="minorEastAsia" w:hAnsiTheme="minorHAnsi"/>
-          <w:noProof/>
-          <w:szCs w:val="24"/>
-          <w:lang w:eastAsia="it-IT"/>
-        </w:rPr>
-      </w:pPr>
-      <w:hyperlink w:anchor="_Toc214993120" w:history="1">
-        <w:r>
-          <w:rPr>
-            <w:rStyle w:val="Collegamentoipertestuale"/>
-            <w:noProof/>
-          </w:rPr>
-          <w:t>DG_9 –  Prevenzione di attacchi</w:t>
-        </w:r>
-        <w:r>
-          <w:rPr>
-            <w:noProof/>
-            <w:webHidden/>
-          </w:rPr>
-          <w:tab/>
-        </w:r>
-        <w:r>
-          <w:rPr>
-            <w:noProof/>
-            <w:webHidden/>
-          </w:rPr>
-          <w:fldChar w:fldCharType="begin"/>
-        </w:r>
-        <w:r>
-          <w:rPr>
-            <w:noProof/>
-            <w:webHidden/>
-          </w:rPr>
-          <w:instrText xml:space="preserve"> PAGEREF _Toc214993120 \h </w:instrText>
-        </w:r>
-        <w:r>
-          <w:rPr>
-            <w:noProof/>
-            <w:webHidden/>
-          </w:rPr>
-        </w:r>
-        <w:r>
-          <w:rPr>
-            <w:noProof/>
-            <w:webHidden/>
-          </w:rPr>
-          <w:fldChar w:fldCharType="separate"/>
-        </w:r>
-        <w:r>
-          <w:rPr>
-            <w:noProof/>
-            <w:webHidden/>
-          </w:rPr>
-          <w:t>8</w:t>
+          <w:t>4</w:t>
         </w:r>
         <w:r>
           <w:rPr>
@@ -2776,7 +2212,7 @@
           <w14:ligatures w14:val="standardContextual"/>
         </w:rPr>
       </w:pPr>
-      <w:hyperlink w:anchor="_Toc214993121" w:history="1">
+      <w:hyperlink w:anchor="_Toc218505598" w:history="1">
         <w:r>
           <w:rPr>
             <w:rStyle w:val="Collegamentoipertestuale"/>
@@ -2820,7 +2256,7 @@
             <w:noProof/>
             <w:webHidden/>
           </w:rPr>
-          <w:instrText xml:space="preserve"> PAGEREF _Toc214993121 \h </w:instrText>
+          <w:instrText xml:space="preserve"> PAGEREF _Toc218505598 \h </w:instrText>
         </w:r>
         <w:r>
           <w:rPr>
@@ -2840,7 +2276,7 @@
             <w:noProof/>
             <w:webHidden/>
           </w:rPr>
-          <w:t>9</w:t>
+          <w:t>8</w:t>
         </w:r>
         <w:r>
           <w:rPr>
@@ -2865,7 +2301,7 @@
           <w14:ligatures w14:val="standardContextual"/>
         </w:rPr>
       </w:pPr>
-      <w:hyperlink w:anchor="_Toc214993122" w:history="1">
+      <w:hyperlink w:anchor="_Toc218505599" w:history="1">
         <w:r>
           <w:rPr>
             <w:rStyle w:val="Collegamentoipertestuale"/>
@@ -2909,7 +2345,7 @@
             <w:noProof/>
             <w:webHidden/>
           </w:rPr>
-          <w:instrText xml:space="preserve"> PAGEREF _Toc214993122 \h </w:instrText>
+          <w:instrText xml:space="preserve"> PAGEREF _Toc218505599 \h </w:instrText>
         </w:r>
         <w:r>
           <w:rPr>
@@ -2929,7 +2365,7 @@
             <w:noProof/>
             <w:webHidden/>
           </w:rPr>
-          <w:t>10</w:t>
+          <w:t>9</w:t>
         </w:r>
         <w:r>
           <w:rPr>
@@ -2954,7 +2390,7 @@
           <w14:ligatures w14:val="standardContextual"/>
         </w:rPr>
       </w:pPr>
-      <w:hyperlink w:anchor="_Toc214993123" w:history="1">
+      <w:hyperlink w:anchor="_Toc218505600" w:history="1">
         <w:r>
           <w:rPr>
             <w:rStyle w:val="Collegamentoipertestuale"/>
@@ -3000,7 +2436,7 @@
             <w:noProof/>
             <w:webHidden/>
           </w:rPr>
-          <w:instrText xml:space="preserve"> PAGEREF _Toc214993123 \h </w:instrText>
+          <w:instrText xml:space="preserve"> PAGEREF _Toc218505600 \h </w:instrText>
         </w:r>
         <w:r>
           <w:rPr>
@@ -3020,7 +2456,7 @@
             <w:noProof/>
             <w:webHidden/>
           </w:rPr>
-          <w:t>10</w:t>
+          <w:t>9</w:t>
         </w:r>
         <w:r>
           <w:rPr>
@@ -3045,7 +2481,7 @@
           <w14:ligatures w14:val="standardContextual"/>
         </w:rPr>
       </w:pPr>
-      <w:hyperlink w:anchor="_Toc214993124" w:history="1">
+      <w:hyperlink w:anchor="_Toc218505601" w:history="1">
         <w:r>
           <w:rPr>
             <w:rStyle w:val="Collegamentoipertestuale"/>
@@ -3091,7 +2527,7 @@
             <w:noProof/>
             <w:webHidden/>
           </w:rPr>
-          <w:instrText xml:space="preserve"> PAGEREF _Toc214993124 \h </w:instrText>
+          <w:instrText xml:space="preserve"> PAGEREF _Toc218505601 \h </w:instrText>
         </w:r>
         <w:r>
           <w:rPr>
@@ -3111,7 +2547,7 @@
             <w:noProof/>
             <w:webHidden/>
           </w:rPr>
-          <w:t>11</w:t>
+          <w:t>10</w:t>
         </w:r>
         <w:r>
           <w:rPr>
@@ -3136,7 +2572,7 @@
           <w14:ligatures w14:val="standardContextual"/>
         </w:rPr>
       </w:pPr>
-      <w:hyperlink w:anchor="_Toc214993125" w:history="1">
+      <w:hyperlink w:anchor="_Toc218505602" w:history="1">
         <w:r>
           <w:rPr>
             <w:rStyle w:val="Collegamentoipertestuale"/>
@@ -3180,7 +2616,7 @@
             <w:noProof/>
             <w:webHidden/>
           </w:rPr>
-          <w:instrText xml:space="preserve"> PAGEREF _Toc214993125 \h </w:instrText>
+          <w:instrText xml:space="preserve"> PAGEREF _Toc218505602 \h </w:instrText>
         </w:r>
         <w:r>
           <w:rPr>
@@ -3200,7 +2636,7 @@
             <w:noProof/>
             <w:webHidden/>
           </w:rPr>
-          <w:t>12</w:t>
+          <w:t>11</w:t>
         </w:r>
         <w:r>
           <w:rPr>
@@ -3222,7 +2658,7 @@
           <w14:ligatures w14:val="standardContextual"/>
         </w:rPr>
       </w:pPr>
-      <w:hyperlink w:anchor="_Toc214993126" w:history="1">
+      <w:hyperlink w:anchor="_Toc218505603" w:history="1">
         <w:r>
           <w:rPr>
             <w:rStyle w:val="Collegamentoipertestuale"/>
@@ -3249,7 +2685,7 @@
             <w:noProof/>
             <w:webHidden/>
           </w:rPr>
-          <w:instrText xml:space="preserve"> PAGEREF _Toc214993126 \h </w:instrText>
+          <w:instrText xml:space="preserve"> PAGEREF _Toc218505603 \h </w:instrText>
         </w:r>
         <w:r>
           <w:rPr>
@@ -3269,7 +2705,7 @@
             <w:noProof/>
             <w:webHidden/>
           </w:rPr>
-          <w:t>12</w:t>
+          <w:t>11</w:t>
         </w:r>
         <w:r>
           <w:rPr>
@@ -3291,7 +2727,7 @@
           <w14:ligatures w14:val="standardContextual"/>
         </w:rPr>
       </w:pPr>
-      <w:hyperlink w:anchor="_Toc214993127" w:history="1">
+      <w:hyperlink w:anchor="_Toc218505604" w:history="1">
         <w:r>
           <w:rPr>
             <w:rStyle w:val="Collegamentoipertestuale"/>
@@ -3318,7 +2754,7 @@
             <w:noProof/>
             <w:webHidden/>
           </w:rPr>
-          <w:instrText xml:space="preserve"> PAGEREF _Toc214993127 \h </w:instrText>
+          <w:instrText xml:space="preserve"> PAGEREF _Toc218505604 \h </w:instrText>
         </w:r>
         <w:r>
           <w:rPr>
@@ -3338,7 +2774,7 @@
             <w:noProof/>
             <w:webHidden/>
           </w:rPr>
-          <w:t>13</w:t>
+          <w:t>12</w:t>
         </w:r>
         <w:r>
           <w:rPr>
@@ -3360,7 +2796,7 @@
           <w14:ligatures w14:val="standardContextual"/>
         </w:rPr>
       </w:pPr>
-      <w:hyperlink w:anchor="_Toc214993128" w:history="1">
+      <w:hyperlink w:anchor="_Toc218505605" w:history="1">
         <w:r>
           <w:rPr>
             <w:rStyle w:val="Collegamentoipertestuale"/>
@@ -3387,7 +2823,7 @@
             <w:noProof/>
             <w:webHidden/>
           </w:rPr>
-          <w:instrText xml:space="preserve"> PAGEREF _Toc214993128 \h </w:instrText>
+          <w:instrText xml:space="preserve"> PAGEREF _Toc218505605 \h </w:instrText>
         </w:r>
         <w:r>
           <w:rPr>
@@ -3407,7 +2843,7 @@
             <w:noProof/>
             <w:webHidden/>
           </w:rPr>
-          <w:t>14</w:t>
+          <w:t>13</w:t>
         </w:r>
         <w:r>
           <w:rPr>
@@ -3429,7 +2865,7 @@
           <w14:ligatures w14:val="standardContextual"/>
         </w:rPr>
       </w:pPr>
-      <w:hyperlink w:anchor="_Toc214993129" w:history="1">
+      <w:hyperlink w:anchor="_Toc218505606" w:history="1">
         <w:r>
           <w:rPr>
             <w:rStyle w:val="Collegamentoipertestuale"/>
@@ -3456,7 +2892,7 @@
             <w:noProof/>
             <w:webHidden/>
           </w:rPr>
-          <w:instrText xml:space="preserve"> PAGEREF _Toc214993129 \h </w:instrText>
+          <w:instrText xml:space="preserve"> PAGEREF _Toc218505606 \h </w:instrText>
         </w:r>
         <w:r>
           <w:rPr>
@@ -3476,7 +2912,7 @@
             <w:noProof/>
             <w:webHidden/>
           </w:rPr>
-          <w:t>15</w:t>
+          <w:t>14</w:t>
         </w:r>
         <w:r>
           <w:rPr>
@@ -3498,7 +2934,7 @@
           <w14:ligatures w14:val="standardContextual"/>
         </w:rPr>
       </w:pPr>
-      <w:hyperlink w:anchor="_Toc214993130" w:history="1">
+      <w:hyperlink w:anchor="_Toc218505607" w:history="1">
         <w:r>
           <w:rPr>
             <w:rStyle w:val="Collegamentoipertestuale"/>
@@ -3525,7 +2961,7 @@
             <w:noProof/>
             <w:webHidden/>
           </w:rPr>
-          <w:instrText xml:space="preserve"> PAGEREF _Toc214993130 \h </w:instrText>
+          <w:instrText xml:space="preserve"> PAGEREF _Toc218505607 \h </w:instrText>
         </w:r>
         <w:r>
           <w:rPr>
@@ -3545,7 +2981,7 @@
             <w:noProof/>
             <w:webHidden/>
           </w:rPr>
-          <w:t>16</w:t>
+          <w:t>15</w:t>
         </w:r>
         <w:r>
           <w:rPr>
@@ -3567,7 +3003,7 @@
           <w14:ligatures w14:val="standardContextual"/>
         </w:rPr>
       </w:pPr>
-      <w:hyperlink w:anchor="_Toc214993131" w:history="1">
+      <w:hyperlink w:anchor="_Toc218505608" w:history="1">
         <w:r>
           <w:rPr>
             <w:rStyle w:val="Collegamentoipertestuale"/>
@@ -3594,7 +3030,7 @@
             <w:noProof/>
             <w:webHidden/>
           </w:rPr>
-          <w:instrText xml:space="preserve"> PAGEREF _Toc214993131 \h </w:instrText>
+          <w:instrText xml:space="preserve"> PAGEREF _Toc218505608 \h </w:instrText>
         </w:r>
         <w:r>
           <w:rPr>
@@ -3614,7 +3050,7 @@
             <w:noProof/>
             <w:webHidden/>
           </w:rPr>
-          <w:t>17</w:t>
+          <w:t>16</w:t>
         </w:r>
         <w:r>
           <w:rPr>
@@ -3638,7 +3074,7 @@
           <w:lang w:eastAsia="it-IT"/>
         </w:rPr>
       </w:pPr>
-      <w:hyperlink w:anchor="_Toc214993132" w:history="1">
+      <w:hyperlink w:anchor="_Toc218505609" w:history="1">
         <w:r>
           <w:rPr>
             <w:rStyle w:val="Collegamentoipertestuale"/>
@@ -3665,7 +3101,7 @@
             <w:noProof/>
             <w:webHidden/>
           </w:rPr>
-          <w:instrText xml:space="preserve"> PAGEREF _Toc214993132 \h </w:instrText>
+          <w:instrText xml:space="preserve"> PAGEREF _Toc218505609 \h </w:instrText>
         </w:r>
         <w:r>
           <w:rPr>
@@ -3685,7 +3121,7 @@
             <w:noProof/>
             <w:webHidden/>
           </w:rPr>
-          <w:t>17</w:t>
+          <w:t>16</w:t>
         </w:r>
         <w:r>
           <w:rPr>
@@ -3709,7 +3145,7 @@
           <w:lang w:eastAsia="it-IT"/>
         </w:rPr>
       </w:pPr>
-      <w:hyperlink w:anchor="_Toc214993133" w:history="1">
+      <w:hyperlink w:anchor="_Toc218505610" w:history="1">
         <w:r>
           <w:rPr>
             <w:rStyle w:val="Collegamentoipertestuale"/>
@@ -3736,7 +3172,7 @@
             <w:noProof/>
             <w:webHidden/>
           </w:rPr>
-          <w:instrText xml:space="preserve"> PAGEREF _Toc214993133 \h </w:instrText>
+          <w:instrText xml:space="preserve"> PAGEREF _Toc218505610 \h </w:instrText>
         </w:r>
         <w:r>
           <w:rPr>
@@ -3756,7 +3192,7 @@
             <w:noProof/>
             <w:webHidden/>
           </w:rPr>
-          <w:t>17</w:t>
+          <w:t>16</w:t>
         </w:r>
         <w:r>
           <w:rPr>
@@ -3780,7 +3216,7 @@
           <w:lang w:eastAsia="it-IT"/>
         </w:rPr>
       </w:pPr>
-      <w:hyperlink w:anchor="_Toc214993134" w:history="1">
+      <w:hyperlink w:anchor="_Toc218505611" w:history="1">
         <w:r>
           <w:rPr>
             <w:rStyle w:val="Collegamentoipertestuale"/>
@@ -3807,7 +3243,7 @@
             <w:noProof/>
             <w:webHidden/>
           </w:rPr>
-          <w:instrText xml:space="preserve"> PAGEREF _Toc214993134 \h </w:instrText>
+          <w:instrText xml:space="preserve"> PAGEREF _Toc218505611 \h </w:instrText>
         </w:r>
         <w:r>
           <w:rPr>
@@ -3827,7 +3263,7 @@
             <w:noProof/>
             <w:webHidden/>
           </w:rPr>
-          <w:t>17</w:t>
+          <w:t>16</w:t>
         </w:r>
         <w:r>
           <w:rPr>
@@ -3849,7 +3285,7 @@
           <w14:ligatures w14:val="standardContextual"/>
         </w:rPr>
       </w:pPr>
-      <w:hyperlink w:anchor="_Toc214993135" w:history="1">
+      <w:hyperlink w:anchor="_Toc218505612" w:history="1">
         <w:r>
           <w:rPr>
             <w:rStyle w:val="Collegamentoipertestuale"/>
@@ -3876,7 +3312,7 @@
             <w:noProof/>
             <w:webHidden/>
           </w:rPr>
-          <w:instrText xml:space="preserve"> PAGEREF _Toc214993135 \h </w:instrText>
+          <w:instrText xml:space="preserve"> PAGEREF _Toc218505612 \h </w:instrText>
         </w:r>
         <w:r>
           <w:rPr>
@@ -3896,7 +3332,7 @@
             <w:noProof/>
             <w:webHidden/>
           </w:rPr>
-          <w:t>18</w:t>
+          <w:t>17</w:t>
         </w:r>
         <w:r>
           <w:rPr>
@@ -3920,7 +3356,7 @@
           <w:lang w:eastAsia="it-IT"/>
         </w:rPr>
       </w:pPr>
-      <w:hyperlink w:anchor="_Toc214993136" w:history="1">
+      <w:hyperlink w:anchor="_Toc218505613" w:history="1">
         <w:r>
           <w:rPr>
             <w:rStyle w:val="Collegamentoipertestuale"/>
@@ -3947,7 +3383,7 @@
             <w:noProof/>
             <w:webHidden/>
           </w:rPr>
-          <w:instrText xml:space="preserve"> PAGEREF _Toc214993136 \h </w:instrText>
+          <w:instrText xml:space="preserve"> PAGEREF _Toc218505613 \h </w:instrText>
         </w:r>
         <w:r>
           <w:rPr>
@@ -3967,7 +3403,7 @@
             <w:noProof/>
             <w:webHidden/>
           </w:rPr>
-          <w:t>18</w:t>
+          <w:t>17</w:t>
         </w:r>
         <w:r>
           <w:rPr>
@@ -3991,7 +3427,7 @@
           <w:lang w:eastAsia="it-IT"/>
         </w:rPr>
       </w:pPr>
-      <w:hyperlink w:anchor="_Toc214993137" w:history="1">
+      <w:hyperlink w:anchor="_Toc218505614" w:history="1">
         <w:r>
           <w:rPr>
             <w:rStyle w:val="Collegamentoipertestuale"/>
@@ -4018,7 +3454,7 @@
             <w:noProof/>
             <w:webHidden/>
           </w:rPr>
-          <w:instrText xml:space="preserve"> PAGEREF _Toc214993137 \h </w:instrText>
+          <w:instrText xml:space="preserve"> PAGEREF _Toc218505614 \h </w:instrText>
         </w:r>
         <w:r>
           <w:rPr>
@@ -4038,7 +3474,7 @@
             <w:noProof/>
             <w:webHidden/>
           </w:rPr>
-          <w:t>18</w:t>
+          <w:t>17</w:t>
         </w:r>
         <w:r>
           <w:rPr>
@@ -4062,7 +3498,7 @@
           <w:lang w:eastAsia="it-IT"/>
         </w:rPr>
       </w:pPr>
-      <w:hyperlink w:anchor="_Toc214993138" w:history="1">
+      <w:hyperlink w:anchor="_Toc218505615" w:history="1">
         <w:r>
           <w:rPr>
             <w:rStyle w:val="Collegamentoipertestuale"/>
@@ -4089,7 +3525,7 @@
             <w:noProof/>
             <w:webHidden/>
           </w:rPr>
-          <w:instrText xml:space="preserve"> PAGEREF _Toc214993138 \h </w:instrText>
+          <w:instrText xml:space="preserve"> PAGEREF _Toc218505615 \h </w:instrText>
         </w:r>
         <w:r>
           <w:rPr>
@@ -4109,7 +3545,7 @@
             <w:noProof/>
             <w:webHidden/>
           </w:rPr>
-          <w:t>19</w:t>
+          <w:t>18</w:t>
         </w:r>
         <w:r>
           <w:rPr>
@@ -4134,7 +3570,7 @@
           <w14:ligatures w14:val="standardContextual"/>
         </w:rPr>
       </w:pPr>
-      <w:hyperlink w:anchor="_Toc214993139" w:history="1">
+      <w:hyperlink w:anchor="_Toc218505616" w:history="1">
         <w:r>
           <w:rPr>
             <w:rStyle w:val="Collegamentoipertestuale"/>
@@ -4178,7 +3614,7 @@
             <w:noProof/>
             <w:webHidden/>
           </w:rPr>
-          <w:instrText xml:space="preserve"> PAGEREF _Toc214993139 \h </w:instrText>
+          <w:instrText xml:space="preserve"> PAGEREF _Toc218505616 \h </w:instrText>
         </w:r>
         <w:r>
           <w:rPr>
@@ -4198,7 +3634,7 @@
             <w:noProof/>
             <w:webHidden/>
           </w:rPr>
-          <w:t>20</w:t>
+          <w:t>19</w:t>
         </w:r>
         <w:r>
           <w:rPr>
@@ -4222,7 +3658,7 @@
           <w:lang w:eastAsia="it-IT"/>
         </w:rPr>
       </w:pPr>
-      <w:hyperlink w:anchor="_Toc214993140" w:history="1">
+      <w:hyperlink w:anchor="_Toc218505617" w:history="1">
         <w:r>
           <w:rPr>
             <w:rStyle w:val="Collegamentoipertestuale"/>
@@ -4249,7 +3685,7 @@
             <w:noProof/>
             <w:webHidden/>
           </w:rPr>
-          <w:instrText xml:space="preserve"> PAGEREF _Toc214993140 \h </w:instrText>
+          <w:instrText xml:space="preserve"> PAGEREF _Toc218505617 \h </w:instrText>
         </w:r>
         <w:r>
           <w:rPr>
@@ -4269,7 +3705,7 @@
             <w:noProof/>
             <w:webHidden/>
           </w:rPr>
-          <w:t>20</w:t>
+          <w:t>19</w:t>
         </w:r>
         <w:r>
           <w:rPr>
@@ -4293,7 +3729,7 @@
           <w:lang w:eastAsia="it-IT"/>
         </w:rPr>
       </w:pPr>
-      <w:hyperlink w:anchor="_Toc214993141" w:history="1">
+      <w:hyperlink w:anchor="_Toc218505618" w:history="1">
         <w:r>
           <w:rPr>
             <w:rStyle w:val="Collegamentoipertestuale"/>
@@ -4320,7 +3756,7 @@
             <w:noProof/>
             <w:webHidden/>
           </w:rPr>
-          <w:instrText xml:space="preserve"> PAGEREF _Toc214993141 \h </w:instrText>
+          <w:instrText xml:space="preserve"> PAGEREF _Toc218505618 \h </w:instrText>
         </w:r>
         <w:r>
           <w:rPr>
@@ -4340,7 +3776,7 @@
             <w:noProof/>
             <w:webHidden/>
           </w:rPr>
-          <w:t>20</w:t>
+          <w:t>19</w:t>
         </w:r>
         <w:r>
           <w:rPr>
@@ -4364,7 +3800,7 @@
           <w:lang w:eastAsia="it-IT"/>
         </w:rPr>
       </w:pPr>
-      <w:hyperlink w:anchor="_Toc214993142" w:history="1">
+      <w:hyperlink w:anchor="_Toc218505619" w:history="1">
         <w:r>
           <w:rPr>
             <w:rStyle w:val="Collegamentoipertestuale"/>
@@ -4391,7 +3827,7 @@
             <w:noProof/>
             <w:webHidden/>
           </w:rPr>
-          <w:instrText xml:space="preserve"> PAGEREF _Toc214993142 \h </w:instrText>
+          <w:instrText xml:space="preserve"> PAGEREF _Toc218505619 \h </w:instrText>
         </w:r>
         <w:r>
           <w:rPr>
@@ -4411,7 +3847,7 @@
             <w:noProof/>
             <w:webHidden/>
           </w:rPr>
-          <w:t>21</w:t>
+          <w:t>20</w:t>
         </w:r>
         <w:r>
           <w:rPr>
@@ -4435,7 +3871,7 @@
           <w:lang w:eastAsia="it-IT"/>
         </w:rPr>
       </w:pPr>
-      <w:hyperlink w:anchor="_Toc214993143" w:history="1">
+      <w:hyperlink w:anchor="_Toc218505620" w:history="1">
         <w:r>
           <w:rPr>
             <w:rStyle w:val="Collegamentoipertestuale"/>
@@ -4462,7 +3898,7 @@
             <w:noProof/>
             <w:webHidden/>
           </w:rPr>
-          <w:instrText xml:space="preserve"> PAGEREF _Toc214993143 \h </w:instrText>
+          <w:instrText xml:space="preserve"> PAGEREF _Toc218505620 \h </w:instrText>
         </w:r>
         <w:r>
           <w:rPr>
@@ -4482,7 +3918,7 @@
             <w:noProof/>
             <w:webHidden/>
           </w:rPr>
-          <w:t>22</w:t>
+          <w:t>21</w:t>
         </w:r>
         <w:r>
           <w:rPr>
@@ -4506,7 +3942,7 @@
           <w:lang w:eastAsia="it-IT"/>
         </w:rPr>
       </w:pPr>
-      <w:hyperlink w:anchor="_Toc214993144" w:history="1">
+      <w:hyperlink w:anchor="_Toc218505621" w:history="1">
         <w:r>
           <w:rPr>
             <w:rStyle w:val="Collegamentoipertestuale"/>
@@ -4533,7 +3969,7 @@
             <w:noProof/>
             <w:webHidden/>
           </w:rPr>
-          <w:instrText xml:space="preserve"> PAGEREF _Toc214993144 \h </w:instrText>
+          <w:instrText xml:space="preserve"> PAGEREF _Toc218505621 \h </w:instrText>
         </w:r>
         <w:r>
           <w:rPr>
@@ -4553,7 +3989,7 @@
             <w:noProof/>
             <w:webHidden/>
           </w:rPr>
-          <w:t>23</w:t>
+          <w:t>22</w:t>
         </w:r>
         <w:r>
           <w:rPr>
@@ -4575,7 +4011,7 @@
           <w14:ligatures w14:val="standardContextual"/>
         </w:rPr>
       </w:pPr>
-      <w:hyperlink w:anchor="_Toc214993145" w:history="1">
+      <w:hyperlink w:anchor="_Toc218505622" w:history="1">
         <w:r>
           <w:rPr>
             <w:rStyle w:val="Collegamentoipertestuale"/>
@@ -4602,7 +4038,7 @@
             <w:noProof/>
             <w:webHidden/>
           </w:rPr>
-          <w:instrText xml:space="preserve"> PAGEREF _Toc214993145 \h </w:instrText>
+          <w:instrText xml:space="preserve"> PAGEREF _Toc218505622 \h </w:instrText>
         </w:r>
         <w:r>
           <w:rPr>
@@ -4622,7 +4058,7 @@
             <w:noProof/>
             <w:webHidden/>
           </w:rPr>
-          <w:t>24</w:t>
+          <w:t>23</w:t>
         </w:r>
         <w:r>
           <w:rPr>
@@ -4668,7 +4104,7 @@
         </w:numPr>
         <w:ind w:left="142"/>
       </w:pPr>
-      <w:bookmarkStart w:id="0" w:name="_Toc214993109"/>
+      <w:bookmarkStart w:id="0" w:name="_Toc218505595"/>
       <w:r>
         <w:lastRenderedPageBreak/>
         <w:t>Introduzione</w:t>
@@ -4685,7 +4121,7 @@
         </w:numPr>
         <w:ind w:left="567"/>
       </w:pPr>
-      <w:bookmarkStart w:id="1" w:name="_Toc214993110"/>
+      <w:bookmarkStart w:id="1" w:name="_Toc218505596"/>
       <w:r>
         <w:t>Scopo del Sistema</w:t>
       </w:r>
@@ -4717,7 +4153,7 @@
         </w:numPr>
         <w:ind w:left="567"/>
       </w:pPr>
-      <w:bookmarkStart w:id="2" w:name="_Toc214993111"/>
+      <w:bookmarkStart w:id="2" w:name="_Toc218505597"/>
       <w:r>
         <w:t>Design Goals</w:t>
       </w:r>
@@ -4728,15 +4164,10 @@
     </w:p>
     <w:p>
       <w:pPr>
-        <w:pStyle w:val="Titolo3"/>
-      </w:pPr>
-      <w:bookmarkStart w:id="3" w:name="_Toc214993112"/>
-      <w:r>
-        <w:t>DG_1 – UI Web basata su browser moderni</w:t>
-      </w:r>
-      <w:bookmarkEnd w:id="3"/>
-      <w:r>
-        <w:t xml:space="preserve"> </w:t>
+        <w:pStyle w:val="Titolo4"/>
+      </w:pPr>
+      <w:r>
+        <w:t xml:space="preserve">DG_1 – UI Web basata su browser moderni </w:t>
       </w:r>
       <w:r>
         <w:br/>
@@ -4906,9 +4337,8 @@
     <w:p/>
     <w:p>
       <w:pPr>
-        <w:pStyle w:val="Titolo3"/>
-      </w:pPr>
-      <w:bookmarkStart w:id="4" w:name="_Toc214993113"/>
+        <w:pStyle w:val="Titolo4"/>
+      </w:pPr>
       <w:r>
         <w:lastRenderedPageBreak/>
         <w:t>D</w:t>
@@ -4919,7 +4349,6 @@
       <w:r>
         <w:t>– Interfaccia Software Database via JDBC</w:t>
       </w:r>
-      <w:bookmarkEnd w:id="4"/>
       <w:r>
         <w:t xml:space="preserve"> </w:t>
       </w:r>
@@ -5062,9 +4491,8 @@
     <w:p/>
     <w:p>
       <w:pPr>
-        <w:pStyle w:val="Titolo3"/>
-      </w:pPr>
-      <w:bookmarkStart w:id="5" w:name="_Toc214993114"/>
+        <w:pStyle w:val="Titolo4"/>
+      </w:pPr>
       <w:r>
         <w:t>D</w:t>
       </w:r>
@@ -5100,7 +4528,6 @@
       <w:r>
         <w:t>eale</w:t>
       </w:r>
-      <w:bookmarkEnd w:id="5"/>
       <w:r>
         <w:t xml:space="preserve"> </w:t>
       </w:r>
@@ -5271,9 +4698,8 @@
     </w:p>
     <w:p>
       <w:pPr>
-        <w:pStyle w:val="Titolo3"/>
-      </w:pPr>
-      <w:bookmarkStart w:id="6" w:name="_Toc214993115"/>
+        <w:pStyle w:val="Titolo4"/>
+      </w:pPr>
       <w:r>
         <w:t>DG_</w:t>
       </w:r>
@@ -5298,7 +4724,6 @@
       <w:r>
         <w:t>ntranet</w:t>
       </w:r>
-      <w:bookmarkEnd w:id="6"/>
       <w:r>
         <w:br/>
       </w:r>
@@ -5378,14 +4803,13 @@
         <w:t>enormemente le possibilità</w:t>
       </w:r>
       <w:r>
-        <w:t xml:space="preserve"> di attacco, ma </w:t>
+        <w:t xml:space="preserve"> di attacco, ma impedisce l’uso esterno (es. supervisori in mobilità, smart working).</w:t>
+      </w:r>
+      <w:r>
+        <w:br/>
       </w:r>
       <w:r>
         <w:lastRenderedPageBreak/>
-        <w:t>impedisce l’uso esterno (es. supervisori in mobilità, smart working).</w:t>
-      </w:r>
-      <w:r>
-        <w:br/>
         <w:t>Richiede l’eventuale creazione futura di VPN o proxy sicuri se si volesse espandere l’accesso.</w:t>
       </w:r>
     </w:p>
@@ -5461,9 +4885,8 @@
     </w:p>
     <w:p>
       <w:pPr>
-        <w:pStyle w:val="Titolo3"/>
-      </w:pPr>
-      <w:bookmarkStart w:id="7" w:name="_Toc214993116"/>
+        <w:pStyle w:val="Titolo4"/>
+      </w:pPr>
       <w:r>
         <w:t xml:space="preserve">DG_5 </w:t>
       </w:r>
@@ -5474,11 +4897,7 @@
         <w:t xml:space="preserve"> </w:t>
       </w:r>
       <w:r>
-        <w:t>Distribuzione e portabilità del pacchetto</w:t>
-      </w:r>
-      <w:bookmarkEnd w:id="7"/>
-      <w:r>
-        <w:t xml:space="preserve"> </w:t>
+        <w:t xml:space="preserve">Distribuzione e portabilità del pacchetto </w:t>
       </w:r>
     </w:p>
     <w:p>
@@ -5594,9 +5013,8 @@
     <w:p/>
     <w:p>
       <w:pPr>
-        <w:pStyle w:val="Titolo3"/>
-      </w:pPr>
-      <w:bookmarkStart w:id="8" w:name="_Toc214993117"/>
+        <w:pStyle w:val="Titolo4"/>
+      </w:pPr>
       <w:r>
         <w:t xml:space="preserve">DG_6 </w:t>
       </w:r>
@@ -5609,7 +5027,9 @@
       <w:r>
         <w:t>onfigurabilità del database</w:t>
       </w:r>
-      <w:bookmarkEnd w:id="8"/>
+      <w:r>
+        <w:br/>
+      </w:r>
     </w:p>
     <w:p>
       <w:pPr>
@@ -5740,9 +5160,8 @@
     </w:p>
     <w:p>
       <w:pPr>
-        <w:pStyle w:val="Titolo3"/>
-      </w:pPr>
-      <w:bookmarkStart w:id="9" w:name="_Toc214993118"/>
+        <w:pStyle w:val="Titolo4"/>
+      </w:pPr>
       <w:r>
         <w:lastRenderedPageBreak/>
         <w:t xml:space="preserve">DG_7 </w:t>
@@ -5754,11 +5173,7 @@
         <w:t xml:space="preserve"> </w:t>
       </w:r>
       <w:r>
-        <w:t>Sicurezza dei dati sensibili</w:t>
-      </w:r>
-      <w:bookmarkEnd w:id="9"/>
-      <w:r>
-        <w:t xml:space="preserve"> </w:t>
+        <w:t xml:space="preserve">Sicurezza dei dati sensibili </w:t>
       </w:r>
       <w:r>
         <w:br/>
@@ -5885,9 +5300,8 @@
     <w:p/>
     <w:p>
       <w:pPr>
-        <w:pStyle w:val="Titolo3"/>
-      </w:pPr>
-      <w:bookmarkStart w:id="10" w:name="_Toc214993119"/>
+        <w:pStyle w:val="Titolo4"/>
+      </w:pPr>
       <w:r>
         <w:t xml:space="preserve">DG-8 </w:t>
       </w:r>
@@ -5895,11 +5309,10 @@
         <w:t xml:space="preserve">– </w:t>
       </w:r>
       <w:r>
-        <w:t xml:space="preserve"> Gestione sicura delle sessioni</w:t>
-      </w:r>
-      <w:bookmarkEnd w:id="10"/>
-      <w:r>
-        <w:t xml:space="preserve"> </w:t>
+        <w:t xml:space="preserve"> Gestione sicura delle sessioni </w:t>
+      </w:r>
+      <w:r>
+        <w:br/>
       </w:r>
     </w:p>
     <w:p>
@@ -5992,9 +5405,8 @@
     </w:p>
     <w:p>
       <w:pPr>
-        <w:pStyle w:val="Titolo3"/>
-      </w:pPr>
-      <w:bookmarkStart w:id="11" w:name="_Toc214993120"/>
+        <w:pStyle w:val="Titolo4"/>
+      </w:pPr>
       <w:r>
         <w:t xml:space="preserve">DG_9 </w:t>
       </w:r>
@@ -6005,11 +5417,7 @@
         <w:t xml:space="preserve"> </w:t>
       </w:r>
       <w:r>
-        <w:t>Prevenzione di attacchi</w:t>
-      </w:r>
-      <w:bookmarkEnd w:id="11"/>
-      <w:r>
-        <w:t xml:space="preserve"> </w:t>
+        <w:t xml:space="preserve">Prevenzione di attacchi </w:t>
       </w:r>
     </w:p>
     <w:p/>
@@ -6111,7 +5519,6 @@
       </w:r>
     </w:p>
     <w:p/>
-    <w:p/>
     <w:p>
       <w:pPr>
         <w:pStyle w:val="Titolo2"/>
@@ -6121,11 +5528,12 @@
         </w:numPr>
         <w:ind w:left="567"/>
       </w:pPr>
-      <w:bookmarkStart w:id="12" w:name="_Toc214993121"/>
-      <w:r>
+      <w:bookmarkStart w:id="3" w:name="_Toc218505598"/>
+      <w:r>
+        <w:lastRenderedPageBreak/>
         <w:t>Definizioni, Acronimi e Abbreviazioni</w:t>
       </w:r>
-      <w:bookmarkEnd w:id="12"/>
+      <w:bookmarkEnd w:id="3"/>
       <w:r>
         <w:br/>
       </w:r>
@@ -6924,7 +6332,6 @@
                 <w:b/>
                 <w:bCs/>
               </w:rPr>
-              <w:lastRenderedPageBreak/>
               <w:t>MIME</w:t>
             </w:r>
           </w:p>
@@ -6992,6 +6399,7 @@
                 <w:b/>
                 <w:bCs/>
               </w:rPr>
+              <w:lastRenderedPageBreak/>
               <w:t>SQL</w:t>
             </w:r>
           </w:p>
@@ -7255,11 +6663,11 @@
         </w:numPr>
         <w:ind w:left="567"/>
       </w:pPr>
-      <w:bookmarkStart w:id="13" w:name="_Toc214993122"/>
+      <w:bookmarkStart w:id="4" w:name="_Toc218505599"/>
       <w:r>
         <w:t>Riferimenti</w:t>
       </w:r>
-      <w:bookmarkEnd w:id="13"/>
+      <w:bookmarkEnd w:id="4"/>
     </w:p>
     <w:p>
       <w:r>
@@ -7400,7 +6808,7 @@
           <w:lang w:val="en-US"/>
         </w:rPr>
       </w:pPr>
-      <w:bookmarkStart w:id="14" w:name="_Toc214993123"/>
+      <w:bookmarkStart w:id="5" w:name="_Toc218505600"/>
       <w:proofErr w:type="spellStart"/>
       <w:r>
         <w:rPr>
@@ -7422,7 +6830,7 @@
         </w:rPr>
         <w:t>Documento</w:t>
       </w:r>
-      <w:bookmarkEnd w:id="14"/>
+      <w:bookmarkEnd w:id="5"/>
       <w:proofErr w:type="spellEnd"/>
     </w:p>
     <w:p>
@@ -7527,7 +6935,6 @@
         </w:numPr>
       </w:pPr>
       <w:r>
-        <w:lastRenderedPageBreak/>
         <w:t>Viene presentata la scomposizione logica in sottosistemi.</w:t>
       </w:r>
     </w:p>
@@ -7550,6 +6957,7 @@
         </w:numPr>
       </w:pPr>
       <w:r>
+        <w:lastRenderedPageBreak/>
         <w:t>Vengono dettagliate le strategie per la persistenza dei dati, la sicurezza e la gestione del flusso di controllo globale.</w:t>
       </w:r>
     </w:p>
@@ -7628,7 +7036,6 @@
         <w:t xml:space="preserve"> Fornisce le definizioni dei termini tecnici e degli acronimi utilizzati nel documento.</w:t>
       </w:r>
     </w:p>
-    <w:p/>
     <w:p/>
     <w:p/>
     <w:p>
@@ -7646,7 +7053,7 @@
       <w:r>
         <w:t xml:space="preserve"> </w:t>
       </w:r>
-      <w:bookmarkStart w:id="15" w:name="_Toc214993124"/>
+      <w:bookmarkStart w:id="6" w:name="_Toc218505601"/>
       <w:proofErr w:type="spellStart"/>
       <w:r>
         <w:rPr>
@@ -7674,7 +7081,7 @@
         </w:rPr>
         <w:t>orrente</w:t>
       </w:r>
-      <w:bookmarkEnd w:id="15"/>
+      <w:bookmarkEnd w:id="6"/>
       <w:proofErr w:type="spellEnd"/>
     </w:p>
     <w:p>
@@ -7798,11 +7205,7 @@
         <w:t xml:space="preserve"> </w:t>
       </w:r>
       <w:r>
-        <w:t xml:space="preserve">I problemi più comuni riscontrati includono: frammentazione delle informazioni, mancanza di un controllo centralizzato dei task, impossibilità di monitorare efficacemente l’avanzamento, carico comunicativo elevato su canali non strutturati, </w:t>
-      </w:r>
-      <w:r>
-        <w:lastRenderedPageBreak/>
-        <w:t>scarsa scalabilità,  bassa integrazione con i flussi operativi reali, ridondanza delle informazioni e perdita di dati.</w:t>
+        <w:t>I problemi più comuni riscontrati includono: frammentazione delle informazioni, mancanza di un controllo centralizzato dei task, impossibilità di monitorare efficacemente l’avanzamento, carico comunicativo elevato su canali non strutturati, scarsa scalabilità,  bassa integrazione con i flussi operativi reali, ridondanza delle informazioni e perdita di dati.</w:t>
       </w:r>
       <w:r>
         <w:t xml:space="preserve"> </w:t>
@@ -7814,7 +7217,6 @@
         <w:t xml:space="preserve"> affronta tali limitazioni offrendo una piattaforma centralizzata, progettata per garantire visibilità in tempo reale, scalabilità operativa e un'interazione fluida tra dipendenti e supervisori. L’architettura del sistema permette una gestione precisa dei task e una distribuzione efficiente del carico operativo.</w:t>
       </w:r>
     </w:p>
-    <w:p/>
     <w:p>
       <w:pPr>
         <w:pStyle w:val="Titolo1"/>
@@ -7825,20 +7227,21 @@
         <w:ind w:left="142"/>
       </w:pPr>
       <w:r>
+        <w:lastRenderedPageBreak/>
         <w:t xml:space="preserve"> </w:t>
       </w:r>
-      <w:bookmarkStart w:id="16" w:name="_Toc214993125"/>
+      <w:bookmarkStart w:id="7" w:name="_Toc218505602"/>
       <w:r>
         <w:t>Architettura software proposta</w:t>
       </w:r>
-      <w:bookmarkEnd w:id="16"/>
+      <w:bookmarkEnd w:id="7"/>
     </w:p>
     <w:p/>
     <w:p>
       <w:pPr>
         <w:pStyle w:val="Titolo2"/>
       </w:pPr>
-      <w:bookmarkStart w:id="17" w:name="_Toc214993126"/>
+      <w:bookmarkStart w:id="8" w:name="_Toc218505603"/>
       <w:r>
         <w:t xml:space="preserve">3.1 </w:t>
       </w:r>
@@ -7846,7 +7249,7 @@
       <w:r>
         <w:t>Overview</w:t>
       </w:r>
-      <w:bookmarkEnd w:id="17"/>
+      <w:bookmarkEnd w:id="8"/>
       <w:proofErr w:type="spellEnd"/>
     </w:p>
     <w:p>
@@ -8016,11 +7419,15 @@
     <w:p/>
     <w:p/>
     <w:p/>
+    <w:p/>
+    <w:p/>
+    <w:p/>
+    <w:p/>
     <w:p>
       <w:pPr>
         <w:pStyle w:val="Titolo2"/>
       </w:pPr>
-      <w:bookmarkStart w:id="18" w:name="_Toc214993127"/>
+      <w:bookmarkStart w:id="9" w:name="_Toc218505604"/>
       <w:r>
         <w:lastRenderedPageBreak/>
         <w:t xml:space="preserve">3.2 Decomposizione in </w:t>
@@ -8029,7 +7436,7 @@
       <w:r>
         <w:t>subsystem</w:t>
       </w:r>
-      <w:bookmarkEnd w:id="18"/>
+      <w:bookmarkEnd w:id="9"/>
       <w:proofErr w:type="spellEnd"/>
     </w:p>
     <w:p/>
@@ -8044,6 +7451,9 @@
       <w:proofErr w:type="spellEnd"/>
       <w:r>
         <w:t>” e le relative dipendenze.</w:t>
+      </w:r>
+      <w:r>
+        <w:br/>
       </w:r>
     </w:p>
     <w:p>
@@ -8370,7 +7780,7 @@
       <w:pPr>
         <w:pStyle w:val="Titolo2"/>
       </w:pPr>
-      <w:bookmarkStart w:id="19" w:name="_Toc214993128"/>
+      <w:bookmarkStart w:id="10" w:name="_Toc218505605"/>
       <w:r>
         <w:lastRenderedPageBreak/>
         <w:t xml:space="preserve">3.3 </w:t>
@@ -8378,7 +7788,7 @@
       <w:r>
         <w:t>Hardware/software mapping</w:t>
       </w:r>
-      <w:bookmarkEnd w:id="19"/>
+      <w:bookmarkEnd w:id="10"/>
     </w:p>
     <w:p/>
     <w:p>
@@ -8537,10 +7947,10 @@
           <w:noProof/>
         </w:rPr>
         <w:drawing>
-          <wp:inline distT="0" distB="0" distL="0" distR="0" wp14:anchorId="65E47189" wp14:editId="77ADF16D">
-            <wp:extent cx="4177556" cy="3079750"/>
-            <wp:effectExtent l="0" t="0" r="0" b="6350"/>
-            <wp:docPr id="1954747525" name="Elemento grafico 2"/>
+          <wp:inline distT="0" distB="0" distL="0" distR="0" wp14:anchorId="79813FB2" wp14:editId="7A758AB5">
+            <wp:extent cx="4404360" cy="3246953"/>
+            <wp:effectExtent l="0" t="0" r="0" b="0"/>
+            <wp:docPr id="1440560546" name="Elemento grafico 2"/>
             <wp:cNvGraphicFramePr>
               <a:graphicFrameLocks xmlns:a="http://schemas.openxmlformats.org/drawingml/2006/main" noChangeAspect="1"/>
             </wp:cNvGraphicFramePr>
@@ -8548,7 +7958,7 @@
               <a:graphicData uri="http://schemas.openxmlformats.org/drawingml/2006/picture">
                 <pic:pic xmlns:pic="http://schemas.openxmlformats.org/drawingml/2006/picture">
                   <pic:nvPicPr>
-                    <pic:cNvPr id="1954747525" name="Elemento grafico 1954747525"/>
+                    <pic:cNvPr id="1440560546" name="Elemento grafico 1440560546"/>
                     <pic:cNvPicPr/>
                   </pic:nvPicPr>
                   <pic:blipFill>
@@ -8566,7 +7976,7 @@
                   <pic:spPr>
                     <a:xfrm>
                       <a:off x="0" y="0"/>
-                      <a:ext cx="4185393" cy="3085528"/>
+                      <a:ext cx="4407434" cy="3249219"/>
                     </a:xfrm>
                     <a:prstGeom prst="rect">
                       <a:avLst/>
@@ -8874,9 +8284,8 @@
       <w:pPr>
         <w:pStyle w:val="Titolo2"/>
       </w:pPr>
-      <w:bookmarkStart w:id="20" w:name="_Toc214993129"/>
-      <w:r>
-        <w:lastRenderedPageBreak/>
+      <w:bookmarkStart w:id="11" w:name="_Toc218505606"/>
+      <w:r>
         <w:t xml:space="preserve">3.4 </w:t>
       </w:r>
       <w:proofErr w:type="spellStart"/>
@@ -8887,7 +8296,7 @@
       <w:r>
         <w:t xml:space="preserve"> Data Management</w:t>
       </w:r>
-      <w:bookmarkEnd w:id="20"/>
+      <w:bookmarkEnd w:id="11"/>
     </w:p>
     <w:p/>
     <w:p>
@@ -9109,9 +8518,9 @@
           <w:noProof/>
         </w:rPr>
         <w:drawing>
-          <wp:inline distT="0" distB="0" distL="0" distR="0" wp14:anchorId="739CB723" wp14:editId="048FED46">
-            <wp:extent cx="4560273" cy="4442460"/>
-            <wp:effectExtent l="0" t="0" r="0" b="0"/>
+          <wp:inline distT="0" distB="0" distL="0" distR="0" wp14:anchorId="739CB723" wp14:editId="448B2788">
+            <wp:extent cx="4075304" cy="3970020"/>
+            <wp:effectExtent l="0" t="0" r="1905" b="0"/>
             <wp:docPr id="209727934" name="Elemento grafico 1"/>
             <wp:cNvGraphicFramePr>
               <a:graphicFrameLocks xmlns:a="http://schemas.openxmlformats.org/drawingml/2006/main" noChangeAspect="1"/>
@@ -9138,7 +8547,7 @@
                   <pic:spPr>
                     <a:xfrm>
                       <a:off x="0" y="0"/>
-                      <a:ext cx="4560273" cy="4442460"/>
+                      <a:ext cx="4077491" cy="3972150"/>
                     </a:xfrm>
                     <a:prstGeom prst="rect">
                       <a:avLst/>
@@ -9155,7 +8564,7 @@
       <w:pPr>
         <w:pStyle w:val="Titolo2"/>
       </w:pPr>
-      <w:bookmarkStart w:id="21" w:name="_Toc214993130"/>
+      <w:bookmarkStart w:id="12" w:name="_Toc218505607"/>
       <w:r>
         <w:lastRenderedPageBreak/>
         <w:t xml:space="preserve">3.5 </w:t>
@@ -9163,7 +8572,7 @@
       <w:r>
         <w:t>Access control and security</w:t>
       </w:r>
-      <w:bookmarkEnd w:id="21"/>
+      <w:bookmarkEnd w:id="12"/>
     </w:p>
     <w:p/>
     <w:p>
@@ -9395,11 +8804,9 @@
             <w:pPr>
               <w:jc w:val="center"/>
             </w:pPr>
-            <w:proofErr w:type="spellStart"/>
-            <w:r>
-              <w:t>CatalogoUtenti</w:t>
-            </w:r>
-            <w:proofErr w:type="spellEnd"/>
+            <w:r>
+              <w:t>Utente</w:t>
+            </w:r>
           </w:p>
         </w:tc>
         <w:tc>
@@ -9411,11 +8818,9 @@
             <w:pPr>
               <w:jc w:val="center"/>
             </w:pPr>
-            <w:proofErr w:type="spellStart"/>
-            <w:r>
-              <w:t>CatalogoNotifiche</w:t>
-            </w:r>
-            <w:proofErr w:type="spellEnd"/>
+            <w:r>
+              <w:t>Notifica</w:t>
+            </w:r>
           </w:p>
         </w:tc>
         <w:tc>
@@ -9427,11 +8832,9 @@
             <w:pPr>
               <w:jc w:val="center"/>
             </w:pPr>
-            <w:proofErr w:type="spellStart"/>
-            <w:r>
-              <w:t>CatalogoTask</w:t>
-            </w:r>
-            <w:proofErr w:type="spellEnd"/>
+            <w:r>
+              <w:t>Task</w:t>
+            </w:r>
           </w:p>
         </w:tc>
         <w:tc>
@@ -10027,7 +9430,7 @@
       <w:pPr>
         <w:pStyle w:val="Titolo2"/>
       </w:pPr>
-      <w:bookmarkStart w:id="22" w:name="_Toc214993131"/>
+      <w:bookmarkStart w:id="13" w:name="_Toc218505608"/>
       <w:r>
         <w:lastRenderedPageBreak/>
         <w:t xml:space="preserve">3.6 </w:t>
@@ -10035,7 +9438,7 @@
       <w:r>
         <w:t>Global software control</w:t>
       </w:r>
-      <w:bookmarkEnd w:id="22"/>
+      <w:bookmarkEnd w:id="13"/>
     </w:p>
     <w:p>
       <w:r>
@@ -10062,11 +9465,11 @@
         <w:pStyle w:val="Titolo3"/>
         <w:ind w:left="-284" w:firstLine="708"/>
       </w:pPr>
-      <w:bookmarkStart w:id="23" w:name="_Toc214993132"/>
+      <w:bookmarkStart w:id="14" w:name="_Toc218505609"/>
       <w:r>
         <w:t>3.6.1 Flusso delle richieste</w:t>
       </w:r>
-      <w:bookmarkEnd w:id="23"/>
+      <w:bookmarkEnd w:id="14"/>
       <w:r>
         <w:br/>
       </w:r>
@@ -10177,13 +9580,13 @@
         <w:pStyle w:val="Titolo3"/>
         <w:ind w:left="-284" w:firstLine="708"/>
       </w:pPr>
-      <w:bookmarkStart w:id="24" w:name="_Hlk214907318"/>
-      <w:bookmarkStart w:id="25" w:name="_Toc214993133"/>
+      <w:bookmarkStart w:id="15" w:name="_Hlk214907318"/>
+      <w:bookmarkStart w:id="16" w:name="_Toc218505610"/>
       <w:r>
         <w:t>3.6.2 Concorrenza</w:t>
       </w:r>
-      <w:bookmarkEnd w:id="24"/>
-      <w:bookmarkEnd w:id="25"/>
+      <w:bookmarkEnd w:id="15"/>
+      <w:bookmarkEnd w:id="16"/>
       <w:r>
         <w:br/>
       </w:r>
@@ -10327,11 +9730,11 @@
         <w:pStyle w:val="Titolo3"/>
         <w:ind w:left="426"/>
       </w:pPr>
-      <w:bookmarkStart w:id="26" w:name="_Toc214993134"/>
+      <w:bookmarkStart w:id="17" w:name="_Toc218505611"/>
       <w:r>
         <w:t>3.6.3 Sincronizzazione e integrità dei dati</w:t>
       </w:r>
-      <w:bookmarkEnd w:id="26"/>
+      <w:bookmarkEnd w:id="17"/>
       <w:r>
         <w:br/>
       </w:r>
@@ -10444,7 +9847,7 @@
       <w:pPr>
         <w:pStyle w:val="Titolo2"/>
       </w:pPr>
-      <w:bookmarkStart w:id="27" w:name="_Toc214993135"/>
+      <w:bookmarkStart w:id="18" w:name="_Toc218505612"/>
       <w:r>
         <w:t xml:space="preserve">3.7 </w:t>
       </w:r>
@@ -10460,7 +9863,7 @@
       <w:r>
         <w:t>conditions</w:t>
       </w:r>
-      <w:bookmarkEnd w:id="27"/>
+      <w:bookmarkEnd w:id="18"/>
       <w:proofErr w:type="spellEnd"/>
     </w:p>
     <w:p/>
@@ -10497,11 +9900,11 @@
       <w:pPr>
         <w:pStyle w:val="Titolo3"/>
       </w:pPr>
-      <w:bookmarkStart w:id="28" w:name="_Toc214993136"/>
+      <w:bookmarkStart w:id="19" w:name="_Toc218505613"/>
       <w:r>
         <w:t>3.7.1 Inizializzazione</w:t>
       </w:r>
-      <w:bookmarkEnd w:id="28"/>
+      <w:bookmarkEnd w:id="19"/>
       <w:r>
         <w:t xml:space="preserve"> </w:t>
       </w:r>
@@ -10647,11 +10050,11 @@
       <w:pPr>
         <w:pStyle w:val="Titolo3"/>
       </w:pPr>
-      <w:bookmarkStart w:id="29" w:name="_Toc214993137"/>
+      <w:bookmarkStart w:id="20" w:name="_Toc218505614"/>
       <w:r>
         <w:t>3.7.2 Terminazione</w:t>
       </w:r>
-      <w:bookmarkEnd w:id="29"/>
+      <w:bookmarkEnd w:id="20"/>
       <w:r>
         <w:t xml:space="preserve"> </w:t>
       </w:r>
@@ -10777,11 +10180,11 @@
       <w:pPr>
         <w:pStyle w:val="Titolo3"/>
       </w:pPr>
-      <w:bookmarkStart w:id="30" w:name="_Toc214993138"/>
+      <w:bookmarkStart w:id="21" w:name="_Toc218505615"/>
       <w:r>
         <w:t>3.7.3 Comportamento in caso di errore</w:t>
       </w:r>
-      <w:bookmarkEnd w:id="30"/>
+      <w:bookmarkEnd w:id="21"/>
       <w:r>
         <w:t xml:space="preserve"> </w:t>
       </w:r>
@@ -11009,12 +10412,12 @@
         </w:tabs>
         <w:ind w:left="142"/>
       </w:pPr>
-      <w:bookmarkStart w:id="31" w:name="_Toc214993139"/>
+      <w:bookmarkStart w:id="22" w:name="_Toc218505616"/>
       <w:r>
         <w:lastRenderedPageBreak/>
         <w:t>Subsystem Services</w:t>
       </w:r>
-      <w:bookmarkEnd w:id="31"/>
+      <w:bookmarkEnd w:id="22"/>
     </w:p>
     <w:p/>
     <w:p>
@@ -11036,7 +10439,7 @@
         <w:pStyle w:val="Titolo3"/>
         <w:ind w:left="360"/>
       </w:pPr>
-      <w:bookmarkStart w:id="32" w:name="_Toc214993140"/>
+      <w:bookmarkStart w:id="23" w:name="_Toc218505617"/>
       <w:r>
         <w:t xml:space="preserve">4.1 </w:t>
       </w:r>
@@ -11044,7 +10447,7 @@
       <w:r>
         <w:t>AccessManagement</w:t>
       </w:r>
-      <w:bookmarkEnd w:id="32"/>
+      <w:bookmarkEnd w:id="23"/>
       <w:proofErr w:type="spellEnd"/>
       <w:r>
         <w:t xml:space="preserve"> </w:t>
@@ -11217,7 +10620,7 @@
         <w:pStyle w:val="Titolo3"/>
         <w:ind w:left="360"/>
       </w:pPr>
-      <w:bookmarkStart w:id="33" w:name="_Toc214993141"/>
+      <w:bookmarkStart w:id="24" w:name="_Toc218505618"/>
       <w:r>
         <w:t xml:space="preserve">4.2 </w:t>
       </w:r>
@@ -11225,7 +10628,7 @@
       <w:r>
         <w:t>AccountManagement</w:t>
       </w:r>
-      <w:bookmarkEnd w:id="33"/>
+      <w:bookmarkEnd w:id="24"/>
       <w:proofErr w:type="spellEnd"/>
       <w:r>
         <w:br/>
@@ -11631,7 +11034,7 @@
         <w:pStyle w:val="Titolo3"/>
         <w:ind w:left="360"/>
       </w:pPr>
-      <w:bookmarkStart w:id="34" w:name="_Toc214993142"/>
+      <w:bookmarkStart w:id="25" w:name="_Toc218505619"/>
       <w:r>
         <w:t xml:space="preserve">4.3 </w:t>
       </w:r>
@@ -11639,7 +11042,7 @@
       <w:r>
         <w:t>TaskManagement</w:t>
       </w:r>
-      <w:bookmarkEnd w:id="34"/>
+      <w:bookmarkEnd w:id="25"/>
       <w:proofErr w:type="spellEnd"/>
     </w:p>
     <w:p/>
@@ -12164,7 +11567,7 @@
       <w:pPr>
         <w:pStyle w:val="Titolo3"/>
       </w:pPr>
-      <w:bookmarkStart w:id="35" w:name="_Toc214993143"/>
+      <w:bookmarkStart w:id="26" w:name="_Toc218505620"/>
       <w:r>
         <w:t xml:space="preserve">4.5 </w:t>
       </w:r>
@@ -12172,7 +11575,7 @@
       <w:r>
         <w:t>NotificheManagement</w:t>
       </w:r>
-      <w:bookmarkEnd w:id="35"/>
+      <w:bookmarkEnd w:id="26"/>
       <w:proofErr w:type="spellEnd"/>
     </w:p>
     <w:p/>
@@ -12313,7 +11716,7 @@
       <w:pPr>
         <w:pStyle w:val="Titolo3"/>
       </w:pPr>
-      <w:bookmarkStart w:id="36" w:name="_Toc214993144"/>
+      <w:bookmarkStart w:id="27" w:name="_Toc218505621"/>
       <w:r>
         <w:lastRenderedPageBreak/>
         <w:t xml:space="preserve">4.6 </w:t>
@@ -12322,7 +11725,7 @@
       <w:r>
         <w:t>PersistenceManagement</w:t>
       </w:r>
-      <w:bookmarkEnd w:id="36"/>
+      <w:bookmarkEnd w:id="27"/>
       <w:proofErr w:type="spellEnd"/>
     </w:p>
     <w:p/>
@@ -12424,24 +11827,29 @@
             </w:pPr>
             <w:proofErr w:type="spellStart"/>
             <w:r>
-              <w:t>Persist</w:t>
+              <w:t>getUtenteDAO</w:t>
             </w:r>
             <w:proofErr w:type="spellEnd"/>
+          </w:p>
+        </w:tc>
+        <w:tc>
+          <w:tcPr>
+            <w:tcW w:w="4633" w:type="dxa"/>
+          </w:tcPr>
+          <w:p>
+            <w:pPr>
+              <w:spacing w:after="160" w:line="259" w:lineRule="auto"/>
+            </w:pPr>
+            <w:r>
+              <w:t xml:space="preserve">Restituisce un riferimento ad un oggetto della classe </w:t>
+            </w:r>
+            <w:proofErr w:type="spellStart"/>
+            <w:r>
+              <w:t>UtenteDAO</w:t>
+            </w:r>
+            <w:proofErr w:type="spellEnd"/>
             <w:r>
               <w:t xml:space="preserve"> </w:t>
-            </w:r>
-          </w:p>
-        </w:tc>
-        <w:tc>
-          <w:tcPr>
-            <w:tcW w:w="4633" w:type="dxa"/>
-          </w:tcPr>
-          <w:p>
-            <w:pPr>
-              <w:spacing w:after="160" w:line="259" w:lineRule="auto"/>
-            </w:pPr>
-            <w:r>
-              <w:t>Salva lo stato di un oggetto all’interno del database.</w:t>
             </w:r>
           </w:p>
         </w:tc>
@@ -12454,12 +11862,9 @@
           <w:p>
             <w:proofErr w:type="spellStart"/>
             <w:r>
-              <w:t>Retrieve</w:t>
+              <w:t>getTaskDAO</w:t>
             </w:r>
             <w:proofErr w:type="spellEnd"/>
-            <w:r>
-              <w:t xml:space="preserve"> </w:t>
-            </w:r>
           </w:p>
         </w:tc>
         <w:tc>
@@ -12467,14 +11872,17 @@
             <w:tcW w:w="4633" w:type="dxa"/>
           </w:tcPr>
           <w:p>
+            <w:r>
+              <w:t xml:space="preserve">Restituisce un riferimento ad un oggetto della </w:t>
+            </w:r>
+            <w:r>
+              <w:t xml:space="preserve">classe </w:t>
+            </w:r>
             <w:proofErr w:type="spellStart"/>
             <w:r>
-              <w:t>Recupara</w:t>
+              <w:t>TaskDAO</w:t>
             </w:r>
             <w:proofErr w:type="spellEnd"/>
-            <w:r>
-              <w:t xml:space="preserve"> dati dal database </w:t>
-            </w:r>
           </w:p>
         </w:tc>
       </w:tr>
@@ -12484,9 +11892,16 @@
             <w:tcW w:w="4634" w:type="dxa"/>
           </w:tcPr>
           <w:p>
-            <w:r>
-              <w:t xml:space="preserve">Update </w:t>
-            </w:r>
+            <w:pPr>
+              <w:tabs>
+                <w:tab w:val="center" w:pos="2209"/>
+              </w:tabs>
+            </w:pPr>
+            <w:proofErr w:type="spellStart"/>
+            <w:r>
+              <w:t>getNotificheDAO</w:t>
+            </w:r>
+            <w:proofErr w:type="spellEnd"/>
           </w:p>
         </w:tc>
         <w:tc>
@@ -12495,54 +11910,13 @@
           </w:tcPr>
           <w:p>
             <w:r>
-              <w:t>Esegue operazioni di modifica di dati dal database</w:t>
-            </w:r>
-          </w:p>
-        </w:tc>
-      </w:tr>
-      <w:tr>
-        <w:tc>
-          <w:tcPr>
-            <w:tcW w:w="4634" w:type="dxa"/>
-          </w:tcPr>
-          <w:p>
-            <w:r>
-              <w:t>Delete</w:t>
-            </w:r>
-          </w:p>
-        </w:tc>
-        <w:tc>
-          <w:tcPr>
-            <w:tcW w:w="4633" w:type="dxa"/>
-          </w:tcPr>
-          <w:p>
-            <w:r>
-              <w:t>Permette di cancellare record dal database</w:t>
-            </w:r>
-          </w:p>
-        </w:tc>
-      </w:tr>
-      <w:tr>
-        <w:tc>
-          <w:tcPr>
-            <w:tcW w:w="4634" w:type="dxa"/>
-          </w:tcPr>
-          <w:p>
+              <w:t xml:space="preserve">Restituisce un riferimento ad un oggetto della classe </w:t>
+            </w:r>
             <w:proofErr w:type="spellStart"/>
             <w:r>
-              <w:t>ExecuteQuery</w:t>
+              <w:t>NotificheDAO</w:t>
             </w:r>
             <w:proofErr w:type="spellEnd"/>
-          </w:p>
-        </w:tc>
-        <w:tc>
-          <w:tcPr>
-            <w:tcW w:w="4633" w:type="dxa"/>
-          </w:tcPr>
-          <w:p>
-            <w:r>
-              <w:t>Permette di eseguire query complesse sul database</w:t>
-            </w:r>
           </w:p>
         </w:tc>
       </w:tr>
@@ -12564,16 +11938,17 @@
     <w:p/>
     <w:p/>
     <w:p/>
+    <w:p/>
     <w:p>
       <w:pPr>
         <w:pStyle w:val="Titolo1"/>
       </w:pPr>
-      <w:bookmarkStart w:id="37" w:name="_Toc214993145"/>
+      <w:bookmarkStart w:id="28" w:name="_Toc218505622"/>
       <w:r>
         <w:lastRenderedPageBreak/>
         <w:t>Glossario</w:t>
       </w:r>
-      <w:bookmarkEnd w:id="37"/>
+      <w:bookmarkEnd w:id="28"/>
     </w:p>
     <w:p/>
     <w:p>
@@ -12997,7 +12372,14 @@
               <w:b w:val="0"/>
               <w:sz w:val="20"/>
             </w:rPr>
-            <w:t>Versione: 1.0</w:t>
+            <w:t>Versione: 1.</w:t>
+          </w:r>
+          <w:r>
+            <w:rPr>
+              <w:b w:val="0"/>
+              <w:sz w:val="20"/>
+            </w:rPr>
+            <w:t>1</w:t>
           </w:r>
         </w:p>
       </w:tc>
@@ -13071,7 +12453,31 @@
             <w:rPr>
               <w:sz w:val="20"/>
             </w:rPr>
-            <w:t>25/11/2025</w:t>
+            <w:t>05</w:t>
+          </w:r>
+          <w:r>
+            <w:rPr>
+              <w:sz w:val="20"/>
+            </w:rPr>
+            <w:t>/</w:t>
+          </w:r>
+          <w:r>
+            <w:rPr>
+              <w:sz w:val="20"/>
+            </w:rPr>
+            <w:t>01</w:t>
+          </w:r>
+          <w:r>
+            <w:rPr>
+              <w:sz w:val="20"/>
+            </w:rPr>
+            <w:t>/202</w:t>
+          </w:r>
+          <w:r>
+            <w:rPr>
+              <w:sz w:val="20"/>
+            </w:rPr>
+            <w:t>6</w:t>
           </w:r>
         </w:p>
       </w:tc>
@@ -16851,7 +16257,6 @@
     <w:next w:val="Normale"/>
     <w:link w:val="Titolo4Carattere"/>
     <w:uiPriority w:val="9"/>
-    <w:semiHidden/>
     <w:unhideWhenUsed/>
     <w:qFormat/>
     <w:rsid w:val="00166817"/>
@@ -17048,7 +16453,6 @@
     <w:basedOn w:val="Carpredefinitoparagrafo"/>
     <w:link w:val="Titolo4"/>
     <w:uiPriority w:val="9"/>
-    <w:semiHidden/>
     <w:rsid w:val="00166817"/>
     <w:rPr>
       <w:rFonts w:eastAsiaTheme="majorEastAsia" w:cstheme="majorBidi"/>

</xml_diff>

<commit_message>
Modificati Odd e Sdd per AccountManagement e AccessManagement (inizio)
</commit_message>
<xml_diff>
--- a/Workspace/SDD/SDD_EWMS.docx
+++ b/Workspace/SDD/SDD_EWMS.docx
@@ -126,7 +126,6 @@
         </w:rPr>
         <w:br/>
       </w:r>
-      <w:proofErr w:type="spellStart"/>
       <w:r>
         <w:rPr>
           <w:rFonts w:ascii="Arial" w:hAnsi="Arial"/>
@@ -134,9 +133,8 @@
           <w:sz w:val="36"/>
           <w:lang w:val="en-GB"/>
         </w:rPr>
-        <w:t>System</w:t>
-      </w:r>
-      <w:proofErr w:type="spellEnd"/>
+        <w:t>System Design Document</w:t>
+      </w:r>
       <w:r>
         <w:rPr>
           <w:rFonts w:ascii="Arial" w:hAnsi="Arial"/>
@@ -144,7 +142,8 @@
           <w:sz w:val="36"/>
           <w:lang w:val="en-GB"/>
         </w:rPr>
-        <w:t xml:space="preserve"> Design Document</w:t>
+        <w:br/>
+        <w:t xml:space="preserve">Versione </w:t>
       </w:r>
       <w:r>
         <w:rPr>
@@ -153,9 +152,8 @@
           <w:sz w:val="36"/>
           <w:lang w:val="en-GB"/>
         </w:rPr>
-        <w:br/>
-      </w:r>
-      <w:proofErr w:type="spellStart"/>
+        <w:t>1</w:t>
+      </w:r>
       <w:r>
         <w:rPr>
           <w:rFonts w:ascii="Arial" w:hAnsi="Arial"/>
@@ -163,9 +161,8 @@
           <w:sz w:val="36"/>
           <w:lang w:val="en-GB"/>
         </w:rPr>
-        <w:t>Versione</w:t>
-      </w:r>
-      <w:proofErr w:type="spellEnd"/>
+        <w:t>.</w:t>
+      </w:r>
       <w:r>
         <w:rPr>
           <w:rFonts w:ascii="Arial" w:hAnsi="Arial"/>
@@ -173,7 +170,7 @@
           <w:sz w:val="36"/>
           <w:lang w:val="en-GB"/>
         </w:rPr>
-        <w:t xml:space="preserve"> </w:t>
+        <w:t>2</w:t>
       </w:r>
       <w:r>
         <w:rPr>
@@ -182,25 +179,7 @@
           <w:sz w:val="36"/>
           <w:lang w:val="en-GB"/>
         </w:rPr>
-        <w:t>1</w:t>
-      </w:r>
-      <w:r>
-        <w:rPr>
-          <w:rFonts w:ascii="Arial" w:hAnsi="Arial"/>
-          <w:b/>
-          <w:sz w:val="36"/>
-          <w:lang w:val="en-GB"/>
-        </w:rPr>
-        <w:t>.</w:t>
-      </w:r>
-      <w:r>
-        <w:rPr>
-          <w:rFonts w:ascii="Arial" w:hAnsi="Arial"/>
-          <w:b/>
-          <w:sz w:val="36"/>
-          <w:lang w:val="en-GB"/>
-        </w:rPr>
-        <w:t>2</w:t>
+        <w:t>.1</w:t>
       </w:r>
       <w:r>
         <w:rPr>
@@ -339,7 +318,13 @@
         <w:rPr>
           <w:sz w:val="32"/>
         </w:rPr>
-        <w:t>24</w:t>
+        <w:t>2</w:t>
+      </w:r>
+      <w:r>
+        <w:rPr>
+          <w:sz w:val="32"/>
+        </w:rPr>
+        <w:t>6</w:t>
       </w:r>
       <w:r>
         <w:rPr>
@@ -1066,23 +1051,13 @@
           <w:sz w:val="32"/>
         </w:rPr>
       </w:pPr>
-      <w:proofErr w:type="spellStart"/>
       <w:r>
         <w:rPr>
           <w:rFonts w:cs="Times New Roman"/>
           <w:b/>
           <w:sz w:val="32"/>
         </w:rPr>
-        <w:t>Revision</w:t>
-      </w:r>
-      <w:proofErr w:type="spellEnd"/>
-      <w:r>
-        <w:rPr>
-          <w:rFonts w:cs="Times New Roman"/>
-          <w:b/>
-          <w:sz w:val="32"/>
-        </w:rPr>
-        <w:t xml:space="preserve"> History</w:t>
+        <w:t>Revision History</w:t>
       </w:r>
       <w:r>
         <w:rPr>
@@ -1095,7 +1070,7 @@
     </w:p>
     <w:tbl>
       <w:tblPr>
-        <w:tblW w:w="0" w:type="auto"/>
+        <w:tblW w:w="9637" w:type="dxa"/>
         <w:tblInd w:w="55" w:type="dxa"/>
         <w:tblLayout w:type="fixed"/>
         <w:tblCellMar>
@@ -1292,16 +1267,8 @@
               <w:rPr>
                 <w:sz w:val="20"/>
               </w:rPr>
-              <w:t xml:space="preserve">Assemblaggio documento a partire dai singoli prodotti effettuati </w:t>
-            </w:r>
-            <w:proofErr w:type="gramStart"/>
-            <w:r>
-              <w:rPr>
-                <w:sz w:val="20"/>
-              </w:rPr>
-              <w:t>dal team</w:t>
-            </w:r>
-            <w:proofErr w:type="gramEnd"/>
+              <w:t>Assemblaggio documento a partire dai singoli prodotti effettuati dal team</w:t>
+            </w:r>
           </w:p>
         </w:tc>
         <w:tc>
@@ -1418,30 +1385,8 @@
               <w:rPr>
                 <w:sz w:val="20"/>
               </w:rPr>
-              <w:t xml:space="preserve">Modificati il component e deployment </w:t>
-            </w:r>
-            <w:proofErr w:type="spellStart"/>
-            <w:r>
-              <w:rPr>
-                <w:sz w:val="20"/>
-              </w:rPr>
-              <w:t>diagram</w:t>
-            </w:r>
-            <w:proofErr w:type="spellEnd"/>
-            <w:r>
-              <w:rPr>
-                <w:sz w:val="20"/>
-              </w:rPr>
-              <w:t xml:space="preserve">, modificato i servizi offerti dal </w:t>
-            </w:r>
-            <w:proofErr w:type="spellStart"/>
-            <w:r>
-              <w:rPr>
-                <w:sz w:val="20"/>
-              </w:rPr>
-              <w:t>PersistanceManagement</w:t>
-            </w:r>
-            <w:proofErr w:type="spellEnd"/>
+              <w:t>Modificati il component e deployment diagram, modificato i servizi offerti dal PersistanceManagement</w:t>
+            </w:r>
           </w:p>
         </w:tc>
         <w:tc>
@@ -1453,11 +1398,11 @@
               <w:bottom w:val="single" w:sz="1" w:space="0" w:color="000000"/>
               <w:right w:val="single" w:sz="1" w:space="0" w:color="000000"/>
             </w:tcBorders>
+            <w:vAlign w:val="center"/>
           </w:tcPr>
           <w:p>
             <w:pPr>
               <w:pStyle w:val="Contenutotabella"/>
-              <w:jc w:val="center"/>
               <w:rPr>
                 <w:sz w:val="20"/>
               </w:rPr>
@@ -1545,30 +1490,8 @@
               <w:rPr>
                 <w:sz w:val="20"/>
               </w:rPr>
-              <w:t xml:space="preserve">Aggiunti metodi </w:t>
-            </w:r>
-            <w:proofErr w:type="gramStart"/>
-            <w:r>
-              <w:rPr>
-                <w:sz w:val="20"/>
-              </w:rPr>
-              <w:t>alle interfaccia</w:t>
-            </w:r>
-            <w:proofErr w:type="gramEnd"/>
-            <w:r>
-              <w:rPr>
-                <w:sz w:val="20"/>
-              </w:rPr>
-              <w:t xml:space="preserve"> </w:t>
-            </w:r>
-            <w:proofErr w:type="spellStart"/>
-            <w:r>
-              <w:rPr>
-                <w:sz w:val="20"/>
-              </w:rPr>
-              <w:t>UtenteDAO</w:t>
-            </w:r>
-            <w:proofErr w:type="spellEnd"/>
+              <w:t>Aggiunti metodi alle interfaccia UtenteDAO</w:t>
+            </w:r>
           </w:p>
         </w:tc>
         <w:tc>
@@ -1580,11 +1503,11 @@
               <w:bottom w:val="single" w:sz="1" w:space="0" w:color="000000"/>
               <w:right w:val="single" w:sz="1" w:space="0" w:color="000000"/>
             </w:tcBorders>
+            <w:vAlign w:val="center"/>
           </w:tcPr>
           <w:p>
             <w:pPr>
               <w:pStyle w:val="Contenutotabella"/>
-              <w:jc w:val="center"/>
               <w:rPr>
                 <w:sz w:val="20"/>
               </w:rPr>
@@ -1610,14 +1533,23 @@
               <w:left w:val="single" w:sz="1" w:space="0" w:color="000000"/>
               <w:bottom w:val="single" w:sz="1" w:space="0" w:color="000000"/>
             </w:tcBorders>
+            <w:vAlign w:val="center"/>
           </w:tcPr>
           <w:p>
             <w:pPr>
               <w:pStyle w:val="Contenutotabella"/>
+              <w:jc w:val="center"/>
               <w:rPr>
                 <w:sz w:val="20"/>
               </w:rPr>
             </w:pPr>
+            <w:r>
+              <w:rPr>
+                <w:sz w:val="20"/>
+                <w14:ligatures w14:val="standardContextual"/>
+              </w:rPr>
+              <w:t>26/01/2026</w:t>
+            </w:r>
           </w:p>
         </w:tc>
         <w:tc>
@@ -1628,14 +1560,23 @@
               <w:left w:val="single" w:sz="1" w:space="0" w:color="000000"/>
               <w:bottom w:val="single" w:sz="1" w:space="0" w:color="000000"/>
             </w:tcBorders>
+            <w:vAlign w:val="center"/>
           </w:tcPr>
           <w:p>
             <w:pPr>
               <w:pStyle w:val="Contenutotabella"/>
+              <w:jc w:val="center"/>
               <w:rPr>
                 <w:sz w:val="20"/>
               </w:rPr>
             </w:pPr>
+            <w:r>
+              <w:rPr>
+                <w:sz w:val="20"/>
+                <w14:ligatures w14:val="standardContextual"/>
+              </w:rPr>
+              <w:t>1.2.1</w:t>
+            </w:r>
           </w:p>
         </w:tc>
         <w:tc>
@@ -1654,6 +1595,13 @@
                 <w:sz w:val="20"/>
               </w:rPr>
             </w:pPr>
+            <w:r>
+              <w:rPr>
+                <w:sz w:val="20"/>
+                <w14:ligatures w14:val="standardContextual"/>
+              </w:rPr>
+              <w:t>Aggiunti metodi per servizi di AccountManagement e AccessManagement</w:t>
+            </w:r>
           </w:p>
         </w:tc>
         <w:tc>
@@ -1665,6 +1613,7 @@
               <w:bottom w:val="single" w:sz="1" w:space="0" w:color="000000"/>
               <w:right w:val="single" w:sz="1" w:space="0" w:color="000000"/>
             </w:tcBorders>
+            <w:vAlign w:val="center"/>
           </w:tcPr>
           <w:p>
             <w:pPr>
@@ -1673,6 +1622,13 @@
                 <w:sz w:val="20"/>
               </w:rPr>
             </w:pPr>
+            <w:r>
+              <w:rPr>
+                <w:sz w:val="20"/>
+                <w14:ligatures w14:val="standardContextual"/>
+              </w:rPr>
+              <w:t>Giovanni Robustelli</w:t>
+            </w:r>
           </w:p>
         </w:tc>
       </w:tr>
@@ -4143,6 +4099,9 @@
           <w:docGrid w:linePitch="312" w:charSpace="-6145"/>
         </w:sectPr>
       </w:pPr>
+      <w:r>
+        <w:tab/>
+      </w:r>
     </w:p>
     <w:p>
       <w:pPr>
@@ -4305,11 +4264,9 @@
         <w:br/>
         <w:t xml:space="preserve">Per garantire la compatibilità cross-browser, è necessario rinunciare o limitare l’uso di funzionalità web </w:t>
       </w:r>
-      <w:proofErr w:type="gramStart"/>
       <w:r>
         <w:t>ultra-moderne</w:t>
       </w:r>
-      <w:proofErr w:type="gramEnd"/>
       <w:r>
         <w:t xml:space="preserve"> non ancora supportate uniformemente dai browser.</w:t>
       </w:r>
@@ -4327,13 +4284,8 @@
         <w:t xml:space="preserve"> o</w:t>
       </w:r>
       <w:r>
-        <w:t xml:space="preserve"> animazioni </w:t>
-      </w:r>
-      <w:proofErr w:type="spellStart"/>
-      <w:r>
-        <w:t>WebGPU</w:t>
-      </w:r>
-      <w:proofErr w:type="spellEnd"/>
+        <w:t xml:space="preserve"> animazioni WebGPU</w:t>
+      </w:r>
       <w:r>
         <w:t xml:space="preserve"> </w:t>
       </w:r>
@@ -4423,15 +4375,7 @@
         <w:t>a</w:t>
       </w:r>
       <w:r>
-        <w:t xml:space="preserve"> portabilità tra diversi DBMS, stabilità, compatibilità con Java e facilità di manutenzione del </w:t>
-      </w:r>
-      <w:proofErr w:type="spellStart"/>
-      <w:r>
-        <w:t>layer</w:t>
-      </w:r>
-      <w:proofErr w:type="spellEnd"/>
-      <w:r>
-        <w:t xml:space="preserve"> di persistenza.</w:t>
+        <w:t xml:space="preserve"> portabilità tra diversi DBMS, stabilità, compatibilità con Java e facilità di manutenzione del layer di persistenza.</w:t>
       </w:r>
     </w:p>
     <w:p>
@@ -4549,15 +4493,7 @@
         <w:t>G_</w:t>
       </w:r>
       <w:r>
-        <w:t xml:space="preserve">3 – Interfaccia </w:t>
-      </w:r>
-      <w:proofErr w:type="spellStart"/>
-      <w:r>
-        <w:t>WebSocket</w:t>
-      </w:r>
-      <w:proofErr w:type="spellEnd"/>
-      <w:r>
-        <w:t xml:space="preserve"> per </w:t>
+        <w:t xml:space="preserve">3 – Interfaccia WebSocket per </w:t>
       </w:r>
       <w:r>
         <w:t>n</w:t>
@@ -4596,23 +4532,7 @@
         <w:t xml:space="preserve"> </w:t>
       </w:r>
       <w:r>
-        <w:t xml:space="preserve">Fornire aggiornamenti immediati dell’interfaccia utente tramite </w:t>
-      </w:r>
-      <w:proofErr w:type="spellStart"/>
-      <w:r>
-        <w:t>WebSocket</w:t>
-      </w:r>
-      <w:proofErr w:type="spellEnd"/>
-      <w:r>
-        <w:t xml:space="preserve">, permettendo al client di ricevere notifiche </w:t>
-      </w:r>
-      <w:proofErr w:type="spellStart"/>
-      <w:r>
-        <w:t>push</w:t>
-      </w:r>
-      <w:proofErr w:type="spellEnd"/>
-      <w:r>
-        <w:t xml:space="preserve"> senza refresh della pagina.</w:t>
+        <w:t>Fornire aggiornamenti immediati dell’interfaccia utente tramite WebSocket, permettendo al client di ricevere notifiche push senza refresh della pagina.</w:t>
       </w:r>
     </w:p>
     <w:p>
@@ -4655,15 +4575,7 @@
       </w:r>
       <w:r>
         <w:br/>
-        <w:t xml:space="preserve">Le connessioni </w:t>
-      </w:r>
-      <w:proofErr w:type="spellStart"/>
-      <w:r>
-        <w:t>WebSocket</w:t>
-      </w:r>
-      <w:proofErr w:type="spellEnd"/>
-      <w:r>
-        <w:t xml:space="preserve"> sono persistenti</w:t>
+        <w:t>Le connessioni WebSocket sono persistenti</w:t>
       </w:r>
       <w:r>
         <w:t>; quindi,</w:t>
@@ -4717,21 +4629,8 @@
       </w:r>
       <w:r>
         <w:br/>
-        <w:t xml:space="preserve">Introduce complessità maggiore rispetto al classico modello </w:t>
-      </w:r>
-      <w:proofErr w:type="spellStart"/>
-      <w:r>
-        <w:t>request</w:t>
-      </w:r>
-      <w:proofErr w:type="spellEnd"/>
-      <w:r>
-        <w:t>/</w:t>
-      </w:r>
-      <w:proofErr w:type="spellStart"/>
-      <w:r>
-        <w:t>response</w:t>
-      </w:r>
-      <w:proofErr w:type="spellEnd"/>
+        <w:t>Introduce complessità maggiore rispetto al classico modello request/response</w:t>
+      </w:r>
       <w:r>
         <w:t xml:space="preserve">. </w:t>
       </w:r>
@@ -4986,21 +4885,12 @@
       </w:r>
     </w:p>
     <w:p>
-      <w:proofErr w:type="spellStart"/>
       <w:r>
         <w:rPr>
           <w:b/>
           <w:bCs/>
         </w:rPr>
-        <w:t>Tradeoff</w:t>
-      </w:r>
-      <w:proofErr w:type="spellEnd"/>
-      <w:r>
-        <w:rPr>
-          <w:b/>
-          <w:bCs/>
-        </w:rPr>
-        <w:t>:</w:t>
+        <w:t>Tradeoff:</w:t>
       </w:r>
     </w:p>
     <w:p>
@@ -5099,21 +4989,12 @@
       </w:r>
     </w:p>
     <w:p>
-      <w:proofErr w:type="spellStart"/>
       <w:r>
         <w:rPr>
           <w:b/>
           <w:bCs/>
         </w:rPr>
-        <w:t>Tradeoff</w:t>
-      </w:r>
-      <w:proofErr w:type="spellEnd"/>
-      <w:r>
-        <w:rPr>
-          <w:b/>
-          <w:bCs/>
-        </w:rPr>
-        <w:t>:</w:t>
+        <w:t>Tradeoff:</w:t>
       </w:r>
     </w:p>
     <w:p>
@@ -5138,15 +5019,7 @@
         <w:pStyle w:val="Paragrafoelenco"/>
       </w:pPr>
       <w:r>
-        <w:t xml:space="preserve">Esternalizzare la configurazione migliora la portabilità e facilita la gestione di ambienti multipli, ma aumenta la complessità del </w:t>
-      </w:r>
-      <w:proofErr w:type="spellStart"/>
-      <w:r>
-        <w:t>deploy</w:t>
-      </w:r>
-      <w:proofErr w:type="spellEnd"/>
-      <w:r>
-        <w:t xml:space="preserve"> e la possibilità di errori di configurazione.</w:t>
+        <w:t>Esternalizzare la configurazione migliora la portabilità e facilita la gestione di ambienti multipli, ma aumenta la complessità del deploy e la possibilità di errori di configurazione.</w:t>
       </w:r>
     </w:p>
     <w:p>
@@ -5176,15 +5049,7 @@
         <w:pStyle w:val="Paragrafoelenco"/>
       </w:pPr>
       <w:r>
-        <w:t xml:space="preserve">Configurazioni interne semplificano il </w:t>
-      </w:r>
-      <w:proofErr w:type="spellStart"/>
-      <w:r>
-        <w:t>deploy</w:t>
-      </w:r>
-      <w:proofErr w:type="spellEnd"/>
-      <w:r>
-        <w:t>, ma rendono più difficile modificare i parametri senza ricreare il pacchetto WAR.</w:t>
+        <w:t>Configurazioni interne semplificano il deploy, ma rendono più difficile modificare i parametri senza ricreare il pacchetto WAR.</w:t>
       </w:r>
     </w:p>
     <w:p>
@@ -5243,23 +5108,7 @@
         <w:t xml:space="preserve">Obiettivo: </w:t>
       </w:r>
       <w:r>
-        <w:t xml:space="preserve">Proteggere le informazioni personali dei dipendenti tramite cifratura sicura delle password (AES, </w:t>
-      </w:r>
-      <w:proofErr w:type="spellStart"/>
-      <w:r>
-        <w:t>scrypt</w:t>
-      </w:r>
-      <w:proofErr w:type="spellEnd"/>
-      <w:r>
-        <w:t xml:space="preserve">, </w:t>
-      </w:r>
-      <w:proofErr w:type="spellStart"/>
-      <w:r>
-        <w:t>bcrypt</w:t>
-      </w:r>
-      <w:proofErr w:type="spellEnd"/>
-      <w:r>
-        <w:t>) e accessi profilati per ruolo.</w:t>
+        <w:t>Proteggere le informazioni personali dei dipendenti tramite cifratura sicura delle password (AES, scrypt, bcrypt) e accessi profilati per ruolo.</w:t>
       </w:r>
     </w:p>
     <w:p>
@@ -5269,21 +5118,12 @@
           <w:bCs/>
         </w:rPr>
       </w:pPr>
-      <w:proofErr w:type="spellStart"/>
       <w:r>
         <w:rPr>
           <w:b/>
           <w:bCs/>
         </w:rPr>
-        <w:t>Tradeoff</w:t>
-      </w:r>
-      <w:proofErr w:type="spellEnd"/>
-      <w:r>
-        <w:rPr>
-          <w:b/>
-          <w:bCs/>
-        </w:rPr>
-        <w:t>:</w:t>
+        <w:t>Tradeoff:</w:t>
       </w:r>
     </w:p>
     <w:p>
@@ -5385,21 +5225,12 @@
       </w:r>
     </w:p>
     <w:p>
-      <w:proofErr w:type="spellStart"/>
       <w:r>
         <w:rPr>
           <w:b/>
           <w:bCs/>
         </w:rPr>
-        <w:t>Tradeoff</w:t>
-      </w:r>
-      <w:proofErr w:type="spellEnd"/>
-      <w:r>
-        <w:rPr>
-          <w:b/>
-          <w:bCs/>
-        </w:rPr>
-        <w:t>:</w:t>
+        <w:t>Tradeoff:</w:t>
       </w:r>
     </w:p>
     <w:p>
@@ -5416,122 +5247,86 @@
           <w:b/>
           <w:bCs/>
         </w:rPr>
-        <w:t xml:space="preserve">Sicurezza vs. user </w:t>
-      </w:r>
-      <w:proofErr w:type="spellStart"/>
-      <w:r>
+        <w:t>Sicurezza vs. user experience</w:t>
+      </w:r>
+    </w:p>
+    <w:p>
+      <w:pPr>
+        <w:pStyle w:val="Paragrafoelenco"/>
+      </w:pPr>
+      <w:r>
+        <w:t>Sessioni più brevi aumentano la sicurezza, ma possono essere frustranti per gli utenti con task prolungati.</w:t>
+      </w:r>
+      <w:r>
+        <w:t xml:space="preserve"> </w:t>
+      </w:r>
+    </w:p>
+    <w:p>
+      <w:pPr>
+        <w:pStyle w:val="Paragrafoelenco"/>
+      </w:pPr>
+      <w:r>
+        <w:t>Sessioni più lunghe migliorano l’usabilità, ma aumentano la finestra di rischio per accessi non autorizzati.</w:t>
+      </w:r>
+    </w:p>
+    <w:p>
+      <w:pPr>
+        <w:pStyle w:val="Paragrafoelenco"/>
+      </w:pPr>
+    </w:p>
+    <w:p>
+      <w:pPr>
+        <w:pStyle w:val="Titolo4"/>
+      </w:pPr>
+      <w:r>
+        <w:t xml:space="preserve">DG_9 </w:t>
+      </w:r>
+      <w:r>
+        <w:t xml:space="preserve">– </w:t>
+      </w:r>
+      <w:r>
+        <w:t xml:space="preserve"> </w:t>
+      </w:r>
+      <w:r>
+        <w:t xml:space="preserve">Prevenzione di attacchi </w:t>
+      </w:r>
+    </w:p>
+    <w:p/>
+    <w:p>
+      <w:pPr>
         <w:rPr>
           <w:b/>
           <w:bCs/>
         </w:rPr>
-        <w:t>experience</w:t>
-      </w:r>
-      <w:proofErr w:type="spellEnd"/>
-    </w:p>
-    <w:p>
-      <w:pPr>
-        <w:pStyle w:val="Paragrafoelenco"/>
-      </w:pPr>
-      <w:r>
-        <w:t>Sessioni più brevi aumentano la sicurezza, ma possono essere frustranti per gli utenti con task prolungati.</w:t>
-      </w:r>
-      <w:r>
-        <w:t xml:space="preserve"> </w:t>
-      </w:r>
-    </w:p>
-    <w:p>
-      <w:pPr>
-        <w:pStyle w:val="Paragrafoelenco"/>
-      </w:pPr>
-      <w:r>
-        <w:t>Sessioni più lunghe migliorano l’usabilità, ma aumentano la finestra di rischio per accessi non autorizzati.</w:t>
-      </w:r>
-    </w:p>
-    <w:p>
-      <w:pPr>
-        <w:pStyle w:val="Paragrafoelenco"/>
-      </w:pPr>
-    </w:p>
-    <w:p>
-      <w:pPr>
-        <w:pStyle w:val="Titolo4"/>
-      </w:pPr>
-      <w:r>
-        <w:t xml:space="preserve">DG_9 </w:t>
-      </w:r>
-      <w:r>
-        <w:t xml:space="preserve">– </w:t>
-      </w:r>
-      <w:r>
-        <w:t xml:space="preserve"> </w:t>
-      </w:r>
-      <w:r>
-        <w:t xml:space="preserve">Prevenzione di attacchi </w:t>
-      </w:r>
-    </w:p>
-    <w:p/>
-    <w:p>
-      <w:pPr>
+      </w:pPr>
+      <w:r>
         <w:rPr>
           <w:b/>
           <w:bCs/>
         </w:rPr>
-      </w:pPr>
+        <w:t xml:space="preserve">Obiettivo: </w:t>
+      </w:r>
+      <w:r>
+        <w:t xml:space="preserve">Prevenire SQL injection utilizzando </w:t>
+      </w:r>
       <w:r>
         <w:rPr>
           <w:b/>
           <w:bCs/>
         </w:rPr>
-        <w:t xml:space="preserve">Obiettivo: </w:t>
-      </w:r>
-      <w:r>
-        <w:t xml:space="preserve">Prevenire SQL injection utilizzando </w:t>
-      </w:r>
-      <w:proofErr w:type="spellStart"/>
+        <w:t>prepared statements</w:t>
+      </w:r>
+      <w:r>
+        <w:t xml:space="preserve"> e best practice di validazione input.</w:t>
+      </w:r>
+    </w:p>
+    <w:p>
       <w:r>
         <w:rPr>
           <w:b/>
           <w:bCs/>
         </w:rPr>
-        <w:t>prepared</w:t>
-      </w:r>
-      <w:proofErr w:type="spellEnd"/>
-      <w:r>
-        <w:rPr>
-          <w:b/>
-          <w:bCs/>
-        </w:rPr>
-        <w:t xml:space="preserve"> </w:t>
-      </w:r>
-      <w:proofErr w:type="spellStart"/>
-      <w:r>
-        <w:rPr>
-          <w:b/>
-          <w:bCs/>
-        </w:rPr>
-        <w:t>statements</w:t>
-      </w:r>
-      <w:proofErr w:type="spellEnd"/>
-      <w:r>
-        <w:t xml:space="preserve"> e best practice di validazione input.</w:t>
-      </w:r>
-    </w:p>
-    <w:p>
-      <w:proofErr w:type="spellStart"/>
-      <w:r>
-        <w:rPr>
-          <w:b/>
-          <w:bCs/>
-        </w:rPr>
-        <w:t>Tradeoff</w:t>
-      </w:r>
-      <w:proofErr w:type="spellEnd"/>
-      <w:r>
-        <w:rPr>
-          <w:b/>
-          <w:bCs/>
-        </w:rPr>
-        <w:t>:</w:t>
+        <w:t>Tradeoff:</w:t>
       </w:r>
     </w:p>
     <w:p>
@@ -5682,35 +5477,9 @@
             <w:pPr>
               <w:spacing w:after="160" w:line="259" w:lineRule="auto"/>
             </w:pPr>
-            <w:proofErr w:type="spellStart"/>
-            <w:r>
-              <w:t>Atomicity</w:t>
-            </w:r>
-            <w:proofErr w:type="spellEnd"/>
-            <w:r>
-              <w:t xml:space="preserve">, </w:t>
-            </w:r>
-            <w:proofErr w:type="spellStart"/>
-            <w:r>
-              <w:t>Consistency</w:t>
-            </w:r>
-            <w:proofErr w:type="spellEnd"/>
-            <w:r>
-              <w:t xml:space="preserve">, </w:t>
-            </w:r>
-            <w:proofErr w:type="spellStart"/>
-            <w:r>
-              <w:t>Isolation</w:t>
-            </w:r>
-            <w:proofErr w:type="spellEnd"/>
-            <w:r>
-              <w:t xml:space="preserve">, </w:t>
-            </w:r>
-            <w:proofErr w:type="spellStart"/>
-            <w:r>
-              <w:t>Durability</w:t>
-            </w:r>
-            <w:proofErr w:type="spellEnd"/>
+            <w:r>
+              <w:t>Atomicity, Consistency, Isolation, Durability</w:t>
+            </w:r>
           </w:p>
         </w:tc>
         <w:tc>
@@ -5757,15 +5526,7 @@
               <w:spacing w:after="160" w:line="259" w:lineRule="auto"/>
             </w:pPr>
             <w:r>
-              <w:t xml:space="preserve">Advanced </w:t>
-            </w:r>
-            <w:proofErr w:type="spellStart"/>
-            <w:r>
-              <w:t>Encryption</w:t>
-            </w:r>
-            <w:proofErr w:type="spellEnd"/>
-            <w:r>
-              <w:t xml:space="preserve"> Standard</w:t>
+              <w:t>Advanced Encryption Standard</w:t>
             </w:r>
           </w:p>
         </w:tc>
@@ -5860,13 +5621,8 @@
             <w:pPr>
               <w:spacing w:after="160" w:line="259" w:lineRule="auto"/>
             </w:pPr>
-            <w:proofErr w:type="spellStart"/>
-            <w:r>
-              <w:t>Binary</w:t>
-            </w:r>
-            <w:proofErr w:type="spellEnd"/>
-            <w:r>
-              <w:t xml:space="preserve"> Large Object</w:t>
+            <w:r>
+              <w:t>Binary Large Object</w:t>
             </w:r>
           </w:p>
         </w:tc>
@@ -5913,13 +5669,8 @@
             <w:pPr>
               <w:spacing w:after="160" w:line="259" w:lineRule="auto"/>
             </w:pPr>
-            <w:proofErr w:type="spellStart"/>
-            <w:r>
-              <w:t>Cascading</w:t>
-            </w:r>
-            <w:proofErr w:type="spellEnd"/>
-            <w:r>
-              <w:t xml:space="preserve"> Style Sheets</w:t>
+            <w:r>
+              <w:t>Cascading Style Sheets</w:t>
             </w:r>
           </w:p>
         </w:tc>
@@ -6020,11 +5771,9 @@
             <w:pPr>
               <w:spacing w:after="160" w:line="259" w:lineRule="auto"/>
             </w:pPr>
-            <w:proofErr w:type="spellStart"/>
             <w:r>
               <w:t>Entity-Relationship</w:t>
             </w:r>
-            <w:proofErr w:type="spellEnd"/>
           </w:p>
         </w:tc>
         <w:tc>
@@ -6070,13 +5819,8 @@
             <w:pPr>
               <w:spacing w:after="160" w:line="259" w:lineRule="auto"/>
             </w:pPr>
-            <w:proofErr w:type="spellStart"/>
-            <w:r>
-              <w:t>HyperText</w:t>
-            </w:r>
-            <w:proofErr w:type="spellEnd"/>
-            <w:r>
-              <w:t xml:space="preserve"> Markup Language</w:t>
+            <w:r>
+              <w:t>HyperText Markup Language</w:t>
             </w:r>
           </w:p>
         </w:tc>
@@ -6123,21 +5867,8 @@
             <w:pPr>
               <w:spacing w:after="160" w:line="259" w:lineRule="auto"/>
             </w:pPr>
-            <w:proofErr w:type="spellStart"/>
-            <w:r>
-              <w:t>HyperText</w:t>
-            </w:r>
-            <w:proofErr w:type="spellEnd"/>
-            <w:r>
-              <w:t xml:space="preserve"> Transfer </w:t>
-            </w:r>
-            <w:proofErr w:type="spellStart"/>
-            <w:r>
-              <w:t>Protocol</w:t>
-            </w:r>
-            <w:proofErr w:type="spellEnd"/>
-            <w:r>
-              <w:t xml:space="preserve"> (Secure)</w:t>
+            <w:r>
+              <w:t>HyperText Transfer Protocol (Secure)</w:t>
             </w:r>
           </w:p>
         </w:tc>
@@ -6280,13 +6011,8 @@
             <w:pPr>
               <w:spacing w:after="160" w:line="259" w:lineRule="auto"/>
             </w:pPr>
-            <w:proofErr w:type="spellStart"/>
-            <w:r>
-              <w:t>JavaServer</w:t>
-            </w:r>
-            <w:proofErr w:type="spellEnd"/>
-            <w:r>
-              <w:t xml:space="preserve"> Pages</w:t>
+            <w:r>
+              <w:t>JavaServer Pages</w:t>
             </w:r>
           </w:p>
         </w:tc>
@@ -6348,15 +6074,7 @@
               <w:spacing w:after="160" w:line="259" w:lineRule="auto"/>
             </w:pPr>
             <w:r>
-              <w:t xml:space="preserve">Macchina virtuale che esegue i </w:t>
-            </w:r>
-            <w:proofErr w:type="spellStart"/>
-            <w:r>
-              <w:t>bytecode</w:t>
-            </w:r>
-            <w:proofErr w:type="spellEnd"/>
-            <w:r>
-              <w:t xml:space="preserve"> Java.</w:t>
+              <w:t>Macchina virtuale che esegue i bytecode Java.</w:t>
             </w:r>
           </w:p>
         </w:tc>
@@ -6389,13 +6107,8 @@
             <w:pPr>
               <w:spacing w:after="160" w:line="259" w:lineRule="auto"/>
             </w:pPr>
-            <w:proofErr w:type="spellStart"/>
-            <w:r>
-              <w:t>Multipurpose</w:t>
-            </w:r>
-            <w:proofErr w:type="spellEnd"/>
-            <w:r>
-              <w:t xml:space="preserve"> Internet Mail Extensions</w:t>
+            <w:r>
+              <w:t>Multipurpose Internet Mail Extensions</w:t>
             </w:r>
           </w:p>
         </w:tc>
@@ -6415,15 +6128,7 @@
               <w:t>e-mail</w:t>
             </w:r>
             <w:r>
-              <w:t xml:space="preserve"> e viene usato nel web per indicare il tipo di contenuto di un file (es. </w:t>
-            </w:r>
-            <w:proofErr w:type="spellStart"/>
-            <w:r>
-              <w:t>application</w:t>
-            </w:r>
-            <w:proofErr w:type="spellEnd"/>
-            <w:r>
-              <w:t>/pdf).</w:t>
+              <w:t xml:space="preserve"> e viene usato nel web per indicare il tipo di contenuto di un file (es. application/pdf).</w:t>
             </w:r>
           </w:p>
         </w:tc>
@@ -6457,13 +6162,8 @@
             <w:pPr>
               <w:spacing w:after="160" w:line="259" w:lineRule="auto"/>
             </w:pPr>
-            <w:proofErr w:type="spellStart"/>
-            <w:r>
-              <w:t>Structured</w:t>
-            </w:r>
-            <w:proofErr w:type="spellEnd"/>
-            <w:r>
-              <w:t xml:space="preserve"> Query Language</w:t>
+            <w:r>
+              <w:t>Structured Query Language</w:t>
             </w:r>
           </w:p>
         </w:tc>
@@ -6511,21 +6211,8 @@
               <w:spacing w:after="160" w:line="259" w:lineRule="auto"/>
             </w:pPr>
             <w:r>
-              <w:t xml:space="preserve">Transmission Control </w:t>
-            </w:r>
-            <w:proofErr w:type="spellStart"/>
-            <w:r>
-              <w:t>Protocol</w:t>
-            </w:r>
-            <w:proofErr w:type="spellEnd"/>
-            <w:r>
-              <w:t xml:space="preserve"> / Internet </w:t>
-            </w:r>
-            <w:proofErr w:type="spellStart"/>
-            <w:r>
-              <w:t>Protocol</w:t>
-            </w:r>
-            <w:proofErr w:type="spellEnd"/>
+              <w:t>Transmission Control Protocol / Internet Protocol</w:t>
+            </w:r>
           </w:p>
         </w:tc>
         <w:tc>
@@ -6586,15 +6273,7 @@
               <w:spacing w:after="160" w:line="259" w:lineRule="auto"/>
             </w:pPr>
             <w:r>
-              <w:t xml:space="preserve">Formato di file JAR utilizzato per distribuire una collezione di file JSP, </w:t>
-            </w:r>
-            <w:proofErr w:type="spellStart"/>
-            <w:r>
-              <w:t>servlet</w:t>
-            </w:r>
-            <w:proofErr w:type="spellEnd"/>
-            <w:r>
-              <w:t>, classi Java e risorse web.</w:t>
+              <w:t>Formato di file JAR utilizzato per distribuire una collezione di file JSP, servlet, classi Java e risorse web.</w:t>
             </w:r>
           </w:p>
         </w:tc>
@@ -6724,47 +6403,43 @@
           <w:lang w:val="en-GB"/>
         </w:rPr>
       </w:pPr>
-      <w:proofErr w:type="spellStart"/>
       <w:r>
         <w:rPr>
           <w:lang w:val="en-GB"/>
         </w:rPr>
-        <w:t>analisi</w:t>
-      </w:r>
-      <w:proofErr w:type="spellEnd"/>
-      <w:r>
+        <w:t xml:space="preserve">analisi dei requisiti: </w:t>
+      </w:r>
+    </w:p>
+    <w:p>
+      <w:pPr>
         <w:rPr>
           <w:lang w:val="en-GB"/>
         </w:rPr>
-        <w:t xml:space="preserve"> </w:t>
-      </w:r>
-      <w:proofErr w:type="spellStart"/>
+      </w:pPr>
       <w:r>
         <w:rPr>
           <w:lang w:val="en-GB"/>
         </w:rPr>
-        <w:t>dei</w:t>
-      </w:r>
-      <w:proofErr w:type="spellEnd"/>
-      <w:r>
+        <w:t xml:space="preserve">[REF-1] Object-oriented-Software-Engineering-3rd-Edition  </w:t>
+      </w:r>
+    </w:p>
+    <w:p>
+      <w:pPr>
         <w:rPr>
           <w:lang w:val="en-GB"/>
         </w:rPr>
-        <w:t xml:space="preserve"> </w:t>
-      </w:r>
-      <w:proofErr w:type="spellStart"/>
+      </w:pPr>
       <w:r>
         <w:rPr>
           <w:lang w:val="en-GB"/>
         </w:rPr>
-        <w:t>requisiti</w:t>
-      </w:r>
-      <w:proofErr w:type="spellEnd"/>
+        <w:t xml:space="preserve">[REF-2] </w:t>
+      </w:r>
       <w:r>
         <w:rPr>
           <w:lang w:val="en-GB"/>
         </w:rPr>
-        <w:t xml:space="preserve">: </w:t>
+        <w:t>RAD_EWMS V1.0</w:t>
       </w:r>
     </w:p>
     <w:p>
@@ -6777,53 +6452,7 @@
         <w:rPr>
           <w:lang w:val="en-GB"/>
         </w:rPr>
-        <w:t xml:space="preserve">[REF-1] Object-oriented-Software-Engineering-3rd-Edition  </w:t>
-      </w:r>
-    </w:p>
-    <w:p>
-      <w:pPr>
-        <w:rPr>
-          <w:lang w:val="en-GB"/>
-        </w:rPr>
-      </w:pPr>
-      <w:r>
-        <w:rPr>
-          <w:lang w:val="en-GB"/>
-        </w:rPr>
-        <w:t xml:space="preserve">[REF-2] </w:t>
-      </w:r>
-      <w:r>
-        <w:rPr>
-          <w:lang w:val="en-GB"/>
-        </w:rPr>
-        <w:t>RAD_EWMS V1.0</w:t>
-      </w:r>
-    </w:p>
-    <w:p>
-      <w:pPr>
-        <w:rPr>
-          <w:lang w:val="en-GB"/>
-        </w:rPr>
-      </w:pPr>
-      <w:r>
-        <w:rPr>
-          <w:lang w:val="en-GB"/>
-        </w:rPr>
-        <w:t xml:space="preserve">[REF-3] Team di Progetto, </w:t>
-      </w:r>
-      <w:proofErr w:type="spellStart"/>
-      <w:r>
-        <w:rPr>
-          <w:lang w:val="en-GB"/>
-        </w:rPr>
-        <w:t>SDD_start_meeting</w:t>
-      </w:r>
-      <w:proofErr w:type="spellEnd"/>
-      <w:r>
-        <w:rPr>
-          <w:lang w:val="en-GB"/>
-        </w:rPr>
-        <w:t xml:space="preserve"> </w:t>
+        <w:t xml:space="preserve">[REF-3] Team di Progetto, SDD_start_meeting </w:t>
       </w:r>
     </w:p>
     <w:p>
@@ -6853,29 +6482,13 @@
         </w:rPr>
       </w:pPr>
       <w:bookmarkStart w:id="5" w:name="_Toc220175277"/>
-      <w:proofErr w:type="spellStart"/>
       <w:r>
         <w:rPr>
           <w:lang w:val="en-US"/>
         </w:rPr>
-        <w:t>Panoramica</w:t>
-      </w:r>
-      <w:proofErr w:type="spellEnd"/>
-      <w:r>
-        <w:rPr>
-          <w:lang w:val="en-US"/>
-        </w:rPr>
-        <w:t xml:space="preserve"> del </w:t>
-      </w:r>
-      <w:proofErr w:type="spellStart"/>
-      <w:r>
-        <w:rPr>
-          <w:lang w:val="en-US"/>
-        </w:rPr>
-        <w:t>Documento</w:t>
+        <w:t>Panoramica del Documento</w:t>
       </w:r>
       <w:bookmarkEnd w:id="5"/>
-      <w:proofErr w:type="spellEnd"/>
     </w:p>
     <w:p>
       <w:r>
@@ -7098,35 +6711,25 @@
         <w:t xml:space="preserve"> </w:t>
       </w:r>
       <w:bookmarkStart w:id="6" w:name="_Toc220175278"/>
-      <w:proofErr w:type="spellStart"/>
       <w:r>
         <w:rPr>
           <w:lang w:val="en-US"/>
         </w:rPr>
-        <w:t>Architettura</w:t>
-      </w:r>
-      <w:proofErr w:type="spellEnd"/>
+        <w:t xml:space="preserve">Architettura software </w:t>
+      </w:r>
       <w:r>
         <w:rPr>
           <w:lang w:val="en-US"/>
         </w:rPr>
-        <w:t xml:space="preserve"> software </w:t>
-      </w:r>
-      <w:proofErr w:type="spellStart"/>
+        <w:t>c</w:t>
+      </w:r>
       <w:r>
         <w:rPr>
           <w:lang w:val="en-US"/>
         </w:rPr>
-        <w:t>c</w:t>
-      </w:r>
-      <w:r>
-        <w:rPr>
-          <w:lang w:val="en-US"/>
-        </w:rPr>
         <w:t>orrente</w:t>
       </w:r>
       <w:bookmarkEnd w:id="6"/>
-      <w:proofErr w:type="spellEnd"/>
     </w:p>
     <w:p>
       <w:pPr>
@@ -7187,35 +6790,7 @@
         <w:rPr>
           <w:lang w:val="en-US"/>
         </w:rPr>
-        <w:t xml:space="preserve">accesso </w:t>
-      </w:r>
-      <w:proofErr w:type="spellStart"/>
-      <w:r>
-        <w:rPr>
-          <w:lang w:val="en-US"/>
-        </w:rPr>
-        <w:t>immediato</w:t>
-      </w:r>
-      <w:proofErr w:type="spellEnd"/>
-      <w:r>
-        <w:rPr>
-          <w:lang w:val="en-US"/>
-        </w:rPr>
-        <w:t xml:space="preserve"> alle </w:t>
-      </w:r>
-      <w:proofErr w:type="spellStart"/>
-      <w:r>
-        <w:rPr>
-          <w:lang w:val="en-US"/>
-        </w:rPr>
-        <w:t>informazioni</w:t>
-      </w:r>
-      <w:proofErr w:type="spellEnd"/>
-      <w:r>
-        <w:rPr>
-          <w:lang w:val="en-US"/>
-        </w:rPr>
-        <w:t xml:space="preserve"> operative</w:t>
+        <w:t>accesso immediato alle informazioni operative</w:t>
       </w:r>
     </w:p>
     <w:p>
@@ -7287,14 +6862,9 @@
       </w:pPr>
       <w:bookmarkStart w:id="8" w:name="_Toc220175280"/>
       <w:r>
-        <w:t xml:space="preserve">3.1 </w:t>
-      </w:r>
-      <w:proofErr w:type="spellStart"/>
-      <w:r>
-        <w:t>Overview</w:t>
+        <w:t>3.1 Overview</w:t>
       </w:r>
       <w:bookmarkEnd w:id="8"/>
-      <w:proofErr w:type="spellEnd"/>
     </w:p>
     <w:p>
       <w:r>
@@ -7322,17 +6892,8 @@
           <w:b/>
           <w:bCs/>
         </w:rPr>
-        <w:t xml:space="preserve">Presentation </w:t>
-      </w:r>
-      <w:proofErr w:type="spellStart"/>
-      <w:r>
-        <w:rPr>
-          <w:b/>
-          <w:bCs/>
-        </w:rPr>
-        <w:t>layer</w:t>
-      </w:r>
-      <w:proofErr w:type="spellEnd"/>
+        <w:t>Presentation layer</w:t>
+      </w:r>
       <w:r>
         <w:t xml:space="preserve">: costituisce il livello </w:t>
       </w:r>
@@ -7359,17 +6920,8 @@
           <w:b/>
           <w:bCs/>
         </w:rPr>
-        <w:t xml:space="preserve">Application </w:t>
-      </w:r>
-      <w:proofErr w:type="spellStart"/>
-      <w:r>
-        <w:rPr>
-          <w:b/>
-          <w:bCs/>
-        </w:rPr>
-        <w:t>layer</w:t>
-      </w:r>
-      <w:proofErr w:type="spellEnd"/>
+        <w:t>Application layer</w:t>
+      </w:r>
       <w:r>
         <w:t>:</w:t>
       </w:r>
@@ -7388,31 +6940,13 @@
           <w:numId w:val="11"/>
         </w:numPr>
       </w:pPr>
-      <w:proofErr w:type="spellStart"/>
       <w:r>
         <w:rPr>
           <w:b/>
           <w:bCs/>
         </w:rPr>
-        <w:t>Persistence</w:t>
-      </w:r>
-      <w:proofErr w:type="spellEnd"/>
-      <w:r>
-        <w:rPr>
-          <w:b/>
-          <w:bCs/>
-        </w:rPr>
-        <w:t xml:space="preserve"> </w:t>
-      </w:r>
-      <w:proofErr w:type="spellStart"/>
-      <w:r>
-        <w:rPr>
-          <w:b/>
-          <w:bCs/>
-        </w:rPr>
-        <w:t>layer</w:t>
-      </w:r>
-      <w:proofErr w:type="spellEnd"/>
+        <w:t>Persistence layer</w:t>
+      </w:r>
       <w:r>
         <w:t>:</w:t>
       </w:r>
@@ -7458,27 +6992,14 @@
       <w:bookmarkStart w:id="9" w:name="_Toc220175281"/>
       <w:r>
         <w:lastRenderedPageBreak/>
-        <w:t xml:space="preserve">3.2 Decomposizione in </w:t>
-      </w:r>
-      <w:proofErr w:type="spellStart"/>
-      <w:r>
-        <w:t>subsystem</w:t>
+        <w:t>3.2 Decomposizione in subsystem</w:t>
       </w:r>
       <w:bookmarkEnd w:id="9"/>
-      <w:proofErr w:type="spellEnd"/>
     </w:p>
     <w:p/>
     <w:p>
       <w:r>
-        <w:t>Di seguito viene presentato il sistema scomposto in “</w:t>
-      </w:r>
-      <w:proofErr w:type="spellStart"/>
-      <w:r>
-        <w:t>subsystem</w:t>
-      </w:r>
-      <w:proofErr w:type="spellEnd"/>
-      <w:r>
-        <w:t>” e le relative dipendenze.</w:t>
+        <w:t>Di seguito viene presentato il sistema scomposto in “subsystem” e le relative dipendenze.</w:t>
       </w:r>
       <w:r>
         <w:br/>
@@ -7607,11 +7128,9 @@
             <w:tcW w:w="2694" w:type="dxa"/>
           </w:tcPr>
           <w:p>
-            <w:proofErr w:type="spellStart"/>
             <w:r>
               <w:t>EWMSClient</w:t>
             </w:r>
-            <w:proofErr w:type="spellEnd"/>
           </w:p>
         </w:tc>
         <w:tc>
@@ -7631,11 +7150,9 @@
             <w:tcW w:w="2694" w:type="dxa"/>
           </w:tcPr>
           <w:p>
-            <w:proofErr w:type="spellStart"/>
             <w:r>
               <w:t>AccountControl</w:t>
             </w:r>
-            <w:proofErr w:type="spellEnd"/>
           </w:p>
         </w:tc>
         <w:tc>
@@ -7655,11 +7172,9 @@
             <w:tcW w:w="2694" w:type="dxa"/>
           </w:tcPr>
           <w:p>
-            <w:proofErr w:type="spellStart"/>
             <w:r>
               <w:t>TaskControl</w:t>
             </w:r>
-            <w:proofErr w:type="spellEnd"/>
           </w:p>
         </w:tc>
         <w:tc>
@@ -7682,13 +7197,8 @@
             <w:tcW w:w="2694" w:type="dxa"/>
           </w:tcPr>
           <w:p>
-            <w:proofErr w:type="spellStart"/>
-            <w:r>
-              <w:t>AccessManagement</w:t>
-            </w:r>
-            <w:proofErr w:type="spellEnd"/>
-            <w:r>
-              <w:t xml:space="preserve"> </w:t>
+            <w:r>
+              <w:t xml:space="preserve">AccessManagement </w:t>
             </w:r>
           </w:p>
         </w:tc>
@@ -7709,11 +7219,9 @@
             <w:tcW w:w="2694" w:type="dxa"/>
           </w:tcPr>
           <w:p>
-            <w:proofErr w:type="spellStart"/>
             <w:r>
               <w:t>AccountManagement</w:t>
             </w:r>
-            <w:proofErr w:type="spellEnd"/>
           </w:p>
         </w:tc>
         <w:tc>
@@ -7733,11 +7241,9 @@
             <w:tcW w:w="2694" w:type="dxa"/>
           </w:tcPr>
           <w:p>
-            <w:proofErr w:type="spellStart"/>
             <w:r>
               <w:t>TaskManagement</w:t>
             </w:r>
-            <w:proofErr w:type="spellEnd"/>
           </w:p>
         </w:tc>
         <w:tc>
@@ -7757,11 +7263,9 @@
             <w:tcW w:w="2694" w:type="dxa"/>
           </w:tcPr>
           <w:p>
-            <w:proofErr w:type="spellStart"/>
             <w:r>
               <w:t>NotificheManagement</w:t>
             </w:r>
-            <w:proofErr w:type="spellEnd"/>
           </w:p>
         </w:tc>
         <w:tc>
@@ -7784,11 +7288,9 @@
             <w:tcW w:w="2694" w:type="dxa"/>
           </w:tcPr>
           <w:p>
-            <w:proofErr w:type="spellStart"/>
             <w:r>
               <w:t>PersistenceManagement</w:t>
             </w:r>
-            <w:proofErr w:type="spellEnd"/>
           </w:p>
         </w:tc>
         <w:tc>
@@ -7837,41 +7339,16 @@
           <w:b/>
           <w:bCs/>
         </w:rPr>
-        <w:t xml:space="preserve">Client </w:t>
-      </w:r>
-      <w:proofErr w:type="spellStart"/>
-      <w:r>
-        <w:rPr>
-          <w:b/>
-          <w:bCs/>
-        </w:rPr>
-        <w:t>Node</w:t>
-      </w:r>
-      <w:proofErr w:type="spellEnd"/>
-      <w:r>
-        <w:t xml:space="preserve">: il dispositivo dell’utente finale, essendo EWMS una web </w:t>
-      </w:r>
-      <w:proofErr w:type="spellStart"/>
-      <w:r>
-        <w:t>application</w:t>
-      </w:r>
-      <w:proofErr w:type="spellEnd"/>
-      <w:r>
-        <w:t xml:space="preserve"> che gira sul server di azienda n</w:t>
+        <w:t>Client Node</w:t>
+      </w:r>
+      <w:r>
+        <w:t>: il dispositivo dell’utente finale, essendo EWMS una web application che gira sul server di azienda n</w:t>
       </w:r>
       <w:r>
         <w:t>on richiede installazione di software proprietario, ma si affida</w:t>
       </w:r>
       <w:r>
-        <w:t xml:space="preserve"> ad un browser (Chrome, Mozilla, Opera </w:t>
-      </w:r>
-      <w:proofErr w:type="spellStart"/>
-      <w:r>
-        <w:t>ecc</w:t>
-      </w:r>
-      <w:proofErr w:type="spellEnd"/>
-      <w:r>
-        <w:t>…).</w:t>
+        <w:t xml:space="preserve"> ad un browser (Chrome, Mozilla, Opera ecc…).</w:t>
       </w:r>
     </w:p>
     <w:p>
@@ -7887,34 +7364,10 @@
           <w:b/>
           <w:bCs/>
         </w:rPr>
-        <w:t xml:space="preserve">Application Server </w:t>
-      </w:r>
-      <w:proofErr w:type="spellStart"/>
-      <w:r>
-        <w:rPr>
-          <w:b/>
-          <w:bCs/>
-        </w:rPr>
-        <w:t>Node</w:t>
-      </w:r>
-      <w:proofErr w:type="spellEnd"/>
-      <w:r>
-        <w:rPr>
-          <w:b/>
-          <w:bCs/>
-        </w:rPr>
-        <w:t>:</w:t>
-      </w:r>
-      <w:r>
-        <w:t xml:space="preserve"> È il server centrale che ospita la logica applicativa. Esegue il container web necessario per gestire il ciclo di vita delle </w:t>
-      </w:r>
-      <w:proofErr w:type="spellStart"/>
-      <w:r>
-        <w:t>Servlet</w:t>
-      </w:r>
-      <w:proofErr w:type="spellEnd"/>
-      <w:r>
-        <w:t xml:space="preserve"> e delle pagine JSP.</w:t>
+        <w:t>Application Server Node:</w:t>
+      </w:r>
+      <w:r>
+        <w:t xml:space="preserve"> È il server centrale che ospita la logica applicativa. Esegue il container web necessario per gestire il ciclo di vita delle Servlet e delle pagine JSP.</w:t>
       </w:r>
     </w:p>
     <w:p>
@@ -7930,23 +7383,7 @@
           <w:b/>
           <w:bCs/>
         </w:rPr>
-        <w:t xml:space="preserve">Database Server </w:t>
-      </w:r>
-      <w:proofErr w:type="spellStart"/>
-      <w:r>
-        <w:rPr>
-          <w:b/>
-          <w:bCs/>
-        </w:rPr>
-        <w:t>Node</w:t>
-      </w:r>
-      <w:proofErr w:type="spellEnd"/>
-      <w:r>
-        <w:rPr>
-          <w:b/>
-          <w:bCs/>
-        </w:rPr>
-        <w:t>:</w:t>
+        <w:t>Database Server Node:</w:t>
       </w:r>
       <w:r>
         <w:t xml:space="preserve"> È il server dedicato alla persistenza dei dati. Ospita il DBMS relazionale che memorizza tutte le informazioni di sistema</w:t>
@@ -8021,17 +7458,8 @@
           <w:b/>
           <w:bCs/>
         </w:rPr>
-        <w:t>Componenti off-the-</w:t>
-      </w:r>
-      <w:proofErr w:type="spellStart"/>
-      <w:r>
-        <w:rPr>
-          <w:b/>
-          <w:bCs/>
-        </w:rPr>
-        <w:t>shelfs</w:t>
-      </w:r>
-      <w:proofErr w:type="spellEnd"/>
+        <w:t>Componenti off-the-shelfs</w:t>
+      </w:r>
     </w:p>
     <w:tbl>
       <w:tblPr>
@@ -8151,23 +7579,7 @@
               <w:t>Ges</w:t>
             </w:r>
             <w:r>
-              <w:t xml:space="preserve">tione del ciclo di vita di </w:t>
-            </w:r>
-            <w:proofErr w:type="spellStart"/>
-            <w:r>
-              <w:t>Servlet</w:t>
-            </w:r>
-            <w:proofErr w:type="spellEnd"/>
-            <w:r>
-              <w:t xml:space="preserve">/JSP e dove verrà caricato il file </w:t>
-            </w:r>
-            <w:proofErr w:type="spellStart"/>
-            <w:r>
-              <w:t>ewms.war</w:t>
-            </w:r>
-            <w:proofErr w:type="spellEnd"/>
-            <w:r>
-              <w:t xml:space="preserve"> per il deployment</w:t>
+              <w:t>tione del ciclo di vita di Servlet/JSP e dove verrà caricato il file ewms.war per il deployment</w:t>
             </w:r>
           </w:p>
         </w:tc>
@@ -8232,13 +7644,8 @@
           </w:tcPr>
           <w:p>
             <w:r>
-              <w:t xml:space="preserve">Runtime </w:t>
-            </w:r>
-            <w:proofErr w:type="spellStart"/>
-            <w:r>
-              <w:t>enviroment</w:t>
-            </w:r>
-            <w:proofErr w:type="spellEnd"/>
+              <w:t>Runtime enviroment</w:t>
+            </w:r>
           </w:p>
         </w:tc>
         <w:tc>
@@ -8263,11 +7670,9 @@
             <w:vAlign w:val="center"/>
           </w:tcPr>
           <w:p>
-            <w:proofErr w:type="spellStart"/>
             <w:r>
               <w:t>WebBrowser</w:t>
             </w:r>
-            <w:proofErr w:type="spellEnd"/>
           </w:p>
         </w:tc>
         <w:tc>
@@ -8277,13 +7682,8 @@
           </w:tcPr>
           <w:p>
             <w:r>
-              <w:t xml:space="preserve">Client </w:t>
-            </w:r>
-            <w:proofErr w:type="spellStart"/>
-            <w:r>
-              <w:t>runtime</w:t>
-            </w:r>
-            <w:proofErr w:type="spellEnd"/>
+              <w:t>Client runtime</w:t>
+            </w:r>
           </w:p>
         </w:tc>
         <w:tc>
@@ -8306,30 +7706,14 @@
       </w:pPr>
       <w:bookmarkStart w:id="11" w:name="_Toc220175283"/>
       <w:r>
-        <w:t xml:space="preserve">3.4 </w:t>
-      </w:r>
-      <w:proofErr w:type="spellStart"/>
-      <w:r>
-        <w:t>Persistent</w:t>
-      </w:r>
-      <w:proofErr w:type="spellEnd"/>
-      <w:r>
-        <w:t xml:space="preserve"> Data Management</w:t>
+        <w:t>3.4 Persistent Data Management</w:t>
       </w:r>
       <w:bookmarkEnd w:id="11"/>
     </w:p>
     <w:p/>
     <w:p>
       <w:r>
-        <w:t>La gestione della persistenza dei dati nel sistema E.W.M.S. è affidata a un RDBMS (</w:t>
-      </w:r>
-      <w:proofErr w:type="spellStart"/>
-      <w:r>
-        <w:t>Relational</w:t>
-      </w:r>
-      <w:proofErr w:type="spellEnd"/>
-      <w:r>
-        <w:t xml:space="preserve"> Database Management System). Il sistema applicativo interagisce con il database per garantire che le informazioni relative agli account, ai task e alle notifiche siano salvate in modo durevole, consistente e sicuro.</w:t>
+        <w:t>La gestione della persistenza dei dati nel sistema E.W.M.S. è affidata a un RDBMS (Relational Database Management System). Il sistema applicativo interagisce con il database per garantire che le informazioni relative agli account, ai task e alle notifiche siano salvate in modo durevole, consistente e sicuro.</w:t>
       </w:r>
     </w:p>
     <w:p>
@@ -8452,13 +7836,8 @@
           <w:numId w:val="11"/>
         </w:numPr>
       </w:pPr>
-      <w:proofErr w:type="spellStart"/>
-      <w:r>
-        <w:t>Filename</w:t>
-      </w:r>
-      <w:proofErr w:type="spellEnd"/>
-      <w:r>
-        <w:t>: il nome del file caricato,</w:t>
+      <w:r>
+        <w:t>Filename: il nome del file caricato,</w:t>
       </w:r>
     </w:p>
     <w:p>
@@ -8469,13 +7848,8 @@
           <w:numId w:val="11"/>
         </w:numPr>
       </w:pPr>
-      <w:proofErr w:type="spellStart"/>
-      <w:r>
-        <w:t>File_path</w:t>
-      </w:r>
-      <w:proofErr w:type="spellEnd"/>
-      <w:r>
-        <w:t>: dove trovare lato server il file caricato,</w:t>
+      <w:r>
+        <w:t>File_path: dove trovare lato server il file caricato,</w:t>
       </w:r>
     </w:p>
     <w:p>
@@ -8486,29 +7860,8 @@
           <w:numId w:val="11"/>
         </w:numPr>
       </w:pPr>
-      <w:proofErr w:type="spellStart"/>
-      <w:r>
-        <w:t>Content_type</w:t>
-      </w:r>
-      <w:proofErr w:type="spellEnd"/>
-      <w:r>
-        <w:t>: il tipo MIME (es. pdf, .</w:t>
-      </w:r>
-      <w:proofErr w:type="spellStart"/>
-      <w:r>
-        <w:t>xlsx</w:t>
-      </w:r>
-      <w:proofErr w:type="spellEnd"/>
-      <w:r>
-        <w:t xml:space="preserve"> </w:t>
-      </w:r>
-      <w:proofErr w:type="spellStart"/>
-      <w:r>
-        <w:t>ecc</w:t>
-      </w:r>
-      <w:proofErr w:type="spellEnd"/>
-      <w:r>
-        <w:t>…)</w:t>
+      <w:r>
+        <w:t>Content_type: il tipo MIME (es. pdf, .xlsx ecc…)</w:t>
       </w:r>
       <w:r>
         <w:br/>
@@ -8602,15 +7955,7 @@
     <w:p/>
     <w:p>
       <w:r>
-        <w:t>La strategia di sicurezza del sistema E.W.M.S. è progettata per garantire la riservatezza e l'integrità dei dati attraverso un modello di controllo degli accessi basato sui ruoli (Role-</w:t>
-      </w:r>
-      <w:proofErr w:type="spellStart"/>
-      <w:r>
-        <w:t>Based</w:t>
-      </w:r>
-      <w:proofErr w:type="spellEnd"/>
-      <w:r>
-        <w:t xml:space="preserve"> Access Control).</w:t>
+        <w:t>La strategia di sicurezza del sistema E.W.M.S. è progettata per garantire la riservatezza e l'integrità dei dati attraverso un modello di controllo degli accessi basato sui ruoli (Role-Based Access Control).</w:t>
       </w:r>
       <w:r>
         <w:t xml:space="preserve"> L’implementazione del controllo degli accessi verrà effettuata </w:t>
@@ -8618,21 +7963,12 @@
       <w:r>
         <w:t xml:space="preserve">a livello programmatico tramite l'utilizzo di </w:t>
       </w:r>
-      <w:proofErr w:type="spellStart"/>
       <w:r>
         <w:rPr>
           <w:b/>
           <w:bCs/>
         </w:rPr>
-        <w:t>Servlet</w:t>
-      </w:r>
-      <w:proofErr w:type="spellEnd"/>
-      <w:r>
-        <w:rPr>
-          <w:b/>
-          <w:bCs/>
-        </w:rPr>
-        <w:t xml:space="preserve"> Filters</w:t>
+        <w:t>Servlet Filters</w:t>
       </w:r>
       <w:r>
         <w:t xml:space="preserve"> standard. Questi componenti intercettano ogni richiesta HTTP diretta al livello applicativo, verificando l'identità dell'utente e i suoi privilegi prima di consentire l'esecuzione di qualsiasi logica di business.</w:t>
@@ -8896,15 +8232,21 @@
           </w:tcPr>
           <w:p>
             <w:r>
-              <w:t>login</w:t>
-            </w:r>
-          </w:p>
-          <w:p>
-            <w:proofErr w:type="spellStart"/>
+              <w:t>L</w:t>
+            </w:r>
+            <w:r>
+              <w:t>ogin</w:t>
+            </w:r>
+          </w:p>
+          <w:p>
+            <w:r>
+              <w:t>getUtente</w:t>
+            </w:r>
+          </w:p>
+          <w:p>
             <w:r>
               <w:t>change_pwd</w:t>
             </w:r>
-            <w:proofErr w:type="spellEnd"/>
           </w:p>
         </w:tc>
         <w:tc>
@@ -8912,29 +8254,21 @@
             <w:tcW w:w="2127" w:type="dxa"/>
           </w:tcPr>
           <w:p>
-            <w:proofErr w:type="spellStart"/>
             <w:r>
               <w:t>showNotification</w:t>
             </w:r>
-            <w:proofErr w:type="spellEnd"/>
             <w:r>
               <w:br/>
-            </w:r>
-            <w:proofErr w:type="spellStart"/>
-            <w:r>
               <w:t>sendWarning</w:t>
             </w:r>
-            <w:proofErr w:type="spellEnd"/>
-          </w:p>
-          <w:p>
-            <w:proofErr w:type="spellStart"/>
+          </w:p>
+          <w:p>
             <w:r>
               <w:rPr>
                 <w:lang w:val="en-GB"/>
               </w:rPr>
               <w:t>holdTask</w:t>
             </w:r>
-            <w:proofErr w:type="spellEnd"/>
           </w:p>
         </w:tc>
         <w:tc>
@@ -8948,14 +8282,12 @@
                 <w:lang w:val="en-GB"/>
               </w:rPr>
             </w:pPr>
-            <w:proofErr w:type="spellStart"/>
             <w:r>
               <w:rPr>
                 <w:lang w:val="en-GB"/>
               </w:rPr>
               <w:t>createTask</w:t>
             </w:r>
-            <w:proofErr w:type="spellEnd"/>
           </w:p>
           <w:p>
             <w:pPr>
@@ -8963,14 +8295,12 @@
                 <w:lang w:val="en-GB"/>
               </w:rPr>
             </w:pPr>
-            <w:proofErr w:type="spellStart"/>
             <w:r>
               <w:rPr>
                 <w:lang w:val="en-GB"/>
               </w:rPr>
               <w:t>deleteTask</w:t>
             </w:r>
-            <w:proofErr w:type="spellEnd"/>
           </w:p>
           <w:p>
             <w:pPr>
@@ -8978,14 +8308,12 @@
                 <w:lang w:val="en-GB"/>
               </w:rPr>
             </w:pPr>
-            <w:proofErr w:type="spellStart"/>
             <w:r>
               <w:rPr>
                 <w:lang w:val="en-GB"/>
               </w:rPr>
               <w:t>showTasks</w:t>
             </w:r>
-            <w:proofErr w:type="spellEnd"/>
           </w:p>
           <w:p>
             <w:pPr>
@@ -8993,14 +8321,12 @@
                 <w:lang w:val="en-GB"/>
               </w:rPr>
             </w:pPr>
-            <w:proofErr w:type="spellStart"/>
             <w:r>
               <w:rPr>
                 <w:lang w:val="en-GB"/>
               </w:rPr>
               <w:t>fetchTask</w:t>
             </w:r>
-            <w:proofErr w:type="spellEnd"/>
           </w:p>
           <w:p>
             <w:pPr>
@@ -9008,14 +8334,12 @@
                 <w:lang w:val="en-GB"/>
               </w:rPr>
             </w:pPr>
-            <w:proofErr w:type="spellStart"/>
             <w:r>
               <w:rPr>
                 <w:lang w:val="en-GB"/>
               </w:rPr>
               <w:t>holdTask</w:t>
             </w:r>
-            <w:proofErr w:type="spellEnd"/>
           </w:p>
         </w:tc>
         <w:tc>
@@ -9064,7 +8388,11 @@
             </w:r>
           </w:p>
           <w:p>
-            <w:proofErr w:type="spellStart"/>
+            <w:r>
+              <w:t>getUtente</w:t>
+            </w:r>
+          </w:p>
+          <w:p>
             <w:r>
               <w:t>c</w:t>
             </w:r>
@@ -9077,7 +8405,6 @@
             <w:r>
               <w:t>pwd</w:t>
             </w:r>
-            <w:proofErr w:type="spellEnd"/>
           </w:p>
         </w:tc>
         <w:tc>
@@ -9085,21 +8412,17 @@
             <w:tcW w:w="2127" w:type="dxa"/>
           </w:tcPr>
           <w:p>
-            <w:proofErr w:type="spellStart"/>
             <w:r>
               <w:t>showNotification</w:t>
             </w:r>
-            <w:proofErr w:type="spellEnd"/>
-          </w:p>
-          <w:p>
-            <w:proofErr w:type="spellStart"/>
+          </w:p>
+          <w:p>
             <w:r>
               <w:rPr>
                 <w:lang w:val="en-GB"/>
               </w:rPr>
               <w:t>holdTask</w:t>
             </w:r>
-            <w:proofErr w:type="spellEnd"/>
           </w:p>
         </w:tc>
         <w:tc>
@@ -9113,14 +8436,12 @@
                 <w:lang w:val="en-GB"/>
               </w:rPr>
             </w:pPr>
-            <w:proofErr w:type="spellStart"/>
             <w:r>
               <w:rPr>
                 <w:lang w:val="en-GB"/>
               </w:rPr>
               <w:t>showTasks</w:t>
             </w:r>
-            <w:proofErr w:type="spellEnd"/>
           </w:p>
           <w:p>
             <w:pPr>
@@ -9128,14 +8449,12 @@
                 <w:lang w:val="en-GB"/>
               </w:rPr>
             </w:pPr>
-            <w:proofErr w:type="spellStart"/>
             <w:r>
               <w:rPr>
                 <w:lang w:val="en-GB"/>
               </w:rPr>
               <w:t>fetchTask</w:t>
             </w:r>
-            <w:proofErr w:type="spellEnd"/>
           </w:p>
           <w:p>
             <w:pPr>
@@ -9143,14 +8462,12 @@
                 <w:lang w:val="en-GB"/>
               </w:rPr>
             </w:pPr>
-            <w:proofErr w:type="spellStart"/>
             <w:r>
               <w:rPr>
                 <w:lang w:val="en-GB"/>
               </w:rPr>
               <w:t>inizializzaTask</w:t>
             </w:r>
-            <w:proofErr w:type="spellEnd"/>
           </w:p>
           <w:p>
             <w:pPr>
@@ -9158,14 +8475,12 @@
                 <w:lang w:val="en-GB"/>
               </w:rPr>
             </w:pPr>
-            <w:proofErr w:type="spellStart"/>
             <w:r>
               <w:rPr>
                 <w:lang w:val="en-GB"/>
               </w:rPr>
               <w:t>completeTask</w:t>
             </w:r>
-            <w:proofErr w:type="spellEnd"/>
           </w:p>
           <w:p>
             <w:pPr>
@@ -9173,7 +8488,6 @@
                 <w:lang w:val="en-GB"/>
               </w:rPr>
             </w:pPr>
-            <w:proofErr w:type="spellStart"/>
             <w:r>
               <w:rPr>
                 <w:lang w:val="en-GB"/>
@@ -9186,7 +8500,6 @@
               </w:rPr>
               <w:t>oldTask</w:t>
             </w:r>
-            <w:proofErr w:type="spellEnd"/>
           </w:p>
         </w:tc>
         <w:tc>
@@ -9243,14 +8556,25 @@
                 <w:lang w:val="en-GB"/>
               </w:rPr>
             </w:pPr>
-            <w:proofErr w:type="spellStart"/>
             <w:r>
               <w:rPr>
                 <w:lang w:val="en-GB"/>
               </w:rPr>
+              <w:t>getUtente</w:t>
+            </w:r>
+          </w:p>
+          <w:p>
+            <w:pPr>
+              <w:rPr>
+                <w:lang w:val="en-GB"/>
+              </w:rPr>
+            </w:pPr>
+            <w:r>
+              <w:rPr>
+                <w:lang w:val="en-GB"/>
+              </w:rPr>
               <w:t>change_pwd</w:t>
             </w:r>
-            <w:proofErr w:type="spellEnd"/>
           </w:p>
           <w:p>
             <w:pPr>
@@ -9258,14 +8582,12 @@
                 <w:lang w:val="en-GB"/>
               </w:rPr>
             </w:pPr>
-            <w:proofErr w:type="spellStart"/>
             <w:r>
               <w:rPr>
                 <w:lang w:val="en-GB"/>
               </w:rPr>
               <w:t>addAccount</w:t>
             </w:r>
-            <w:proofErr w:type="spellEnd"/>
           </w:p>
           <w:p>
             <w:pPr>
@@ -9273,7 +8595,6 @@
                 <w:lang w:val="en-GB"/>
               </w:rPr>
             </w:pPr>
-            <w:proofErr w:type="spellStart"/>
             <w:r>
               <w:rPr>
                 <w:lang w:val="en-GB"/>
@@ -9286,7 +8607,6 @@
               </w:rPr>
               <w:t>Account</w:t>
             </w:r>
-            <w:proofErr w:type="spellEnd"/>
           </w:p>
           <w:p>
             <w:pPr>
@@ -9294,14 +8614,12 @@
                 <w:lang w:val="en-GB"/>
               </w:rPr>
             </w:pPr>
-            <w:proofErr w:type="spellStart"/>
             <w:r>
               <w:rPr>
                 <w:lang w:val="en-GB"/>
               </w:rPr>
               <w:t>generateNewPwd</w:t>
             </w:r>
-            <w:proofErr w:type="spellEnd"/>
           </w:p>
           <w:p>
             <w:pPr>
@@ -9309,14 +8627,12 @@
                 <w:lang w:val="en-GB"/>
               </w:rPr>
             </w:pPr>
-            <w:proofErr w:type="spellStart"/>
             <w:r>
               <w:rPr>
                 <w:lang w:val="en-GB"/>
               </w:rPr>
               <w:t>modifyRole</w:t>
             </w:r>
-            <w:proofErr w:type="spellEnd"/>
           </w:p>
           <w:p>
             <w:pPr>
@@ -9324,14 +8640,12 @@
                 <w:lang w:val="en-GB"/>
               </w:rPr>
             </w:pPr>
-            <w:proofErr w:type="spellStart"/>
             <w:r>
               <w:rPr>
                 <w:lang w:val="en-GB"/>
               </w:rPr>
               <w:t>modifySupervisor</w:t>
             </w:r>
-            <w:proofErr w:type="spellEnd"/>
           </w:p>
           <w:p>
             <w:pPr>
@@ -9339,14 +8653,12 @@
                 <w:lang w:val="en-GB"/>
               </w:rPr>
             </w:pPr>
-            <w:proofErr w:type="spellStart"/>
             <w:r>
               <w:rPr>
                 <w:lang w:val="en-GB"/>
               </w:rPr>
               <w:t>deleteAccount</w:t>
             </w:r>
-            <w:proofErr w:type="spellEnd"/>
           </w:p>
         </w:tc>
         <w:tc>
@@ -9466,15 +8778,7 @@
     </w:p>
     <w:p>
       <w:r>
-        <w:t>Il controllo del flusso software nel sistema E.W.M.S. segue il modello Event-</w:t>
-      </w:r>
-      <w:proofErr w:type="spellStart"/>
-      <w:r>
-        <w:t>Driven</w:t>
-      </w:r>
-      <w:proofErr w:type="spellEnd"/>
-      <w:r>
-        <w:t>, tipico delle applicazioni web interattive.</w:t>
+        <w:t>Il controllo del flusso software nel sistema E.W.M.S. segue il modello Event-Driven, tipico delle applicazioni web interattive.</w:t>
       </w:r>
       <w:r>
         <w:t xml:space="preserve"> L</w:t>
@@ -9501,15 +8805,7 @@
     <w:p>
       <w:r>
         <w:tab/>
-        <w:t xml:space="preserve">Il flusso di controllo principale è del tipo sincrono </w:t>
-      </w:r>
-      <w:proofErr w:type="spellStart"/>
-      <w:r>
-        <w:t>Request-Response</w:t>
-      </w:r>
-      <w:proofErr w:type="spellEnd"/>
-      <w:r>
-        <w:t>:</w:t>
+        <w:t>Il flusso di controllo principale è del tipo sincrono Request-Response:</w:t>
       </w:r>
     </w:p>
     <w:p>
@@ -9533,23 +8829,7 @@
         </w:numPr>
       </w:pPr>
       <w:r>
-        <w:t xml:space="preserve">Il web-container intercetterà la richiesta, istanzierà un nuovo </w:t>
-      </w:r>
-      <w:proofErr w:type="spellStart"/>
-      <w:r>
-        <w:t>thread</w:t>
-      </w:r>
-      <w:proofErr w:type="spellEnd"/>
-      <w:r>
-        <w:t xml:space="preserve"> dedicato e lo indirizza alla </w:t>
-      </w:r>
-      <w:proofErr w:type="spellStart"/>
-      <w:r>
-        <w:t>servlet</w:t>
-      </w:r>
-      <w:proofErr w:type="spellEnd"/>
-      <w:r>
-        <w:t xml:space="preserve"> specificata</w:t>
+        <w:t>Il web-container intercetterà la richiesta, istanzierà un nuovo thread dedicato e lo indirizza alla servlet specificata</w:t>
       </w:r>
       <w:r>
         <w:t>;</w:t>
@@ -9564,15 +8844,7 @@
         </w:numPr>
       </w:pPr>
       <w:r>
-        <w:t xml:space="preserve">La </w:t>
-      </w:r>
-      <w:proofErr w:type="spellStart"/>
-      <w:r>
-        <w:t>servlet</w:t>
-      </w:r>
-      <w:proofErr w:type="spellEnd"/>
-      <w:r>
-        <w:t xml:space="preserve"> esegue la logica di business</w:t>
+        <w:t>La servlet esegue la logica di business</w:t>
       </w:r>
       <w:r>
         <w:t>;</w:t>
@@ -9629,29 +8901,13 @@
         <w:t>iene</w:t>
       </w:r>
       <w:r>
-        <w:t xml:space="preserve"> un </w:t>
-      </w:r>
-      <w:proofErr w:type="spellStart"/>
-      <w:r>
-        <w:t>Thread</w:t>
-      </w:r>
-      <w:proofErr w:type="spellEnd"/>
-      <w:r>
-        <w:t xml:space="preserve"> Pool; ogni richiesta HTTP </w:t>
+        <w:t xml:space="preserve"> un Thread Pool; ogni richiesta HTTP </w:t>
       </w:r>
       <w:r>
         <w:t xml:space="preserve">verrà quindi </w:t>
       </w:r>
       <w:r>
-        <w:t xml:space="preserve">eseguita in un </w:t>
-      </w:r>
-      <w:proofErr w:type="spellStart"/>
-      <w:r>
-        <w:t>thread</w:t>
-      </w:r>
-      <w:proofErr w:type="spellEnd"/>
-      <w:r>
-        <w:t xml:space="preserve"> separato.</w:t>
+        <w:t>eseguita in un thread separato.</w:t>
       </w:r>
     </w:p>
     <w:p>
@@ -9659,23 +8915,7 @@
         <w:ind w:left="708"/>
       </w:pPr>
       <w:r>
-        <w:t xml:space="preserve">Le </w:t>
-      </w:r>
-      <w:proofErr w:type="spellStart"/>
-      <w:r>
-        <w:t>servlet</w:t>
-      </w:r>
-      <w:proofErr w:type="spellEnd"/>
-      <w:r>
-        <w:t xml:space="preserve">, inoltre, sono oggetti di tipo </w:t>
-      </w:r>
-      <w:proofErr w:type="spellStart"/>
-      <w:r>
-        <w:t>stateless</w:t>
-      </w:r>
-      <w:proofErr w:type="spellEnd"/>
-      <w:r>
-        <w:t>, non conservano uno stato e n</w:t>
+        <w:t>Le servlet, inoltre, sono oggetti di tipo stateless, non conservano uno stato e n</w:t>
       </w:r>
       <w:r>
         <w:t xml:space="preserve">on utilizzano variabili di istanza mutabili per conservare dati specifici dell'utente, prevenendo </w:t>
@@ -9685,38 +8925,13 @@
           <w:b/>
           <w:bCs/>
         </w:rPr>
-        <w:t xml:space="preserve">race </w:t>
-      </w:r>
-      <w:proofErr w:type="spellStart"/>
-      <w:r>
-        <w:rPr>
-          <w:b/>
-          <w:bCs/>
-        </w:rPr>
-        <w:t>condition</w:t>
-      </w:r>
-      <w:proofErr w:type="spellEnd"/>
+        <w:t>race condition</w:t>
+      </w:r>
       <w:r>
         <w:t xml:space="preserve"> </w:t>
       </w:r>
       <w:r>
-        <w:t xml:space="preserve">quando più </w:t>
-      </w:r>
-      <w:proofErr w:type="spellStart"/>
-      <w:r>
-        <w:t>thread</w:t>
-      </w:r>
-      <w:proofErr w:type="spellEnd"/>
-      <w:r>
-        <w:t xml:space="preserve"> accedono alla stessa </w:t>
-      </w:r>
-      <w:proofErr w:type="spellStart"/>
-      <w:r>
-        <w:t>Servlet</w:t>
-      </w:r>
-      <w:proofErr w:type="spellEnd"/>
-      <w:r>
-        <w:t xml:space="preserve"> contemporaneamente.</w:t>
+        <w:t>quando più thread accedono alla stessa Servlet contemporaneamente.</w:t>
       </w:r>
     </w:p>
     <w:p>
@@ -9726,11 +8941,9 @@
       <w:r>
         <w:t xml:space="preserve">Lo stato dell’utente verrà gestito grazie all’utilizzo di un oggetto </w:t>
       </w:r>
-      <w:proofErr w:type="spellStart"/>
       <w:r>
         <w:t>HttpSession</w:t>
       </w:r>
-      <w:proofErr w:type="spellEnd"/>
       <w:r>
         <w:t xml:space="preserve"> unico per ogni utente </w:t>
       </w:r>
@@ -9770,14 +8983,12 @@
       <w:r>
         <w:t xml:space="preserve">La sincronizzazione tra i sottosistemi e l'accesso concorrente al database </w:t>
       </w:r>
-      <w:proofErr w:type="gramStart"/>
       <w:r>
         <w:t>è gestit</w:t>
       </w:r>
       <w:r>
         <w:t>o</w:t>
       </w:r>
-      <w:proofErr w:type="gramEnd"/>
       <w:r>
         <w:t xml:space="preserve"> attraverso:</w:t>
       </w:r>
@@ -9797,15 +9008,7 @@
         <w:t>Transazioni Database (ACID):</w:t>
       </w:r>
       <w:r>
-        <w:t xml:space="preserve"> Per operazioni critiche che coinvolgono più scritture, la consistenza è delegata al DBMS tramite transazioni. In caso di errore in uno dei passaggi, l'intera operazione viene annullata (</w:t>
-      </w:r>
-      <w:proofErr w:type="spellStart"/>
-      <w:r>
-        <w:t>Rollback</w:t>
-      </w:r>
-      <w:proofErr w:type="spellEnd"/>
-      <w:r>
-        <w:t>).</w:t>
+        <w:t xml:space="preserve"> Per operazioni critiche che coinvolgono più scritture, la consistenza è delegata al DBMS tramite transazioni. In caso di errore in uno dei passaggi, l'intera operazione viene annullata (Rollback).</w:t>
       </w:r>
     </w:p>
     <w:p>
@@ -9823,27 +9026,11 @@
         <w:t>Connection Pooling:</w:t>
       </w:r>
       <w:r>
-        <w:t xml:space="preserve"> L'accesso al database è sincronizzato tramite un </w:t>
-      </w:r>
-      <w:proofErr w:type="spellStart"/>
-      <w:r>
-        <w:t>DataSource</w:t>
-      </w:r>
-      <w:proofErr w:type="spellEnd"/>
-      <w:r>
-        <w:t xml:space="preserve"> (Connection Pool). Questo componente gestisce una coda di connessioni disponibili, </w:t>
+        <w:t xml:space="preserve"> L'accesso al database è sincronizzato tramite un DataSource (Connection Pool). Questo componente gestisce una coda di connessioni disponibili, </w:t>
       </w:r>
       <w:r>
         <w:lastRenderedPageBreak/>
-        <w:t xml:space="preserve">mettendo in attesa i </w:t>
-      </w:r>
-      <w:proofErr w:type="spellStart"/>
-      <w:r>
-        <w:t>thread</w:t>
-      </w:r>
-      <w:proofErr w:type="spellEnd"/>
-      <w:r>
-        <w:t xml:space="preserve"> se tutte le connessioni sono occupate, prevenendo il sovraccarico del database.</w:t>
+        <w:t>mettendo in attesa i thread se tutte le connessioni sono occupate, prevenendo il sovraccarico del database.</w:t>
       </w:r>
     </w:p>
     <w:p>
@@ -9876,92 +9063,55 @@
       </w:pPr>
       <w:bookmarkStart w:id="18" w:name="_Toc220175289"/>
       <w:r>
-        <w:t xml:space="preserve">3.7 </w:t>
-      </w:r>
-      <w:proofErr w:type="spellStart"/>
-      <w:r>
-        <w:t>Boundary</w:t>
-      </w:r>
-      <w:proofErr w:type="spellEnd"/>
+        <w:t>3.7 Boundary conditions</w:t>
+      </w:r>
+      <w:bookmarkEnd w:id="18"/>
+    </w:p>
+    <w:p/>
+    <w:p>
+      <w:r>
+        <w:t xml:space="preserve">In questa sezione viene descritto il comportamento </w:t>
+      </w:r>
+      <w:r>
+        <w:t>del sistema E.W.M.S. durante le fasi di avvio, arresto e in presenza di errori critici</w:t>
+      </w:r>
+      <w:r>
+        <w:t xml:space="preserve">. </w:t>
+      </w:r>
+      <w:r>
+        <w:t>L'obiettivo è garantire l'integrità dei dati e fornire feedback adeguati agli utenti</w:t>
+      </w:r>
+      <w:r>
+        <w:t xml:space="preserve"> e ai programmatori che interverranno in caso di malfunzionamenti</w:t>
+      </w:r>
+      <w:r>
+        <w:t>.</w:t>
+      </w:r>
+    </w:p>
+    <w:p/>
+    <w:p>
+      <w:pPr>
+        <w:pStyle w:val="Titolo3"/>
+      </w:pPr>
+      <w:bookmarkStart w:id="19" w:name="_Toc220175290"/>
+      <w:r>
+        <w:t>3.7.1 Inizializzazione</w:t>
+      </w:r>
+      <w:bookmarkEnd w:id="19"/>
       <w:r>
         <w:t xml:space="preserve"> </w:t>
       </w:r>
-      <w:proofErr w:type="spellStart"/>
-      <w:r>
-        <w:t>conditions</w:t>
-      </w:r>
-      <w:bookmarkEnd w:id="18"/>
-      <w:proofErr w:type="spellEnd"/>
     </w:p>
     <w:p/>
     <w:p>
       <w:r>
-        <w:t xml:space="preserve">In questa sezione viene descritto il comportamento </w:t>
-      </w:r>
-      <w:r>
-        <w:t>del sistema E.W.M.S. durante le fasi di avvio, arresto e in presenza di errori critici</w:t>
-      </w:r>
-      <w:r>
-        <w:t xml:space="preserve">. </w:t>
-      </w:r>
-      <w:r>
-        <w:t xml:space="preserve">L'obiettivo è garantire l'integrità dei dati e fornire </w:t>
-      </w:r>
-      <w:proofErr w:type="gramStart"/>
-      <w:r>
-        <w:t>feedback</w:t>
-      </w:r>
-      <w:proofErr w:type="gramEnd"/>
-      <w:r>
-        <w:t xml:space="preserve"> adeguati agli utenti</w:t>
-      </w:r>
-      <w:r>
-        <w:t xml:space="preserve"> e ai programmatori che interverranno in caso di malfunzionamenti</w:t>
-      </w:r>
-      <w:r>
-        <w:t>.</w:t>
-      </w:r>
-    </w:p>
-    <w:p/>
-    <w:p>
-      <w:pPr>
-        <w:pStyle w:val="Titolo3"/>
-      </w:pPr>
-      <w:bookmarkStart w:id="19" w:name="_Toc220175290"/>
-      <w:r>
-        <w:t>3.7.1 Inizializzazione</w:t>
-      </w:r>
-      <w:bookmarkEnd w:id="19"/>
-      <w:r>
-        <w:t xml:space="preserve"> </w:t>
-      </w:r>
-    </w:p>
-    <w:p/>
-    <w:p>
-      <w:r>
-        <w:t xml:space="preserve">L'avvio del sistema coincide con il </w:t>
-      </w:r>
-      <w:proofErr w:type="spellStart"/>
-      <w:r>
-        <w:t>deploy</w:t>
-      </w:r>
-      <w:proofErr w:type="spellEnd"/>
-      <w:r>
-        <w:t xml:space="preserve"> </w:t>
+        <w:t xml:space="preserve">L'avvio del sistema coincide con il deploy </w:t>
       </w:r>
       <w:r>
         <w:t>del file</w:t>
       </w:r>
       <w:r>
-        <w:t xml:space="preserve"> </w:t>
-      </w:r>
-      <w:proofErr w:type="spellStart"/>
-      <w:r>
-        <w:t>EWMS.war</w:t>
-      </w:r>
-      <w:proofErr w:type="spellEnd"/>
-      <w:r>
-        <w:t xml:space="preserve"> all'interno del Web Container (Apache Tomcat) o con il riavvio del servizio Tomcat stesso. Durante la fase di inizializzazione, il sistema esegue le seguenti operazioni sequenziali:</w:t>
+        <w:t xml:space="preserve"> EWMS.war all'interno del Web Container (Apache Tomcat) o con il riavvio del servizio Tomcat stesso. Durante la fase di inizializzazione, il sistema esegue le seguenti operazioni sequenziali:</w:t>
       </w:r>
     </w:p>
     <w:p>
@@ -10003,15 +9153,7 @@
         <w:t>Inizializzazione Connection Pool:</w:t>
       </w:r>
       <w:r>
-        <w:t xml:space="preserve"> Viene istanziato il </w:t>
-      </w:r>
-      <w:proofErr w:type="spellStart"/>
-      <w:r>
-        <w:t>DataSource</w:t>
-      </w:r>
-      <w:proofErr w:type="spellEnd"/>
-      <w:r>
-        <w:t xml:space="preserve"> per la connessione al database MySQL. </w:t>
+        <w:t xml:space="preserve"> Viene istanziato il DataSource per la connessione al database MySQL. </w:t>
       </w:r>
     </w:p>
     <w:p>
@@ -10088,15 +9230,7 @@
     </w:p>
     <w:p>
       <w:r>
-        <w:t>La terminazione del sistema coincide all’arresto o l’</w:t>
-      </w:r>
-      <w:proofErr w:type="spellStart"/>
-      <w:r>
-        <w:t>undeploy</w:t>
-      </w:r>
-      <w:proofErr w:type="spellEnd"/>
-      <w:r>
-        <w:t>, tramite il servizio Tomcat</w:t>
+        <w:t>La terminazione del sistema coincide all’arresto o l’undeploy, tramite il servizio Tomcat</w:t>
       </w:r>
       <w:r>
         <w:t>. Il sistema garantisce:</w:t>
@@ -10138,21 +9272,12 @@
       <w:r>
         <w:t xml:space="preserve"> Il Connection Pool viene chiuso forzatamente. Tutte le connessioni JDBC attive vengono terminate e i driver database deregistrati per evitare </w:t>
       </w:r>
-      <w:proofErr w:type="spellStart"/>
       <w:r>
         <w:rPr>
           <w:i/>
           <w:iCs/>
         </w:rPr>
-        <w:t>memory</w:t>
-      </w:r>
-      <w:proofErr w:type="spellEnd"/>
-      <w:r>
-        <w:rPr>
-          <w:i/>
-          <w:iCs/>
-        </w:rPr>
-        <w:t xml:space="preserve"> leaks</w:t>
+        <w:t>memory leaks</w:t>
       </w:r>
       <w:r>
         <w:t xml:space="preserve"> nel server.</w:t>
@@ -10170,34 +9295,10 @@
           <w:b/>
           <w:bCs/>
         </w:rPr>
-        <w:t xml:space="preserve">Completamento </w:t>
-      </w:r>
-      <w:proofErr w:type="spellStart"/>
-      <w:r>
-        <w:rPr>
-          <w:b/>
-          <w:bCs/>
-        </w:rPr>
-        <w:t>Thread</w:t>
-      </w:r>
-      <w:proofErr w:type="spellEnd"/>
-      <w:r>
-        <w:rPr>
-          <w:b/>
-          <w:bCs/>
-        </w:rPr>
-        <w:t>:</w:t>
-      </w:r>
-      <w:r>
-        <w:t xml:space="preserve"> Se vi sono operazioni di upload file in corso, il sistema tenta di completarle (entro un </w:t>
-      </w:r>
-      <w:proofErr w:type="spellStart"/>
-      <w:r>
-        <w:t>timeout</w:t>
-      </w:r>
-      <w:proofErr w:type="spellEnd"/>
-      <w:r>
-        <w:t xml:space="preserve"> prestabilito) o di abortirle in modo pulito cancellando i file parziali.</w:t>
+        <w:t>Completamento Thread:</w:t>
+      </w:r>
+      <w:r>
+        <w:t xml:space="preserve"> Se vi sono operazioni di upload file in corso, il sistema tenta di completarle (entro un timeout prestabilito) o di abortirle in modo pulito cancellando i file parziali.</w:t>
       </w:r>
       <w:r>
         <w:br/>
@@ -10218,15 +9319,7 @@
     </w:p>
     <w:p>
       <w:r>
-        <w:t xml:space="preserve">Il sistema deve gestire i malfunzionamenti garantendo che l'utente non veda mai </w:t>
-      </w:r>
-      <w:proofErr w:type="spellStart"/>
-      <w:r>
-        <w:t>stack</w:t>
-      </w:r>
-      <w:proofErr w:type="spellEnd"/>
-      <w:r>
-        <w:t xml:space="preserve"> trace o errori di codice.</w:t>
+        <w:t>Il sistema deve gestire i malfunzionamenti garantendo che l'utente non veda mai stack trace o errori di codice.</w:t>
       </w:r>
     </w:p>
     <w:p>
@@ -10245,15 +9338,7 @@
         <w:t>Errori Applicativi (Software Bugs / Eccezioni)</w:t>
       </w:r>
       <w:r>
-        <w:t xml:space="preserve"> In caso di </w:t>
-      </w:r>
-      <w:proofErr w:type="spellStart"/>
-      <w:r>
-        <w:t>NullPointerException</w:t>
-      </w:r>
-      <w:proofErr w:type="spellEnd"/>
-      <w:r>
-        <w:t xml:space="preserve"> o altre eccezioni non gestite (HTTP 500):</w:t>
+        <w:t xml:space="preserve"> In caso di NullPointerException o altre eccezioni non gestite (HTTP 500):</w:t>
       </w:r>
     </w:p>
     <w:p>
@@ -10274,15 +9359,7 @@
         <w:t>Log:</w:t>
       </w:r>
       <w:r>
-        <w:t xml:space="preserve"> L'errore completo (con </w:t>
-      </w:r>
-      <w:proofErr w:type="spellStart"/>
-      <w:r>
-        <w:t>stack</w:t>
-      </w:r>
-      <w:proofErr w:type="spellEnd"/>
-      <w:r>
-        <w:t xml:space="preserve"> trace) viene scritto nei file di log del server (es. Log4j/SLF4J) per l'analisi da parte degli sviluppatori.</w:t>
+        <w:t xml:space="preserve"> L'errore completo (con stack trace) viene scritto nei file di log del server (es. Log4j/SLF4J) per l'analisi da parte degli sviluppatori.</w:t>
       </w:r>
     </w:p>
     <w:p>
@@ -10339,15 +9416,7 @@
         </w:numPr>
       </w:pPr>
       <w:r>
-        <w:t xml:space="preserve">Il Connection Pool solleverà eccezioni </w:t>
-      </w:r>
-      <w:proofErr w:type="spellStart"/>
-      <w:r>
-        <w:t>SQLTransientConnectionException</w:t>
-      </w:r>
-      <w:proofErr w:type="spellEnd"/>
-      <w:r>
-        <w:t>.</w:t>
+        <w:t>Il Connection Pool solleverà eccezioni SQLTransientConnectionException.</w:t>
       </w:r>
     </w:p>
     <w:p>
@@ -10410,15 +9479,7 @@
         <w:t>Violazioni di Sicurezza</w:t>
       </w:r>
       <w:r>
-        <w:t xml:space="preserve"> Come definito nella sezione 3.5, tentativi di accesso non autorizzato (es. URL Forcing) non generano errori di sistema, ma reindirizzano l'utente alla pagina di Login o mostrano una pagina di errore 403 (</w:t>
-      </w:r>
-      <w:proofErr w:type="spellStart"/>
-      <w:r>
-        <w:t>Forbidden</w:t>
-      </w:r>
-      <w:proofErr w:type="spellEnd"/>
-      <w:r>
-        <w:t>) standardizzata.</w:t>
+        <w:t xml:space="preserve"> Come definito nella sezione 3.5, tentativi di accesso non autorizzato (es. URL Forcing) non generano errori di sistema, ma reindirizzano l'utente alla pagina di Login o mostrano una pagina di errore 403 (Forbidden) standardizzata.</w:t>
       </w:r>
     </w:p>
     <w:p/>
@@ -10448,15 +9509,7 @@
     <w:p/>
     <w:p>
       <w:r>
-        <w:t xml:space="preserve">In questa sezione verranno descritti i servizi offerti da ciascun </w:t>
-      </w:r>
-      <w:proofErr w:type="spellStart"/>
-      <w:r>
-        <w:t>subsystem</w:t>
-      </w:r>
-      <w:proofErr w:type="spellEnd"/>
-      <w:r>
-        <w:t xml:space="preserve"> applicativo.</w:t>
+        <w:t>In questa sezione verranno descritti i servizi offerti da ciascun subsystem applicativo.</w:t>
       </w:r>
     </w:p>
     <w:p/>
@@ -10467,14 +9520,9 @@
       </w:pPr>
       <w:bookmarkStart w:id="23" w:name="_Toc220175294"/>
       <w:r>
-        <w:t xml:space="preserve">4.1 </w:t>
-      </w:r>
-      <w:proofErr w:type="spellStart"/>
-      <w:r>
-        <w:t>AccessManagement</w:t>
+        <w:t>4.1 AccessManagement</w:t>
       </w:r>
       <w:bookmarkEnd w:id="23"/>
-      <w:proofErr w:type="spellEnd"/>
       <w:r>
         <w:t xml:space="preserve"> </w:t>
       </w:r>
@@ -10484,7 +9532,6 @@
       <w:pPr>
         <w:ind w:left="360"/>
       </w:pPr>
-      <w:proofErr w:type="spellStart"/>
       <w:r>
         <w:rPr>
           <w:b/>
@@ -10492,7 +9539,6 @@
         </w:rPr>
         <w:t>SessionService</w:t>
       </w:r>
-      <w:proofErr w:type="spellEnd"/>
       <w:r>
         <w:t>: gestisce il controllo degli accessi e la sicurezza della sessione. È utilizzato da tutti gli altri sistemi e dal livello client per verificare l’identità e i permessi.</w:t>
       </w:r>
@@ -10539,7 +9585,7 @@
         </w:tc>
         <w:tc>
           <w:tcPr>
-            <w:tcW w:w="4634" w:type="dxa"/>
+            <w:tcW w:w="4633" w:type="dxa"/>
             <w:vAlign w:val="center"/>
           </w:tcPr>
           <w:p>
@@ -10573,11 +9619,36 @@
         </w:tc>
         <w:tc>
           <w:tcPr>
+            <w:tcW w:w="4633" w:type="dxa"/>
+          </w:tcPr>
+          <w:p>
+            <w:r>
+              <w:t>Verifica le credenziali dell’utente.</w:t>
+            </w:r>
+          </w:p>
+        </w:tc>
+      </w:tr>
+      <w:tr>
+        <w:tc>
+          <w:tcPr>
             <w:tcW w:w="4634" w:type="dxa"/>
           </w:tcPr>
           <w:p>
             <w:r>
-              <w:t>Verifica le credenziali dell’utente e crea una nuova sessione.</w:t>
+              <w:t>getUtente</w:t>
+            </w:r>
+          </w:p>
+        </w:tc>
+        <w:tc>
+          <w:tcPr>
+            <w:tcW w:w="4633" w:type="dxa"/>
+          </w:tcPr>
+          <w:p>
+            <w:r>
+              <w:t>Ritorna un oggetto Utente per permettere la giusta inizializzazione della sessione</w:t>
+            </w:r>
+            <w:r>
+              <w:t>.</w:t>
             </w:r>
           </w:p>
         </w:tc>
@@ -10592,40 +9663,13 @@
           </w:tcPr>
           <w:p>
             <w:r>
-              <w:t>Logout</w:t>
-            </w:r>
-          </w:p>
-        </w:tc>
-        <w:tc>
-          <w:tcPr>
-            <w:tcW w:w="4634" w:type="dxa"/>
-          </w:tcPr>
-          <w:p>
-            <w:r>
-              <w:t>Invalida la sessione corrente dell’utente.</w:t>
-            </w:r>
-          </w:p>
-        </w:tc>
-      </w:tr>
-      <w:tr>
-        <w:trPr>
-          <w:trHeight w:val="390"/>
-        </w:trPr>
-        <w:tc>
-          <w:tcPr>
-            <w:tcW w:w="4634" w:type="dxa"/>
-          </w:tcPr>
-          <w:p>
-            <w:proofErr w:type="spellStart"/>
-            <w:r>
               <w:t>checkPermission</w:t>
             </w:r>
-            <w:proofErr w:type="spellEnd"/>
-          </w:p>
-        </w:tc>
-        <w:tc>
-          <w:tcPr>
-            <w:tcW w:w="4634" w:type="dxa"/>
+          </w:p>
+        </w:tc>
+        <w:tc>
+          <w:tcPr>
+            <w:tcW w:w="4633" w:type="dxa"/>
           </w:tcPr>
           <w:p>
             <w:r>
@@ -10648,20 +9692,14 @@
       </w:pPr>
       <w:bookmarkStart w:id="24" w:name="_Toc220175295"/>
       <w:r>
-        <w:t xml:space="preserve">4.2 </w:t>
-      </w:r>
-      <w:proofErr w:type="spellStart"/>
-      <w:r>
-        <w:t>AccountManagement</w:t>
+        <w:t>4.2 AccountManagement</w:t>
       </w:r>
       <w:bookmarkEnd w:id="24"/>
-      <w:proofErr w:type="spellEnd"/>
       <w:r>
         <w:br/>
       </w:r>
     </w:p>
     <w:p>
-      <w:proofErr w:type="spellStart"/>
       <w:r>
         <w:rPr>
           <w:b/>
@@ -10669,7 +9707,6 @@
         </w:rPr>
         <w:t>PersonalProfileService</w:t>
       </w:r>
-      <w:proofErr w:type="spellEnd"/>
       <w:r>
         <w:t>: gestisce tutte le operazioni che un utente autenticato può eseguire sul proprio account</w:t>
       </w:r>
@@ -10744,11 +9781,9 @@
             <w:pPr>
               <w:spacing w:after="160" w:line="259" w:lineRule="auto"/>
             </w:pPr>
-            <w:proofErr w:type="spellStart"/>
             <w:r>
               <w:t>getMyProfile</w:t>
             </w:r>
-            <w:proofErr w:type="spellEnd"/>
           </w:p>
         </w:tc>
         <w:tc>
@@ -10760,7 +9795,13 @@
               <w:spacing w:after="160" w:line="259" w:lineRule="auto"/>
             </w:pPr>
             <w:r>
-              <w:t>Recupera i dettagli dell’account dell’utente correntemente loggato.</w:t>
+              <w:t>Recupera i dettagli dell’account dell’utente corrent</w:t>
+            </w:r>
+            <w:r>
+              <w:t>a</w:t>
+            </w:r>
+            <w:r>
+              <w:t>mente loggato.</w:t>
             </w:r>
           </w:p>
         </w:tc>
@@ -10771,11 +9812,9 @@
             <w:tcW w:w="4634" w:type="dxa"/>
           </w:tcPr>
           <w:p>
-            <w:proofErr w:type="spellStart"/>
             <w:r>
               <w:t>changePwd</w:t>
             </w:r>
-            <w:proofErr w:type="spellEnd"/>
           </w:p>
         </w:tc>
         <w:tc>
@@ -10824,7 +9863,6 @@
       </w:pPr>
     </w:p>
     <w:p>
-      <w:proofErr w:type="spellStart"/>
       <w:r>
         <w:rPr>
           <w:b/>
@@ -10832,7 +9870,6 @@
         </w:rPr>
         <w:t>ProfileManagementService</w:t>
       </w:r>
-      <w:proofErr w:type="spellEnd"/>
       <w:r>
         <w:t>: gestisce le operazioni amministrative riservate al ruolo del Gestore degli account</w:t>
       </w:r>
@@ -10877,7 +9914,7 @@
         </w:tc>
         <w:tc>
           <w:tcPr>
-            <w:tcW w:w="4634" w:type="dxa"/>
+            <w:tcW w:w="4633" w:type="dxa"/>
             <w:vAlign w:val="center"/>
           </w:tcPr>
           <w:p>
@@ -10907,16 +9944,14 @@
             <w:pPr>
               <w:spacing w:after="160" w:line="259" w:lineRule="auto"/>
             </w:pPr>
-            <w:proofErr w:type="spellStart"/>
             <w:r>
               <w:t>addAccount</w:t>
             </w:r>
-            <w:proofErr w:type="spellEnd"/>
-          </w:p>
-        </w:tc>
-        <w:tc>
-          <w:tcPr>
-            <w:tcW w:w="4634" w:type="dxa"/>
+          </w:p>
+        </w:tc>
+        <w:tc>
+          <w:tcPr>
+            <w:tcW w:w="4633" w:type="dxa"/>
           </w:tcPr>
           <w:p>
             <w:pPr>
@@ -10934,16 +9969,14 @@
             <w:tcW w:w="4634" w:type="dxa"/>
           </w:tcPr>
           <w:p>
-            <w:proofErr w:type="spellStart"/>
             <w:r>
               <w:t>getAccount</w:t>
             </w:r>
-            <w:proofErr w:type="spellEnd"/>
-          </w:p>
-        </w:tc>
-        <w:tc>
-          <w:tcPr>
-            <w:tcW w:w="4634" w:type="dxa"/>
+          </w:p>
+        </w:tc>
+        <w:tc>
+          <w:tcPr>
+            <w:tcW w:w="4633" w:type="dxa"/>
           </w:tcPr>
           <w:p>
             <w:r>
@@ -10958,20 +9991,18 @@
             <w:tcW w:w="4634" w:type="dxa"/>
           </w:tcPr>
           <w:p>
-            <w:proofErr w:type="spellStart"/>
             <w:r>
               <w:t>generateNewPwd</w:t>
             </w:r>
-            <w:proofErr w:type="spellEnd"/>
-          </w:p>
-        </w:tc>
-        <w:tc>
-          <w:tcPr>
-            <w:tcW w:w="4634" w:type="dxa"/>
-          </w:tcPr>
-          <w:p>
-            <w:r>
-              <w:t>Permette di rimpiazzare la password preesistente di un account con una nuova.</w:t>
+          </w:p>
+        </w:tc>
+        <w:tc>
+          <w:tcPr>
+            <w:tcW w:w="4633" w:type="dxa"/>
+          </w:tcPr>
+          <w:p>
+            <w:r>
+              <w:t>Genera e ritorna una nuova password</w:t>
             </w:r>
           </w:p>
         </w:tc>
@@ -10982,16 +10013,14 @@
             <w:tcW w:w="4634" w:type="dxa"/>
           </w:tcPr>
           <w:p>
-            <w:proofErr w:type="spellStart"/>
             <w:r>
               <w:t>modifyRole</w:t>
             </w:r>
-            <w:proofErr w:type="spellEnd"/>
-          </w:p>
-        </w:tc>
-        <w:tc>
-          <w:tcPr>
-            <w:tcW w:w="4634" w:type="dxa"/>
+          </w:p>
+        </w:tc>
+        <w:tc>
+          <w:tcPr>
+            <w:tcW w:w="4633" w:type="dxa"/>
           </w:tcPr>
           <w:p>
             <w:r>
@@ -11006,16 +10035,14 @@
             <w:tcW w:w="4634" w:type="dxa"/>
           </w:tcPr>
           <w:p>
-            <w:proofErr w:type="spellStart"/>
             <w:r>
               <w:t>modifySupervisor</w:t>
             </w:r>
-            <w:proofErr w:type="spellEnd"/>
-          </w:p>
-        </w:tc>
-        <w:tc>
-          <w:tcPr>
-            <w:tcW w:w="4634" w:type="dxa"/>
+          </w:p>
+        </w:tc>
+        <w:tc>
+          <w:tcPr>
+            <w:tcW w:w="4633" w:type="dxa"/>
           </w:tcPr>
           <w:p>
             <w:r>
@@ -11030,16 +10057,36 @@
             <w:tcW w:w="4634" w:type="dxa"/>
           </w:tcPr>
           <w:p>
-            <w:proofErr w:type="spellStart"/>
+            <w:r>
+              <w:t>replacePassword</w:t>
+            </w:r>
+          </w:p>
+        </w:tc>
+        <w:tc>
+          <w:tcPr>
+            <w:tcW w:w="4633" w:type="dxa"/>
+          </w:tcPr>
+          <w:p>
+            <w:r>
+              <w:t>Rimpiazza la password all’interno del database dell’account indicato</w:t>
+            </w:r>
+          </w:p>
+        </w:tc>
+      </w:tr>
+      <w:tr>
+        <w:tc>
+          <w:tcPr>
+            <w:tcW w:w="4634" w:type="dxa"/>
+          </w:tcPr>
+          <w:p>
             <w:r>
               <w:t>deleteAccount</w:t>
             </w:r>
-            <w:proofErr w:type="spellEnd"/>
-          </w:p>
-        </w:tc>
-        <w:tc>
-          <w:tcPr>
-            <w:tcW w:w="4634" w:type="dxa"/>
+          </w:p>
+        </w:tc>
+        <w:tc>
+          <w:tcPr>
+            <w:tcW w:w="4633" w:type="dxa"/>
           </w:tcPr>
           <w:p>
             <w:r>
@@ -11061,18 +10108,12 @@
       </w:pPr>
       <w:bookmarkStart w:id="25" w:name="_Toc220175296"/>
       <w:r>
-        <w:t xml:space="preserve">4.3 </w:t>
-      </w:r>
-      <w:proofErr w:type="spellStart"/>
-      <w:r>
-        <w:t>TaskManagement</w:t>
+        <w:t>4.3 TaskManagement</w:t>
       </w:r>
       <w:bookmarkEnd w:id="25"/>
-      <w:proofErr w:type="spellEnd"/>
     </w:p>
     <w:p/>
     <w:p>
-      <w:proofErr w:type="spellStart"/>
       <w:r>
         <w:rPr>
           <w:b/>
@@ -11080,7 +10121,6 @@
         </w:rPr>
         <w:t>TaskCommonService</w:t>
       </w:r>
-      <w:proofErr w:type="spellEnd"/>
       <w:r>
         <w:t xml:space="preserve">: </w:t>
       </w:r>
@@ -11160,11 +10200,9 @@
             <w:pPr>
               <w:spacing w:after="160" w:line="259" w:lineRule="auto"/>
             </w:pPr>
-            <w:proofErr w:type="spellStart"/>
             <w:r>
               <w:t>getTask</w:t>
             </w:r>
-            <w:proofErr w:type="spellEnd"/>
           </w:p>
         </w:tc>
         <w:tc>
@@ -11187,11 +10225,9 @@
             <w:tcW w:w="4634" w:type="dxa"/>
           </w:tcPr>
           <w:p>
-            <w:proofErr w:type="spellStart"/>
             <w:r>
               <w:t>filterTask</w:t>
             </w:r>
-            <w:proofErr w:type="spellEnd"/>
           </w:p>
         </w:tc>
         <w:tc>
@@ -11200,15 +10236,7 @@
           </w:tcPr>
           <w:p>
             <w:r>
-              <w:t xml:space="preserve">Permette di filtrare task per stato (da completare, inizializzate </w:t>
-            </w:r>
-            <w:proofErr w:type="spellStart"/>
-            <w:r>
-              <w:t>ecc</w:t>
-            </w:r>
-            <w:proofErr w:type="spellEnd"/>
-            <w:r>
-              <w:t>…).</w:t>
+              <w:t>Permette di filtrare task per stato (da completare, inizializzate ecc…).</w:t>
             </w:r>
           </w:p>
         </w:tc>
@@ -11219,11 +10247,9 @@
             <w:tcW w:w="4634" w:type="dxa"/>
           </w:tcPr>
           <w:p>
-            <w:proofErr w:type="spellStart"/>
             <w:r>
               <w:t>holdTask</w:t>
             </w:r>
-            <w:proofErr w:type="spellEnd"/>
           </w:p>
         </w:tc>
         <w:tc>
@@ -11243,11 +10269,9 @@
             <w:tcW w:w="4634" w:type="dxa"/>
           </w:tcPr>
           <w:p>
-            <w:proofErr w:type="spellStart"/>
             <w:r>
               <w:t>dowloadAllegato</w:t>
             </w:r>
-            <w:proofErr w:type="spellEnd"/>
           </w:p>
         </w:tc>
         <w:tc>
@@ -11278,16 +10302,13 @@
     </w:p>
     <w:p/>
     <w:p>
-      <w:proofErr w:type="spellStart"/>
       <w:r>
         <w:rPr>
           <w:b/>
           <w:bCs/>
         </w:rPr>
-        <w:lastRenderedPageBreak/>
         <w:t>TaskSupervisoreService</w:t>
       </w:r>
-      <w:proofErr w:type="spellEnd"/>
       <w:r>
         <w:t>: espone tutte le operazioni eseguibili da un Supervisore sul ciclo di vita di un task</w:t>
       </w:r>
@@ -11364,11 +10385,9 @@
             <w:pPr>
               <w:spacing w:after="160" w:line="259" w:lineRule="auto"/>
             </w:pPr>
-            <w:proofErr w:type="spellStart"/>
             <w:r>
               <w:t>createTask</w:t>
             </w:r>
-            <w:proofErr w:type="spellEnd"/>
           </w:p>
         </w:tc>
         <w:tc>
@@ -11391,11 +10410,9 @@
             <w:tcW w:w="4634" w:type="dxa"/>
           </w:tcPr>
           <w:p>
-            <w:proofErr w:type="spellStart"/>
             <w:r>
               <w:t>deleteTask</w:t>
             </w:r>
-            <w:proofErr w:type="spellEnd"/>
           </w:p>
         </w:tc>
         <w:tc>
@@ -11415,11 +10432,9 @@
             <w:tcW w:w="4634" w:type="dxa"/>
           </w:tcPr>
           <w:p>
-            <w:proofErr w:type="spellStart"/>
             <w:r>
               <w:t>sendWarning</w:t>
             </w:r>
-            <w:proofErr w:type="spellEnd"/>
           </w:p>
         </w:tc>
         <w:tc>
@@ -11442,7 +10457,6 @@
     </w:tbl>
     <w:p/>
     <w:p>
-      <w:proofErr w:type="spellStart"/>
       <w:r>
         <w:rPr>
           <w:b/>
@@ -11450,7 +10464,6 @@
         </w:rPr>
         <w:t>TaskDipendenteService</w:t>
       </w:r>
-      <w:proofErr w:type="spellEnd"/>
       <w:r>
         <w:t>: espone tutte le operazioni eseguibili da un Dipendente sul ciclo di vita di un task.</w:t>
       </w:r>
@@ -11525,11 +10538,9 @@
             <w:pPr>
               <w:spacing w:after="160" w:line="259" w:lineRule="auto"/>
             </w:pPr>
-            <w:proofErr w:type="spellStart"/>
             <w:r>
               <w:t>inizializzaTask</w:t>
             </w:r>
-            <w:proofErr w:type="spellEnd"/>
           </w:p>
         </w:tc>
         <w:tc>
@@ -11561,11 +10572,9 @@
             <w:tcW w:w="4634" w:type="dxa"/>
           </w:tcPr>
           <w:p>
-            <w:proofErr w:type="spellStart"/>
             <w:r>
               <w:t>completeTask</w:t>
             </w:r>
-            <w:proofErr w:type="spellEnd"/>
           </w:p>
         </w:tc>
         <w:tc>
@@ -11594,18 +10603,12 @@
       </w:pPr>
       <w:bookmarkStart w:id="26" w:name="_Toc220175297"/>
       <w:r>
-        <w:t xml:space="preserve">4.5 </w:t>
-      </w:r>
-      <w:proofErr w:type="spellStart"/>
-      <w:r>
-        <w:t>NotificheManagement</w:t>
+        <w:t>4.5 NotificheManagement</w:t>
       </w:r>
       <w:bookmarkEnd w:id="26"/>
-      <w:proofErr w:type="spellEnd"/>
     </w:p>
     <w:p/>
     <w:p>
-      <w:proofErr w:type="spellStart"/>
       <w:r>
         <w:rPr>
           <w:b/>
@@ -11613,7 +10616,6 @@
         </w:rPr>
         <w:t>NotificheService</w:t>
       </w:r>
-      <w:proofErr w:type="spellEnd"/>
       <w:r>
         <w:t xml:space="preserve">: gestisce la comunicazione asincrona e gli avvisi. </w:t>
       </w:r>
@@ -11688,11 +10690,9 @@
             <w:pPr>
               <w:spacing w:after="160" w:line="259" w:lineRule="auto"/>
             </w:pPr>
-            <w:proofErr w:type="spellStart"/>
             <w:r>
               <w:t>showNotification</w:t>
             </w:r>
-            <w:proofErr w:type="spellEnd"/>
           </w:p>
         </w:tc>
         <w:tc>
@@ -11715,11 +10715,9 @@
             <w:tcW w:w="4634" w:type="dxa"/>
           </w:tcPr>
           <w:p>
-            <w:proofErr w:type="spellStart"/>
             <w:r>
               <w:t>send</w:t>
             </w:r>
-            <w:proofErr w:type="spellEnd"/>
           </w:p>
         </w:tc>
         <w:tc>
@@ -11744,18 +10742,12 @@
       <w:bookmarkStart w:id="27" w:name="_Toc220175298"/>
       <w:r>
         <w:lastRenderedPageBreak/>
-        <w:t xml:space="preserve">4.6 </w:t>
-      </w:r>
-      <w:proofErr w:type="spellStart"/>
-      <w:r>
-        <w:t>PersistenceManagement</w:t>
+        <w:t>4.6 PersistenceManagement</w:t>
       </w:r>
       <w:bookmarkEnd w:id="27"/>
-      <w:proofErr w:type="spellEnd"/>
     </w:p>
     <w:p/>
     <w:p>
-      <w:proofErr w:type="spellStart"/>
       <w:r>
         <w:rPr>
           <w:b/>
@@ -11763,7 +10755,6 @@
         </w:rPr>
         <w:t>PersistenceService</w:t>
       </w:r>
-      <w:proofErr w:type="spellEnd"/>
       <w:r>
         <w:rPr>
           <w:b/>
@@ -11850,11 +10841,9 @@
             <w:pPr>
               <w:spacing w:after="160" w:line="259" w:lineRule="auto"/>
             </w:pPr>
-            <w:proofErr w:type="spellStart"/>
             <w:r>
               <w:t>getUtenteDAO</w:t>
             </w:r>
-            <w:proofErr w:type="spellEnd"/>
           </w:p>
         </w:tc>
         <w:tc>
@@ -11866,15 +10855,7 @@
               <w:spacing w:after="160" w:line="259" w:lineRule="auto"/>
             </w:pPr>
             <w:r>
-              <w:t xml:space="preserve">Restituisce un riferimento ad un oggetto della classe </w:t>
-            </w:r>
-            <w:proofErr w:type="spellStart"/>
-            <w:r>
-              <w:t>UtenteDAO</w:t>
-            </w:r>
-            <w:proofErr w:type="spellEnd"/>
-            <w:r>
-              <w:t xml:space="preserve"> </w:t>
+              <w:t xml:space="preserve">Restituisce un riferimento ad un oggetto della classe UtenteDAO </w:t>
             </w:r>
           </w:p>
         </w:tc>
@@ -11885,11 +10866,9 @@
             <w:tcW w:w="4634" w:type="dxa"/>
           </w:tcPr>
           <w:p>
-            <w:proofErr w:type="spellStart"/>
             <w:r>
               <w:t>getTaskDAO</w:t>
             </w:r>
-            <w:proofErr w:type="spellEnd"/>
           </w:p>
         </w:tc>
         <w:tc>
@@ -11901,13 +10880,8 @@
               <w:t xml:space="preserve">Restituisce un riferimento ad un oggetto della </w:t>
             </w:r>
             <w:r>
-              <w:t xml:space="preserve">classe </w:t>
-            </w:r>
-            <w:proofErr w:type="spellStart"/>
-            <w:r>
-              <w:t>TaskDAO</w:t>
-            </w:r>
-            <w:proofErr w:type="spellEnd"/>
+              <w:t>classe TaskDAO</w:t>
+            </w:r>
           </w:p>
         </w:tc>
       </w:tr>
@@ -11922,11 +10896,9 @@
                 <w:tab w:val="center" w:pos="2209"/>
               </w:tabs>
             </w:pPr>
-            <w:proofErr w:type="spellStart"/>
             <w:r>
               <w:t>getNotificheDAO</w:t>
             </w:r>
-            <w:proofErr w:type="spellEnd"/>
           </w:p>
         </w:tc>
         <w:tc>
@@ -11937,11 +10909,9 @@
             <w:r>
               <w:t xml:space="preserve">Restituisce un riferimento ad un oggetto della classe </w:t>
             </w:r>
-            <w:proofErr w:type="spellStart"/>
             <w:r>
               <w:t>NotificheDAO</w:t>
             </w:r>
-            <w:proofErr w:type="spellEnd"/>
           </w:p>
         </w:tc>
       </w:tr>
@@ -11949,7 +10919,6 @@
     <w:p/>
     <w:p/>
     <w:p>
-      <w:proofErr w:type="spellStart"/>
       <w:r>
         <w:rPr>
           <w:b/>
@@ -11957,7 +10926,6 @@
         </w:rPr>
         <w:t>ITaskDAO</w:t>
       </w:r>
-      <w:proofErr w:type="spellEnd"/>
       <w:r>
         <w:t>: gestisce tutte le operazioni CRUD del sistema riguardando i task.</w:t>
       </w:r>
@@ -12059,11 +11027,9 @@
             <w:tcW w:w="4634" w:type="dxa"/>
           </w:tcPr>
           <w:p>
-            <w:proofErr w:type="spellStart"/>
             <w:r>
               <w:t>findById</w:t>
             </w:r>
-            <w:proofErr w:type="spellEnd"/>
           </w:p>
         </w:tc>
         <w:tc>
@@ -12083,11 +11049,9 @@
             <w:tcW w:w="4634" w:type="dxa"/>
           </w:tcPr>
           <w:p>
-            <w:proofErr w:type="spellStart"/>
             <w:r>
               <w:t>findByUtente</w:t>
             </w:r>
-            <w:proofErr w:type="spellEnd"/>
           </w:p>
         </w:tc>
         <w:tc>
@@ -12107,11 +11071,9 @@
             <w:tcW w:w="4634" w:type="dxa"/>
           </w:tcPr>
           <w:p>
-            <w:proofErr w:type="spellStart"/>
             <w:r>
               <w:t>updateStatus</w:t>
             </w:r>
-            <w:proofErr w:type="spellEnd"/>
           </w:p>
         </w:tc>
         <w:tc>
@@ -12150,7 +11112,6 @@
     </w:tbl>
     <w:p/>
     <w:p>
-      <w:proofErr w:type="spellStart"/>
       <w:r>
         <w:rPr>
           <w:b/>
@@ -12172,7 +11133,6 @@
         </w:rPr>
         <w:t>DAO</w:t>
       </w:r>
-      <w:proofErr w:type="spellEnd"/>
       <w:r>
         <w:rPr>
           <w:b/>
@@ -12256,14 +11216,12 @@
             <w:pPr>
               <w:spacing w:after="160" w:line="259" w:lineRule="auto"/>
             </w:pPr>
-            <w:proofErr w:type="spellStart"/>
             <w:r>
               <w:t>Create</w:t>
             </w:r>
             <w:r>
               <w:t>Utente</w:t>
             </w:r>
-            <w:proofErr w:type="spellEnd"/>
           </w:p>
         </w:tc>
         <w:tc>
@@ -12286,11 +11244,9 @@
             <w:tcW w:w="4634" w:type="dxa"/>
           </w:tcPr>
           <w:p>
-            <w:proofErr w:type="spellStart"/>
             <w:r>
               <w:t>createDipendente</w:t>
             </w:r>
-            <w:proofErr w:type="spellEnd"/>
           </w:p>
         </w:tc>
         <w:tc>
@@ -12310,11 +11266,9 @@
             <w:tcW w:w="4634" w:type="dxa"/>
           </w:tcPr>
           <w:p>
-            <w:proofErr w:type="spellStart"/>
             <w:r>
               <w:t>createSupervisore</w:t>
             </w:r>
-            <w:proofErr w:type="spellEnd"/>
           </w:p>
         </w:tc>
         <w:tc>
@@ -12334,12 +11288,10 @@
             <w:tcW w:w="4634" w:type="dxa"/>
           </w:tcPr>
           <w:p>
-            <w:proofErr w:type="spellStart"/>
             <w:r>
               <w:lastRenderedPageBreak/>
               <w:t>findByMatricola</w:t>
             </w:r>
-            <w:proofErr w:type="spellEnd"/>
           </w:p>
         </w:tc>
         <w:tc>
@@ -12359,11 +11311,9 @@
             <w:tcW w:w="4634" w:type="dxa"/>
           </w:tcPr>
           <w:p>
-            <w:proofErr w:type="spellStart"/>
             <w:r>
               <w:t>findByEmail</w:t>
             </w:r>
-            <w:proofErr w:type="spellEnd"/>
           </w:p>
         </w:tc>
         <w:tc>
@@ -12372,13 +11322,8 @@
           </w:tcPr>
           <w:p>
             <w:r>
-              <w:t xml:space="preserve">Permette di recuperare un utente dal database utilizzando </w:t>
-            </w:r>
-            <w:proofErr w:type="gramStart"/>
-            <w:r>
-              <w:t>l’email</w:t>
-            </w:r>
-            <w:proofErr w:type="gramEnd"/>
+              <w:t>Permette di recuperare un utente dal database utilizzando l’email</w:t>
+            </w:r>
           </w:p>
         </w:tc>
       </w:tr>
@@ -12388,11 +11333,9 @@
             <w:tcW w:w="4634" w:type="dxa"/>
           </w:tcPr>
           <w:p>
-            <w:proofErr w:type="spellStart"/>
             <w:r>
               <w:t>getAllDipendentiInfo</w:t>
             </w:r>
-            <w:proofErr w:type="spellEnd"/>
           </w:p>
         </w:tc>
         <w:tc>
@@ -12412,11 +11355,9 @@
             <w:tcW w:w="4634" w:type="dxa"/>
           </w:tcPr>
           <w:p>
-            <w:proofErr w:type="spellStart"/>
             <w:r>
               <w:t>getSupervisoreInfo</w:t>
             </w:r>
-            <w:proofErr w:type="spellEnd"/>
           </w:p>
         </w:tc>
         <w:tc>
@@ -12436,11 +11377,9 @@
             <w:tcW w:w="4634" w:type="dxa"/>
           </w:tcPr>
           <w:p>
-            <w:proofErr w:type="spellStart"/>
             <w:r>
               <w:t>updateRuolo</w:t>
             </w:r>
-            <w:proofErr w:type="spellEnd"/>
           </w:p>
         </w:tc>
         <w:tc>
@@ -12460,11 +11399,9 @@
             <w:tcW w:w="4634" w:type="dxa"/>
           </w:tcPr>
           <w:p>
-            <w:proofErr w:type="spellStart"/>
             <w:r>
               <w:t>updateSupervisore</w:t>
             </w:r>
-            <w:proofErr w:type="spellEnd"/>
           </w:p>
         </w:tc>
         <w:tc>
@@ -12484,11 +11421,9 @@
             <w:tcW w:w="4634" w:type="dxa"/>
           </w:tcPr>
           <w:p>
-            <w:proofErr w:type="spellStart"/>
             <w:r>
               <w:t>updatePassword</w:t>
             </w:r>
-            <w:proofErr w:type="spellEnd"/>
           </w:p>
         </w:tc>
         <w:tc>
@@ -12497,15 +11432,7 @@
           </w:tcPr>
           <w:p>
             <w:r>
-              <w:t>Cambia l’</w:t>
-            </w:r>
-            <w:proofErr w:type="spellStart"/>
-            <w:r>
-              <w:t>hash</w:t>
-            </w:r>
-            <w:proofErr w:type="spellEnd"/>
-            <w:r>
-              <w:t xml:space="preserve"> della password nel database </w:t>
+              <w:t xml:space="preserve">Cambia l’hash della password nel database </w:t>
             </w:r>
           </w:p>
         </w:tc>
@@ -12538,11 +11465,9 @@
             <w:tcW w:w="4634" w:type="dxa"/>
           </w:tcPr>
           <w:p>
-            <w:proofErr w:type="spellStart"/>
             <w:r>
               <w:t>recuperaPassword</w:t>
             </w:r>
-            <w:proofErr w:type="spellEnd"/>
           </w:p>
         </w:tc>
         <w:tc>
@@ -12551,15 +11476,7 @@
           </w:tcPr>
           <w:p>
             <w:r>
-              <w:t xml:space="preserve">Permettere di ottenere la password sul database utilizzando </w:t>
-            </w:r>
-            <w:proofErr w:type="gramStart"/>
-            <w:r>
-              <w:t>l’email</w:t>
-            </w:r>
-            <w:proofErr w:type="gramEnd"/>
-            <w:r>
-              <w:t xml:space="preserve"> dell’utente</w:t>
+              <w:t>Permettere di ottenere la password sul database utilizzando l’email dell’utente</w:t>
             </w:r>
           </w:p>
         </w:tc>
@@ -12582,7 +11499,6 @@
       </w:pPr>
     </w:p>
     <w:p>
-      <w:proofErr w:type="spellStart"/>
       <w:r>
         <w:rPr>
           <w:b/>
@@ -12590,7 +11506,6 @@
         </w:rPr>
         <w:t>INotificheDAO</w:t>
       </w:r>
-      <w:proofErr w:type="spellEnd"/>
       <w:r>
         <w:t>: gestisce tutte le operazioni CRUD del sistema riguardando le notifiche</w:t>
       </w:r>
@@ -12693,11 +11608,9 @@
             <w:tcW w:w="4634" w:type="dxa"/>
           </w:tcPr>
           <w:p>
-            <w:proofErr w:type="spellStart"/>
             <w:r>
               <w:t>getByUtente</w:t>
             </w:r>
-            <w:proofErr w:type="spellEnd"/>
           </w:p>
         </w:tc>
         <w:tc>
@@ -12752,49 +11665,31 @@
           <w:bCs/>
         </w:rPr>
       </w:pPr>
-      <w:proofErr w:type="spellStart"/>
       <w:r>
         <w:rPr>
           <w:b/>
           <w:bCs/>
         </w:rPr>
-        <w:t>Deploy</w:t>
-      </w:r>
-      <w:proofErr w:type="spellEnd"/>
+        <w:t>Deploy / Deployment:</w:t>
+      </w:r>
+      <w:r>
+        <w:t xml:space="preserve"> L'atto di installare e avviare l'applicazione sul server di produzione. È il momento in cui il codice scritto dai programmatori viene impacchettato e messo in condizione di essere usato dagli utenti.</w:t>
+      </w:r>
       <w:r>
         <w:rPr>
           <w:b/>
           <w:bCs/>
         </w:rPr>
-        <w:t xml:space="preserve"> / Deployment:</w:t>
-      </w:r>
-      <w:r>
-        <w:t xml:space="preserve"> L'atto di installare e avviare l'applicazione sul server di produzione. È il momento in cui il codice scritto dai programmatori viene impacchettato e messo in condizione di essere usato dagli utenti.</w:t>
-      </w:r>
+        <w:t xml:space="preserve"> </w:t>
+      </w:r>
+    </w:p>
+    <w:p>
       <w:r>
         <w:rPr>
           <w:b/>
           <w:bCs/>
         </w:rPr>
-        <w:t xml:space="preserve"> </w:t>
-      </w:r>
-    </w:p>
-    <w:p>
-      <w:proofErr w:type="spellStart"/>
-      <w:r>
-        <w:rPr>
-          <w:b/>
-          <w:bCs/>
-        </w:rPr>
-        <w:t>Graceful</w:t>
-      </w:r>
-      <w:proofErr w:type="spellEnd"/>
-      <w:r>
-        <w:rPr>
-          <w:b/>
-          <w:bCs/>
-        </w:rPr>
-        <w:t xml:space="preserve"> Shutdown:</w:t>
+        <w:t>Graceful Shutdown:</w:t>
       </w:r>
       <w:r>
         <w:t xml:space="preserve"> Una procedura di spegnimento controllato.</w:t>
@@ -13163,6 +12058,13 @@
             </w:rPr>
             <w:t>2</w:t>
           </w:r>
+          <w:r>
+            <w:rPr>
+              <w:b w:val="0"/>
+              <w:sz w:val="20"/>
+            </w:rPr>
+            <w:t>.1</w:t>
+          </w:r>
         </w:p>
       </w:tc>
     </w:tr>
@@ -13196,16 +12098,8 @@
             <w:rPr>
               <w:sz w:val="20"/>
             </w:rPr>
-            <w:t xml:space="preserve">System Design </w:t>
+            <w:t>System Design Document</w:t>
           </w:r>
-          <w:proofErr w:type="spellStart"/>
-          <w:r>
-            <w:rPr>
-              <w:sz w:val="20"/>
-            </w:rPr>
-            <w:t>Document</w:t>
-          </w:r>
-          <w:proofErr w:type="spellEnd"/>
         </w:p>
       </w:tc>
       <w:tc>
@@ -13235,7 +12129,19 @@
             <w:rPr>
               <w:sz w:val="20"/>
             </w:rPr>
-            <w:t>24/01</w:t>
+            <w:t>2</w:t>
+          </w:r>
+          <w:r>
+            <w:rPr>
+              <w:sz w:val="20"/>
+            </w:rPr>
+            <w:t>6</w:t>
+          </w:r>
+          <w:r>
+            <w:rPr>
+              <w:sz w:val="20"/>
+            </w:rPr>
+            <w:t>/01</w:t>
           </w:r>
           <w:r>
             <w:rPr>

</xml_diff>

<commit_message>
Mod: modificati degli spazi ed errori nei documenti
</commit_message>
<xml_diff>
--- a/Workspace/SDD/SDD_EWMS.docx
+++ b/Workspace/SDD/SDD_EWMS.docx
@@ -126,6 +126,7 @@
         </w:rPr>
         <w:br/>
       </w:r>
+      <w:proofErr w:type="spellStart"/>
       <w:r>
         <w:rPr>
           <w:rFonts w:ascii="Arial" w:hAnsi="Arial"/>
@@ -133,8 +134,9 @@
           <w:sz w:val="36"/>
           <w:lang w:val="en-GB"/>
         </w:rPr>
-        <w:t>System Design Document</w:t>
-      </w:r>
+        <w:t>System</w:t>
+      </w:r>
+      <w:proofErr w:type="spellEnd"/>
       <w:r>
         <w:rPr>
           <w:rFonts w:ascii="Arial" w:hAnsi="Arial"/>
@@ -142,8 +144,36 @@
           <w:sz w:val="36"/>
           <w:lang w:val="en-GB"/>
         </w:rPr>
+        <w:t xml:space="preserve"> Design Document</w:t>
+      </w:r>
+      <w:r>
+        <w:rPr>
+          <w:rFonts w:ascii="Arial" w:hAnsi="Arial"/>
+          <w:b/>
+          <w:sz w:val="36"/>
+          <w:lang w:val="en-GB"/>
+        </w:rPr>
         <w:br/>
-        <w:t xml:space="preserve">Versione </w:t>
+      </w:r>
+      <w:proofErr w:type="spellStart"/>
+      <w:r>
+        <w:rPr>
+          <w:rFonts w:ascii="Arial" w:hAnsi="Arial"/>
+          <w:b/>
+          <w:sz w:val="36"/>
+          <w:lang w:val="en-GB"/>
+        </w:rPr>
+        <w:t>Versione</w:t>
+      </w:r>
+      <w:proofErr w:type="spellEnd"/>
+      <w:r>
+        <w:rPr>
+          <w:rFonts w:ascii="Arial" w:hAnsi="Arial"/>
+          <w:b/>
+          <w:sz w:val="36"/>
+          <w:lang w:val="en-GB"/>
+        </w:rPr>
+        <w:t xml:space="preserve"> </w:t>
       </w:r>
       <w:r>
         <w:rPr>
@@ -1051,13 +1081,23 @@
           <w:sz w:val="32"/>
         </w:rPr>
       </w:pPr>
+      <w:proofErr w:type="spellStart"/>
       <w:r>
         <w:rPr>
           <w:rFonts w:cs="Times New Roman"/>
           <w:b/>
           <w:sz w:val="32"/>
         </w:rPr>
-        <w:t>Revision History</w:t>
+        <w:t>Revision</w:t>
+      </w:r>
+      <w:proofErr w:type="spellEnd"/>
+      <w:r>
+        <w:rPr>
+          <w:rFonts w:cs="Times New Roman"/>
+          <w:b/>
+          <w:sz w:val="32"/>
+        </w:rPr>
+        <w:t xml:space="preserve"> History</w:t>
       </w:r>
       <w:r>
         <w:rPr>
@@ -1267,8 +1307,16 @@
               <w:rPr>
                 <w:sz w:val="20"/>
               </w:rPr>
-              <w:t>Assemblaggio documento a partire dai singoli prodotti effettuati dal team</w:t>
-            </w:r>
+              <w:t xml:space="preserve">Assemblaggio documento a partire dai singoli prodotti effettuati </w:t>
+            </w:r>
+            <w:proofErr w:type="gramStart"/>
+            <w:r>
+              <w:rPr>
+                <w:sz w:val="20"/>
+              </w:rPr>
+              <w:t>dal team</w:t>
+            </w:r>
+            <w:proofErr w:type="gramEnd"/>
           </w:p>
         </w:tc>
         <w:tc>
@@ -1385,8 +1433,30 @@
               <w:rPr>
                 <w:sz w:val="20"/>
               </w:rPr>
-              <w:t>Modificati il component e deployment diagram, modificato i servizi offerti dal PersistanceManagement</w:t>
-            </w:r>
+              <w:t xml:space="preserve">Modificati il component e deployment </w:t>
+            </w:r>
+            <w:proofErr w:type="spellStart"/>
+            <w:r>
+              <w:rPr>
+                <w:sz w:val="20"/>
+              </w:rPr>
+              <w:t>diagram</w:t>
+            </w:r>
+            <w:proofErr w:type="spellEnd"/>
+            <w:r>
+              <w:rPr>
+                <w:sz w:val="20"/>
+              </w:rPr>
+              <w:t xml:space="preserve">, modificato i servizi offerti dal </w:t>
+            </w:r>
+            <w:proofErr w:type="spellStart"/>
+            <w:r>
+              <w:rPr>
+                <w:sz w:val="20"/>
+              </w:rPr>
+              <w:t>PersistanceManagement</w:t>
+            </w:r>
+            <w:proofErr w:type="spellEnd"/>
           </w:p>
         </w:tc>
         <w:tc>
@@ -1490,8 +1560,30 @@
               <w:rPr>
                 <w:sz w:val="20"/>
               </w:rPr>
-              <w:t>Aggiunti metodi alle interfaccia UtenteDAO</w:t>
-            </w:r>
+              <w:t xml:space="preserve">Aggiunti metodi </w:t>
+            </w:r>
+            <w:proofErr w:type="gramStart"/>
+            <w:r>
+              <w:rPr>
+                <w:sz w:val="20"/>
+              </w:rPr>
+              <w:t>alle interfaccia</w:t>
+            </w:r>
+            <w:proofErr w:type="gramEnd"/>
+            <w:r>
+              <w:rPr>
+                <w:sz w:val="20"/>
+              </w:rPr>
+              <w:t xml:space="preserve"> </w:t>
+            </w:r>
+            <w:proofErr w:type="spellStart"/>
+            <w:r>
+              <w:rPr>
+                <w:sz w:val="20"/>
+              </w:rPr>
+              <w:t>UtenteDAO</w:t>
+            </w:r>
+            <w:proofErr w:type="spellEnd"/>
           </w:p>
         </w:tc>
         <w:tc>
@@ -1600,8 +1692,33 @@
                 <w:sz w:val="20"/>
                 <w14:ligatures w14:val="standardContextual"/>
               </w:rPr>
-              <w:t>Aggiunti metodi per servizi di AccountManagement e AccessManagement</w:t>
-            </w:r>
+              <w:t xml:space="preserve">Aggiunti metodi per servizi di </w:t>
+            </w:r>
+            <w:proofErr w:type="spellStart"/>
+            <w:r>
+              <w:rPr>
+                <w:sz w:val="20"/>
+                <w14:ligatures w14:val="standardContextual"/>
+              </w:rPr>
+              <w:t>AccountManagement</w:t>
+            </w:r>
+            <w:proofErr w:type="spellEnd"/>
+            <w:r>
+              <w:rPr>
+                <w:sz w:val="20"/>
+                <w14:ligatures w14:val="standardContextual"/>
+              </w:rPr>
+              <w:t xml:space="preserve"> e </w:t>
+            </w:r>
+            <w:proofErr w:type="spellStart"/>
+            <w:r>
+              <w:rPr>
+                <w:sz w:val="20"/>
+                <w14:ligatures w14:val="standardContextual"/>
+              </w:rPr>
+              <w:t>AccessManagement</w:t>
+            </w:r>
+            <w:proofErr w:type="spellEnd"/>
           </w:p>
         </w:tc>
         <w:tc>
@@ -4264,9 +4381,11 @@
         <w:br/>
         <w:t xml:space="preserve">Per garantire la compatibilità cross-browser, è necessario rinunciare o limitare l’uso di funzionalità web </w:t>
       </w:r>
+      <w:proofErr w:type="gramStart"/>
       <w:r>
         <w:t>ultra-moderne</w:t>
       </w:r>
+      <w:proofErr w:type="gramEnd"/>
       <w:r>
         <w:t xml:space="preserve"> non ancora supportate uniformemente dai browser.</w:t>
       </w:r>
@@ -4284,8 +4403,13 @@
         <w:t xml:space="preserve"> o</w:t>
       </w:r>
       <w:r>
-        <w:t xml:space="preserve"> animazioni WebGPU</w:t>
-      </w:r>
+        <w:t xml:space="preserve"> animazioni </w:t>
+      </w:r>
+      <w:proofErr w:type="spellStart"/>
+      <w:r>
+        <w:t>WebGPU</w:t>
+      </w:r>
+      <w:proofErr w:type="spellEnd"/>
       <w:r>
         <w:t xml:space="preserve"> </w:t>
       </w:r>
@@ -4375,7 +4499,15 @@
         <w:t>a</w:t>
       </w:r>
       <w:r>
-        <w:t xml:space="preserve"> portabilità tra diversi DBMS, stabilità, compatibilità con Java e facilità di manutenzione del layer di persistenza.</w:t>
+        <w:t xml:space="preserve"> portabilità tra diversi DBMS, stabilità, compatibilità con Java e facilità di manutenzione del </w:t>
+      </w:r>
+      <w:proofErr w:type="spellStart"/>
+      <w:r>
+        <w:t>layer</w:t>
+      </w:r>
+      <w:proofErr w:type="spellEnd"/>
+      <w:r>
+        <w:t xml:space="preserve"> di persistenza.</w:t>
       </w:r>
     </w:p>
     <w:p>
@@ -4493,7 +4625,15 @@
         <w:t>G_</w:t>
       </w:r>
       <w:r>
-        <w:t xml:space="preserve">3 – Interfaccia WebSocket per </w:t>
+        <w:t xml:space="preserve">3 – Interfaccia </w:t>
+      </w:r>
+      <w:proofErr w:type="spellStart"/>
+      <w:r>
+        <w:t>WebSocket</w:t>
+      </w:r>
+      <w:proofErr w:type="spellEnd"/>
+      <w:r>
+        <w:t xml:space="preserve"> per </w:t>
       </w:r>
       <w:r>
         <w:t>n</w:t>
@@ -4532,7 +4672,23 @@
         <w:t xml:space="preserve"> </w:t>
       </w:r>
       <w:r>
-        <w:t>Fornire aggiornamenti immediati dell’interfaccia utente tramite WebSocket, permettendo al client di ricevere notifiche push senza refresh della pagina.</w:t>
+        <w:t xml:space="preserve">Fornire aggiornamenti immediati dell’interfaccia utente tramite </w:t>
+      </w:r>
+      <w:proofErr w:type="spellStart"/>
+      <w:r>
+        <w:t>WebSocket</w:t>
+      </w:r>
+      <w:proofErr w:type="spellEnd"/>
+      <w:r>
+        <w:t xml:space="preserve">, permettendo al client di ricevere notifiche </w:t>
+      </w:r>
+      <w:proofErr w:type="spellStart"/>
+      <w:r>
+        <w:t>push</w:t>
+      </w:r>
+      <w:proofErr w:type="spellEnd"/>
+      <w:r>
+        <w:t xml:space="preserve"> senza refresh della pagina.</w:t>
       </w:r>
     </w:p>
     <w:p>
@@ -4575,7 +4731,15 @@
       </w:r>
       <w:r>
         <w:br/>
-        <w:t>Le connessioni WebSocket sono persistenti</w:t>
+        <w:t xml:space="preserve">Le connessioni </w:t>
+      </w:r>
+      <w:proofErr w:type="spellStart"/>
+      <w:r>
+        <w:t>WebSocket</w:t>
+      </w:r>
+      <w:proofErr w:type="spellEnd"/>
+      <w:r>
+        <w:t xml:space="preserve"> sono persistenti</w:t>
       </w:r>
       <w:r>
         <w:t>; quindi,</w:t>
@@ -4629,8 +4793,21 @@
       </w:r>
       <w:r>
         <w:br/>
-        <w:t>Introduce complessità maggiore rispetto al classico modello request/response</w:t>
-      </w:r>
+        <w:t xml:space="preserve">Introduce complessità maggiore rispetto al classico modello </w:t>
+      </w:r>
+      <w:proofErr w:type="spellStart"/>
+      <w:r>
+        <w:t>request</w:t>
+      </w:r>
+      <w:proofErr w:type="spellEnd"/>
+      <w:r>
+        <w:t>/</w:t>
+      </w:r>
+      <w:proofErr w:type="spellStart"/>
+      <w:r>
+        <w:t>response</w:t>
+      </w:r>
+      <w:proofErr w:type="spellEnd"/>
       <w:r>
         <w:t xml:space="preserve">. </w:t>
       </w:r>
@@ -4885,12 +5062,21 @@
       </w:r>
     </w:p>
     <w:p>
+      <w:proofErr w:type="spellStart"/>
       <w:r>
         <w:rPr>
           <w:b/>
           <w:bCs/>
         </w:rPr>
-        <w:t>Tradeoff:</w:t>
+        <w:t>Tradeoff</w:t>
+      </w:r>
+      <w:proofErr w:type="spellEnd"/>
+      <w:r>
+        <w:rPr>
+          <w:b/>
+          <w:bCs/>
+        </w:rPr>
+        <w:t>:</w:t>
       </w:r>
     </w:p>
     <w:p>
@@ -4989,12 +5175,21 @@
       </w:r>
     </w:p>
     <w:p>
+      <w:proofErr w:type="spellStart"/>
       <w:r>
         <w:rPr>
           <w:b/>
           <w:bCs/>
         </w:rPr>
-        <w:t>Tradeoff:</w:t>
+        <w:t>Tradeoff</w:t>
+      </w:r>
+      <w:proofErr w:type="spellEnd"/>
+      <w:r>
+        <w:rPr>
+          <w:b/>
+          <w:bCs/>
+        </w:rPr>
+        <w:t>:</w:t>
       </w:r>
     </w:p>
     <w:p>
@@ -5019,7 +5214,15 @@
         <w:pStyle w:val="Paragrafoelenco"/>
       </w:pPr>
       <w:r>
-        <w:t>Esternalizzare la configurazione migliora la portabilità e facilita la gestione di ambienti multipli, ma aumenta la complessità del deploy e la possibilità di errori di configurazione.</w:t>
+        <w:t xml:space="preserve">Esternalizzare la configurazione migliora la portabilità e facilita la gestione di ambienti multipli, ma aumenta la complessità del </w:t>
+      </w:r>
+      <w:proofErr w:type="spellStart"/>
+      <w:r>
+        <w:t>deploy</w:t>
+      </w:r>
+      <w:proofErr w:type="spellEnd"/>
+      <w:r>
+        <w:t xml:space="preserve"> e la possibilità di errori di configurazione.</w:t>
       </w:r>
     </w:p>
     <w:p>
@@ -5049,7 +5252,15 @@
         <w:pStyle w:val="Paragrafoelenco"/>
       </w:pPr>
       <w:r>
-        <w:t>Configurazioni interne semplificano il deploy, ma rendono più difficile modificare i parametri senza ricreare il pacchetto WAR.</w:t>
+        <w:t xml:space="preserve">Configurazioni interne semplificano il </w:t>
+      </w:r>
+      <w:proofErr w:type="spellStart"/>
+      <w:r>
+        <w:t>deploy</w:t>
+      </w:r>
+      <w:proofErr w:type="spellEnd"/>
+      <w:r>
+        <w:t>, ma rendono più difficile modificare i parametri senza ricreare il pacchetto WAR.</w:t>
       </w:r>
     </w:p>
     <w:p>
@@ -5108,7 +5319,23 @@
         <w:t xml:space="preserve">Obiettivo: </w:t>
       </w:r>
       <w:r>
-        <w:t>Proteggere le informazioni personali dei dipendenti tramite cifratura sicura delle password (AES, scrypt, bcrypt) e accessi profilati per ruolo.</w:t>
+        <w:t xml:space="preserve">Proteggere le informazioni personali dei dipendenti tramite cifratura sicura delle password (AES, </w:t>
+      </w:r>
+      <w:proofErr w:type="spellStart"/>
+      <w:r>
+        <w:t>scrypt</w:t>
+      </w:r>
+      <w:proofErr w:type="spellEnd"/>
+      <w:r>
+        <w:t xml:space="preserve">, </w:t>
+      </w:r>
+      <w:proofErr w:type="spellStart"/>
+      <w:r>
+        <w:t>bcrypt</w:t>
+      </w:r>
+      <w:proofErr w:type="spellEnd"/>
+      <w:r>
+        <w:t>) e accessi profilati per ruolo.</w:t>
       </w:r>
     </w:p>
     <w:p>
@@ -5118,12 +5345,21 @@
           <w:bCs/>
         </w:rPr>
       </w:pPr>
+      <w:proofErr w:type="spellStart"/>
       <w:r>
         <w:rPr>
           <w:b/>
           <w:bCs/>
         </w:rPr>
-        <w:t>Tradeoff:</w:t>
+        <w:t>Tradeoff</w:t>
+      </w:r>
+      <w:proofErr w:type="spellEnd"/>
+      <w:r>
+        <w:rPr>
+          <w:b/>
+          <w:bCs/>
+        </w:rPr>
+        <w:t>:</w:t>
       </w:r>
     </w:p>
     <w:p>
@@ -5225,12 +5461,21 @@
       </w:r>
     </w:p>
     <w:p>
+      <w:proofErr w:type="spellStart"/>
       <w:r>
         <w:rPr>
           <w:b/>
           <w:bCs/>
         </w:rPr>
-        <w:t>Tradeoff:</w:t>
+        <w:t>Tradeoff</w:t>
+      </w:r>
+      <w:proofErr w:type="spellEnd"/>
+      <w:r>
+        <w:rPr>
+          <w:b/>
+          <w:bCs/>
+        </w:rPr>
+        <w:t>:</w:t>
       </w:r>
     </w:p>
     <w:p>
@@ -5247,8 +5492,17 @@
           <w:b/>
           <w:bCs/>
         </w:rPr>
-        <w:t>Sicurezza vs. user experience</w:t>
-      </w:r>
+        <w:t xml:space="preserve">Sicurezza vs. user </w:t>
+      </w:r>
+      <w:proofErr w:type="spellStart"/>
+      <w:r>
+        <w:rPr>
+          <w:b/>
+          <w:bCs/>
+        </w:rPr>
+        <w:t>experience</w:t>
+      </w:r>
+      <w:proofErr w:type="spellEnd"/>
     </w:p>
     <w:p>
       <w:pPr>
@@ -5309,24 +5563,51 @@
       <w:r>
         <w:t xml:space="preserve">Prevenire SQL injection utilizzando </w:t>
       </w:r>
+      <w:proofErr w:type="spellStart"/>
       <w:r>
         <w:rPr>
           <w:b/>
           <w:bCs/>
         </w:rPr>
-        <w:t>prepared statements</w:t>
-      </w:r>
+        <w:t>prepared</w:t>
+      </w:r>
+      <w:proofErr w:type="spellEnd"/>
+      <w:r>
+        <w:rPr>
+          <w:b/>
+          <w:bCs/>
+        </w:rPr>
+        <w:t xml:space="preserve"> </w:t>
+      </w:r>
+      <w:proofErr w:type="spellStart"/>
+      <w:r>
+        <w:rPr>
+          <w:b/>
+          <w:bCs/>
+        </w:rPr>
+        <w:t>statements</w:t>
+      </w:r>
+      <w:proofErr w:type="spellEnd"/>
       <w:r>
         <w:t xml:space="preserve"> e best practice di validazione input.</w:t>
       </w:r>
     </w:p>
     <w:p>
+      <w:proofErr w:type="spellStart"/>
       <w:r>
         <w:rPr>
           <w:b/>
           <w:bCs/>
         </w:rPr>
-        <w:t>Tradeoff:</w:t>
+        <w:t>Tradeoff</w:t>
+      </w:r>
+      <w:proofErr w:type="spellEnd"/>
+      <w:r>
+        <w:rPr>
+          <w:b/>
+          <w:bCs/>
+        </w:rPr>
+        <w:t>:</w:t>
       </w:r>
     </w:p>
     <w:p>
@@ -5477,9 +5758,35 @@
             <w:pPr>
               <w:spacing w:after="160" w:line="259" w:lineRule="auto"/>
             </w:pPr>
-            <w:r>
-              <w:t>Atomicity, Consistency, Isolation, Durability</w:t>
-            </w:r>
+            <w:proofErr w:type="spellStart"/>
+            <w:r>
+              <w:t>Atomicity</w:t>
+            </w:r>
+            <w:proofErr w:type="spellEnd"/>
+            <w:r>
+              <w:t xml:space="preserve">, </w:t>
+            </w:r>
+            <w:proofErr w:type="spellStart"/>
+            <w:r>
+              <w:t>Consistency</w:t>
+            </w:r>
+            <w:proofErr w:type="spellEnd"/>
+            <w:r>
+              <w:t xml:space="preserve">, </w:t>
+            </w:r>
+            <w:proofErr w:type="spellStart"/>
+            <w:r>
+              <w:t>Isolation</w:t>
+            </w:r>
+            <w:proofErr w:type="spellEnd"/>
+            <w:r>
+              <w:t xml:space="preserve">, </w:t>
+            </w:r>
+            <w:proofErr w:type="spellStart"/>
+            <w:r>
+              <w:t>Durability</w:t>
+            </w:r>
+            <w:proofErr w:type="spellEnd"/>
           </w:p>
         </w:tc>
         <w:tc>
@@ -5526,7 +5833,15 @@
               <w:spacing w:after="160" w:line="259" w:lineRule="auto"/>
             </w:pPr>
             <w:r>
-              <w:t>Advanced Encryption Standard</w:t>
+              <w:t xml:space="preserve">Advanced </w:t>
+            </w:r>
+            <w:proofErr w:type="spellStart"/>
+            <w:r>
+              <w:t>Encryption</w:t>
+            </w:r>
+            <w:proofErr w:type="spellEnd"/>
+            <w:r>
+              <w:t xml:space="preserve"> Standard</w:t>
             </w:r>
           </w:p>
         </w:tc>
@@ -5621,8 +5936,13 @@
             <w:pPr>
               <w:spacing w:after="160" w:line="259" w:lineRule="auto"/>
             </w:pPr>
-            <w:r>
-              <w:t>Binary Large Object</w:t>
+            <w:proofErr w:type="spellStart"/>
+            <w:r>
+              <w:t>Binary</w:t>
+            </w:r>
+            <w:proofErr w:type="spellEnd"/>
+            <w:r>
+              <w:t xml:space="preserve"> Large Object</w:t>
             </w:r>
           </w:p>
         </w:tc>
@@ -5669,8 +5989,13 @@
             <w:pPr>
               <w:spacing w:after="160" w:line="259" w:lineRule="auto"/>
             </w:pPr>
-            <w:r>
-              <w:t>Cascading Style Sheets</w:t>
+            <w:proofErr w:type="spellStart"/>
+            <w:r>
+              <w:t>Cascading</w:t>
+            </w:r>
+            <w:proofErr w:type="spellEnd"/>
+            <w:r>
+              <w:t xml:space="preserve"> Style Sheets</w:t>
             </w:r>
           </w:p>
         </w:tc>
@@ -5771,9 +6096,11 @@
             <w:pPr>
               <w:spacing w:after="160" w:line="259" w:lineRule="auto"/>
             </w:pPr>
+            <w:proofErr w:type="spellStart"/>
             <w:r>
               <w:t>Entity-Relationship</w:t>
             </w:r>
+            <w:proofErr w:type="spellEnd"/>
           </w:p>
         </w:tc>
         <w:tc>
@@ -5819,8 +6146,13 @@
             <w:pPr>
               <w:spacing w:after="160" w:line="259" w:lineRule="auto"/>
             </w:pPr>
-            <w:r>
-              <w:t>HyperText Markup Language</w:t>
+            <w:proofErr w:type="spellStart"/>
+            <w:r>
+              <w:t>HyperText</w:t>
+            </w:r>
+            <w:proofErr w:type="spellEnd"/>
+            <w:r>
+              <w:t xml:space="preserve"> Markup Language</w:t>
             </w:r>
           </w:p>
         </w:tc>
@@ -5867,8 +6199,21 @@
             <w:pPr>
               <w:spacing w:after="160" w:line="259" w:lineRule="auto"/>
             </w:pPr>
-            <w:r>
-              <w:t>HyperText Transfer Protocol (Secure)</w:t>
+            <w:proofErr w:type="spellStart"/>
+            <w:r>
+              <w:t>HyperText</w:t>
+            </w:r>
+            <w:proofErr w:type="spellEnd"/>
+            <w:r>
+              <w:t xml:space="preserve"> Transfer </w:t>
+            </w:r>
+            <w:proofErr w:type="spellStart"/>
+            <w:r>
+              <w:t>Protocol</w:t>
+            </w:r>
+            <w:proofErr w:type="spellEnd"/>
+            <w:r>
+              <w:t xml:space="preserve"> (Secure)</w:t>
             </w:r>
           </w:p>
         </w:tc>
@@ -6011,8 +6356,13 @@
             <w:pPr>
               <w:spacing w:after="160" w:line="259" w:lineRule="auto"/>
             </w:pPr>
-            <w:r>
-              <w:t>JavaServer Pages</w:t>
+            <w:proofErr w:type="spellStart"/>
+            <w:r>
+              <w:t>JavaServer</w:t>
+            </w:r>
+            <w:proofErr w:type="spellEnd"/>
+            <w:r>
+              <w:t xml:space="preserve"> Pages</w:t>
             </w:r>
           </w:p>
         </w:tc>
@@ -6074,7 +6424,15 @@
               <w:spacing w:after="160" w:line="259" w:lineRule="auto"/>
             </w:pPr>
             <w:r>
-              <w:t>Macchina virtuale che esegue i bytecode Java.</w:t>
+              <w:t xml:space="preserve">Macchina virtuale che esegue i </w:t>
+            </w:r>
+            <w:proofErr w:type="spellStart"/>
+            <w:r>
+              <w:t>bytecode</w:t>
+            </w:r>
+            <w:proofErr w:type="spellEnd"/>
+            <w:r>
+              <w:t xml:space="preserve"> Java.</w:t>
             </w:r>
           </w:p>
         </w:tc>
@@ -6107,8 +6465,13 @@
             <w:pPr>
               <w:spacing w:after="160" w:line="259" w:lineRule="auto"/>
             </w:pPr>
-            <w:r>
-              <w:t>Multipurpose Internet Mail Extensions</w:t>
+            <w:proofErr w:type="spellStart"/>
+            <w:r>
+              <w:t>Multipurpose</w:t>
+            </w:r>
+            <w:proofErr w:type="spellEnd"/>
+            <w:r>
+              <w:t xml:space="preserve"> Internet Mail Extensions</w:t>
             </w:r>
           </w:p>
         </w:tc>
@@ -6128,7 +6491,15 @@
               <w:t>e-mail</w:t>
             </w:r>
             <w:r>
-              <w:t xml:space="preserve"> e viene usato nel web per indicare il tipo di contenuto di un file (es. application/pdf).</w:t>
+              <w:t xml:space="preserve"> e viene usato nel web per indicare il tipo di contenuto di un file (es. </w:t>
+            </w:r>
+            <w:proofErr w:type="spellStart"/>
+            <w:r>
+              <w:t>application</w:t>
+            </w:r>
+            <w:proofErr w:type="spellEnd"/>
+            <w:r>
+              <w:t>/pdf).</w:t>
             </w:r>
           </w:p>
         </w:tc>
@@ -6162,8 +6533,13 @@
             <w:pPr>
               <w:spacing w:after="160" w:line="259" w:lineRule="auto"/>
             </w:pPr>
-            <w:r>
-              <w:t>Structured Query Language</w:t>
+            <w:proofErr w:type="spellStart"/>
+            <w:r>
+              <w:t>Structured</w:t>
+            </w:r>
+            <w:proofErr w:type="spellEnd"/>
+            <w:r>
+              <w:t xml:space="preserve"> Query Language</w:t>
             </w:r>
           </w:p>
         </w:tc>
@@ -6211,8 +6587,21 @@
               <w:spacing w:after="160" w:line="259" w:lineRule="auto"/>
             </w:pPr>
             <w:r>
-              <w:t>Transmission Control Protocol / Internet Protocol</w:t>
-            </w:r>
+              <w:t xml:space="preserve">Transmission Control </w:t>
+            </w:r>
+            <w:proofErr w:type="spellStart"/>
+            <w:r>
+              <w:t>Protocol</w:t>
+            </w:r>
+            <w:proofErr w:type="spellEnd"/>
+            <w:r>
+              <w:t xml:space="preserve"> / Internet </w:t>
+            </w:r>
+            <w:proofErr w:type="spellStart"/>
+            <w:r>
+              <w:t>Protocol</w:t>
+            </w:r>
+            <w:proofErr w:type="spellEnd"/>
           </w:p>
         </w:tc>
         <w:tc>
@@ -6273,7 +6662,15 @@
               <w:spacing w:after="160" w:line="259" w:lineRule="auto"/>
             </w:pPr>
             <w:r>
-              <w:t>Formato di file JAR utilizzato per distribuire una collezione di file JSP, servlet, classi Java e risorse web.</w:t>
+              <w:t xml:space="preserve">Formato di file JAR utilizzato per distribuire una collezione di file JSP, </w:t>
+            </w:r>
+            <w:proofErr w:type="spellStart"/>
+            <w:r>
+              <w:t>servlet</w:t>
+            </w:r>
+            <w:proofErr w:type="spellEnd"/>
+            <w:r>
+              <w:t>, classi Java e risorse web.</w:t>
             </w:r>
           </w:p>
         </w:tc>
@@ -6403,23 +6800,59 @@
           <w:lang w:val="en-GB"/>
         </w:rPr>
       </w:pPr>
+      <w:proofErr w:type="spellStart"/>
       <w:r>
         <w:rPr>
           <w:lang w:val="en-GB"/>
         </w:rPr>
-        <w:t xml:space="preserve">analisi dei requisiti: </w:t>
-      </w:r>
-    </w:p>
-    <w:p>
-      <w:pPr>
+        <w:t>analisi</w:t>
+      </w:r>
+      <w:proofErr w:type="spellEnd"/>
+      <w:r>
         <w:rPr>
           <w:lang w:val="en-GB"/>
         </w:rPr>
-      </w:pPr>
+        <w:t xml:space="preserve"> </w:t>
+      </w:r>
+      <w:proofErr w:type="spellStart"/>
       <w:r>
         <w:rPr>
           <w:lang w:val="en-GB"/>
         </w:rPr>
+        <w:t>dei</w:t>
+      </w:r>
+      <w:proofErr w:type="spellEnd"/>
+      <w:r>
+        <w:rPr>
+          <w:lang w:val="en-GB"/>
+        </w:rPr>
+        <w:t xml:space="preserve"> </w:t>
+      </w:r>
+      <w:proofErr w:type="spellStart"/>
+      <w:r>
+        <w:rPr>
+          <w:lang w:val="en-GB"/>
+        </w:rPr>
+        <w:t>requisiti</w:t>
+      </w:r>
+      <w:proofErr w:type="spellEnd"/>
+      <w:r>
+        <w:rPr>
+          <w:lang w:val="en-GB"/>
+        </w:rPr>
+        <w:t xml:space="preserve">: </w:t>
+      </w:r>
+    </w:p>
+    <w:p>
+      <w:pPr>
+        <w:rPr>
+          <w:lang w:val="en-GB"/>
+        </w:rPr>
+      </w:pPr>
+      <w:r>
+        <w:rPr>
+          <w:lang w:val="en-GB"/>
+        </w:rPr>
         <w:t xml:space="preserve">[REF-1] Object-oriented-Software-Engineering-3rd-Edition  </w:t>
       </w:r>
     </w:p>
@@ -6452,7 +6885,21 @@
         <w:rPr>
           <w:lang w:val="en-GB"/>
         </w:rPr>
-        <w:t xml:space="preserve">[REF-3] Team di Progetto, SDD_start_meeting </w:t>
+        <w:t xml:space="preserve">[REF-3] Team di Progetto, </w:t>
+      </w:r>
+      <w:proofErr w:type="spellStart"/>
+      <w:r>
+        <w:rPr>
+          <w:lang w:val="en-GB"/>
+        </w:rPr>
+        <w:t>SDD_start_meeting</w:t>
+      </w:r>
+      <w:proofErr w:type="spellEnd"/>
+      <w:r>
+        <w:rPr>
+          <w:lang w:val="en-GB"/>
+        </w:rPr>
+        <w:t xml:space="preserve"> </w:t>
       </w:r>
     </w:p>
     <w:p>
@@ -6482,13 +6929,29 @@
         </w:rPr>
       </w:pPr>
       <w:bookmarkStart w:id="5" w:name="_Toc220175277"/>
+      <w:proofErr w:type="spellStart"/>
       <w:r>
         <w:rPr>
           <w:lang w:val="en-US"/>
         </w:rPr>
-        <w:t>Panoramica del Documento</w:t>
+        <w:t>Panoramica</w:t>
+      </w:r>
+      <w:proofErr w:type="spellEnd"/>
+      <w:r>
+        <w:rPr>
+          <w:lang w:val="en-US"/>
+        </w:rPr>
+        <w:t xml:space="preserve"> del </w:t>
+      </w:r>
+      <w:proofErr w:type="spellStart"/>
+      <w:r>
+        <w:rPr>
+          <w:lang w:val="en-US"/>
+        </w:rPr>
+        <w:t>Documento</w:t>
       </w:r>
       <w:bookmarkEnd w:id="5"/>
+      <w:proofErr w:type="spellEnd"/>
     </w:p>
     <w:p>
       <w:r>
@@ -6711,16 +7174,25 @@
         <w:t xml:space="preserve"> </w:t>
       </w:r>
       <w:bookmarkStart w:id="6" w:name="_Toc220175278"/>
+      <w:proofErr w:type="spellStart"/>
       <w:r>
         <w:rPr>
           <w:lang w:val="en-US"/>
         </w:rPr>
-        <w:t xml:space="preserve">Architettura software </w:t>
-      </w:r>
+        <w:t>Architettura</w:t>
+      </w:r>
+      <w:proofErr w:type="spellEnd"/>
       <w:r>
         <w:rPr>
           <w:lang w:val="en-US"/>
         </w:rPr>
+        <w:t xml:space="preserve"> software </w:t>
+      </w:r>
+      <w:proofErr w:type="spellStart"/>
+      <w:r>
+        <w:rPr>
+          <w:lang w:val="en-US"/>
+        </w:rPr>
         <w:t>c</w:t>
       </w:r>
       <w:r>
@@ -6730,6 +7202,7 @@
         <w:t>orrente</w:t>
       </w:r>
       <w:bookmarkEnd w:id="6"/>
+      <w:proofErr w:type="spellEnd"/>
     </w:p>
     <w:p>
       <w:pPr>
@@ -6790,7 +7263,35 @@
         <w:rPr>
           <w:lang w:val="en-US"/>
         </w:rPr>
-        <w:t>accesso immediato alle informazioni operative</w:t>
+        <w:t xml:space="preserve">accesso </w:t>
+      </w:r>
+      <w:proofErr w:type="spellStart"/>
+      <w:r>
+        <w:rPr>
+          <w:lang w:val="en-US"/>
+        </w:rPr>
+        <w:t>immediato</w:t>
+      </w:r>
+      <w:proofErr w:type="spellEnd"/>
+      <w:r>
+        <w:rPr>
+          <w:lang w:val="en-US"/>
+        </w:rPr>
+        <w:t xml:space="preserve"> alle </w:t>
+      </w:r>
+      <w:proofErr w:type="spellStart"/>
+      <w:r>
+        <w:rPr>
+          <w:lang w:val="en-US"/>
+        </w:rPr>
+        <w:t>informazioni</w:t>
+      </w:r>
+      <w:proofErr w:type="spellEnd"/>
+      <w:r>
+        <w:rPr>
+          <w:lang w:val="en-US"/>
+        </w:rPr>
+        <w:t xml:space="preserve"> operative</w:t>
       </w:r>
     </w:p>
     <w:p>
@@ -6862,9 +7363,14 @@
       </w:pPr>
       <w:bookmarkStart w:id="8" w:name="_Toc220175280"/>
       <w:r>
-        <w:t>3.1 Overview</w:t>
+        <w:t xml:space="preserve">3.1 </w:t>
+      </w:r>
+      <w:proofErr w:type="spellStart"/>
+      <w:r>
+        <w:t>Overview</w:t>
       </w:r>
       <w:bookmarkEnd w:id="8"/>
+      <w:proofErr w:type="spellEnd"/>
     </w:p>
     <w:p>
       <w:r>
@@ -6892,8 +7398,17 @@
           <w:b/>
           <w:bCs/>
         </w:rPr>
-        <w:t>Presentation layer</w:t>
-      </w:r>
+        <w:t xml:space="preserve">Presentation </w:t>
+      </w:r>
+      <w:proofErr w:type="spellStart"/>
+      <w:r>
+        <w:rPr>
+          <w:b/>
+          <w:bCs/>
+        </w:rPr>
+        <w:t>layer</w:t>
+      </w:r>
+      <w:proofErr w:type="spellEnd"/>
       <w:r>
         <w:t xml:space="preserve">: costituisce il livello </w:t>
       </w:r>
@@ -6920,8 +7435,17 @@
           <w:b/>
           <w:bCs/>
         </w:rPr>
-        <w:t>Application layer</w:t>
-      </w:r>
+        <w:t xml:space="preserve">Application </w:t>
+      </w:r>
+      <w:proofErr w:type="spellStart"/>
+      <w:r>
+        <w:rPr>
+          <w:b/>
+          <w:bCs/>
+        </w:rPr>
+        <w:t>layer</w:t>
+      </w:r>
+      <w:proofErr w:type="spellEnd"/>
       <w:r>
         <w:t>:</w:t>
       </w:r>
@@ -6940,13 +7464,31 @@
           <w:numId w:val="11"/>
         </w:numPr>
       </w:pPr>
+      <w:proofErr w:type="spellStart"/>
       <w:r>
         <w:rPr>
           <w:b/>
           <w:bCs/>
         </w:rPr>
-        <w:t>Persistence layer</w:t>
-      </w:r>
+        <w:t>Persistence</w:t>
+      </w:r>
+      <w:proofErr w:type="spellEnd"/>
+      <w:r>
+        <w:rPr>
+          <w:b/>
+          <w:bCs/>
+        </w:rPr>
+        <w:t xml:space="preserve"> </w:t>
+      </w:r>
+      <w:proofErr w:type="spellStart"/>
+      <w:r>
+        <w:rPr>
+          <w:b/>
+          <w:bCs/>
+        </w:rPr>
+        <w:t>layer</w:t>
+      </w:r>
+      <w:proofErr w:type="spellEnd"/>
       <w:r>
         <w:t>:</w:t>
       </w:r>
@@ -6992,14 +7534,27 @@
       <w:bookmarkStart w:id="9" w:name="_Toc220175281"/>
       <w:r>
         <w:lastRenderedPageBreak/>
-        <w:t>3.2 Decomposizione in subsystem</w:t>
+        <w:t xml:space="preserve">3.2 Decomposizione in </w:t>
+      </w:r>
+      <w:proofErr w:type="spellStart"/>
+      <w:r>
+        <w:t>subsystem</w:t>
       </w:r>
       <w:bookmarkEnd w:id="9"/>
+      <w:proofErr w:type="spellEnd"/>
     </w:p>
     <w:p/>
     <w:p>
       <w:r>
-        <w:t>Di seguito viene presentato il sistema scomposto in “subsystem” e le relative dipendenze.</w:t>
+        <w:t>Di seguito viene presentato il sistema scomposto in “</w:t>
+      </w:r>
+      <w:proofErr w:type="spellStart"/>
+      <w:r>
+        <w:t>subsystem</w:t>
+      </w:r>
+      <w:proofErr w:type="spellEnd"/>
+      <w:r>
+        <w:t>” e le relative dipendenze.</w:t>
       </w:r>
       <w:r>
         <w:br/>
@@ -7128,9 +7683,11 @@
             <w:tcW w:w="2694" w:type="dxa"/>
           </w:tcPr>
           <w:p>
+            <w:proofErr w:type="spellStart"/>
             <w:r>
               <w:t>EWMSClient</w:t>
             </w:r>
+            <w:proofErr w:type="spellEnd"/>
           </w:p>
         </w:tc>
         <w:tc>
@@ -7150,9 +7707,11 @@
             <w:tcW w:w="2694" w:type="dxa"/>
           </w:tcPr>
           <w:p>
+            <w:proofErr w:type="spellStart"/>
             <w:r>
               <w:t>AccountControl</w:t>
             </w:r>
+            <w:proofErr w:type="spellEnd"/>
           </w:p>
         </w:tc>
         <w:tc>
@@ -7172,9 +7731,11 @@
             <w:tcW w:w="2694" w:type="dxa"/>
           </w:tcPr>
           <w:p>
+            <w:proofErr w:type="spellStart"/>
             <w:r>
               <w:t>TaskControl</w:t>
             </w:r>
+            <w:proofErr w:type="spellEnd"/>
           </w:p>
         </w:tc>
         <w:tc>
@@ -7197,8 +7758,13 @@
             <w:tcW w:w="2694" w:type="dxa"/>
           </w:tcPr>
           <w:p>
-            <w:r>
-              <w:t xml:space="preserve">AccessManagement </w:t>
+            <w:proofErr w:type="spellStart"/>
+            <w:r>
+              <w:t>AccessManagement</w:t>
+            </w:r>
+            <w:proofErr w:type="spellEnd"/>
+            <w:r>
+              <w:t xml:space="preserve"> </w:t>
             </w:r>
           </w:p>
         </w:tc>
@@ -7219,9 +7785,11 @@
             <w:tcW w:w="2694" w:type="dxa"/>
           </w:tcPr>
           <w:p>
+            <w:proofErr w:type="spellStart"/>
             <w:r>
               <w:t>AccountManagement</w:t>
             </w:r>
+            <w:proofErr w:type="spellEnd"/>
           </w:p>
         </w:tc>
         <w:tc>
@@ -7241,9 +7809,11 @@
             <w:tcW w:w="2694" w:type="dxa"/>
           </w:tcPr>
           <w:p>
+            <w:proofErr w:type="spellStart"/>
             <w:r>
               <w:t>TaskManagement</w:t>
             </w:r>
+            <w:proofErr w:type="spellEnd"/>
           </w:p>
         </w:tc>
         <w:tc>
@@ -7263,9 +7833,11 @@
             <w:tcW w:w="2694" w:type="dxa"/>
           </w:tcPr>
           <w:p>
+            <w:proofErr w:type="spellStart"/>
             <w:r>
               <w:t>NotificheManagement</w:t>
             </w:r>
+            <w:proofErr w:type="spellEnd"/>
           </w:p>
         </w:tc>
         <w:tc>
@@ -7288,9 +7860,11 @@
             <w:tcW w:w="2694" w:type="dxa"/>
           </w:tcPr>
           <w:p>
+            <w:proofErr w:type="spellStart"/>
             <w:r>
               <w:t>PersistenceManagement</w:t>
             </w:r>
+            <w:proofErr w:type="spellEnd"/>
           </w:p>
         </w:tc>
         <w:tc>
@@ -7339,16 +7913,41 @@
           <w:b/>
           <w:bCs/>
         </w:rPr>
-        <w:t>Client Node</w:t>
-      </w:r>
-      <w:r>
-        <w:t>: il dispositivo dell’utente finale, essendo EWMS una web application che gira sul server di azienda n</w:t>
+        <w:t xml:space="preserve">Client </w:t>
+      </w:r>
+      <w:proofErr w:type="spellStart"/>
+      <w:r>
+        <w:rPr>
+          <w:b/>
+          <w:bCs/>
+        </w:rPr>
+        <w:t>Node</w:t>
+      </w:r>
+      <w:proofErr w:type="spellEnd"/>
+      <w:r>
+        <w:t xml:space="preserve">: il dispositivo dell’utente finale, essendo EWMS una web </w:t>
+      </w:r>
+      <w:proofErr w:type="spellStart"/>
+      <w:r>
+        <w:t>application</w:t>
+      </w:r>
+      <w:proofErr w:type="spellEnd"/>
+      <w:r>
+        <w:t xml:space="preserve"> che gira sul server di azienda n</w:t>
       </w:r>
       <w:r>
         <w:t>on richiede installazione di software proprietario, ma si affida</w:t>
       </w:r>
       <w:r>
-        <w:t xml:space="preserve"> ad un browser (Chrome, Mozilla, Opera ecc…).</w:t>
+        <w:t xml:space="preserve"> ad un browser (Chrome, Mozilla, Opera </w:t>
+      </w:r>
+      <w:proofErr w:type="spellStart"/>
+      <w:r>
+        <w:t>ecc</w:t>
+      </w:r>
+      <w:proofErr w:type="spellEnd"/>
+      <w:r>
+        <w:t>…).</w:t>
       </w:r>
     </w:p>
     <w:p>
@@ -7364,10 +7963,34 @@
           <w:b/>
           <w:bCs/>
         </w:rPr>
-        <w:t>Application Server Node:</w:t>
-      </w:r>
-      <w:r>
-        <w:t xml:space="preserve"> È il server centrale che ospita la logica applicativa. Esegue il container web necessario per gestire il ciclo di vita delle Servlet e delle pagine JSP.</w:t>
+        <w:t xml:space="preserve">Application Server </w:t>
+      </w:r>
+      <w:proofErr w:type="spellStart"/>
+      <w:r>
+        <w:rPr>
+          <w:b/>
+          <w:bCs/>
+        </w:rPr>
+        <w:t>Node</w:t>
+      </w:r>
+      <w:proofErr w:type="spellEnd"/>
+      <w:r>
+        <w:rPr>
+          <w:b/>
+          <w:bCs/>
+        </w:rPr>
+        <w:t>:</w:t>
+      </w:r>
+      <w:r>
+        <w:t xml:space="preserve"> È il server centrale che ospita la logica applicativa. Esegue il container web necessario per gestire il ciclo di vita delle </w:t>
+      </w:r>
+      <w:proofErr w:type="spellStart"/>
+      <w:r>
+        <w:t>Servlet</w:t>
+      </w:r>
+      <w:proofErr w:type="spellEnd"/>
+      <w:r>
+        <w:t xml:space="preserve"> e delle pagine JSP.</w:t>
       </w:r>
     </w:p>
     <w:p>
@@ -7383,7 +8006,23 @@
           <w:b/>
           <w:bCs/>
         </w:rPr>
-        <w:t>Database Server Node:</w:t>
+        <w:t xml:space="preserve">Database Server </w:t>
+      </w:r>
+      <w:proofErr w:type="spellStart"/>
+      <w:r>
+        <w:rPr>
+          <w:b/>
+          <w:bCs/>
+        </w:rPr>
+        <w:t>Node</w:t>
+      </w:r>
+      <w:proofErr w:type="spellEnd"/>
+      <w:r>
+        <w:rPr>
+          <w:b/>
+          <w:bCs/>
+        </w:rPr>
+        <w:t>:</w:t>
       </w:r>
       <w:r>
         <w:t xml:space="preserve"> È il server dedicato alla persistenza dei dati. Ospita il DBMS relazionale che memorizza tutte le informazioni di sistema</w:t>
@@ -7458,8 +8097,17 @@
           <w:b/>
           <w:bCs/>
         </w:rPr>
-        <w:t>Componenti off-the-shelfs</w:t>
-      </w:r>
+        <w:t>Componenti off-the-</w:t>
+      </w:r>
+      <w:proofErr w:type="spellStart"/>
+      <w:r>
+        <w:rPr>
+          <w:b/>
+          <w:bCs/>
+        </w:rPr>
+        <w:t>shelfs</w:t>
+      </w:r>
+      <w:proofErr w:type="spellEnd"/>
     </w:p>
     <w:tbl>
       <w:tblPr>
@@ -7579,7 +8227,23 @@
               <w:t>Ges</w:t>
             </w:r>
             <w:r>
-              <w:t>tione del ciclo di vita di Servlet/JSP e dove verrà caricato il file ewms.war per il deployment</w:t>
+              <w:t xml:space="preserve">tione del ciclo di vita di </w:t>
+            </w:r>
+            <w:proofErr w:type="spellStart"/>
+            <w:r>
+              <w:t>Servlet</w:t>
+            </w:r>
+            <w:proofErr w:type="spellEnd"/>
+            <w:r>
+              <w:t xml:space="preserve">/JSP e dove verrà caricato il file </w:t>
+            </w:r>
+            <w:proofErr w:type="spellStart"/>
+            <w:r>
+              <w:t>ewms.war</w:t>
+            </w:r>
+            <w:proofErr w:type="spellEnd"/>
+            <w:r>
+              <w:t xml:space="preserve"> per il deployment</w:t>
             </w:r>
           </w:p>
         </w:tc>
@@ -7644,8 +8308,13 @@
           </w:tcPr>
           <w:p>
             <w:r>
-              <w:t>Runtime enviroment</w:t>
-            </w:r>
+              <w:t xml:space="preserve">Runtime </w:t>
+            </w:r>
+            <w:proofErr w:type="spellStart"/>
+            <w:r>
+              <w:t>enviroment</w:t>
+            </w:r>
+            <w:proofErr w:type="spellEnd"/>
           </w:p>
         </w:tc>
         <w:tc>
@@ -7670,9 +8339,11 @@
             <w:vAlign w:val="center"/>
           </w:tcPr>
           <w:p>
+            <w:proofErr w:type="spellStart"/>
             <w:r>
               <w:t>WebBrowser</w:t>
             </w:r>
+            <w:proofErr w:type="spellEnd"/>
           </w:p>
         </w:tc>
         <w:tc>
@@ -7682,8 +8353,13 @@
           </w:tcPr>
           <w:p>
             <w:r>
-              <w:t>Client runtime</w:t>
-            </w:r>
+              <w:t xml:space="preserve">Client </w:t>
+            </w:r>
+            <w:proofErr w:type="spellStart"/>
+            <w:r>
+              <w:t>runtime</w:t>
+            </w:r>
+            <w:proofErr w:type="spellEnd"/>
           </w:p>
         </w:tc>
         <w:tc>
@@ -7706,14 +8382,30 @@
       </w:pPr>
       <w:bookmarkStart w:id="11" w:name="_Toc220175283"/>
       <w:r>
-        <w:t>3.4 Persistent Data Management</w:t>
+        <w:t xml:space="preserve">3.4 </w:t>
+      </w:r>
+      <w:proofErr w:type="spellStart"/>
+      <w:r>
+        <w:t>Persistent</w:t>
+      </w:r>
+      <w:proofErr w:type="spellEnd"/>
+      <w:r>
+        <w:t xml:space="preserve"> Data Management</w:t>
       </w:r>
       <w:bookmarkEnd w:id="11"/>
     </w:p>
     <w:p/>
     <w:p>
       <w:r>
-        <w:t>La gestione della persistenza dei dati nel sistema E.W.M.S. è affidata a un RDBMS (Relational Database Management System). Il sistema applicativo interagisce con il database per garantire che le informazioni relative agli account, ai task e alle notifiche siano salvate in modo durevole, consistente e sicuro.</w:t>
+        <w:t>La gestione della persistenza dei dati nel sistema E.W.M.S. è affidata a un RDBMS (</w:t>
+      </w:r>
+      <w:proofErr w:type="spellStart"/>
+      <w:r>
+        <w:t>Relational</w:t>
+      </w:r>
+      <w:proofErr w:type="spellEnd"/>
+      <w:r>
+        <w:t xml:space="preserve"> Database Management System). Il sistema applicativo interagisce con il database per garantire che le informazioni relative agli account, ai task e alle notifiche siano salvate in modo durevole, consistente e sicuro.</w:t>
       </w:r>
     </w:p>
     <w:p>
@@ -7836,8 +8528,13 @@
           <w:numId w:val="11"/>
         </w:numPr>
       </w:pPr>
-      <w:r>
-        <w:t>Filename: il nome del file caricato,</w:t>
+      <w:proofErr w:type="spellStart"/>
+      <w:r>
+        <w:t>Filename</w:t>
+      </w:r>
+      <w:proofErr w:type="spellEnd"/>
+      <w:r>
+        <w:t>: il nome del file caricato,</w:t>
       </w:r>
     </w:p>
     <w:p>
@@ -7848,8 +8545,13 @@
           <w:numId w:val="11"/>
         </w:numPr>
       </w:pPr>
-      <w:r>
-        <w:t>File_path: dove trovare lato server il file caricato,</w:t>
+      <w:proofErr w:type="spellStart"/>
+      <w:r>
+        <w:t>File_path</w:t>
+      </w:r>
+      <w:proofErr w:type="spellEnd"/>
+      <w:r>
+        <w:t>: dove trovare lato server il file caricato,</w:t>
       </w:r>
     </w:p>
     <w:p>
@@ -7860,8 +8562,29 @@
           <w:numId w:val="11"/>
         </w:numPr>
       </w:pPr>
-      <w:r>
-        <w:t>Content_type: il tipo MIME (es. pdf, .xlsx ecc…)</w:t>
+      <w:proofErr w:type="spellStart"/>
+      <w:r>
+        <w:t>Content_type</w:t>
+      </w:r>
+      <w:proofErr w:type="spellEnd"/>
+      <w:r>
+        <w:t>: il tipo MIME (es. pdf, .</w:t>
+      </w:r>
+      <w:proofErr w:type="spellStart"/>
+      <w:r>
+        <w:t>xlsx</w:t>
+      </w:r>
+      <w:proofErr w:type="spellEnd"/>
+      <w:r>
+        <w:t xml:space="preserve"> </w:t>
+      </w:r>
+      <w:proofErr w:type="spellStart"/>
+      <w:r>
+        <w:t>ecc</w:t>
+      </w:r>
+      <w:proofErr w:type="spellEnd"/>
+      <w:r>
+        <w:t>…)</w:t>
       </w:r>
       <w:r>
         <w:br/>
@@ -7955,7 +8678,15 @@
     <w:p/>
     <w:p>
       <w:r>
-        <w:t>La strategia di sicurezza del sistema E.W.M.S. è progettata per garantire la riservatezza e l'integrità dei dati attraverso un modello di controllo degli accessi basato sui ruoli (Role-Based Access Control).</w:t>
+        <w:t>La strategia di sicurezza del sistema E.W.M.S. è progettata per garantire la riservatezza e l'integrità dei dati attraverso un modello di controllo degli accessi basato sui ruoli (Role-</w:t>
+      </w:r>
+      <w:proofErr w:type="spellStart"/>
+      <w:r>
+        <w:t>Based</w:t>
+      </w:r>
+      <w:proofErr w:type="spellEnd"/>
+      <w:r>
+        <w:t xml:space="preserve"> Access Control).</w:t>
       </w:r>
       <w:r>
         <w:t xml:space="preserve"> L’implementazione del controllo degli accessi verrà effettuata </w:t>
@@ -7963,12 +8694,21 @@
       <w:r>
         <w:t xml:space="preserve">a livello programmatico tramite l'utilizzo di </w:t>
       </w:r>
+      <w:proofErr w:type="spellStart"/>
       <w:r>
         <w:rPr>
           <w:b/>
           <w:bCs/>
         </w:rPr>
-        <w:t>Servlet Filters</w:t>
+        <w:t>Servlet</w:t>
+      </w:r>
+      <w:proofErr w:type="spellEnd"/>
+      <w:r>
+        <w:rPr>
+          <w:b/>
+          <w:bCs/>
+        </w:rPr>
+        <w:t xml:space="preserve"> Filters</w:t>
       </w:r>
       <w:r>
         <w:t xml:space="preserve"> standard. Questi componenti intercettano ogni richiesta HTTP diretta al livello applicativo, verificando l'identità dell'utente e i suoi privilegi prima di consentire l'esecuzione di qualsiasi logica di business.</w:t>
@@ -8239,14 +8979,18 @@
             </w:r>
           </w:p>
           <w:p>
+            <w:proofErr w:type="spellStart"/>
             <w:r>
               <w:t>getUtente</w:t>
             </w:r>
-          </w:p>
-          <w:p>
+            <w:proofErr w:type="spellEnd"/>
+          </w:p>
+          <w:p>
+            <w:proofErr w:type="spellStart"/>
             <w:r>
               <w:t>change_pwd</w:t>
             </w:r>
+            <w:proofErr w:type="spellEnd"/>
           </w:p>
         </w:tc>
         <w:tc>
@@ -8254,21 +8998,29 @@
             <w:tcW w:w="2127" w:type="dxa"/>
           </w:tcPr>
           <w:p>
+            <w:proofErr w:type="spellStart"/>
             <w:r>
               <w:t>showNotification</w:t>
             </w:r>
+            <w:proofErr w:type="spellEnd"/>
             <w:r>
               <w:br/>
+            </w:r>
+            <w:proofErr w:type="spellStart"/>
+            <w:r>
               <w:t>sendWarning</w:t>
             </w:r>
-          </w:p>
-          <w:p>
+            <w:proofErr w:type="spellEnd"/>
+          </w:p>
+          <w:p>
+            <w:proofErr w:type="spellStart"/>
             <w:r>
               <w:rPr>
                 <w:lang w:val="en-GB"/>
               </w:rPr>
               <w:t>holdTask</w:t>
             </w:r>
+            <w:proofErr w:type="spellEnd"/>
           </w:p>
         </w:tc>
         <w:tc>
@@ -8282,12 +9034,14 @@
                 <w:lang w:val="en-GB"/>
               </w:rPr>
             </w:pPr>
+            <w:proofErr w:type="spellStart"/>
             <w:r>
               <w:rPr>
                 <w:lang w:val="en-GB"/>
               </w:rPr>
               <w:t>createTask</w:t>
             </w:r>
+            <w:proofErr w:type="spellEnd"/>
           </w:p>
           <w:p>
             <w:pPr>
@@ -8295,12 +9049,14 @@
                 <w:lang w:val="en-GB"/>
               </w:rPr>
             </w:pPr>
+            <w:proofErr w:type="spellStart"/>
             <w:r>
               <w:rPr>
                 <w:lang w:val="en-GB"/>
               </w:rPr>
               <w:t>deleteTask</w:t>
             </w:r>
+            <w:proofErr w:type="spellEnd"/>
           </w:p>
           <w:p>
             <w:pPr>
@@ -8308,12 +9064,14 @@
                 <w:lang w:val="en-GB"/>
               </w:rPr>
             </w:pPr>
+            <w:proofErr w:type="spellStart"/>
             <w:r>
               <w:rPr>
                 <w:lang w:val="en-GB"/>
               </w:rPr>
               <w:t>showTasks</w:t>
             </w:r>
+            <w:proofErr w:type="spellEnd"/>
           </w:p>
           <w:p>
             <w:pPr>
@@ -8321,12 +9079,14 @@
                 <w:lang w:val="en-GB"/>
               </w:rPr>
             </w:pPr>
+            <w:proofErr w:type="spellStart"/>
             <w:r>
               <w:rPr>
                 <w:lang w:val="en-GB"/>
               </w:rPr>
               <w:t>fetchTask</w:t>
             </w:r>
+            <w:proofErr w:type="spellEnd"/>
           </w:p>
           <w:p>
             <w:pPr>
@@ -8334,12 +9094,14 @@
                 <w:lang w:val="en-GB"/>
               </w:rPr>
             </w:pPr>
+            <w:proofErr w:type="spellStart"/>
             <w:r>
               <w:rPr>
                 <w:lang w:val="en-GB"/>
               </w:rPr>
               <w:t>holdTask</w:t>
             </w:r>
+            <w:proofErr w:type="spellEnd"/>
           </w:p>
         </w:tc>
         <w:tc>
@@ -8388,11 +9150,14 @@
             </w:r>
           </w:p>
           <w:p>
+            <w:proofErr w:type="spellStart"/>
             <w:r>
               <w:t>getUtente</w:t>
             </w:r>
-          </w:p>
-          <w:p>
+            <w:proofErr w:type="spellEnd"/>
+          </w:p>
+          <w:p>
+            <w:proofErr w:type="spellStart"/>
             <w:r>
               <w:t>c</w:t>
             </w:r>
@@ -8405,6 +9170,7 @@
             <w:r>
               <w:t>pwd</w:t>
             </w:r>
+            <w:proofErr w:type="spellEnd"/>
           </w:p>
         </w:tc>
         <w:tc>
@@ -8412,17 +9178,21 @@
             <w:tcW w:w="2127" w:type="dxa"/>
           </w:tcPr>
           <w:p>
+            <w:proofErr w:type="spellStart"/>
             <w:r>
               <w:t>showNotification</w:t>
             </w:r>
-          </w:p>
-          <w:p>
+            <w:proofErr w:type="spellEnd"/>
+          </w:p>
+          <w:p>
+            <w:proofErr w:type="spellStart"/>
             <w:r>
               <w:rPr>
                 <w:lang w:val="en-GB"/>
               </w:rPr>
               <w:t>holdTask</w:t>
             </w:r>
+            <w:proofErr w:type="spellEnd"/>
           </w:p>
         </w:tc>
         <w:tc>
@@ -8436,12 +9206,14 @@
                 <w:lang w:val="en-GB"/>
               </w:rPr>
             </w:pPr>
+            <w:proofErr w:type="spellStart"/>
             <w:r>
               <w:rPr>
                 <w:lang w:val="en-GB"/>
               </w:rPr>
               <w:t>showTasks</w:t>
             </w:r>
+            <w:proofErr w:type="spellEnd"/>
           </w:p>
           <w:p>
             <w:pPr>
@@ -8449,12 +9221,14 @@
                 <w:lang w:val="en-GB"/>
               </w:rPr>
             </w:pPr>
+            <w:proofErr w:type="spellStart"/>
             <w:r>
               <w:rPr>
                 <w:lang w:val="en-GB"/>
               </w:rPr>
               <w:t>fetchTask</w:t>
             </w:r>
+            <w:proofErr w:type="spellEnd"/>
           </w:p>
           <w:p>
             <w:pPr>
@@ -8462,12 +9236,14 @@
                 <w:lang w:val="en-GB"/>
               </w:rPr>
             </w:pPr>
+            <w:proofErr w:type="spellStart"/>
             <w:r>
               <w:rPr>
                 <w:lang w:val="en-GB"/>
               </w:rPr>
               <w:t>inizializzaTask</w:t>
             </w:r>
+            <w:proofErr w:type="spellEnd"/>
           </w:p>
           <w:p>
             <w:pPr>
@@ -8475,12 +9251,14 @@
                 <w:lang w:val="en-GB"/>
               </w:rPr>
             </w:pPr>
+            <w:proofErr w:type="spellStart"/>
             <w:r>
               <w:rPr>
                 <w:lang w:val="en-GB"/>
               </w:rPr>
               <w:t>completeTask</w:t>
             </w:r>
+            <w:proofErr w:type="spellEnd"/>
           </w:p>
           <w:p>
             <w:pPr>
@@ -8488,6 +9266,7 @@
                 <w:lang w:val="en-GB"/>
               </w:rPr>
             </w:pPr>
+            <w:proofErr w:type="spellStart"/>
             <w:r>
               <w:rPr>
                 <w:lang w:val="en-GB"/>
@@ -8500,6 +9279,7 @@
               </w:rPr>
               <w:t>oldTask</w:t>
             </w:r>
+            <w:proofErr w:type="spellEnd"/>
           </w:p>
         </w:tc>
         <w:tc>
@@ -8556,12 +9336,14 @@
                 <w:lang w:val="en-GB"/>
               </w:rPr>
             </w:pPr>
+            <w:proofErr w:type="spellStart"/>
             <w:r>
               <w:rPr>
                 <w:lang w:val="en-GB"/>
               </w:rPr>
               <w:t>getUtente</w:t>
             </w:r>
+            <w:proofErr w:type="spellEnd"/>
           </w:p>
           <w:p>
             <w:pPr>
@@ -8569,12 +9351,14 @@
                 <w:lang w:val="en-GB"/>
               </w:rPr>
             </w:pPr>
+            <w:proofErr w:type="spellStart"/>
             <w:r>
               <w:rPr>
                 <w:lang w:val="en-GB"/>
               </w:rPr>
               <w:t>change_pwd</w:t>
             </w:r>
+            <w:proofErr w:type="spellEnd"/>
           </w:p>
           <w:p>
             <w:pPr>
@@ -8582,12 +9366,14 @@
                 <w:lang w:val="en-GB"/>
               </w:rPr>
             </w:pPr>
+            <w:proofErr w:type="spellStart"/>
             <w:r>
               <w:rPr>
                 <w:lang w:val="en-GB"/>
               </w:rPr>
               <w:t>addAccount</w:t>
             </w:r>
+            <w:proofErr w:type="spellEnd"/>
           </w:p>
           <w:p>
             <w:pPr>
@@ -8595,6 +9381,7 @@
                 <w:lang w:val="en-GB"/>
               </w:rPr>
             </w:pPr>
+            <w:proofErr w:type="spellStart"/>
             <w:r>
               <w:rPr>
                 <w:lang w:val="en-GB"/>
@@ -8607,6 +9394,7 @@
               </w:rPr>
               <w:t>Account</w:t>
             </w:r>
+            <w:proofErr w:type="spellEnd"/>
           </w:p>
           <w:p>
             <w:pPr>
@@ -8614,12 +9402,14 @@
                 <w:lang w:val="en-GB"/>
               </w:rPr>
             </w:pPr>
+            <w:proofErr w:type="spellStart"/>
             <w:r>
               <w:rPr>
                 <w:lang w:val="en-GB"/>
               </w:rPr>
               <w:t>generateNewPwd</w:t>
             </w:r>
+            <w:proofErr w:type="spellEnd"/>
           </w:p>
           <w:p>
             <w:pPr>
@@ -8627,12 +9417,14 @@
                 <w:lang w:val="en-GB"/>
               </w:rPr>
             </w:pPr>
+            <w:proofErr w:type="spellStart"/>
             <w:r>
               <w:rPr>
                 <w:lang w:val="en-GB"/>
               </w:rPr>
               <w:t>modifyRole</w:t>
             </w:r>
+            <w:proofErr w:type="spellEnd"/>
           </w:p>
           <w:p>
             <w:pPr>
@@ -8640,12 +9432,14 @@
                 <w:lang w:val="en-GB"/>
               </w:rPr>
             </w:pPr>
+            <w:proofErr w:type="spellStart"/>
             <w:r>
               <w:rPr>
                 <w:lang w:val="en-GB"/>
               </w:rPr>
               <w:t>modifySupervisor</w:t>
             </w:r>
+            <w:proofErr w:type="spellEnd"/>
           </w:p>
           <w:p>
             <w:pPr>
@@ -8653,12 +9447,14 @@
                 <w:lang w:val="en-GB"/>
               </w:rPr>
             </w:pPr>
+            <w:proofErr w:type="spellStart"/>
             <w:r>
               <w:rPr>
                 <w:lang w:val="en-GB"/>
               </w:rPr>
               <w:t>deleteAccount</w:t>
             </w:r>
+            <w:proofErr w:type="spellEnd"/>
           </w:p>
         </w:tc>
         <w:tc>
@@ -8778,7 +9574,15 @@
     </w:p>
     <w:p>
       <w:r>
-        <w:t>Il controllo del flusso software nel sistema E.W.M.S. segue il modello Event-Driven, tipico delle applicazioni web interattive.</w:t>
+        <w:t>Il controllo del flusso software nel sistema E.W.M.S. segue il modello Event-</w:t>
+      </w:r>
+      <w:proofErr w:type="spellStart"/>
+      <w:r>
+        <w:t>Driven</w:t>
+      </w:r>
+      <w:proofErr w:type="spellEnd"/>
+      <w:r>
+        <w:t>, tipico delle applicazioni web interattive.</w:t>
       </w:r>
       <w:r>
         <w:t xml:space="preserve"> L</w:t>
@@ -8805,7 +9609,15 @@
     <w:p>
       <w:r>
         <w:tab/>
-        <w:t>Il flusso di controllo principale è del tipo sincrono Request-Response:</w:t>
+        <w:t xml:space="preserve">Il flusso di controllo principale è del tipo sincrono </w:t>
+      </w:r>
+      <w:proofErr w:type="spellStart"/>
+      <w:r>
+        <w:t>Request-Response</w:t>
+      </w:r>
+      <w:proofErr w:type="spellEnd"/>
+      <w:r>
+        <w:t>:</w:t>
       </w:r>
     </w:p>
     <w:p>
@@ -8829,7 +9641,23 @@
         </w:numPr>
       </w:pPr>
       <w:r>
-        <w:t>Il web-container intercetterà la richiesta, istanzierà un nuovo thread dedicato e lo indirizza alla servlet specificata</w:t>
+        <w:t xml:space="preserve">Il web-container intercetterà la richiesta, istanzierà un nuovo </w:t>
+      </w:r>
+      <w:proofErr w:type="spellStart"/>
+      <w:r>
+        <w:t>thread</w:t>
+      </w:r>
+      <w:proofErr w:type="spellEnd"/>
+      <w:r>
+        <w:t xml:space="preserve"> dedicato e lo indirizza alla </w:t>
+      </w:r>
+      <w:proofErr w:type="spellStart"/>
+      <w:r>
+        <w:t>servlet</w:t>
+      </w:r>
+      <w:proofErr w:type="spellEnd"/>
+      <w:r>
+        <w:t xml:space="preserve"> specificata</w:t>
       </w:r>
       <w:r>
         <w:t>;</w:t>
@@ -8844,7 +9672,15 @@
         </w:numPr>
       </w:pPr>
       <w:r>
-        <w:t>La servlet esegue la logica di business</w:t>
+        <w:t xml:space="preserve">La </w:t>
+      </w:r>
+      <w:proofErr w:type="spellStart"/>
+      <w:r>
+        <w:t>servlet</w:t>
+      </w:r>
+      <w:proofErr w:type="spellEnd"/>
+      <w:r>
+        <w:t xml:space="preserve"> esegue la logica di business</w:t>
       </w:r>
       <w:r>
         <w:t>;</w:t>
@@ -8901,13 +9737,29 @@
         <w:t>iene</w:t>
       </w:r>
       <w:r>
-        <w:t xml:space="preserve"> un Thread Pool; ogni richiesta HTTP </w:t>
+        <w:t xml:space="preserve"> un </w:t>
+      </w:r>
+      <w:proofErr w:type="spellStart"/>
+      <w:r>
+        <w:t>Thread</w:t>
+      </w:r>
+      <w:proofErr w:type="spellEnd"/>
+      <w:r>
+        <w:t xml:space="preserve"> Pool; ogni richiesta HTTP </w:t>
       </w:r>
       <w:r>
         <w:t xml:space="preserve">verrà quindi </w:t>
       </w:r>
       <w:r>
-        <w:t>eseguita in un thread separato.</w:t>
+        <w:t xml:space="preserve">eseguita in un </w:t>
+      </w:r>
+      <w:proofErr w:type="spellStart"/>
+      <w:r>
+        <w:t>thread</w:t>
+      </w:r>
+      <w:proofErr w:type="spellEnd"/>
+      <w:r>
+        <w:t xml:space="preserve"> separato.</w:t>
       </w:r>
     </w:p>
     <w:p>
@@ -8915,7 +9767,23 @@
         <w:ind w:left="708"/>
       </w:pPr>
       <w:r>
-        <w:t>Le servlet, inoltre, sono oggetti di tipo stateless, non conservano uno stato e n</w:t>
+        <w:t xml:space="preserve">Le </w:t>
+      </w:r>
+      <w:proofErr w:type="spellStart"/>
+      <w:r>
+        <w:t>servlet</w:t>
+      </w:r>
+      <w:proofErr w:type="spellEnd"/>
+      <w:r>
+        <w:t xml:space="preserve">, inoltre, sono oggetti di tipo </w:t>
+      </w:r>
+      <w:proofErr w:type="spellStart"/>
+      <w:r>
+        <w:t>stateless</w:t>
+      </w:r>
+      <w:proofErr w:type="spellEnd"/>
+      <w:r>
+        <w:t>, non conservano uno stato e n</w:t>
       </w:r>
       <w:r>
         <w:t xml:space="preserve">on utilizzano variabili di istanza mutabili per conservare dati specifici dell'utente, prevenendo </w:t>
@@ -8925,13 +9793,38 @@
           <w:b/>
           <w:bCs/>
         </w:rPr>
-        <w:t>race condition</w:t>
-      </w:r>
+        <w:t xml:space="preserve">race </w:t>
+      </w:r>
+      <w:proofErr w:type="spellStart"/>
+      <w:r>
+        <w:rPr>
+          <w:b/>
+          <w:bCs/>
+        </w:rPr>
+        <w:t>condition</w:t>
+      </w:r>
+      <w:proofErr w:type="spellEnd"/>
       <w:r>
         <w:t xml:space="preserve"> </w:t>
       </w:r>
       <w:r>
-        <w:t>quando più thread accedono alla stessa Servlet contemporaneamente.</w:t>
+        <w:t xml:space="preserve">quando più </w:t>
+      </w:r>
+      <w:proofErr w:type="spellStart"/>
+      <w:r>
+        <w:t>thread</w:t>
+      </w:r>
+      <w:proofErr w:type="spellEnd"/>
+      <w:r>
+        <w:t xml:space="preserve"> accedono alla stessa </w:t>
+      </w:r>
+      <w:proofErr w:type="spellStart"/>
+      <w:r>
+        <w:t>Servlet</w:t>
+      </w:r>
+      <w:proofErr w:type="spellEnd"/>
+      <w:r>
+        <w:t xml:space="preserve"> contemporaneamente.</w:t>
       </w:r>
     </w:p>
     <w:p>
@@ -8941,9 +9834,11 @@
       <w:r>
         <w:t xml:space="preserve">Lo stato dell’utente verrà gestito grazie all’utilizzo di un oggetto </w:t>
       </w:r>
+      <w:proofErr w:type="spellStart"/>
       <w:r>
         <w:t>HttpSession</w:t>
       </w:r>
+      <w:proofErr w:type="spellEnd"/>
       <w:r>
         <w:t xml:space="preserve"> unico per ogni utente </w:t>
       </w:r>
@@ -8983,12 +9878,14 @@
       <w:r>
         <w:t xml:space="preserve">La sincronizzazione tra i sottosistemi e l'accesso concorrente al database </w:t>
       </w:r>
+      <w:proofErr w:type="gramStart"/>
       <w:r>
         <w:t>è gestit</w:t>
       </w:r>
       <w:r>
         <w:t>o</w:t>
       </w:r>
+      <w:proofErr w:type="gramEnd"/>
       <w:r>
         <w:t xml:space="preserve"> attraverso:</w:t>
       </w:r>
@@ -9008,7 +9905,15 @@
         <w:t>Transazioni Database (ACID):</w:t>
       </w:r>
       <w:r>
-        <w:t xml:space="preserve"> Per operazioni critiche che coinvolgono più scritture, la consistenza è delegata al DBMS tramite transazioni. In caso di errore in uno dei passaggi, l'intera operazione viene annullata (Rollback).</w:t>
+        <w:t xml:space="preserve"> Per operazioni critiche che coinvolgono più scritture, la consistenza è delegata al DBMS tramite transazioni. In caso di errore in uno dei passaggi, l'intera operazione viene annullata (</w:t>
+      </w:r>
+      <w:proofErr w:type="spellStart"/>
+      <w:r>
+        <w:t>Rollback</w:t>
+      </w:r>
+      <w:proofErr w:type="spellEnd"/>
+      <w:r>
+        <w:t>).</w:t>
       </w:r>
     </w:p>
     <w:p>
@@ -9026,11 +9931,27 @@
         <w:t>Connection Pooling:</w:t>
       </w:r>
       <w:r>
-        <w:t xml:space="preserve"> L'accesso al database è sincronizzato tramite un DataSource (Connection Pool). Questo componente gestisce una coda di connessioni disponibili, </w:t>
+        <w:t xml:space="preserve"> L'accesso al database è sincronizzato tramite un </w:t>
+      </w:r>
+      <w:proofErr w:type="spellStart"/>
+      <w:r>
+        <w:t>DataSource</w:t>
+      </w:r>
+      <w:proofErr w:type="spellEnd"/>
+      <w:r>
+        <w:t xml:space="preserve"> (Connection Pool). Questo componente gestisce una coda di connessioni disponibili, </w:t>
       </w:r>
       <w:r>
         <w:lastRenderedPageBreak/>
-        <w:t>mettendo in attesa i thread se tutte le connessioni sono occupate, prevenendo il sovraccarico del database.</w:t>
+        <w:t xml:space="preserve">mettendo in attesa i </w:t>
+      </w:r>
+      <w:proofErr w:type="spellStart"/>
+      <w:r>
+        <w:t>thread</w:t>
+      </w:r>
+      <w:proofErr w:type="spellEnd"/>
+      <w:r>
+        <w:t xml:space="preserve"> se tutte le connessioni sono occupate, prevenendo il sovraccarico del database.</w:t>
       </w:r>
     </w:p>
     <w:p>
@@ -9063,9 +9984,22 @@
       </w:pPr>
       <w:bookmarkStart w:id="18" w:name="_Toc220175289"/>
       <w:r>
-        <w:t>3.7 Boundary conditions</w:t>
+        <w:t xml:space="preserve">3.7 </w:t>
+      </w:r>
+      <w:proofErr w:type="spellStart"/>
+      <w:r>
+        <w:t>Boundary</w:t>
+      </w:r>
+      <w:proofErr w:type="spellEnd"/>
+      <w:r>
+        <w:t xml:space="preserve"> </w:t>
+      </w:r>
+      <w:proofErr w:type="spellStart"/>
+      <w:r>
+        <w:t>conditions</w:t>
       </w:r>
       <w:bookmarkEnd w:id="18"/>
+      <w:proofErr w:type="spellEnd"/>
     </w:p>
     <w:p/>
     <w:p>
@@ -9079,7 +10013,15 @@
         <w:t xml:space="preserve">. </w:t>
       </w:r>
       <w:r>
-        <w:t>L'obiettivo è garantire l'integrità dei dati e fornire feedback adeguati agli utenti</w:t>
+        <w:t xml:space="preserve">L'obiettivo è garantire l'integrità dei dati e fornire </w:t>
+      </w:r>
+      <w:proofErr w:type="gramStart"/>
+      <w:r>
+        <w:t>feedback</w:t>
+      </w:r>
+      <w:proofErr w:type="gramEnd"/>
+      <w:r>
+        <w:t xml:space="preserve"> adeguati agli utenti</w:t>
       </w:r>
       <w:r>
         <w:t xml:space="preserve"> e ai programmatori che interverranno in caso di malfunzionamenti</w:t>
@@ -9105,13 +10047,29 @@
     <w:p/>
     <w:p>
       <w:r>
-        <w:t xml:space="preserve">L'avvio del sistema coincide con il deploy </w:t>
+        <w:t xml:space="preserve">L'avvio del sistema coincide con il </w:t>
+      </w:r>
+      <w:proofErr w:type="spellStart"/>
+      <w:r>
+        <w:t>deploy</w:t>
+      </w:r>
+      <w:proofErr w:type="spellEnd"/>
+      <w:r>
+        <w:t xml:space="preserve"> </w:t>
       </w:r>
       <w:r>
         <w:t>del file</w:t>
       </w:r>
       <w:r>
-        <w:t xml:space="preserve"> EWMS.war all'interno del Web Container (Apache Tomcat) o con il riavvio del servizio Tomcat stesso. Durante la fase di inizializzazione, il sistema esegue le seguenti operazioni sequenziali:</w:t>
+        <w:t xml:space="preserve"> </w:t>
+      </w:r>
+      <w:proofErr w:type="spellStart"/>
+      <w:r>
+        <w:t>EWMS.war</w:t>
+      </w:r>
+      <w:proofErr w:type="spellEnd"/>
+      <w:r>
+        <w:t xml:space="preserve"> all'interno del Web Container (Apache Tomcat) o con il riavvio del servizio Tomcat stesso. Durante la fase di inizializzazione, il sistema esegue le seguenti operazioni sequenziali:</w:t>
       </w:r>
     </w:p>
     <w:p>
@@ -9153,7 +10111,15 @@
         <w:t>Inizializzazione Connection Pool:</w:t>
       </w:r>
       <w:r>
-        <w:t xml:space="preserve"> Viene istanziato il DataSource per la connessione al database MySQL. </w:t>
+        <w:t xml:space="preserve"> Viene istanziato il </w:t>
+      </w:r>
+      <w:proofErr w:type="spellStart"/>
+      <w:r>
+        <w:t>DataSource</w:t>
+      </w:r>
+      <w:proofErr w:type="spellEnd"/>
+      <w:r>
+        <w:t xml:space="preserve"> per la connessione al database MySQL. </w:t>
       </w:r>
     </w:p>
     <w:p>
@@ -9230,7 +10196,15 @@
     </w:p>
     <w:p>
       <w:r>
-        <w:t>La terminazione del sistema coincide all’arresto o l’undeploy, tramite il servizio Tomcat</w:t>
+        <w:t>La terminazione del sistema coincide all’arresto o l’</w:t>
+      </w:r>
+      <w:proofErr w:type="spellStart"/>
+      <w:r>
+        <w:t>undeploy</w:t>
+      </w:r>
+      <w:proofErr w:type="spellEnd"/>
+      <w:r>
+        <w:t>, tramite il servizio Tomcat</w:t>
       </w:r>
       <w:r>
         <w:t>. Il sistema garantisce:</w:t>
@@ -9272,12 +10246,21 @@
       <w:r>
         <w:t xml:space="preserve"> Il Connection Pool viene chiuso forzatamente. Tutte le connessioni JDBC attive vengono terminate e i driver database deregistrati per evitare </w:t>
       </w:r>
+      <w:proofErr w:type="spellStart"/>
       <w:r>
         <w:rPr>
           <w:i/>
           <w:iCs/>
         </w:rPr>
-        <w:t>memory leaks</w:t>
+        <w:t>memory</w:t>
+      </w:r>
+      <w:proofErr w:type="spellEnd"/>
+      <w:r>
+        <w:rPr>
+          <w:i/>
+          <w:iCs/>
+        </w:rPr>
+        <w:t xml:space="preserve"> leaks</w:t>
       </w:r>
       <w:r>
         <w:t xml:space="preserve"> nel server.</w:t>
@@ -9295,10 +10278,34 @@
           <w:b/>
           <w:bCs/>
         </w:rPr>
-        <w:t>Completamento Thread:</w:t>
-      </w:r>
-      <w:r>
-        <w:t xml:space="preserve"> Se vi sono operazioni di upload file in corso, il sistema tenta di completarle (entro un timeout prestabilito) o di abortirle in modo pulito cancellando i file parziali.</w:t>
+        <w:t xml:space="preserve">Completamento </w:t>
+      </w:r>
+      <w:proofErr w:type="spellStart"/>
+      <w:r>
+        <w:rPr>
+          <w:b/>
+          <w:bCs/>
+        </w:rPr>
+        <w:t>Thread</w:t>
+      </w:r>
+      <w:proofErr w:type="spellEnd"/>
+      <w:r>
+        <w:rPr>
+          <w:b/>
+          <w:bCs/>
+        </w:rPr>
+        <w:t>:</w:t>
+      </w:r>
+      <w:r>
+        <w:t xml:space="preserve"> Se vi sono operazioni di upload file in corso, il sistema tenta di completarle (entro un </w:t>
+      </w:r>
+      <w:proofErr w:type="spellStart"/>
+      <w:r>
+        <w:t>timeout</w:t>
+      </w:r>
+      <w:proofErr w:type="spellEnd"/>
+      <w:r>
+        <w:t xml:space="preserve"> prestabilito) o di abortirle in modo pulito cancellando i file parziali.</w:t>
       </w:r>
       <w:r>
         <w:br/>
@@ -9319,7 +10326,15 @@
     </w:p>
     <w:p>
       <w:r>
-        <w:t>Il sistema deve gestire i malfunzionamenti garantendo che l'utente non veda mai stack trace o errori di codice.</w:t>
+        <w:t xml:space="preserve">Il sistema deve gestire i malfunzionamenti garantendo che l'utente non veda mai </w:t>
+      </w:r>
+      <w:proofErr w:type="spellStart"/>
+      <w:r>
+        <w:t>stack</w:t>
+      </w:r>
+      <w:proofErr w:type="spellEnd"/>
+      <w:r>
+        <w:t xml:space="preserve"> trace o errori di codice.</w:t>
       </w:r>
     </w:p>
     <w:p>
@@ -9338,7 +10353,15 @@
         <w:t>Errori Applicativi (Software Bugs / Eccezioni)</w:t>
       </w:r>
       <w:r>
-        <w:t xml:space="preserve"> In caso di NullPointerException o altre eccezioni non gestite (HTTP 500):</w:t>
+        <w:t xml:space="preserve"> In caso di </w:t>
+      </w:r>
+      <w:proofErr w:type="spellStart"/>
+      <w:r>
+        <w:t>NullPointerException</w:t>
+      </w:r>
+      <w:proofErr w:type="spellEnd"/>
+      <w:r>
+        <w:t xml:space="preserve"> o altre eccezioni non gestite (HTTP 500):</w:t>
       </w:r>
     </w:p>
     <w:p>
@@ -9359,7 +10382,15 @@
         <w:t>Log:</w:t>
       </w:r>
       <w:r>
-        <w:t xml:space="preserve"> L'errore completo (con stack trace) viene scritto nei file di log del server (es. Log4j/SLF4J) per l'analisi da parte degli sviluppatori.</w:t>
+        <w:t xml:space="preserve"> L'errore completo (con </w:t>
+      </w:r>
+      <w:proofErr w:type="spellStart"/>
+      <w:r>
+        <w:t>stack</w:t>
+      </w:r>
+      <w:proofErr w:type="spellEnd"/>
+      <w:r>
+        <w:t xml:space="preserve"> trace) viene scritto nei file di log del server (es. Log4j/SLF4J) per l'analisi da parte degli sviluppatori.</w:t>
       </w:r>
     </w:p>
     <w:p>
@@ -9416,7 +10447,15 @@
         </w:numPr>
       </w:pPr>
       <w:r>
-        <w:t>Il Connection Pool solleverà eccezioni SQLTransientConnectionException.</w:t>
+        <w:t xml:space="preserve">Il Connection Pool solleverà eccezioni </w:t>
+      </w:r>
+      <w:proofErr w:type="spellStart"/>
+      <w:r>
+        <w:t>SQLTransientConnectionException</w:t>
+      </w:r>
+      <w:proofErr w:type="spellEnd"/>
+      <w:r>
+        <w:t>.</w:t>
       </w:r>
     </w:p>
     <w:p>
@@ -9479,7 +10518,15 @@
         <w:t>Violazioni di Sicurezza</w:t>
       </w:r>
       <w:r>
-        <w:t xml:space="preserve"> Come definito nella sezione 3.5, tentativi di accesso non autorizzato (es. URL Forcing) non generano errori di sistema, ma reindirizzano l'utente alla pagina di Login o mostrano una pagina di errore 403 (Forbidden) standardizzata.</w:t>
+        <w:t xml:space="preserve"> Come definito nella sezione 3.5, tentativi di accesso non autorizzato (es. URL Forcing) non generano errori di sistema, ma reindirizzano l'utente alla pagina di Login o mostrano una pagina di errore 403 (</w:t>
+      </w:r>
+      <w:proofErr w:type="spellStart"/>
+      <w:r>
+        <w:t>Forbidden</w:t>
+      </w:r>
+      <w:proofErr w:type="spellEnd"/>
+      <w:r>
+        <w:t>) standardizzata.</w:t>
       </w:r>
     </w:p>
     <w:p/>
@@ -9509,7 +10556,15 @@
     <w:p/>
     <w:p>
       <w:r>
-        <w:t>In questa sezione verranno descritti i servizi offerti da ciascun subsystem applicativo.</w:t>
+        <w:t xml:space="preserve">In questa sezione verranno descritti i servizi offerti da ciascun </w:t>
+      </w:r>
+      <w:proofErr w:type="spellStart"/>
+      <w:r>
+        <w:t>subsystem</w:t>
+      </w:r>
+      <w:proofErr w:type="spellEnd"/>
+      <w:r>
+        <w:t xml:space="preserve"> applicativo.</w:t>
       </w:r>
     </w:p>
     <w:p/>
@@ -9520,9 +10575,14 @@
       </w:pPr>
       <w:bookmarkStart w:id="23" w:name="_Toc220175294"/>
       <w:r>
-        <w:t>4.1 AccessManagement</w:t>
+        <w:t xml:space="preserve">4.1 </w:t>
+      </w:r>
+      <w:proofErr w:type="spellStart"/>
+      <w:r>
+        <w:t>AccessManagement</w:t>
       </w:r>
       <w:bookmarkEnd w:id="23"/>
+      <w:proofErr w:type="spellEnd"/>
       <w:r>
         <w:t xml:space="preserve"> </w:t>
       </w:r>
@@ -9532,6 +10592,7 @@
       <w:pPr>
         <w:ind w:left="360"/>
       </w:pPr>
+      <w:proofErr w:type="spellStart"/>
       <w:r>
         <w:rPr>
           <w:b/>
@@ -9539,6 +10600,7 @@
         </w:rPr>
         <w:t>SessionService</w:t>
       </w:r>
+      <w:proofErr w:type="spellEnd"/>
       <w:r>
         <w:t>: gestisce il controllo degli accessi e la sicurezza della sessione. È utilizzato da tutti gli altri sistemi e dal livello client per verificare l’identità e i permessi.</w:t>
       </w:r>
@@ -9634,9 +10696,11 @@
             <w:tcW w:w="4634" w:type="dxa"/>
           </w:tcPr>
           <w:p>
+            <w:proofErr w:type="spellStart"/>
             <w:r>
               <w:t>getUtente</w:t>
             </w:r>
+            <w:proofErr w:type="spellEnd"/>
           </w:p>
         </w:tc>
         <w:tc>
@@ -9662,9 +10726,11 @@
             <w:tcW w:w="4634" w:type="dxa"/>
           </w:tcPr>
           <w:p>
+            <w:proofErr w:type="spellStart"/>
             <w:r>
               <w:t>checkPermission</w:t>
             </w:r>
+            <w:proofErr w:type="spellEnd"/>
           </w:p>
         </w:tc>
         <w:tc>
@@ -9692,14 +10758,20 @@
       </w:pPr>
       <w:bookmarkStart w:id="24" w:name="_Toc220175295"/>
       <w:r>
-        <w:t>4.2 AccountManagement</w:t>
+        <w:t xml:space="preserve">4.2 </w:t>
+      </w:r>
+      <w:proofErr w:type="spellStart"/>
+      <w:r>
+        <w:t>AccountManagement</w:t>
       </w:r>
       <w:bookmarkEnd w:id="24"/>
+      <w:proofErr w:type="spellEnd"/>
       <w:r>
         <w:br/>
       </w:r>
     </w:p>
     <w:p>
+      <w:proofErr w:type="spellStart"/>
       <w:r>
         <w:rPr>
           <w:b/>
@@ -9707,6 +10779,7 @@
         </w:rPr>
         <w:t>PersonalProfileService</w:t>
       </w:r>
+      <w:proofErr w:type="spellEnd"/>
       <w:r>
         <w:t>: gestisce tutte le operazioni che un utente autenticato può eseguire sul proprio account</w:t>
       </w:r>
@@ -9781,9 +10854,11 @@
             <w:pPr>
               <w:spacing w:after="160" w:line="259" w:lineRule="auto"/>
             </w:pPr>
+            <w:proofErr w:type="spellStart"/>
             <w:r>
               <w:t>getMyProfile</w:t>
             </w:r>
+            <w:proofErr w:type="spellEnd"/>
           </w:p>
         </w:tc>
         <w:tc>
@@ -9795,13 +10870,21 @@
               <w:spacing w:after="160" w:line="259" w:lineRule="auto"/>
             </w:pPr>
             <w:r>
-              <w:t>Recupera i dettagli dell’account dell’utente corrent</w:t>
+              <w:t xml:space="preserve">Recupera i dettagli dell’account dell’utente </w:t>
+            </w:r>
+            <w:proofErr w:type="spellStart"/>
+            <w:r>
+              <w:t>corrent</w:t>
             </w:r>
             <w:r>
               <w:t>a</w:t>
             </w:r>
             <w:r>
-              <w:t>mente loggato.</w:t>
+              <w:t>mente</w:t>
+            </w:r>
+            <w:proofErr w:type="spellEnd"/>
+            <w:r>
+              <w:t xml:space="preserve"> loggato.</w:t>
             </w:r>
           </w:p>
         </w:tc>
@@ -9812,9 +10895,11 @@
             <w:tcW w:w="4634" w:type="dxa"/>
           </w:tcPr>
           <w:p>
+            <w:proofErr w:type="spellStart"/>
             <w:r>
               <w:t>changePwd</w:t>
             </w:r>
+            <w:proofErr w:type="spellEnd"/>
           </w:p>
         </w:tc>
         <w:tc>
@@ -9863,6 +10948,7 @@
       </w:pPr>
     </w:p>
     <w:p>
+      <w:proofErr w:type="spellStart"/>
       <w:r>
         <w:rPr>
           <w:b/>
@@ -9870,6 +10956,7 @@
         </w:rPr>
         <w:t>ProfileManagementService</w:t>
       </w:r>
+      <w:proofErr w:type="spellEnd"/>
       <w:r>
         <w:t>: gestisce le operazioni amministrative riservate al ruolo del Gestore degli account</w:t>
       </w:r>
@@ -9944,9 +11031,11 @@
             <w:pPr>
               <w:spacing w:after="160" w:line="259" w:lineRule="auto"/>
             </w:pPr>
+            <w:proofErr w:type="spellStart"/>
             <w:r>
               <w:t>addAccount</w:t>
             </w:r>
+            <w:proofErr w:type="spellEnd"/>
           </w:p>
         </w:tc>
         <w:tc>
@@ -9969,9 +11058,11 @@
             <w:tcW w:w="4634" w:type="dxa"/>
           </w:tcPr>
           <w:p>
+            <w:proofErr w:type="spellStart"/>
             <w:r>
               <w:t>getAccount</w:t>
             </w:r>
+            <w:proofErr w:type="spellEnd"/>
           </w:p>
         </w:tc>
         <w:tc>
@@ -9991,9 +11082,11 @@
             <w:tcW w:w="4634" w:type="dxa"/>
           </w:tcPr>
           <w:p>
+            <w:proofErr w:type="spellStart"/>
             <w:r>
               <w:t>generateNewPwd</w:t>
             </w:r>
+            <w:proofErr w:type="spellEnd"/>
           </w:p>
         </w:tc>
         <w:tc>
@@ -10013,9 +11106,11 @@
             <w:tcW w:w="4634" w:type="dxa"/>
           </w:tcPr>
           <w:p>
+            <w:proofErr w:type="spellStart"/>
             <w:r>
               <w:t>modifyRole</w:t>
             </w:r>
+            <w:proofErr w:type="spellEnd"/>
           </w:p>
         </w:tc>
         <w:tc>
@@ -10035,9 +11130,11 @@
             <w:tcW w:w="4634" w:type="dxa"/>
           </w:tcPr>
           <w:p>
+            <w:proofErr w:type="spellStart"/>
             <w:r>
               <w:t>modifySupervisor</w:t>
             </w:r>
+            <w:proofErr w:type="spellEnd"/>
           </w:p>
         </w:tc>
         <w:tc>
@@ -10057,9 +11154,11 @@
             <w:tcW w:w="4634" w:type="dxa"/>
           </w:tcPr>
           <w:p>
+            <w:proofErr w:type="spellStart"/>
             <w:r>
               <w:t>replacePassword</w:t>
             </w:r>
+            <w:proofErr w:type="spellEnd"/>
           </w:p>
         </w:tc>
         <w:tc>
@@ -10079,9 +11178,11 @@
             <w:tcW w:w="4634" w:type="dxa"/>
           </w:tcPr>
           <w:p>
+            <w:proofErr w:type="spellStart"/>
             <w:r>
               <w:t>deleteAccount</w:t>
             </w:r>
+            <w:proofErr w:type="spellEnd"/>
           </w:p>
         </w:tc>
         <w:tc>
@@ -10108,12 +11209,18 @@
       </w:pPr>
       <w:bookmarkStart w:id="25" w:name="_Toc220175296"/>
       <w:r>
-        <w:t>4.3 TaskManagement</w:t>
+        <w:t xml:space="preserve">4.3 </w:t>
+      </w:r>
+      <w:proofErr w:type="spellStart"/>
+      <w:r>
+        <w:t>TaskManagement</w:t>
       </w:r>
       <w:bookmarkEnd w:id="25"/>
+      <w:proofErr w:type="spellEnd"/>
     </w:p>
     <w:p/>
     <w:p>
+      <w:proofErr w:type="spellStart"/>
       <w:r>
         <w:rPr>
           <w:b/>
@@ -10121,6 +11228,7 @@
         </w:rPr>
         <w:t>TaskCommonService</w:t>
       </w:r>
+      <w:proofErr w:type="spellEnd"/>
       <w:r>
         <w:t xml:space="preserve">: </w:t>
       </w:r>
@@ -10200,9 +11308,11 @@
             <w:pPr>
               <w:spacing w:after="160" w:line="259" w:lineRule="auto"/>
             </w:pPr>
+            <w:proofErr w:type="spellStart"/>
             <w:r>
               <w:t>getTask</w:t>
             </w:r>
+            <w:proofErr w:type="spellEnd"/>
           </w:p>
         </w:tc>
         <w:tc>
@@ -10225,9 +11335,11 @@
             <w:tcW w:w="4634" w:type="dxa"/>
           </w:tcPr>
           <w:p>
+            <w:proofErr w:type="spellStart"/>
             <w:r>
               <w:t>filterTask</w:t>
             </w:r>
+            <w:proofErr w:type="spellEnd"/>
           </w:p>
         </w:tc>
         <w:tc>
@@ -10236,7 +11348,15 @@
           </w:tcPr>
           <w:p>
             <w:r>
-              <w:t>Permette di filtrare task per stato (da completare, inizializzate ecc…).</w:t>
+              <w:t xml:space="preserve">Permette di filtrare task per stato (da completare, inizializzate </w:t>
+            </w:r>
+            <w:proofErr w:type="spellStart"/>
+            <w:r>
+              <w:t>ecc</w:t>
+            </w:r>
+            <w:proofErr w:type="spellEnd"/>
+            <w:r>
+              <w:t>…).</w:t>
             </w:r>
           </w:p>
         </w:tc>
@@ -10247,9 +11367,11 @@
             <w:tcW w:w="4634" w:type="dxa"/>
           </w:tcPr>
           <w:p>
+            <w:proofErr w:type="spellStart"/>
             <w:r>
               <w:t>holdTask</w:t>
             </w:r>
+            <w:proofErr w:type="spellEnd"/>
           </w:p>
         </w:tc>
         <w:tc>
@@ -10269,9 +11391,11 @@
             <w:tcW w:w="4634" w:type="dxa"/>
           </w:tcPr>
           <w:p>
+            <w:proofErr w:type="spellStart"/>
             <w:r>
               <w:t>dowloadAllegato</w:t>
             </w:r>
+            <w:proofErr w:type="spellEnd"/>
           </w:p>
         </w:tc>
         <w:tc>
@@ -10302,6 +11426,7 @@
     </w:p>
     <w:p/>
     <w:p>
+      <w:proofErr w:type="spellStart"/>
       <w:r>
         <w:rPr>
           <w:b/>
@@ -10309,6 +11434,7 @@
         </w:rPr>
         <w:t>TaskSupervisoreService</w:t>
       </w:r>
+      <w:proofErr w:type="spellEnd"/>
       <w:r>
         <w:t>: espone tutte le operazioni eseguibili da un Supervisore sul ciclo di vita di un task</w:t>
       </w:r>
@@ -10385,9 +11511,11 @@
             <w:pPr>
               <w:spacing w:after="160" w:line="259" w:lineRule="auto"/>
             </w:pPr>
+            <w:proofErr w:type="spellStart"/>
             <w:r>
               <w:t>createTask</w:t>
             </w:r>
+            <w:proofErr w:type="spellEnd"/>
           </w:p>
         </w:tc>
         <w:tc>
@@ -10410,9 +11538,11 @@
             <w:tcW w:w="4634" w:type="dxa"/>
           </w:tcPr>
           <w:p>
+            <w:proofErr w:type="spellStart"/>
             <w:r>
               <w:t>deleteTask</w:t>
             </w:r>
+            <w:proofErr w:type="spellEnd"/>
           </w:p>
         </w:tc>
         <w:tc>
@@ -10432,9 +11562,11 @@
             <w:tcW w:w="4634" w:type="dxa"/>
           </w:tcPr>
           <w:p>
+            <w:proofErr w:type="spellStart"/>
             <w:r>
               <w:t>sendWarning</w:t>
             </w:r>
+            <w:proofErr w:type="spellEnd"/>
           </w:p>
         </w:tc>
         <w:tc>
@@ -10457,6 +11589,7 @@
     </w:tbl>
     <w:p/>
     <w:p>
+      <w:proofErr w:type="spellStart"/>
       <w:r>
         <w:rPr>
           <w:b/>
@@ -10464,6 +11597,7 @@
         </w:rPr>
         <w:t>TaskDipendenteService</w:t>
       </w:r>
+      <w:proofErr w:type="spellEnd"/>
       <w:r>
         <w:t>: espone tutte le operazioni eseguibili da un Dipendente sul ciclo di vita di un task.</w:t>
       </w:r>
@@ -10538,9 +11672,11 @@
             <w:pPr>
               <w:spacing w:after="160" w:line="259" w:lineRule="auto"/>
             </w:pPr>
+            <w:proofErr w:type="spellStart"/>
             <w:r>
               <w:t>inizializzaTask</w:t>
             </w:r>
+            <w:proofErr w:type="spellEnd"/>
           </w:p>
         </w:tc>
         <w:tc>
@@ -10572,9 +11708,11 @@
             <w:tcW w:w="4634" w:type="dxa"/>
           </w:tcPr>
           <w:p>
+            <w:proofErr w:type="spellStart"/>
             <w:r>
               <w:t>completeTask</w:t>
             </w:r>
+            <w:proofErr w:type="spellEnd"/>
           </w:p>
         </w:tc>
         <w:tc>
@@ -10603,12 +11741,18 @@
       </w:pPr>
       <w:bookmarkStart w:id="26" w:name="_Toc220175297"/>
       <w:r>
-        <w:t>4.5 NotificheManagement</w:t>
+        <w:t xml:space="preserve">4.5 </w:t>
+      </w:r>
+      <w:proofErr w:type="spellStart"/>
+      <w:r>
+        <w:t>NotificheManagement</w:t>
       </w:r>
       <w:bookmarkEnd w:id="26"/>
+      <w:proofErr w:type="spellEnd"/>
     </w:p>
     <w:p/>
     <w:p>
+      <w:proofErr w:type="spellStart"/>
       <w:r>
         <w:rPr>
           <w:b/>
@@ -10616,6 +11760,7 @@
         </w:rPr>
         <w:t>NotificheService</w:t>
       </w:r>
+      <w:proofErr w:type="spellEnd"/>
       <w:r>
         <w:t xml:space="preserve">: gestisce la comunicazione asincrona e gli avvisi. </w:t>
       </w:r>
@@ -10690,9 +11835,11 @@
             <w:pPr>
               <w:spacing w:after="160" w:line="259" w:lineRule="auto"/>
             </w:pPr>
+            <w:proofErr w:type="spellStart"/>
             <w:r>
               <w:t>showNotification</w:t>
             </w:r>
+            <w:proofErr w:type="spellEnd"/>
           </w:p>
         </w:tc>
         <w:tc>
@@ -10715,9 +11862,11 @@
             <w:tcW w:w="4634" w:type="dxa"/>
           </w:tcPr>
           <w:p>
+            <w:proofErr w:type="spellStart"/>
             <w:r>
               <w:t>send</w:t>
             </w:r>
+            <w:proofErr w:type="spellEnd"/>
           </w:p>
         </w:tc>
         <w:tc>
@@ -10742,12 +11891,18 @@
       <w:bookmarkStart w:id="27" w:name="_Toc220175298"/>
       <w:r>
         <w:lastRenderedPageBreak/>
-        <w:t>4.6 PersistenceManagement</w:t>
+        <w:t xml:space="preserve">4.6 </w:t>
+      </w:r>
+      <w:proofErr w:type="spellStart"/>
+      <w:r>
+        <w:t>PersistenceManagement</w:t>
       </w:r>
       <w:bookmarkEnd w:id="27"/>
+      <w:proofErr w:type="spellEnd"/>
     </w:p>
     <w:p/>
     <w:p>
+      <w:proofErr w:type="spellStart"/>
       <w:r>
         <w:rPr>
           <w:b/>
@@ -10755,6 +11910,7 @@
         </w:rPr>
         <w:t>PersistenceService</w:t>
       </w:r>
+      <w:proofErr w:type="spellEnd"/>
       <w:r>
         <w:rPr>
           <w:b/>
@@ -10841,9 +11997,11 @@
             <w:pPr>
               <w:spacing w:after="160" w:line="259" w:lineRule="auto"/>
             </w:pPr>
+            <w:proofErr w:type="spellStart"/>
             <w:r>
               <w:t>getUtenteDAO</w:t>
             </w:r>
+            <w:proofErr w:type="spellEnd"/>
           </w:p>
         </w:tc>
         <w:tc>
@@ -10855,7 +12013,15 @@
               <w:spacing w:after="160" w:line="259" w:lineRule="auto"/>
             </w:pPr>
             <w:r>
-              <w:t xml:space="preserve">Restituisce un riferimento ad un oggetto della classe UtenteDAO </w:t>
+              <w:t xml:space="preserve">Restituisce un riferimento ad un oggetto della classe </w:t>
+            </w:r>
+            <w:proofErr w:type="spellStart"/>
+            <w:r>
+              <w:t>UtenteDAO</w:t>
+            </w:r>
+            <w:proofErr w:type="spellEnd"/>
+            <w:r>
+              <w:t xml:space="preserve"> </w:t>
             </w:r>
           </w:p>
         </w:tc>
@@ -10866,9 +12032,11 @@
             <w:tcW w:w="4634" w:type="dxa"/>
           </w:tcPr>
           <w:p>
+            <w:proofErr w:type="spellStart"/>
             <w:r>
               <w:t>getTaskDAO</w:t>
             </w:r>
+            <w:proofErr w:type="spellEnd"/>
           </w:p>
         </w:tc>
         <w:tc>
@@ -10880,8 +12048,13 @@
               <w:t xml:space="preserve">Restituisce un riferimento ad un oggetto della </w:t>
             </w:r>
             <w:r>
-              <w:t>classe TaskDAO</w:t>
-            </w:r>
+              <w:t xml:space="preserve">classe </w:t>
+            </w:r>
+            <w:proofErr w:type="spellStart"/>
+            <w:r>
+              <w:t>TaskDAO</w:t>
+            </w:r>
+            <w:proofErr w:type="spellEnd"/>
           </w:p>
         </w:tc>
       </w:tr>
@@ -10896,9 +12069,11 @@
                 <w:tab w:val="center" w:pos="2209"/>
               </w:tabs>
             </w:pPr>
+            <w:proofErr w:type="spellStart"/>
             <w:r>
               <w:t>getNotificheDAO</w:t>
             </w:r>
+            <w:proofErr w:type="spellEnd"/>
           </w:p>
         </w:tc>
         <w:tc>
@@ -10909,9 +12084,11 @@
             <w:r>
               <w:t xml:space="preserve">Restituisce un riferimento ad un oggetto della classe </w:t>
             </w:r>
+            <w:proofErr w:type="spellStart"/>
             <w:r>
               <w:t>NotificheDAO</w:t>
             </w:r>
+            <w:proofErr w:type="spellEnd"/>
           </w:p>
         </w:tc>
       </w:tr>
@@ -10919,6 +12096,7 @@
     <w:p/>
     <w:p/>
     <w:p>
+      <w:proofErr w:type="spellStart"/>
       <w:r>
         <w:rPr>
           <w:b/>
@@ -10926,6 +12104,7 @@
         </w:rPr>
         <w:t>ITaskDAO</w:t>
       </w:r>
+      <w:proofErr w:type="spellEnd"/>
       <w:r>
         <w:t>: gestisce tutte le operazioni CRUD del sistema riguardando i task.</w:t>
       </w:r>
@@ -11027,9 +12206,11 @@
             <w:tcW w:w="4634" w:type="dxa"/>
           </w:tcPr>
           <w:p>
+            <w:proofErr w:type="spellStart"/>
             <w:r>
               <w:t>findById</w:t>
             </w:r>
+            <w:proofErr w:type="spellEnd"/>
           </w:p>
         </w:tc>
         <w:tc>
@@ -11049,9 +12230,11 @@
             <w:tcW w:w="4634" w:type="dxa"/>
           </w:tcPr>
           <w:p>
+            <w:proofErr w:type="spellStart"/>
             <w:r>
               <w:t>findByUtente</w:t>
             </w:r>
+            <w:proofErr w:type="spellEnd"/>
           </w:p>
         </w:tc>
         <w:tc>
@@ -11071,9 +12254,11 @@
             <w:tcW w:w="4634" w:type="dxa"/>
           </w:tcPr>
           <w:p>
+            <w:proofErr w:type="spellStart"/>
             <w:r>
               <w:t>updateStatus</w:t>
             </w:r>
+            <w:proofErr w:type="spellEnd"/>
           </w:p>
         </w:tc>
         <w:tc>
@@ -11112,6 +12297,7 @@
     </w:tbl>
     <w:p/>
     <w:p>
+      <w:proofErr w:type="spellStart"/>
       <w:r>
         <w:rPr>
           <w:b/>
@@ -11133,6 +12319,7 @@
         </w:rPr>
         <w:t>DAO</w:t>
       </w:r>
+      <w:proofErr w:type="spellEnd"/>
       <w:r>
         <w:rPr>
           <w:b/>
@@ -11216,12 +12403,14 @@
             <w:pPr>
               <w:spacing w:after="160" w:line="259" w:lineRule="auto"/>
             </w:pPr>
+            <w:proofErr w:type="spellStart"/>
             <w:r>
               <w:t>Create</w:t>
             </w:r>
             <w:r>
               <w:t>Utente</w:t>
             </w:r>
+            <w:proofErr w:type="spellEnd"/>
           </w:p>
         </w:tc>
         <w:tc>
@@ -11244,9 +12433,11 @@
             <w:tcW w:w="4634" w:type="dxa"/>
           </w:tcPr>
           <w:p>
+            <w:proofErr w:type="spellStart"/>
             <w:r>
               <w:t>createDipendente</w:t>
             </w:r>
+            <w:proofErr w:type="spellEnd"/>
           </w:p>
         </w:tc>
         <w:tc>
@@ -11266,9 +12457,11 @@
             <w:tcW w:w="4634" w:type="dxa"/>
           </w:tcPr>
           <w:p>
+            <w:proofErr w:type="spellStart"/>
             <w:r>
               <w:t>createSupervisore</w:t>
             </w:r>
+            <w:proofErr w:type="spellEnd"/>
           </w:p>
         </w:tc>
         <w:tc>
@@ -11288,10 +12481,12 @@
             <w:tcW w:w="4634" w:type="dxa"/>
           </w:tcPr>
           <w:p>
+            <w:proofErr w:type="spellStart"/>
             <w:r>
               <w:lastRenderedPageBreak/>
               <w:t>findByMatricola</w:t>
             </w:r>
+            <w:proofErr w:type="spellEnd"/>
           </w:p>
         </w:tc>
         <w:tc>
@@ -11311,9 +12506,11 @@
             <w:tcW w:w="4634" w:type="dxa"/>
           </w:tcPr>
           <w:p>
+            <w:proofErr w:type="spellStart"/>
             <w:r>
               <w:t>findByEmail</w:t>
             </w:r>
+            <w:proofErr w:type="spellEnd"/>
           </w:p>
         </w:tc>
         <w:tc>
@@ -11322,8 +12519,13 @@
           </w:tcPr>
           <w:p>
             <w:r>
-              <w:t>Permette di recuperare un utente dal database utilizzando l’email</w:t>
-            </w:r>
+              <w:t xml:space="preserve">Permette di recuperare un utente dal database utilizzando </w:t>
+            </w:r>
+            <w:proofErr w:type="gramStart"/>
+            <w:r>
+              <w:t>l’email</w:t>
+            </w:r>
+            <w:proofErr w:type="gramEnd"/>
           </w:p>
         </w:tc>
       </w:tr>
@@ -11333,9 +12535,11 @@
             <w:tcW w:w="4634" w:type="dxa"/>
           </w:tcPr>
           <w:p>
+            <w:proofErr w:type="spellStart"/>
             <w:r>
               <w:t>getAllDipendentiInfo</w:t>
             </w:r>
+            <w:proofErr w:type="spellEnd"/>
           </w:p>
         </w:tc>
         <w:tc>
@@ -11355,9 +12559,11 @@
             <w:tcW w:w="4634" w:type="dxa"/>
           </w:tcPr>
           <w:p>
+            <w:proofErr w:type="spellStart"/>
             <w:r>
               <w:t>getSupervisoreInfo</w:t>
             </w:r>
+            <w:proofErr w:type="spellEnd"/>
           </w:p>
         </w:tc>
         <w:tc>
@@ -11377,9 +12583,11 @@
             <w:tcW w:w="4634" w:type="dxa"/>
           </w:tcPr>
           <w:p>
+            <w:proofErr w:type="spellStart"/>
             <w:r>
               <w:t>updateRuolo</w:t>
             </w:r>
+            <w:proofErr w:type="spellEnd"/>
           </w:p>
         </w:tc>
         <w:tc>
@@ -11399,9 +12607,11 @@
             <w:tcW w:w="4634" w:type="dxa"/>
           </w:tcPr>
           <w:p>
+            <w:proofErr w:type="spellStart"/>
             <w:r>
               <w:t>updateSupervisore</w:t>
             </w:r>
+            <w:proofErr w:type="spellEnd"/>
           </w:p>
         </w:tc>
         <w:tc>
@@ -11421,9 +12631,11 @@
             <w:tcW w:w="4634" w:type="dxa"/>
           </w:tcPr>
           <w:p>
+            <w:proofErr w:type="spellStart"/>
             <w:r>
               <w:t>updatePassword</w:t>
             </w:r>
+            <w:proofErr w:type="spellEnd"/>
           </w:p>
         </w:tc>
         <w:tc>
@@ -11432,7 +12644,15 @@
           </w:tcPr>
           <w:p>
             <w:r>
-              <w:t xml:space="preserve">Cambia l’hash della password nel database </w:t>
+              <w:t>Cambia l’</w:t>
+            </w:r>
+            <w:proofErr w:type="spellStart"/>
+            <w:r>
+              <w:t>hash</w:t>
+            </w:r>
+            <w:proofErr w:type="spellEnd"/>
+            <w:r>
+              <w:t xml:space="preserve"> della password nel database </w:t>
             </w:r>
           </w:p>
         </w:tc>
@@ -11465,9 +12685,11 @@
             <w:tcW w:w="4634" w:type="dxa"/>
           </w:tcPr>
           <w:p>
+            <w:proofErr w:type="spellStart"/>
             <w:r>
               <w:t>recuperaPassword</w:t>
             </w:r>
+            <w:proofErr w:type="spellEnd"/>
           </w:p>
         </w:tc>
         <w:tc>
@@ -11476,7 +12698,15 @@
           </w:tcPr>
           <w:p>
             <w:r>
-              <w:t>Permettere di ottenere la password sul database utilizzando l’email dell’utente</w:t>
+              <w:t xml:space="preserve">Permettere di ottenere la password sul database utilizzando </w:t>
+            </w:r>
+            <w:proofErr w:type="gramStart"/>
+            <w:r>
+              <w:t>l’email</w:t>
+            </w:r>
+            <w:proofErr w:type="gramEnd"/>
+            <w:r>
+              <w:t xml:space="preserve"> dell’utente</w:t>
             </w:r>
           </w:p>
         </w:tc>
@@ -11499,6 +12729,7 @@
       </w:pPr>
     </w:p>
     <w:p>
+      <w:proofErr w:type="spellStart"/>
       <w:r>
         <w:rPr>
           <w:b/>
@@ -11506,6 +12737,7 @@
         </w:rPr>
         <w:t>INotificheDAO</w:t>
       </w:r>
+      <w:proofErr w:type="spellEnd"/>
       <w:r>
         <w:t>: gestisce tutte le operazioni CRUD del sistema riguardando le notifiche</w:t>
       </w:r>
@@ -11608,9 +12840,11 @@
             <w:tcW w:w="4634" w:type="dxa"/>
           </w:tcPr>
           <w:p>
+            <w:proofErr w:type="spellStart"/>
             <w:r>
               <w:t>getByUtente</w:t>
             </w:r>
+            <w:proofErr w:type="spellEnd"/>
           </w:p>
         </w:tc>
         <w:tc>
@@ -11665,12 +12899,21 @@
           <w:bCs/>
         </w:rPr>
       </w:pPr>
+      <w:proofErr w:type="spellStart"/>
       <w:r>
         <w:rPr>
           <w:b/>
           <w:bCs/>
         </w:rPr>
-        <w:t>Deploy / Deployment:</w:t>
+        <w:t>Deploy</w:t>
+      </w:r>
+      <w:proofErr w:type="spellEnd"/>
+      <w:r>
+        <w:rPr>
+          <w:b/>
+          <w:bCs/>
+        </w:rPr>
+        <w:t xml:space="preserve"> / Deployment:</w:t>
       </w:r>
       <w:r>
         <w:t xml:space="preserve"> L'atto di installare e avviare l'applicazione sul server di produzione. È il momento in cui il codice scritto dai programmatori viene impacchettato e messo in condizione di essere usato dagli utenti.</w:t>
@@ -11684,12 +12927,21 @@
       </w:r>
     </w:p>
     <w:p>
+      <w:proofErr w:type="spellStart"/>
       <w:r>
         <w:rPr>
           <w:b/>
           <w:bCs/>
         </w:rPr>
-        <w:t>Graceful Shutdown:</w:t>
+        <w:t>Graceful</w:t>
+      </w:r>
+      <w:proofErr w:type="spellEnd"/>
+      <w:r>
+        <w:rPr>
+          <w:b/>
+          <w:bCs/>
+        </w:rPr>
+        <w:t xml:space="preserve"> Shutdown:</w:t>
       </w:r>
       <w:r>
         <w:t xml:space="preserve"> Una procedura di spegnimento controllato.</w:t>
@@ -12098,8 +13350,16 @@
             <w:rPr>
               <w:sz w:val="20"/>
             </w:rPr>
-            <w:t>System Design Document</w:t>
+            <w:t xml:space="preserve">System Design </w:t>
           </w:r>
+          <w:proofErr w:type="spellStart"/>
+          <w:r>
+            <w:rPr>
+              <w:sz w:val="20"/>
+            </w:rPr>
+            <w:t>Document</w:t>
+          </w:r>
+          <w:proofErr w:type="spellEnd"/>
         </w:p>
       </w:tc>
       <w:tc>

</xml_diff>

<commit_message>
Add: aggiunti test plan per le classi dao e di servizio da implementare
Mod: modifiche ulteriori ai contratti del ODD
</commit_message>
<xml_diff>
--- a/Workspace/SDD/SDD_EWMS.docx
+++ b/Workspace/SDD/SDD_EWMS.docx
@@ -7658,11 +7658,9 @@
             <w:tcW w:w="2694" w:type="dxa"/>
           </w:tcPr>
           <w:p>
-            <w:proofErr w:type="spellStart"/>
             <w:r>
               <w:t>PersistenceManagement</w:t>
             </w:r>
-            <w:proofErr w:type="spellEnd"/>
           </w:p>
         </w:tc>
         <w:tc>
@@ -11670,14 +11668,9 @@
       <w:bookmarkStart w:id="27" w:name="_Toc220693599"/>
       <w:r>
         <w:lastRenderedPageBreak/>
-        <w:t xml:space="preserve">4.6 </w:t>
-      </w:r>
-      <w:proofErr w:type="spellStart"/>
-      <w:r>
-        <w:t>PersistenceManagement</w:t>
+        <w:t>4.6 PersistenceManagement</w:t>
       </w:r>
       <w:bookmarkEnd w:id="27"/>
-      <w:proofErr w:type="spellEnd"/>
     </w:p>
     <w:p/>
     <w:p>
@@ -12421,11 +12414,11 @@
           </w:tcPr>
           <w:p>
             <w:r>
-              <w:t>Cambia l’</w:t>
+              <w:t xml:space="preserve">Cambia </w:t>
             </w:r>
             <w:proofErr w:type="spellStart"/>
             <w:r>
-              <w:t>hash</w:t>
+              <w:t>l’hash</w:t>
             </w:r>
             <w:proofErr w:type="spellEnd"/>
             <w:r>

</xml_diff>

<commit_message>
Mod: quasi tutte le servlet
Add: aggiunti js validazione form
</commit_message>
<xml_diff>
--- a/Workspace/SDD/SDD_EWMS.docx
+++ b/Workspace/SDD/SDD_EWMS.docx
@@ -4520,15 +4520,13 @@
         <w:t>a</w:t>
       </w:r>
       <w:r>
-        <w:t xml:space="preserve">, stabilità, compatibilità con Java e facilità di manutenzione del </w:t>
-      </w:r>
-      <w:proofErr w:type="spellStart"/>
-      <w:r>
-        <w:t>layer</w:t>
-      </w:r>
-      <w:proofErr w:type="spellEnd"/>
-      <w:r>
-        <w:t xml:space="preserve"> di persistenza.</w:t>
+        <w:t>, stabilità</w:t>
+      </w:r>
+      <w:r>
+        <w:t xml:space="preserve"> e </w:t>
+      </w:r>
+      <w:r>
+        <w:t>compatibilità con Java.</w:t>
       </w:r>
     </w:p>
     <w:p>
@@ -4966,17 +4964,10 @@
     </w:p>
     <w:p>
       <w:pPr>
-        <w:rPr>
-          <w:b/>
-          <w:bCs/>
-        </w:rPr>
-      </w:pPr>
-    </w:p>
-    <w:p>
-      <w:pPr>
         <w:pStyle w:val="Titolo4"/>
       </w:pPr>
       <w:r>
+        <w:lastRenderedPageBreak/>
         <w:t xml:space="preserve">DG_5 </w:t>
       </w:r>
       <w:r>
@@ -5339,29 +5330,26 @@
         <w:br/>
       </w:r>
       <w:r>
-        <w:t xml:space="preserve">Sessioni più brevi aumentano la sicurezza, ma possono essere frustranti per gli utenti con </w:t>
-      </w:r>
+        <w:t>Sessioni più brevi aumentano la sicurezza, ma possono essere frustranti per gli utenti con task prolungati.</w:t>
+      </w:r>
+      <w:r>
+        <w:t xml:space="preserve"> </w:t>
+      </w:r>
+      <w:r>
+        <w:t>Sessioni più lunghe migliorano l’usabilità, ma aumentano la finestra di rischio per accessi non autorizzati.</w:t>
+      </w:r>
+    </w:p>
+    <w:p>
+      <w:pPr>
+        <w:pStyle w:val="Paragrafoelenco"/>
+      </w:pPr>
+    </w:p>
+    <w:p>
+      <w:pPr>
+        <w:pStyle w:val="Titolo4"/>
+      </w:pPr>
       <w:r>
         <w:lastRenderedPageBreak/>
-        <w:t>task prolungati.</w:t>
-      </w:r>
-      <w:r>
-        <w:t xml:space="preserve"> </w:t>
-      </w:r>
-      <w:r>
-        <w:t>Sessioni più lunghe migliorano l’usabilità, ma aumentano la finestra di rischio per accessi non autorizzati.</w:t>
-      </w:r>
-    </w:p>
-    <w:p>
-      <w:pPr>
-        <w:pStyle w:val="Paragrafoelenco"/>
-      </w:pPr>
-    </w:p>
-    <w:p>
-      <w:pPr>
-        <w:pStyle w:val="Titolo4"/>
-      </w:pPr>
-      <w:r>
         <w:t>DG_</w:t>
       </w:r>
       <w:r>
@@ -6020,7 +6008,6 @@
                 <w:b/>
                 <w:bCs/>
               </w:rPr>
-              <w:lastRenderedPageBreak/>
               <w:t>HTTP / HTTPS</w:t>
             </w:r>
           </w:p>
@@ -6082,6 +6069,7 @@
                 <w:b/>
                 <w:bCs/>
               </w:rPr>
+              <w:lastRenderedPageBreak/>
               <w:t>JDBC</w:t>
             </w:r>
           </w:p>
@@ -6768,6 +6756,7 @@
         <w:rPr>
           <w:lang w:val="en-US"/>
         </w:rPr>
+        <w:lastRenderedPageBreak/>
         <w:t>Panoramica</w:t>
       </w:r>
       <w:proofErr w:type="spellEnd"/>
@@ -7079,7 +7068,6 @@
     </w:p>
     <w:p>
       <w:r>
-        <w:lastRenderedPageBreak/>
         <w:t xml:space="preserve">La progettazione del sistema parte dall’assunzione che siano necessari: </w:t>
       </w:r>
     </w:p>
@@ -7097,6 +7085,7 @@
         <w:rPr>
           <w:lang w:val="en-US"/>
         </w:rPr>
+        <w:lastRenderedPageBreak/>
         <w:t xml:space="preserve">accesso </w:t>
       </w:r>
       <w:proofErr w:type="spellStart"/>
@@ -7171,6 +7160,7 @@
         <w:t xml:space="preserve"> affronta tali limitazioni offrendo una piattaforma centralizzata, progettata per garantire visibilità in tempo reale, scalabilità operativa e un'interazione fluida tra dipendenti e supervisori. L’architettura del sistema permette una gestione precisa dei task e una distribuzione efficiente del carico operativo.</w:t>
       </w:r>
     </w:p>
+    <w:p/>
     <w:p>
       <w:pPr>
         <w:pStyle w:val="Titolo1"/>
@@ -8434,10 +8424,10 @@
           <w:noProof/>
         </w:rPr>
         <w:drawing>
-          <wp:inline distT="0" distB="0" distL="0" distR="0" wp14:anchorId="6F9E94D9" wp14:editId="58C7928E">
-            <wp:extent cx="6119495" cy="3774440"/>
+          <wp:inline distT="0" distB="0" distL="0" distR="0" wp14:anchorId="3BD69748" wp14:editId="4C1B2C13">
+            <wp:extent cx="6119495" cy="3628390"/>
             <wp:effectExtent l="0" t="0" r="0" b="0"/>
-            <wp:docPr id="1337559621" name="Elemento grafico 2"/>
+            <wp:docPr id="1135601803" name="Elemento grafico 2"/>
             <wp:cNvGraphicFramePr>
               <a:graphicFrameLocks xmlns:a="http://schemas.openxmlformats.org/drawingml/2006/main" noChangeAspect="1"/>
             </wp:cNvGraphicFramePr>
@@ -8445,7 +8435,7 @@
               <a:graphicData uri="http://schemas.openxmlformats.org/drawingml/2006/picture">
                 <pic:pic xmlns:pic="http://schemas.openxmlformats.org/drawingml/2006/picture">
                   <pic:nvPicPr>
-                    <pic:cNvPr id="1337559621" name="Elemento grafico 1337559621"/>
+                    <pic:cNvPr id="1135601803" name="Elemento grafico 1135601803"/>
                     <pic:cNvPicPr/>
                   </pic:nvPicPr>
                   <pic:blipFill>
@@ -8463,7 +8453,7 @@
                   <pic:spPr>
                     <a:xfrm>
                       <a:off x="0" y="0"/>
-                      <a:ext cx="6119495" cy="3774440"/>
+                      <a:ext cx="6119495" cy="3628390"/>
                     </a:xfrm>
                     <a:prstGeom prst="rect">
                       <a:avLst/>
@@ -8633,16 +8623,16 @@
     <w:tbl>
       <w:tblPr>
         <w:tblStyle w:val="Grigliatabella"/>
-        <w:tblW w:w="0" w:type="auto"/>
+        <w:tblW w:w="10060" w:type="dxa"/>
         <w:tblLayout w:type="fixed"/>
         <w:tblLook w:val="04A0" w:firstRow="1" w:lastRow="0" w:firstColumn="1" w:lastColumn="0" w:noHBand="0" w:noVBand="1"/>
       </w:tblPr>
       <w:tblGrid>
         <w:gridCol w:w="1971"/>
-        <w:gridCol w:w="1993"/>
+        <w:gridCol w:w="2135"/>
+        <w:gridCol w:w="1985"/>
+        <w:gridCol w:w="1842"/>
         <w:gridCol w:w="2127"/>
-        <w:gridCol w:w="1842"/>
-        <w:gridCol w:w="1695"/>
       </w:tblGrid>
       <w:tr>
         <w:trPr>
@@ -8718,7 +8708,7 @@
         </w:tc>
         <w:tc>
           <w:tcPr>
-            <w:tcW w:w="1993" w:type="dxa"/>
+            <w:tcW w:w="2135" w:type="dxa"/>
             <w:vAlign w:val="center"/>
           </w:tcPr>
           <w:p>
@@ -8727,6 +8717,34 @@
             </w:pPr>
             <w:r>
               <w:t>Utente</w:t>
+            </w:r>
+          </w:p>
+        </w:tc>
+        <w:tc>
+          <w:tcPr>
+            <w:tcW w:w="1985" w:type="dxa"/>
+            <w:vAlign w:val="center"/>
+          </w:tcPr>
+          <w:p>
+            <w:pPr>
+              <w:jc w:val="center"/>
+            </w:pPr>
+            <w:r>
+              <w:t>Notifica</w:t>
+            </w:r>
+          </w:p>
+        </w:tc>
+        <w:tc>
+          <w:tcPr>
+            <w:tcW w:w="1842" w:type="dxa"/>
+            <w:vAlign w:val="center"/>
+          </w:tcPr>
+          <w:p>
+            <w:pPr>
+              <w:jc w:val="center"/>
+            </w:pPr>
+            <w:r>
+              <w:t>Task</w:t>
             </w:r>
           </w:p>
         </w:tc>
@@ -8740,7 +8758,93 @@
               <w:jc w:val="center"/>
             </w:pPr>
             <w:r>
-              <w:t>Notifica</w:t>
+              <w:t>Allegato</w:t>
+            </w:r>
+          </w:p>
+        </w:tc>
+      </w:tr>
+      <w:tr>
+        <w:tc>
+          <w:tcPr>
+            <w:tcW w:w="1971" w:type="dxa"/>
+            <w:vAlign w:val="center"/>
+          </w:tcPr>
+          <w:p>
+            <w:r>
+              <w:t>Supervisore</w:t>
+            </w:r>
+          </w:p>
+          <w:p/>
+        </w:tc>
+        <w:tc>
+          <w:tcPr>
+            <w:tcW w:w="2135" w:type="dxa"/>
+          </w:tcPr>
+          <w:p>
+            <w:r>
+              <w:t>L</w:t>
+            </w:r>
+            <w:r>
+              <w:t>ogin</w:t>
+            </w:r>
+          </w:p>
+          <w:p>
+            <w:proofErr w:type="spellStart"/>
+            <w:r>
+              <w:t>getUtente</w:t>
+            </w:r>
+            <w:proofErr w:type="spellEnd"/>
+          </w:p>
+          <w:p>
+            <w:proofErr w:type="spellStart"/>
+            <w:r>
+              <w:t>change_pwd</w:t>
+            </w:r>
+            <w:proofErr w:type="spellEnd"/>
+          </w:p>
+          <w:p>
+            <w:proofErr w:type="spellStart"/>
+            <w:r>
+              <w:rPr>
+                <w:lang w:val="en-GB"/>
+              </w:rPr>
+              <w:t>getAllDipendentiInfo</w:t>
+            </w:r>
+            <w:proofErr w:type="spellEnd"/>
+          </w:p>
+        </w:tc>
+        <w:tc>
+          <w:tcPr>
+            <w:tcW w:w="1985" w:type="dxa"/>
+          </w:tcPr>
+          <w:p>
+            <w:proofErr w:type="spellStart"/>
+            <w:r>
+              <w:t>showNotification</w:t>
+            </w:r>
+            <w:proofErr w:type="spellEnd"/>
+          </w:p>
+          <w:p>
+            <w:pPr>
+              <w:rPr>
+                <w:lang w:val="en-GB"/>
+              </w:rPr>
+            </w:pPr>
+            <w:proofErr w:type="spellStart"/>
+            <w:r>
+              <w:rPr>
+                <w:lang w:val="en-GB"/>
+              </w:rPr>
+              <w:t>holdTask</w:t>
+            </w:r>
+            <w:proofErr w:type="spellEnd"/>
+          </w:p>
+          <w:p>
+            <w:r>
+              <w:rPr>
+                <w:lang w:val="en-GB"/>
+              </w:rPr>
+              <w:t>send</w:t>
             </w:r>
           </w:p>
         </w:tc>
@@ -8751,25 +8855,121 @@
           </w:tcPr>
           <w:p>
             <w:pPr>
-              <w:jc w:val="center"/>
-            </w:pPr>
-            <w:r>
+              <w:rPr>
+                <w:lang w:val="en-GB"/>
+              </w:rPr>
+            </w:pPr>
+            <w:proofErr w:type="spellStart"/>
+            <w:r>
+              <w:rPr>
+                <w:lang w:val="en-GB"/>
+              </w:rPr>
+              <w:t>getAllTaskSup</w:t>
+            </w:r>
+            <w:proofErr w:type="spellEnd"/>
+          </w:p>
+          <w:p>
+            <w:pPr>
+              <w:rPr>
+                <w:lang w:val="en-GB"/>
+              </w:rPr>
+            </w:pPr>
+            <w:proofErr w:type="spellStart"/>
+            <w:r>
+              <w:rPr>
+                <w:lang w:val="en-GB"/>
+              </w:rPr>
+              <w:t>createTask</w:t>
+            </w:r>
+            <w:proofErr w:type="spellEnd"/>
+          </w:p>
+          <w:p>
+            <w:pPr>
+              <w:rPr>
+                <w:lang w:val="en-GB"/>
+              </w:rPr>
+            </w:pPr>
+            <w:proofErr w:type="spellStart"/>
+            <w:r>
+              <w:rPr>
+                <w:lang w:val="en-GB"/>
+              </w:rPr>
+              <w:t>deleteTask</w:t>
+            </w:r>
+            <w:proofErr w:type="spellEnd"/>
+          </w:p>
+          <w:p>
+            <w:pPr>
+              <w:rPr>
+                <w:lang w:val="en-GB"/>
+              </w:rPr>
+            </w:pPr>
+            <w:proofErr w:type="spellStart"/>
+            <w:r>
+              <w:rPr>
+                <w:lang w:val="en-GB"/>
+              </w:rPr>
+              <w:t>get</w:t>
+            </w:r>
+            <w:r>
+              <w:rPr>
+                <w:lang w:val="en-GB"/>
+              </w:rPr>
               <w:t>Task</w:t>
             </w:r>
-          </w:p>
-        </w:tc>
-        <w:tc>
-          <w:tcPr>
-            <w:tcW w:w="1695" w:type="dxa"/>
-            <w:vAlign w:val="center"/>
-          </w:tcPr>
-          <w:p>
-            <w:pPr>
-              <w:jc w:val="center"/>
-            </w:pPr>
+            <w:proofErr w:type="spellEnd"/>
+          </w:p>
+          <w:p>
+            <w:pPr>
+              <w:rPr>
+                <w:lang w:val="en-GB"/>
+              </w:rPr>
+            </w:pPr>
+            <w:proofErr w:type="spellStart"/>
+            <w:r>
+              <w:rPr>
+                <w:lang w:val="en-GB"/>
+              </w:rPr>
+              <w:t>holdTask</w:t>
+            </w:r>
+            <w:proofErr w:type="spellEnd"/>
+          </w:p>
+          <w:p>
+            <w:pPr>
+              <w:rPr>
+                <w:lang w:val="en-GB"/>
+              </w:rPr>
+            </w:pPr>
+          </w:p>
+        </w:tc>
+        <w:tc>
+          <w:tcPr>
+            <w:tcW w:w="2127" w:type="dxa"/>
+          </w:tcPr>
+          <w:p>
+            <w:proofErr w:type="spellStart"/>
+            <w:r>
+              <w:t>upload</w:t>
+            </w:r>
             <w:r>
               <w:t>Allegato</w:t>
             </w:r>
+            <w:proofErr w:type="spellEnd"/>
+          </w:p>
+          <w:p>
+            <w:pPr>
+              <w:rPr>
+                <w:u w:val="single"/>
+              </w:rPr>
+            </w:pPr>
+            <w:proofErr w:type="spellStart"/>
+            <w:r>
+              <w:t>download</w:t>
+            </w:r>
+            <w:r>
+              <w:t>Allegato</w:t>
+            </w:r>
+            <w:proofErr w:type="spellEnd"/>
           </w:p>
         </w:tc>
       </w:tr>
@@ -8781,14 +8981,13 @@
           </w:tcPr>
           <w:p>
             <w:r>
-              <w:t>Supervisore</w:t>
-            </w:r>
-          </w:p>
-          <w:p/>
-        </w:tc>
-        <w:tc>
-          <w:tcPr>
-            <w:tcW w:w="1993" w:type="dxa"/>
+              <w:t>Dipendente</w:t>
+            </w:r>
+          </w:p>
+        </w:tc>
+        <w:tc>
+          <w:tcPr>
+            <w:tcW w:w="2135" w:type="dxa"/>
           </w:tcPr>
           <w:p>
             <w:r>
@@ -8808,14 +9007,23 @@
           <w:p>
             <w:proofErr w:type="spellStart"/>
             <w:r>
-              <w:t>change_pwd</w:t>
+              <w:t>c</w:t>
+            </w:r>
+            <w:r>
+              <w:t>hange</w:t>
+            </w:r>
+            <w:r>
+              <w:t>_</w:t>
+            </w:r>
+            <w:r>
+              <w:t>pwd</w:t>
             </w:r>
             <w:proofErr w:type="spellEnd"/>
           </w:p>
         </w:tc>
         <w:tc>
           <w:tcPr>
-            <w:tcW w:w="2127" w:type="dxa"/>
+            <w:tcW w:w="1985" w:type="dxa"/>
           </w:tcPr>
           <w:p>
             <w:proofErr w:type="spellStart"/>
@@ -8823,24 +9031,29 @@
               <w:t>showNotification</w:t>
             </w:r>
             <w:proofErr w:type="spellEnd"/>
-            <w:r>
-              <w:br/>
-            </w:r>
+          </w:p>
+          <w:p>
+            <w:pPr>
+              <w:rPr>
+                <w:lang w:val="en-GB"/>
+              </w:rPr>
+            </w:pPr>
             <w:proofErr w:type="spellStart"/>
             <w:r>
-              <w:t>sendWarning</w:t>
+              <w:rPr>
+                <w:lang w:val="en-GB"/>
+              </w:rPr>
+              <w:t>holdTask</w:t>
             </w:r>
             <w:proofErr w:type="spellEnd"/>
           </w:p>
           <w:p>
-            <w:proofErr w:type="spellStart"/>
             <w:r>
               <w:rPr>
                 <w:lang w:val="en-GB"/>
               </w:rPr>
-              <w:t>holdTask</w:t>
-            </w:r>
-            <w:proofErr w:type="spellEnd"/>
+              <w:t>send</w:t>
+            </w:r>
           </w:p>
         </w:tc>
         <w:tc>
@@ -8859,7 +9072,7 @@
               <w:rPr>
                 <w:lang w:val="en-GB"/>
               </w:rPr>
-              <w:t>createTask</w:t>
+              <w:t>getAllTaskDip</w:t>
             </w:r>
             <w:proofErr w:type="spellEnd"/>
           </w:p>
@@ -8874,7 +9087,13 @@
               <w:rPr>
                 <w:lang w:val="en-GB"/>
               </w:rPr>
-              <w:t>deleteTask</w:t>
+              <w:t>get</w:t>
+            </w:r>
+            <w:r>
+              <w:rPr>
+                <w:lang w:val="en-GB"/>
+              </w:rPr>
+              <w:t>Task</w:t>
             </w:r>
             <w:proofErr w:type="spellEnd"/>
           </w:p>
@@ -8889,7 +9108,7 @@
               <w:rPr>
                 <w:lang w:val="en-GB"/>
               </w:rPr>
-              <w:t>showTasks</w:t>
+              <w:t>inizializzaTask</w:t>
             </w:r>
             <w:proofErr w:type="spellEnd"/>
           </w:p>
@@ -8904,7 +9123,7 @@
               <w:rPr>
                 <w:lang w:val="en-GB"/>
               </w:rPr>
-              <w:t>fetchTask</w:t>
+              <w:t>completeTask</w:t>
             </w:r>
             <w:proofErr w:type="spellEnd"/>
           </w:p>
@@ -8919,29 +9138,41 @@
               <w:rPr>
                 <w:lang w:val="en-GB"/>
               </w:rPr>
-              <w:t>holdTask</w:t>
+              <w:t>h</w:t>
+            </w:r>
+            <w:r>
+              <w:rPr>
+                <w:lang w:val="en-GB"/>
+              </w:rPr>
+              <w:t>oldTask</w:t>
             </w:r>
             <w:proofErr w:type="spellEnd"/>
           </w:p>
         </w:tc>
         <w:tc>
           <w:tcPr>
-            <w:tcW w:w="1695" w:type="dxa"/>
-          </w:tcPr>
-          <w:p>
-            <w:r>
-              <w:t>upload</w:t>
-            </w:r>
-          </w:p>
-          <w:p>
-            <w:pPr>
-              <w:rPr>
-                <w:u w:val="single"/>
-              </w:rPr>
-            </w:pPr>
-            <w:r>
+            <w:tcW w:w="2127" w:type="dxa"/>
+          </w:tcPr>
+          <w:p>
+            <w:pPr>
+              <w:rPr>
+                <w:lang w:val="en-GB"/>
+              </w:rPr>
+            </w:pPr>
+            <w:proofErr w:type="spellStart"/>
+            <w:r>
+              <w:rPr>
+                <w:lang w:val="en-GB"/>
+              </w:rPr>
               <w:t>download</w:t>
             </w:r>
+            <w:r>
+              <w:rPr>
+                <w:lang w:val="en-GB"/>
+              </w:rPr>
+              <w:t>Allegato</w:t>
+            </w:r>
+            <w:proofErr w:type="spellEnd"/>
           </w:p>
         </w:tc>
       </w:tr>
@@ -8953,66 +9184,179 @@
           </w:tcPr>
           <w:p>
             <w:r>
-              <w:t>Dipendente</w:t>
-            </w:r>
-          </w:p>
-        </w:tc>
-        <w:tc>
-          <w:tcPr>
-            <w:tcW w:w="1993" w:type="dxa"/>
-          </w:tcPr>
-          <w:p>
-            <w:r>
-              <w:t>L</w:t>
-            </w:r>
-            <w:r>
-              <w:t>ogin</w:t>
-            </w:r>
-          </w:p>
-          <w:p>
+              <w:t>Gestore degli account</w:t>
+            </w:r>
+          </w:p>
+        </w:tc>
+        <w:tc>
+          <w:tcPr>
+            <w:tcW w:w="2135" w:type="dxa"/>
+          </w:tcPr>
+          <w:p>
+            <w:pPr>
+              <w:rPr>
+                <w:lang w:val="en-GB"/>
+              </w:rPr>
+            </w:pPr>
+            <w:r>
+              <w:rPr>
+                <w:lang w:val="en-GB"/>
+              </w:rPr>
+              <w:t>Login</w:t>
+            </w:r>
+          </w:p>
+          <w:p>
+            <w:pPr>
+              <w:rPr>
+                <w:lang w:val="en-GB"/>
+              </w:rPr>
+            </w:pPr>
             <w:proofErr w:type="spellStart"/>
             <w:r>
+              <w:rPr>
+                <w:lang w:val="en-GB"/>
+              </w:rPr>
               <w:t>getUtente</w:t>
             </w:r>
             <w:proofErr w:type="spellEnd"/>
           </w:p>
           <w:p>
+            <w:pPr>
+              <w:rPr>
+                <w:lang w:val="en-GB"/>
+              </w:rPr>
+            </w:pPr>
             <w:proofErr w:type="spellStart"/>
             <w:r>
-              <w:t>c</w:t>
-            </w:r>
-            <w:r>
-              <w:t>hange</w:t>
-            </w:r>
-            <w:r>
-              <w:t>_</w:t>
-            </w:r>
-            <w:r>
-              <w:t>pwd</w:t>
+              <w:rPr>
+                <w:lang w:val="en-GB"/>
+              </w:rPr>
+              <w:t>change_pwd</w:t>
             </w:r>
             <w:proofErr w:type="spellEnd"/>
           </w:p>
-        </w:tc>
-        <w:tc>
-          <w:tcPr>
-            <w:tcW w:w="2127" w:type="dxa"/>
-          </w:tcPr>
-          <w:p>
+          <w:p>
+            <w:pPr>
+              <w:rPr>
+                <w:lang w:val="en-GB"/>
+              </w:rPr>
+            </w:pPr>
             <w:proofErr w:type="spellStart"/>
             <w:r>
-              <w:t>showNotification</w:t>
+              <w:rPr>
+                <w:lang w:val="en-GB"/>
+              </w:rPr>
+              <w:t>addAccount</w:t>
             </w:r>
             <w:proofErr w:type="spellEnd"/>
           </w:p>
           <w:p>
+            <w:pPr>
+              <w:rPr>
+                <w:lang w:val="en-GB"/>
+              </w:rPr>
+            </w:pPr>
             <w:proofErr w:type="spellStart"/>
             <w:r>
               <w:rPr>
                 <w:lang w:val="en-GB"/>
               </w:rPr>
-              <w:t>holdTask</w:t>
+              <w:t>get</w:t>
+            </w:r>
+            <w:r>
+              <w:rPr>
+                <w:lang w:val="en-GB"/>
+              </w:rPr>
+              <w:t>Account</w:t>
             </w:r>
             <w:proofErr w:type="spellEnd"/>
+          </w:p>
+          <w:p>
+            <w:pPr>
+              <w:rPr>
+                <w:lang w:val="en-GB"/>
+              </w:rPr>
+            </w:pPr>
+            <w:proofErr w:type="spellStart"/>
+            <w:r>
+              <w:rPr>
+                <w:lang w:val="en-GB"/>
+              </w:rPr>
+              <w:t>getAllAccount</w:t>
+            </w:r>
+            <w:proofErr w:type="spellEnd"/>
+          </w:p>
+          <w:p>
+            <w:pPr>
+              <w:rPr>
+                <w:lang w:val="en-GB"/>
+              </w:rPr>
+            </w:pPr>
+            <w:proofErr w:type="spellStart"/>
+            <w:r>
+              <w:rPr>
+                <w:lang w:val="en-GB"/>
+              </w:rPr>
+              <w:t>modifyRole</w:t>
+            </w:r>
+            <w:proofErr w:type="spellEnd"/>
+          </w:p>
+          <w:p>
+            <w:pPr>
+              <w:rPr>
+                <w:lang w:val="en-GB"/>
+              </w:rPr>
+            </w:pPr>
+            <w:proofErr w:type="spellStart"/>
+            <w:r>
+              <w:rPr>
+                <w:lang w:val="en-GB"/>
+              </w:rPr>
+              <w:t>modifySupervisor</w:t>
+            </w:r>
+            <w:proofErr w:type="spellEnd"/>
+          </w:p>
+          <w:p>
+            <w:pPr>
+              <w:rPr>
+                <w:lang w:val="en-GB"/>
+              </w:rPr>
+            </w:pPr>
+            <w:proofErr w:type="spellStart"/>
+            <w:r>
+              <w:rPr>
+                <w:lang w:val="en-GB"/>
+              </w:rPr>
+              <w:t>replacePassword</w:t>
+            </w:r>
+            <w:proofErr w:type="spellEnd"/>
+          </w:p>
+          <w:p>
+            <w:pPr>
+              <w:rPr>
+                <w:lang w:val="en-GB"/>
+              </w:rPr>
+            </w:pPr>
+            <w:proofErr w:type="spellStart"/>
+            <w:r>
+              <w:rPr>
+                <w:lang w:val="en-GB"/>
+              </w:rPr>
+              <w:t>deleteAccount</w:t>
+            </w:r>
+            <w:proofErr w:type="spellEnd"/>
+          </w:p>
+        </w:tc>
+        <w:tc>
+          <w:tcPr>
+            <w:tcW w:w="1985" w:type="dxa"/>
+          </w:tcPr>
+          <w:p>
+            <w:pPr>
+              <w:rPr>
+                <w:lang w:val="en-GB"/>
+              </w:rPr>
+            </w:pPr>
           </w:p>
         </w:tc>
         <w:tc>
@@ -9026,285 +9370,11 @@
                 <w:lang w:val="en-GB"/>
               </w:rPr>
             </w:pPr>
-            <w:proofErr w:type="spellStart"/>
-            <w:r>
-              <w:rPr>
-                <w:lang w:val="en-GB"/>
-              </w:rPr>
-              <w:t>showTasks</w:t>
-            </w:r>
-            <w:proofErr w:type="spellEnd"/>
-          </w:p>
-          <w:p>
-            <w:pPr>
-              <w:rPr>
-                <w:lang w:val="en-GB"/>
-              </w:rPr>
-            </w:pPr>
-            <w:proofErr w:type="spellStart"/>
-            <w:r>
-              <w:rPr>
-                <w:lang w:val="en-GB"/>
-              </w:rPr>
-              <w:t>fetchTask</w:t>
-            </w:r>
-            <w:proofErr w:type="spellEnd"/>
-          </w:p>
-          <w:p>
-            <w:pPr>
-              <w:rPr>
-                <w:lang w:val="en-GB"/>
-              </w:rPr>
-            </w:pPr>
-            <w:proofErr w:type="spellStart"/>
-            <w:r>
-              <w:rPr>
-                <w:lang w:val="en-GB"/>
-              </w:rPr>
-              <w:t>inizializzaTask</w:t>
-            </w:r>
-            <w:proofErr w:type="spellEnd"/>
-          </w:p>
-          <w:p>
-            <w:pPr>
-              <w:rPr>
-                <w:lang w:val="en-GB"/>
-              </w:rPr>
-            </w:pPr>
-            <w:proofErr w:type="spellStart"/>
-            <w:r>
-              <w:rPr>
-                <w:lang w:val="en-GB"/>
-              </w:rPr>
-              <w:t>completeTask</w:t>
-            </w:r>
-            <w:proofErr w:type="spellEnd"/>
-          </w:p>
-          <w:p>
-            <w:pPr>
-              <w:rPr>
-                <w:lang w:val="en-GB"/>
-              </w:rPr>
-            </w:pPr>
-            <w:proofErr w:type="spellStart"/>
-            <w:r>
-              <w:rPr>
-                <w:lang w:val="en-GB"/>
-              </w:rPr>
-              <w:t>h</w:t>
-            </w:r>
-            <w:r>
-              <w:rPr>
-                <w:lang w:val="en-GB"/>
-              </w:rPr>
-              <w:t>oldTask</w:t>
-            </w:r>
-            <w:proofErr w:type="spellEnd"/>
-          </w:p>
-        </w:tc>
-        <w:tc>
-          <w:tcPr>
-            <w:tcW w:w="1695" w:type="dxa"/>
-          </w:tcPr>
-          <w:p>
-            <w:pPr>
-              <w:rPr>
-                <w:lang w:val="en-GB"/>
-              </w:rPr>
-            </w:pPr>
-            <w:r>
-              <w:rPr>
-                <w:lang w:val="en-GB"/>
-              </w:rPr>
-              <w:t>download</w:t>
-            </w:r>
-          </w:p>
-        </w:tc>
-      </w:tr>
-      <w:tr>
-        <w:tc>
-          <w:tcPr>
-            <w:tcW w:w="1971" w:type="dxa"/>
-            <w:vAlign w:val="center"/>
-          </w:tcPr>
-          <w:p>
-            <w:r>
-              <w:t>Gestore degli account</w:t>
-            </w:r>
-          </w:p>
-        </w:tc>
-        <w:tc>
-          <w:tcPr>
-            <w:tcW w:w="1993" w:type="dxa"/>
-          </w:tcPr>
-          <w:p>
-            <w:pPr>
-              <w:rPr>
-                <w:lang w:val="en-GB"/>
-              </w:rPr>
-            </w:pPr>
-            <w:r>
-              <w:rPr>
-                <w:lang w:val="en-GB"/>
-              </w:rPr>
-              <w:t>Login</w:t>
-            </w:r>
-          </w:p>
-          <w:p>
-            <w:pPr>
-              <w:rPr>
-                <w:lang w:val="en-GB"/>
-              </w:rPr>
-            </w:pPr>
-            <w:proofErr w:type="spellStart"/>
-            <w:r>
-              <w:rPr>
-                <w:lang w:val="en-GB"/>
-              </w:rPr>
-              <w:t>getUtente</w:t>
-            </w:r>
-            <w:proofErr w:type="spellEnd"/>
-          </w:p>
-          <w:p>
-            <w:pPr>
-              <w:rPr>
-                <w:lang w:val="en-GB"/>
-              </w:rPr>
-            </w:pPr>
-            <w:proofErr w:type="spellStart"/>
-            <w:r>
-              <w:rPr>
-                <w:lang w:val="en-GB"/>
-              </w:rPr>
-              <w:t>change_pwd</w:t>
-            </w:r>
-            <w:proofErr w:type="spellEnd"/>
-          </w:p>
-          <w:p>
-            <w:pPr>
-              <w:rPr>
-                <w:lang w:val="en-GB"/>
-              </w:rPr>
-            </w:pPr>
-            <w:proofErr w:type="spellStart"/>
-            <w:r>
-              <w:rPr>
-                <w:lang w:val="en-GB"/>
-              </w:rPr>
-              <w:t>addAccount</w:t>
-            </w:r>
-            <w:proofErr w:type="spellEnd"/>
-          </w:p>
-          <w:p>
-            <w:pPr>
-              <w:rPr>
-                <w:lang w:val="en-GB"/>
-              </w:rPr>
-            </w:pPr>
-            <w:proofErr w:type="spellStart"/>
-            <w:r>
-              <w:rPr>
-                <w:lang w:val="en-GB"/>
-              </w:rPr>
-              <w:t>get</w:t>
-            </w:r>
-            <w:r>
-              <w:rPr>
-                <w:lang w:val="en-GB"/>
-              </w:rPr>
-              <w:t>Account</w:t>
-            </w:r>
-            <w:proofErr w:type="spellEnd"/>
-          </w:p>
-          <w:p>
-            <w:pPr>
-              <w:rPr>
-                <w:lang w:val="en-GB"/>
-              </w:rPr>
-            </w:pPr>
-            <w:proofErr w:type="spellStart"/>
-            <w:r>
-              <w:rPr>
-                <w:lang w:val="en-GB"/>
-              </w:rPr>
-              <w:t>generateNewPwd</w:t>
-            </w:r>
-            <w:proofErr w:type="spellEnd"/>
-          </w:p>
-          <w:p>
-            <w:pPr>
-              <w:rPr>
-                <w:lang w:val="en-GB"/>
-              </w:rPr>
-            </w:pPr>
-            <w:proofErr w:type="spellStart"/>
-            <w:r>
-              <w:rPr>
-                <w:lang w:val="en-GB"/>
-              </w:rPr>
-              <w:t>modifyRole</w:t>
-            </w:r>
-            <w:proofErr w:type="spellEnd"/>
-          </w:p>
-          <w:p>
-            <w:pPr>
-              <w:rPr>
-                <w:lang w:val="en-GB"/>
-              </w:rPr>
-            </w:pPr>
-            <w:proofErr w:type="spellStart"/>
-            <w:r>
-              <w:rPr>
-                <w:lang w:val="en-GB"/>
-              </w:rPr>
-              <w:t>modifySupervisor</w:t>
-            </w:r>
-            <w:proofErr w:type="spellEnd"/>
-          </w:p>
-          <w:p>
-            <w:pPr>
-              <w:rPr>
-                <w:lang w:val="en-GB"/>
-              </w:rPr>
-            </w:pPr>
-            <w:proofErr w:type="spellStart"/>
-            <w:r>
-              <w:rPr>
-                <w:lang w:val="en-GB"/>
-              </w:rPr>
-              <w:t>deleteAccount</w:t>
-            </w:r>
-            <w:proofErr w:type="spellEnd"/>
           </w:p>
         </w:tc>
         <w:tc>
           <w:tcPr>
             <w:tcW w:w="2127" w:type="dxa"/>
-          </w:tcPr>
-          <w:p>
-            <w:pPr>
-              <w:rPr>
-                <w:lang w:val="en-GB"/>
-              </w:rPr>
-            </w:pPr>
-          </w:p>
-        </w:tc>
-        <w:tc>
-          <w:tcPr>
-            <w:tcW w:w="1842" w:type="dxa"/>
-            <w:vAlign w:val="center"/>
-          </w:tcPr>
-          <w:p>
-            <w:pPr>
-              <w:rPr>
-                <w:lang w:val="en-GB"/>
-              </w:rPr>
-            </w:pPr>
-          </w:p>
-        </w:tc>
-        <w:tc>
-          <w:tcPr>
-            <w:tcW w:w="1695" w:type="dxa"/>
           </w:tcPr>
           <w:p>
             <w:pPr>
@@ -11707,14 +11777,13 @@
     <w:p/>
     <w:p/>
     <w:p/>
-    <w:p/>
-    <w:p/>
     <w:p>
       <w:pPr>
         <w:pStyle w:val="Titolo3"/>
       </w:pPr>
       <w:bookmarkStart w:id="27" w:name="_Toc220693599"/>
       <w:r>
+        <w:lastRenderedPageBreak/>
         <w:t>4.6 PersistenceManagement</w:t>
       </w:r>
       <w:bookmarkEnd w:id="27"/>
@@ -12278,7 +12347,6 @@
           <w:p>
             <w:proofErr w:type="spellStart"/>
             <w:r>
-              <w:lastRenderedPageBreak/>
               <w:t>createSupervisore</w:t>
             </w:r>
             <w:proofErr w:type="spellEnd"/>
@@ -12303,6 +12371,7 @@
           <w:p>
             <w:proofErr w:type="spellStart"/>
             <w:r>
+              <w:lastRenderedPageBreak/>
               <w:t>findByMatricola</w:t>
             </w:r>
             <w:proofErr w:type="spellEnd"/>
@@ -12676,6 +12745,7 @@
         </w:tc>
       </w:tr>
     </w:tbl>
+    <w:p/>
     <w:p/>
     <w:p/>
     <w:p/>
@@ -17136,7 +17206,6 @@
   <w:style w:type="character" w:default="1" w:styleId="Carpredefinitoparagrafo">
     <w:name w:val="Default Paragraph Font"/>
     <w:uiPriority w:val="1"/>
-    <w:semiHidden/>
     <w:unhideWhenUsed/>
   </w:style>
   <w:style w:type="table" w:default="1" w:styleId="Tabellanormale">

</xml_diff>

<commit_message>
Mod: correzioni all'interno dei documenti
</commit_message>
<xml_diff>
--- a/Workspace/SDD/SDD_EWMS.docx
+++ b/Workspace/SDD/SDD_EWMS.docx
@@ -322,7 +322,7 @@
             <v:path o:extrusionok="f" gradientshapeok="t" o:connecttype="rect"/>
             <o:lock v:ext="edit" aspectratio="t"/>
           </v:shapetype>
-          <v:shape id="_x0000_i1025" type="#_x0000_t75" style="width:324pt;height:246pt">
+          <v:shape id="_x0000_i1025" type="#_x0000_t75" style="width:324.25pt;height:246.3pt">
             <v:imagedata r:id="rId8" o:title=""/>
           </v:shape>
         </w:pict>
@@ -1302,16 +1302,8 @@
               <w:rPr>
                 <w:sz w:val="20"/>
               </w:rPr>
-              <w:t xml:space="preserve">Assemblaggio documento a partire dai singoli prodotti effettuati </w:t>
-            </w:r>
-            <w:proofErr w:type="gramStart"/>
-            <w:r>
-              <w:rPr>
-                <w:sz w:val="20"/>
-              </w:rPr>
-              <w:t>dal team</w:t>
-            </w:r>
-            <w:proofErr w:type="gramEnd"/>
+              <w:t>Assemblaggio documento a partire dai singoli prodotti effettuati dal team</w:t>
+            </w:r>
           </w:p>
         </w:tc>
         <w:tc>
@@ -1555,21 +1547,7 @@
               <w:rPr>
                 <w:sz w:val="20"/>
               </w:rPr>
-              <w:t xml:space="preserve">Aggiunti metodi </w:t>
-            </w:r>
-            <w:proofErr w:type="gramStart"/>
-            <w:r>
-              <w:rPr>
-                <w:sz w:val="20"/>
-              </w:rPr>
-              <w:t>alle interfaccia</w:t>
-            </w:r>
-            <w:proofErr w:type="gramEnd"/>
-            <w:r>
-              <w:rPr>
-                <w:sz w:val="20"/>
-              </w:rPr>
-              <w:t xml:space="preserve"> </w:t>
+              <w:t xml:space="preserve">Aggiunti metodi alle interfaccia </w:t>
             </w:r>
             <w:proofErr w:type="spellStart"/>
             <w:r>
@@ -4402,11 +4380,9 @@
         <w:br/>
         <w:t xml:space="preserve">Per garantire la compatibilità cross-browser, è necessario rinunciare o limitare l’uso di funzionalità web </w:t>
       </w:r>
-      <w:proofErr w:type="gramStart"/>
       <w:r>
         <w:t>ultra-moderne</w:t>
       </w:r>
-      <w:proofErr w:type="gramEnd"/>
       <w:r>
         <w:t xml:space="preserve"> non ancora supportate uniformemente dai browser.</w:t>
       </w:r>
@@ -6355,13 +6331,8 @@
             <w:pPr>
               <w:spacing w:after="160" w:line="259" w:lineRule="auto"/>
             </w:pPr>
-            <w:proofErr w:type="spellStart"/>
-            <w:r>
-              <w:t>Structured</w:t>
-            </w:r>
-            <w:proofErr w:type="spellEnd"/>
-            <w:r>
-              <w:t xml:space="preserve"> Query Language</w:t>
+            <w:r>
+              <w:t>Structured Query Language</w:t>
             </w:r>
           </w:p>
         </w:tc>
@@ -7792,15 +7763,7 @@
         <w:t>:</w:t>
       </w:r>
       <w:r>
-        <w:t xml:space="preserve"> È il server centrale che ospita la logica applicativa. Esegue il container web necessario per gestire il ciclo di vita delle </w:t>
-      </w:r>
-      <w:proofErr w:type="spellStart"/>
-      <w:r>
-        <w:t>Servlet</w:t>
-      </w:r>
-      <w:proofErr w:type="spellEnd"/>
-      <w:r>
-        <w:t xml:space="preserve"> e delle pagine JSP.</w:t>
+        <w:t xml:space="preserve"> È il server centrale che ospita la logica applicativa. Esegue il container web necessario per gestire il ciclo di vita delle Servlet e delle pagine JSP.</w:t>
       </w:r>
     </w:p>
     <w:p>
@@ -8037,15 +8000,7 @@
               <w:t>Ges</w:t>
             </w:r>
             <w:r>
-              <w:t xml:space="preserve">tione del ciclo di vita di </w:t>
-            </w:r>
-            <w:proofErr w:type="spellStart"/>
-            <w:r>
-              <w:t>Servlet</w:t>
-            </w:r>
-            <w:proofErr w:type="spellEnd"/>
-            <w:r>
-              <w:t xml:space="preserve">/JSP e dove verrà caricato il file </w:t>
+              <w:t xml:space="preserve">tione del ciclo di vita di Servlet/JSP e dove verrà caricato il file </w:t>
             </w:r>
             <w:proofErr w:type="spellStart"/>
             <w:r>
@@ -8502,26 +8457,13 @@
         <w:t xml:space="preserve"> L’implementazione del controllo degli accessi verrà effettuata </w:t>
       </w:r>
       <w:r>
-        <w:t xml:space="preserve">a livello programmatico tramite l'utilizzo di </w:t>
-      </w:r>
-      <w:proofErr w:type="spellStart"/>
-      <w:r>
-        <w:rPr>
-          <w:b/>
-          <w:bCs/>
-        </w:rPr>
-        <w:t>Servlet</w:t>
-      </w:r>
-      <w:proofErr w:type="spellEnd"/>
-      <w:r>
-        <w:rPr>
-          <w:b/>
-          <w:bCs/>
-        </w:rPr>
-        <w:t xml:space="preserve"> Filters</w:t>
-      </w:r>
-      <w:r>
-        <w:t xml:space="preserve"> standard. Questi componenti intercettano ogni richiesta HTTP diretta al livello applicativo, verificando l'identità dell'utente e i suoi privilegi prima di consentire l'esecuzione di qualsiasi logica di business.</w:t>
+        <w:t>a livello programmatico</w:t>
+      </w:r>
+      <w:r>
+        <w:t xml:space="preserve">, verificando </w:t>
+      </w:r>
+      <w:r>
+        <w:t>l'identità dell'utente e i suoi privilegi prima di consentire l'esecuzione di qualsiasi logica di business.</w:t>
       </w:r>
       <w:r>
         <w:t xml:space="preserve"> V</w:t>
@@ -9518,15 +9460,7 @@
         </w:numPr>
       </w:pPr>
       <w:r>
-        <w:t xml:space="preserve">Il web-container intercetterà la richiesta, istanzierà un nuovo </w:t>
-      </w:r>
-      <w:proofErr w:type="spellStart"/>
-      <w:r>
-        <w:t>thread</w:t>
-      </w:r>
-      <w:proofErr w:type="spellEnd"/>
-      <w:r>
-        <w:t xml:space="preserve"> dedicato e lo indirizza alla </w:t>
+        <w:t xml:space="preserve">Il web-container intercetterà la richiesta, istanzierà un nuovo thread dedicato e lo indirizza alla </w:t>
       </w:r>
       <w:proofErr w:type="spellStart"/>
       <w:r>
@@ -9614,53 +9548,29 @@
         <w:t>iene</w:t>
       </w:r>
       <w:r>
-        <w:t xml:space="preserve"> un </w:t>
+        <w:t xml:space="preserve"> un Thread Pool; ogni richiesta HTTP </w:t>
+      </w:r>
+      <w:r>
+        <w:t xml:space="preserve">verrà quindi </w:t>
+      </w:r>
+      <w:r>
+        <w:t>eseguita in un thread separato.</w:t>
+      </w:r>
+    </w:p>
+    <w:p>
+      <w:pPr>
+        <w:ind w:left="708"/>
+      </w:pPr>
+      <w:r>
+        <w:t xml:space="preserve">Le </w:t>
       </w:r>
       <w:proofErr w:type="spellStart"/>
       <w:r>
-        <w:t>Thread</w:t>
+        <w:t>servlet</w:t>
       </w:r>
       <w:proofErr w:type="spellEnd"/>
       <w:r>
-        <w:t xml:space="preserve"> Pool; ogni richiesta HTTP </w:t>
-      </w:r>
-      <w:r>
-        <w:t xml:space="preserve">verrà quindi </w:t>
-      </w:r>
-      <w:r>
-        <w:t xml:space="preserve">eseguita in un </w:t>
-      </w:r>
-      <w:proofErr w:type="spellStart"/>
-      <w:r>
-        <w:t>thread</w:t>
-      </w:r>
-      <w:proofErr w:type="spellEnd"/>
-      <w:r>
-        <w:t xml:space="preserve"> separato.</w:t>
-      </w:r>
-    </w:p>
-    <w:p>
-      <w:pPr>
-        <w:ind w:left="708"/>
-      </w:pPr>
-      <w:r>
-        <w:t xml:space="preserve">Le </w:t>
-      </w:r>
-      <w:proofErr w:type="spellStart"/>
-      <w:r>
-        <w:t>servlet</w:t>
-      </w:r>
-      <w:proofErr w:type="spellEnd"/>
-      <w:r>
-        <w:t xml:space="preserve">, inoltre, sono oggetti di tipo </w:t>
-      </w:r>
-      <w:proofErr w:type="spellStart"/>
-      <w:r>
-        <w:t>stateless</w:t>
-      </w:r>
-      <w:proofErr w:type="spellEnd"/>
-      <w:r>
-        <w:t>, non conservano uno stato e n</w:t>
+        <w:t>, inoltre, sono oggetti di tipo stateless, non conservano uno stato e n</w:t>
       </w:r>
       <w:r>
         <w:t xml:space="preserve">on utilizzano variabili di istanza mutabili per conservare dati specifici dell'utente, prevenendo </w:t>
@@ -9670,38 +9580,13 @@
           <w:b/>
           <w:bCs/>
         </w:rPr>
-        <w:t xml:space="preserve">race </w:t>
-      </w:r>
-      <w:proofErr w:type="spellStart"/>
-      <w:r>
-        <w:rPr>
-          <w:b/>
-          <w:bCs/>
-        </w:rPr>
-        <w:t>condition</w:t>
-      </w:r>
-      <w:proofErr w:type="spellEnd"/>
+        <w:t>race condition</w:t>
+      </w:r>
       <w:r>
         <w:t xml:space="preserve"> </w:t>
       </w:r>
       <w:r>
-        <w:t xml:space="preserve">quando più </w:t>
-      </w:r>
-      <w:proofErr w:type="spellStart"/>
-      <w:r>
-        <w:t>thread</w:t>
-      </w:r>
-      <w:proofErr w:type="spellEnd"/>
-      <w:r>
-        <w:t xml:space="preserve"> accedono alla stessa </w:t>
-      </w:r>
-      <w:proofErr w:type="spellStart"/>
-      <w:r>
-        <w:t>Servlet</w:t>
-      </w:r>
-      <w:proofErr w:type="spellEnd"/>
-      <w:r>
-        <w:t xml:space="preserve"> contemporaneamente.</w:t>
+        <w:t>quando più thread accedono alla stessa Servlet contemporaneamente.</w:t>
       </w:r>
     </w:p>
     <w:p>
@@ -9755,16 +9640,11 @@
       <w:r>
         <w:t xml:space="preserve">La sincronizzazione tra i sottosistemi e l'accesso concorrente al database </w:t>
       </w:r>
-      <w:proofErr w:type="gramStart"/>
-      <w:r>
-        <w:t>è gestit</w:t>
-      </w:r>
-      <w:r>
-        <w:t>o</w:t>
-      </w:r>
-      <w:proofErr w:type="gramEnd"/>
-      <w:r>
-        <w:t xml:space="preserve"> attraverso:</w:t>
+      <w:r>
+        <w:t xml:space="preserve">sono gestiti </w:t>
+      </w:r>
+      <w:r>
+        <w:t>attraverso:</w:t>
       </w:r>
     </w:p>
     <w:p>
@@ -9816,15 +9696,7 @@
       </w:r>
       <w:proofErr w:type="spellEnd"/>
       <w:r>
-        <w:t xml:space="preserve"> (Connection Pool). Questo componente gestisce una coda di connessioni disponibili, mettendo in attesa i </w:t>
-      </w:r>
-      <w:proofErr w:type="spellStart"/>
-      <w:r>
-        <w:t>thread</w:t>
-      </w:r>
-      <w:proofErr w:type="spellEnd"/>
-      <w:r>
-        <w:t xml:space="preserve"> se tutte le connessioni sono occupate, prevenendo il sovraccarico del database.</w:t>
+        <w:t xml:space="preserve"> (Connection Pool). Questo componente gestisce una coda di connessioni disponibili, mettendo in attesa i thread se tutte le connessioni sono occupate, prevenendo il sovraccarico del database.</w:t>
       </w:r>
     </w:p>
     <w:p>
@@ -9887,15 +9759,7 @@
         <w:t xml:space="preserve">. </w:t>
       </w:r>
       <w:r>
-        <w:t xml:space="preserve">L'obiettivo è garantire l'integrità dei dati e fornire </w:t>
-      </w:r>
-      <w:proofErr w:type="gramStart"/>
-      <w:r>
-        <w:t>feedback</w:t>
-      </w:r>
-      <w:proofErr w:type="gramEnd"/>
-      <w:r>
-        <w:t xml:space="preserve"> adeguati agli utenti</w:t>
+        <w:t>L'obiettivo è garantire l'integrità dei dati e fornire feedback adeguati agli utenti</w:t>
       </w:r>
       <w:r>
         <w:t xml:space="preserve"> e ai programmatori che interverranno in caso di malfunzionamenti</w:t>
@@ -10169,23 +10033,7 @@
           <w:bCs/>
         </w:rPr>
         <w:lastRenderedPageBreak/>
-        <w:t xml:space="preserve">Completamento </w:t>
-      </w:r>
-      <w:proofErr w:type="spellStart"/>
-      <w:r>
-        <w:rPr>
-          <w:b/>
-          <w:bCs/>
-        </w:rPr>
-        <w:t>Thread</w:t>
-      </w:r>
-      <w:proofErr w:type="spellEnd"/>
-      <w:r>
-        <w:rPr>
-          <w:b/>
-          <w:bCs/>
-        </w:rPr>
-        <w:t>:</w:t>
+        <w:t>Completamento Thread:</w:t>
       </w:r>
       <w:r>
         <w:t xml:space="preserve"> Se vi sono operazioni di upload file in corso, il sistema tenta di completarle (entro un </w:t>
@@ -10302,13 +10150,16 @@
         <w:t>User Experience:</w:t>
       </w:r>
       <w:r>
-        <w:t xml:space="preserve"> L'utente viene reindirizzato automaticamente a una pagina di </w:t>
-      </w:r>
-      <w:r>
-        <w:t>errore</w:t>
-      </w:r>
-      <w:r>
-        <w:t xml:space="preserve"> (error500.jsp) che comunica "Si è verificato un errore imprevisto" e invita a riprovare più tardi, senza mostrare dettagli tecnici sensibili.</w:t>
+        <w:t xml:space="preserve"> </w:t>
+      </w:r>
+      <w:r>
+        <w:t>All</w:t>
+      </w:r>
+      <w:r>
+        <w:t xml:space="preserve">'utente </w:t>
+      </w:r>
+      <w:r>
+        <w:t>verrà mostrato il messaggio di errore sulla pagina e gli verrà consigliato di riprovare più tardi.</w:t>
       </w:r>
     </w:p>
     <w:p>
@@ -10407,15 +10258,10 @@
         <w:t>Violazioni di Sicurezza</w:t>
       </w:r>
       <w:r>
-        <w:t xml:space="preserve"> Come definito nella sezione 3.5, tentativi di accesso non autorizzato (es. URL Forcing) non generano errori di sistema, ma reindirizzano l'utente alla pagina di Login o mostrano una pagina di errore 403 (</w:t>
-      </w:r>
-      <w:proofErr w:type="spellStart"/>
-      <w:r>
-        <w:t>Forbidden</w:t>
-      </w:r>
-      <w:proofErr w:type="spellEnd"/>
-      <w:r>
-        <w:t>) standardizzata.</w:t>
+        <w:t xml:space="preserve"> Come definito nella sezione 3.5, tentativi di accesso non autorizzato (es. URL Forcing) generano</w:t>
+      </w:r>
+      <w:r>
+        <w:t xml:space="preserve"> un messaggio di errore che viene mostrato sulla pagina.</w:t>
       </w:r>
     </w:p>
     <w:p/>
@@ -12584,15 +12430,7 @@
           </w:tcPr>
           <w:p>
             <w:r>
-              <w:t xml:space="preserve">Permettere di ottenere la password sul database utilizzando </w:t>
-            </w:r>
-            <w:proofErr w:type="gramStart"/>
-            <w:r>
-              <w:t>l’email</w:t>
-            </w:r>
-            <w:proofErr w:type="gramEnd"/>
-            <w:r>
-              <w:t xml:space="preserve"> dell’utente</w:t>
+              <w:t>Permettere di ottenere la password sul database utilizzando l’email dell’utente</w:t>
             </w:r>
           </w:p>
         </w:tc>
@@ -17206,6 +17044,7 @@
   <w:style w:type="character" w:default="1" w:styleId="Carpredefinitoparagrafo">
     <w:name w:val="Default Paragraph Font"/>
     <w:uiPriority w:val="1"/>
+    <w:semiHidden/>
     <w:unhideWhenUsed/>
   </w:style>
   <w:style w:type="table" w:default="1" w:styleId="Tabellanormale">

</xml_diff>